<commit_message>
Added Arduino IDE program for WiFi connection
</commit_message>
<xml_diff>
--- a/Documentation/General/Notes.docx
+++ b/Documentation/General/Notes.docx
@@ -4,39 +4,532 @@
   <w:body>
     <w:p>
       <w:pPr>
-        <w:pStyle w:val="Ttulo1"/>
+        <w:pStyle w:val="Title"/>
+        <w:jc w:val="center"/>
       </w:pPr>
       <w:r>
         <w:t>General notes</w:t>
       </w:r>
     </w:p>
+    <w:sdt>
+      <w:sdtPr>
+        <w:rPr>
+          <w:rFonts w:asciiTheme="minorHAnsi" w:eastAsiaTheme="minorHAnsi" w:hAnsiTheme="minorHAnsi" w:cstheme="minorBidi"/>
+          <w:color w:val="auto"/>
+          <w:sz w:val="22"/>
+          <w:szCs w:val="22"/>
+          <w:lang w:eastAsia="en-US"/>
+        </w:rPr>
+        <w:id w:val="1167678400"/>
+        <w:docPartObj>
+          <w:docPartGallery w:val="Table of Contents"/>
+          <w:docPartUnique/>
+        </w:docPartObj>
+      </w:sdtPr>
+      <w:sdtEndPr>
+        <w:rPr>
+          <w:b/>
+          <w:bCs/>
+        </w:rPr>
+      </w:sdtEndPr>
+      <w:sdtContent>
+        <w:p>
+          <w:pPr>
+            <w:pStyle w:val="TOCHeading"/>
+          </w:pPr>
+          <w:proofErr w:type="spellStart"/>
+          <w:r>
+            <w:t>Contents</w:t>
+          </w:r>
+          <w:proofErr w:type="spellEnd"/>
+        </w:p>
+        <w:p>
+          <w:pPr>
+            <w:pStyle w:val="TOC2"/>
+            <w:tabs>
+              <w:tab w:val="right" w:leader="dot" w:pos="8494"/>
+            </w:tabs>
+            <w:rPr>
+              <w:rFonts w:eastAsiaTheme="minorEastAsia"/>
+              <w:noProof/>
+              <w:lang w:val="en-GB" w:eastAsia="en-GB"/>
+            </w:rPr>
+          </w:pPr>
+          <w:r>
+            <w:fldChar w:fldCharType="begin"/>
+          </w:r>
+          <w:r>
+            <w:instrText xml:space="preserve"> TOC \o "1-3" \h \z \u </w:instrText>
+          </w:r>
+          <w:r>
+            <w:fldChar w:fldCharType="separate"/>
+          </w:r>
+          <w:hyperlink w:anchor="_Toc66527183" w:history="1">
+            <w:r>
+              <w:rPr>
+                <w:rStyle w:val="Hyperlink"/>
+                <w:noProof/>
+                <w:lang w:val="en-GB"/>
+              </w:rPr>
+              <w:t>Purchases</w:t>
+            </w:r>
+            <w:r>
+              <w:rPr>
+                <w:noProof/>
+                <w:webHidden/>
+              </w:rPr>
+              <w:tab/>
+            </w:r>
+            <w:r>
+              <w:rPr>
+                <w:noProof/>
+                <w:webHidden/>
+              </w:rPr>
+              <w:fldChar w:fldCharType="begin"/>
+            </w:r>
+            <w:r>
+              <w:rPr>
+                <w:noProof/>
+                <w:webHidden/>
+              </w:rPr>
+              <w:instrText xml:space="preserve"> PAGEREF _Toc66527183 \h </w:instrText>
+            </w:r>
+            <w:r>
+              <w:rPr>
+                <w:noProof/>
+                <w:webHidden/>
+              </w:rPr>
+            </w:r>
+            <w:r>
+              <w:rPr>
+                <w:noProof/>
+                <w:webHidden/>
+              </w:rPr>
+              <w:fldChar w:fldCharType="separate"/>
+            </w:r>
+            <w:r>
+              <w:rPr>
+                <w:noProof/>
+                <w:webHidden/>
+              </w:rPr>
+              <w:t>1</w:t>
+            </w:r>
+            <w:r>
+              <w:rPr>
+                <w:noProof/>
+                <w:webHidden/>
+              </w:rPr>
+              <w:fldChar w:fldCharType="end"/>
+            </w:r>
+          </w:hyperlink>
+        </w:p>
+        <w:p>
+          <w:pPr>
+            <w:pStyle w:val="TOC2"/>
+            <w:tabs>
+              <w:tab w:val="right" w:leader="dot" w:pos="8494"/>
+            </w:tabs>
+            <w:rPr>
+              <w:rFonts w:eastAsiaTheme="minorEastAsia"/>
+              <w:noProof/>
+              <w:lang w:val="en-GB" w:eastAsia="en-GB"/>
+            </w:rPr>
+          </w:pPr>
+          <w:hyperlink w:anchor="_Toc66527184" w:history="1">
+            <w:r>
+              <w:rPr>
+                <w:rStyle w:val="Hyperlink"/>
+                <w:noProof/>
+                <w:lang w:val="en-GB"/>
+              </w:rPr>
+              <w:t>Arduino MKR 1010 config</w:t>
+            </w:r>
+            <w:r>
+              <w:rPr>
+                <w:noProof/>
+                <w:webHidden/>
+              </w:rPr>
+              <w:tab/>
+            </w:r>
+            <w:r>
+              <w:rPr>
+                <w:noProof/>
+                <w:webHidden/>
+              </w:rPr>
+              <w:fldChar w:fldCharType="begin"/>
+            </w:r>
+            <w:r>
+              <w:rPr>
+                <w:noProof/>
+                <w:webHidden/>
+              </w:rPr>
+              <w:instrText xml:space="preserve"> PAGEREF _Toc66527184 \h </w:instrText>
+            </w:r>
+            <w:r>
+              <w:rPr>
+                <w:noProof/>
+                <w:webHidden/>
+              </w:rPr>
+            </w:r>
+            <w:r>
+              <w:rPr>
+                <w:noProof/>
+                <w:webHidden/>
+              </w:rPr>
+              <w:fldChar w:fldCharType="separate"/>
+            </w:r>
+            <w:r>
+              <w:rPr>
+                <w:noProof/>
+                <w:webHidden/>
+              </w:rPr>
+              <w:t>2</w:t>
+            </w:r>
+            <w:r>
+              <w:rPr>
+                <w:noProof/>
+                <w:webHidden/>
+              </w:rPr>
+              <w:fldChar w:fldCharType="end"/>
+            </w:r>
+          </w:hyperlink>
+        </w:p>
+        <w:p>
+          <w:pPr>
+            <w:pStyle w:val="TOC3"/>
+            <w:tabs>
+              <w:tab w:val="right" w:leader="dot" w:pos="8494"/>
+            </w:tabs>
+            <w:rPr>
+              <w:rFonts w:eastAsiaTheme="minorEastAsia"/>
+              <w:noProof/>
+              <w:lang w:val="en-GB" w:eastAsia="en-GB"/>
+            </w:rPr>
+          </w:pPr>
+          <w:hyperlink w:anchor="_Toc66527185" w:history="1">
+            <w:r>
+              <w:rPr>
+                <w:rStyle w:val="Hyperlink"/>
+                <w:noProof/>
+                <w:lang w:val="en-GB"/>
+              </w:rPr>
+              <w:t>WiFI Config</w:t>
+            </w:r>
+            <w:r>
+              <w:rPr>
+                <w:noProof/>
+                <w:webHidden/>
+              </w:rPr>
+              <w:tab/>
+            </w:r>
+            <w:r>
+              <w:rPr>
+                <w:noProof/>
+                <w:webHidden/>
+              </w:rPr>
+              <w:fldChar w:fldCharType="begin"/>
+            </w:r>
+            <w:r>
+              <w:rPr>
+                <w:noProof/>
+                <w:webHidden/>
+              </w:rPr>
+              <w:instrText xml:space="preserve"> PAGEREF _Toc66527185 \h </w:instrText>
+            </w:r>
+            <w:r>
+              <w:rPr>
+                <w:noProof/>
+                <w:webHidden/>
+              </w:rPr>
+            </w:r>
+            <w:r>
+              <w:rPr>
+                <w:noProof/>
+                <w:webHidden/>
+              </w:rPr>
+              <w:fldChar w:fldCharType="separate"/>
+            </w:r>
+            <w:r>
+              <w:rPr>
+                <w:noProof/>
+                <w:webHidden/>
+              </w:rPr>
+              <w:t>2</w:t>
+            </w:r>
+            <w:r>
+              <w:rPr>
+                <w:noProof/>
+                <w:webHidden/>
+              </w:rPr>
+              <w:fldChar w:fldCharType="end"/>
+            </w:r>
+          </w:hyperlink>
+        </w:p>
+        <w:p>
+          <w:pPr>
+            <w:pStyle w:val="TOC2"/>
+            <w:tabs>
+              <w:tab w:val="right" w:leader="dot" w:pos="8494"/>
+            </w:tabs>
+            <w:rPr>
+              <w:rFonts w:eastAsiaTheme="minorEastAsia"/>
+              <w:noProof/>
+              <w:lang w:val="en-GB" w:eastAsia="en-GB"/>
+            </w:rPr>
+          </w:pPr>
+          <w:hyperlink w:anchor="_Toc66527186" w:history="1">
+            <w:r>
+              <w:rPr>
+                <w:rStyle w:val="Hyperlink"/>
+                <w:noProof/>
+              </w:rPr>
+              <w:t>Matlab/Simulink</w:t>
+            </w:r>
+            <w:r>
+              <w:rPr>
+                <w:noProof/>
+                <w:webHidden/>
+              </w:rPr>
+              <w:tab/>
+            </w:r>
+            <w:r>
+              <w:rPr>
+                <w:noProof/>
+                <w:webHidden/>
+              </w:rPr>
+              <w:fldChar w:fldCharType="begin"/>
+            </w:r>
+            <w:r>
+              <w:rPr>
+                <w:noProof/>
+                <w:webHidden/>
+              </w:rPr>
+              <w:instrText xml:space="preserve"> PAGEREF _Toc66527186 \h </w:instrText>
+            </w:r>
+            <w:r>
+              <w:rPr>
+                <w:noProof/>
+                <w:webHidden/>
+              </w:rPr>
+            </w:r>
+            <w:r>
+              <w:rPr>
+                <w:noProof/>
+                <w:webHidden/>
+              </w:rPr>
+              <w:fldChar w:fldCharType="separate"/>
+            </w:r>
+            <w:r>
+              <w:rPr>
+                <w:noProof/>
+                <w:webHidden/>
+              </w:rPr>
+              <w:t>2</w:t>
+            </w:r>
+            <w:r>
+              <w:rPr>
+                <w:noProof/>
+                <w:webHidden/>
+              </w:rPr>
+              <w:fldChar w:fldCharType="end"/>
+            </w:r>
+          </w:hyperlink>
+        </w:p>
+        <w:p>
+          <w:pPr>
+            <w:pStyle w:val="TOC3"/>
+            <w:tabs>
+              <w:tab w:val="right" w:leader="dot" w:pos="8494"/>
+            </w:tabs>
+            <w:rPr>
+              <w:rFonts w:eastAsiaTheme="minorEastAsia"/>
+              <w:noProof/>
+              <w:lang w:val="en-GB" w:eastAsia="en-GB"/>
+            </w:rPr>
+          </w:pPr>
+          <w:hyperlink w:anchor="_Toc66527187" w:history="1">
+            <w:r>
+              <w:rPr>
+                <w:rStyle w:val="Hyperlink"/>
+                <w:noProof/>
+              </w:rPr>
+              <w:t>Packages</w:t>
+            </w:r>
+            <w:r>
+              <w:rPr>
+                <w:noProof/>
+                <w:webHidden/>
+              </w:rPr>
+              <w:tab/>
+            </w:r>
+            <w:r>
+              <w:rPr>
+                <w:noProof/>
+                <w:webHidden/>
+              </w:rPr>
+              <w:fldChar w:fldCharType="begin"/>
+            </w:r>
+            <w:r>
+              <w:rPr>
+                <w:noProof/>
+                <w:webHidden/>
+              </w:rPr>
+              <w:instrText xml:space="preserve"> PAGEREF _Toc66527187 \h </w:instrText>
+            </w:r>
+            <w:r>
+              <w:rPr>
+                <w:noProof/>
+                <w:webHidden/>
+              </w:rPr>
+            </w:r>
+            <w:r>
+              <w:rPr>
+                <w:noProof/>
+                <w:webHidden/>
+              </w:rPr>
+              <w:fldChar w:fldCharType="separate"/>
+            </w:r>
+            <w:r>
+              <w:rPr>
+                <w:noProof/>
+                <w:webHidden/>
+              </w:rPr>
+              <w:t>2</w:t>
+            </w:r>
+            <w:r>
+              <w:rPr>
+                <w:noProof/>
+                <w:webHidden/>
+              </w:rPr>
+              <w:fldChar w:fldCharType="end"/>
+            </w:r>
+          </w:hyperlink>
+        </w:p>
+        <w:p>
+          <w:pPr>
+            <w:pStyle w:val="TOC3"/>
+            <w:tabs>
+              <w:tab w:val="right" w:leader="dot" w:pos="8494"/>
+            </w:tabs>
+            <w:rPr>
+              <w:rFonts w:eastAsiaTheme="minorEastAsia"/>
+              <w:noProof/>
+              <w:lang w:val="en-GB" w:eastAsia="en-GB"/>
+            </w:rPr>
+          </w:pPr>
+          <w:hyperlink w:anchor="_Toc66527188" w:history="1">
+            <w:r>
+              <w:rPr>
+                <w:rStyle w:val="Hyperlink"/>
+                <w:noProof/>
+              </w:rPr>
+              <w:t>Connection with Arduino</w:t>
+            </w:r>
+            <w:r>
+              <w:rPr>
+                <w:noProof/>
+                <w:webHidden/>
+              </w:rPr>
+              <w:tab/>
+            </w:r>
+            <w:r>
+              <w:rPr>
+                <w:noProof/>
+                <w:webHidden/>
+              </w:rPr>
+              <w:fldChar w:fldCharType="begin"/>
+            </w:r>
+            <w:r>
+              <w:rPr>
+                <w:noProof/>
+                <w:webHidden/>
+              </w:rPr>
+              <w:instrText xml:space="preserve"> PAGEREF _Toc66527188 \h </w:instrText>
+            </w:r>
+            <w:r>
+              <w:rPr>
+                <w:noProof/>
+                <w:webHidden/>
+              </w:rPr>
+            </w:r>
+            <w:r>
+              <w:rPr>
+                <w:noProof/>
+                <w:webHidden/>
+              </w:rPr>
+              <w:fldChar w:fldCharType="separate"/>
+            </w:r>
+            <w:r>
+              <w:rPr>
+                <w:noProof/>
+                <w:webHidden/>
+              </w:rPr>
+              <w:t>2</w:t>
+            </w:r>
+            <w:r>
+              <w:rPr>
+                <w:noProof/>
+                <w:webHidden/>
+              </w:rPr>
+              <w:fldChar w:fldCharType="end"/>
+            </w:r>
+          </w:hyperlink>
+        </w:p>
+        <w:p>
+          <w:r>
+            <w:rPr>
+              <w:b/>
+              <w:bCs/>
+            </w:rPr>
+            <w:fldChar w:fldCharType="end"/>
+          </w:r>
+        </w:p>
+      </w:sdtContent>
+    </w:sdt>
+    <w:p/>
+    <w:p/>
     <w:p/>
     <w:p>
       <w:pPr>
-        <w:pStyle w:val="Ttulo2"/>
-      </w:pPr>
-      <w:proofErr w:type="spellStart"/>
-      <w:r>
+        <w:pStyle w:val="Heading2"/>
+        <w:rPr>
+          <w:lang w:val="en-GB"/>
+        </w:rPr>
+      </w:pPr>
+      <w:bookmarkStart w:id="0" w:name="_Toc66527183"/>
+      <w:r>
+        <w:rPr>
+          <w:lang w:val="en-GB"/>
+        </w:rPr>
         <w:t>Purchases</w:t>
       </w:r>
-      <w:proofErr w:type="spellEnd"/>
-      <w:r>
-        <w:t>:</w:t>
-      </w:r>
+      <w:bookmarkEnd w:id="0"/>
     </w:p>
     <w:p>
-      <w:r>
+      <w:pPr>
+        <w:rPr>
+          <w:lang w:val="en-GB"/>
+        </w:rPr>
+      </w:pPr>
+      <w:r>
+        <w:rPr>
+          <w:lang w:val="en-GB"/>
+        </w:rPr>
         <w:t>Arduino MKR 1010 Wifi (</w:t>
       </w:r>
-      <w:hyperlink r:id="rId5" w:history="1">
+      <w:hyperlink r:id="rId6" w:history="1">
         <w:r>
           <w:rPr>
-            <w:rStyle w:val="Hipervnculo"/>
+            <w:rStyle w:val="Hyperlink"/>
+            <w:lang w:val="en-GB"/>
           </w:rPr>
           <w:t>https://www.amazon.es/gp/product/B07FYFF5YZ/ref=ppx_yo_dt_b_asin_title_o05_s00?ie=UTF8&amp;psc=1</w:t>
         </w:r>
       </w:hyperlink>
       <w:r>
+        <w:rPr>
+          <w:lang w:val="en-GB"/>
+        </w:rPr>
         <w:t>): 33,76€</w:t>
       </w:r>
     </w:p>
@@ -52,53 +545,73 @@
     </w:p>
     <w:p>
       <w:pPr>
-        <w:pStyle w:val="Prrafodelista"/>
+        <w:pStyle w:val="ListParagraph"/>
         <w:numPr>
           <w:ilvl w:val="0"/>
           <w:numId w:val="1"/>
         </w:numPr>
-      </w:pPr>
-      <w:r>
+        <w:rPr>
+          <w:lang w:val="en-GB"/>
+        </w:rPr>
+      </w:pPr>
+      <w:r>
+        <w:rPr>
+          <w:lang w:val="en-GB"/>
+        </w:rPr>
         <w:t>Rain (</w:t>
       </w:r>
-      <w:hyperlink r:id="rId6" w:history="1">
+      <w:hyperlink r:id="rId7" w:history="1">
         <w:r>
           <w:rPr>
-            <w:rStyle w:val="Hipervnculo"/>
+            <w:rStyle w:val="Hyperlink"/>
+            <w:lang w:val="en-GB"/>
           </w:rPr>
           <w:t>https://www.amazon.es/gp/product/B07V5QWXNS/ref=ppx_yo_dt_b_asin_title_o04_s00?ie=UTF8&amp;psc=1</w:t>
         </w:r>
       </w:hyperlink>
       <w:r>
+        <w:rPr>
+          <w:lang w:val="en-GB"/>
+        </w:rPr>
         <w:t>): 5u 7,99€</w:t>
       </w:r>
     </w:p>
     <w:p>
       <w:pPr>
-        <w:pStyle w:val="Prrafodelista"/>
+        <w:pStyle w:val="ListParagraph"/>
         <w:numPr>
           <w:ilvl w:val="0"/>
           <w:numId w:val="1"/>
         </w:numPr>
-      </w:pPr>
-      <w:r>
+        <w:rPr>
+          <w:lang w:val="en-GB"/>
+        </w:rPr>
+      </w:pPr>
+      <w:r>
+        <w:rPr>
+          <w:lang w:val="en-GB"/>
+        </w:rPr>
         <w:t>Light (</w:t>
       </w:r>
-      <w:hyperlink r:id="rId7" w:history="1">
+      <w:hyperlink r:id="rId8" w:history="1">
         <w:r>
           <w:rPr>
-            <w:rStyle w:val="Hipervnculo"/>
+            <w:rStyle w:val="Hyperlink"/>
+            <w:lang w:val="en-GB"/>
           </w:rPr>
           <w:t>https://www.amazon.es/gp/product/B07DJ4LHTR/ref=ppx_yo_dt_b_asin_title_o03_s00?ie=UTF8&amp;psc=1</w:t>
         </w:r>
       </w:hyperlink>
       <w:r>
+        <w:rPr>
+          <w:lang w:val="en-GB"/>
+        </w:rPr>
         <w:t>): 5u 5,99€</w:t>
       </w:r>
     </w:p>
     <w:p>
       <w:pPr>
-        <w:pStyle w:val="Prrafodelista"/>
+        <w:pStyle w:val="ListParagraph"/>
         <w:numPr>
           <w:ilvl w:val="0"/>
           <w:numId w:val="1"/>
@@ -112,10 +625,10 @@
       <w:r>
         <w:t xml:space="preserve"> (</w:t>
       </w:r>
-      <w:hyperlink r:id="rId8" w:history="1">
+      <w:hyperlink r:id="rId9" w:history="1">
         <w:r>
           <w:rPr>
-            <w:rStyle w:val="Hipervnculo"/>
+            <w:rStyle w:val="Hyperlink"/>
           </w:rPr>
           <w:t>https://www.amazon.es/gp/product/B07VB25GS5/ref=ppx_yo_dt_b_asin_title_o03_s00?ie=UTF8&amp;psc=1</w:t>
         </w:r>
@@ -126,7 +639,7 @@
     </w:p>
     <w:p>
       <w:pPr>
-        <w:pStyle w:val="Prrafodelista"/>
+        <w:pStyle w:val="ListParagraph"/>
         <w:numPr>
           <w:ilvl w:val="0"/>
           <w:numId w:val="1"/>
@@ -148,10 +661,10 @@
       <w:r>
         <w:t xml:space="preserve"> (</w:t>
       </w:r>
-      <w:hyperlink r:id="rId9" w:history="1">
+      <w:hyperlink r:id="rId10" w:history="1">
         <w:r>
           <w:rPr>
-            <w:rStyle w:val="Hipervnculo"/>
+            <w:rStyle w:val="Hyperlink"/>
           </w:rPr>
           <w:t>https://www.amazon.es/gp/product/B07V6M5C4H/ref=ppx_yo_dt_b_asin_title_o02_s00?ie=UTF8&amp;psc=1</w:t>
         </w:r>
@@ -164,10 +677,10 @@
       <w:r>
         <w:t>Arduino kit (</w:t>
       </w:r>
-      <w:hyperlink r:id="rId10" w:history="1">
+      <w:hyperlink r:id="rId11" w:history="1">
         <w:r>
           <w:rPr>
-            <w:rStyle w:val="Hipervnculo"/>
+            <w:rStyle w:val="Hyperlink"/>
           </w:rPr>
           <w:t>https://www.amazon.es/gp/product/B07CGD2HLD/ref=ppx_yo_dt_b_asin_title_o01_s00?ie=UTF8&amp;psc=1</w:t>
         </w:r>
@@ -188,10 +701,10 @@
       <w:r>
         <w:t xml:space="preserve"> (</w:t>
       </w:r>
-      <w:hyperlink r:id="rId11" w:history="1">
+      <w:hyperlink r:id="rId12" w:history="1">
         <w:r>
           <w:rPr>
-            <w:rStyle w:val="Hipervnculo"/>
+            <w:rStyle w:val="Hyperlink"/>
           </w:rPr>
           <w:t>https://www.amazon.es/gp/product/B078HM9L7X/ref=ppx_yo_dt_b_asin_title_o00_s00?ie=UTF8&amp;psc=1</w:t>
         </w:r>
@@ -200,11 +713,79 @@
         <w:t>): 2u 9,99€</w:t>
       </w:r>
     </w:p>
-    <w:p/>
     <w:p>
       <w:pPr>
-        <w:pStyle w:val="Ttulo2"/>
-      </w:pPr>
+        <w:pStyle w:val="Heading2"/>
+        <w:rPr>
+          <w:lang w:val="en-GB"/>
+        </w:rPr>
+      </w:pPr>
+      <w:bookmarkStart w:id="1" w:name="_Toc66527184"/>
+      <w:r>
+        <w:rPr>
+          <w:lang w:val="en-GB"/>
+        </w:rPr>
+        <w:lastRenderedPageBreak/>
+        <w:t>Arduino MKR 1010 config</w:t>
+      </w:r>
+      <w:bookmarkEnd w:id="1"/>
+    </w:p>
+    <w:p>
+      <w:pPr>
+        <w:pStyle w:val="Heading3"/>
+        <w:rPr>
+          <w:lang w:val="en-GB"/>
+        </w:rPr>
+      </w:pPr>
+      <w:bookmarkStart w:id="2" w:name="_Toc66527185"/>
+      <w:r>
+        <w:rPr>
+          <w:lang w:val="en-GB"/>
+        </w:rPr>
+        <w:t>WiFI Config</w:t>
+      </w:r>
+      <w:bookmarkEnd w:id="2"/>
+    </w:p>
+    <w:p>
+      <w:pPr>
+        <w:rPr>
+          <w:lang w:val="en-GB"/>
+        </w:rPr>
+      </w:pPr>
+      <w:r>
+        <w:rPr>
+          <w:lang w:val="en-GB"/>
+        </w:rPr>
+        <w:t>First Arduino IDE installation, add Arduino SAMD Core, add drivers and finish config (</w:t>
+      </w:r>
+      <w:hyperlink r:id="rId13" w:history="1">
+        <w:r>
+          <w:rPr>
+            <w:rStyle w:val="Hyperlink"/>
+            <w:lang w:val="en-GB"/>
+          </w:rPr>
+          <w:t>https://www.arduino.cc/en/Guide/MKRWiFi1010/</w:t>
+        </w:r>
+      </w:hyperlink>
+      <w:r>
+        <w:rPr>
+          <w:lang w:val="en-GB"/>
+        </w:rPr>
+        <w:t>)</w:t>
+      </w:r>
+    </w:p>
+    <w:p>
+      <w:pPr>
+        <w:rPr>
+          <w:lang w:val="en-GB"/>
+        </w:rPr>
+      </w:pPr>
+    </w:p>
+    <w:p>
+      <w:pPr>
+        <w:pStyle w:val="Heading2"/>
+      </w:pPr>
+      <w:bookmarkStart w:id="3" w:name="_Toc66527186"/>
       <w:r>
         <w:t>Matlab/</w:t>
       </w:r>
@@ -212,73 +793,42 @@
       <w:r>
         <w:t>Simulink</w:t>
       </w:r>
+      <w:bookmarkEnd w:id="3"/>
       <w:proofErr w:type="spellEnd"/>
     </w:p>
     <w:p>
       <w:pPr>
-        <w:pStyle w:val="Ttulo3"/>
-      </w:pPr>
+        <w:pStyle w:val="Heading3"/>
+      </w:pPr>
+      <w:bookmarkStart w:id="4" w:name="_Toc66527187"/>
       <w:proofErr w:type="spellStart"/>
       <w:r>
         <w:t>Packages</w:t>
       </w:r>
+      <w:bookmarkEnd w:id="4"/>
       <w:proofErr w:type="spellEnd"/>
-      <w:r>
-        <w:t>:</w:t>
-      </w:r>
     </w:p>
     <w:p>
       <w:pPr>
-        <w:pStyle w:val="Prrafodelista"/>
+        <w:pStyle w:val="ListParagraph"/>
         <w:numPr>
           <w:ilvl w:val="0"/>
           <w:numId w:val="2"/>
         </w:numPr>
-      </w:pPr>
-      <w:proofErr w:type="spellStart"/>
-      <w:r>
-        <w:t>Installation</w:t>
-      </w:r>
-      <w:proofErr w:type="spellEnd"/>
-      <w:r>
-        <w:t xml:space="preserve"> </w:t>
-      </w:r>
-      <w:proofErr w:type="spellStart"/>
-      <w:r>
-        <w:t>including</w:t>
-      </w:r>
-      <w:proofErr w:type="spellEnd"/>
-      <w:r>
-        <w:t xml:space="preserve"> </w:t>
-      </w:r>
-      <w:proofErr w:type="spellStart"/>
-      <w:r>
-        <w:t>all</w:t>
-      </w:r>
-      <w:proofErr w:type="spellEnd"/>
-      <w:r>
-        <w:t xml:space="preserve"> </w:t>
-      </w:r>
-      <w:proofErr w:type="spellStart"/>
-      <w:r>
-        <w:t>simulink</w:t>
-      </w:r>
-      <w:proofErr w:type="spellEnd"/>
-      <w:r>
-        <w:t xml:space="preserve"> </w:t>
-      </w:r>
-      <w:proofErr w:type="spellStart"/>
-      <w:r>
-        <w:t>components</w:t>
-      </w:r>
-      <w:proofErr w:type="spellEnd"/>
-      <w:r>
-        <w:t>.</w:t>
+        <w:rPr>
+          <w:lang w:val="en-GB"/>
+        </w:rPr>
+      </w:pPr>
+      <w:r>
+        <w:rPr>
+          <w:lang w:val="en-GB"/>
+        </w:rPr>
+        <w:t>Installation including all simulink components.</w:t>
       </w:r>
     </w:p>
     <w:p>
       <w:pPr>
-        <w:pStyle w:val="Prrafodelista"/>
+        <w:pStyle w:val="ListParagraph"/>
         <w:numPr>
           <w:ilvl w:val="0"/>
           <w:numId w:val="2"/>
@@ -303,7 +853,7 @@
     </w:p>
     <w:p>
       <w:pPr>
-        <w:pStyle w:val="Prrafodelista"/>
+        <w:pStyle w:val="ListParagraph"/>
         <w:numPr>
           <w:ilvl w:val="0"/>
           <w:numId w:val="2"/>
@@ -336,8 +886,9 @@
     </w:p>
     <w:p>
       <w:pPr>
-        <w:pStyle w:val="Ttulo3"/>
-      </w:pPr>
+        <w:pStyle w:val="Heading3"/>
+      </w:pPr>
+      <w:bookmarkStart w:id="5" w:name="_Toc66527188"/>
       <w:proofErr w:type="spellStart"/>
       <w:r>
         <w:t>Connection</w:t>
@@ -354,11 +905,12 @@
       <w:r>
         <w:t xml:space="preserve"> Arduino</w:t>
       </w:r>
+      <w:bookmarkEnd w:id="5"/>
     </w:p>
     <w:p/>
     <w:p>
       <w:pPr>
-        <w:pStyle w:val="Prrafodelista"/>
+        <w:pStyle w:val="ListParagraph"/>
       </w:pPr>
     </w:p>
     <w:p/>
@@ -1008,11 +1560,11 @@
     <w:name w:val="Normal"/>
     <w:qFormat/>
   </w:style>
-  <w:style w:type="paragraph" w:styleId="Ttulo1">
+  <w:style w:type="paragraph" w:styleId="Heading1">
     <w:name w:val="heading 1"/>
     <w:basedOn w:val="Normal"/>
     <w:next w:val="Normal"/>
-    <w:link w:val="Ttulo1Car"/>
+    <w:link w:val="Heading1Char"/>
     <w:uiPriority w:val="9"/>
     <w:qFormat/>
     <w:rsid w:val="00AF1E9C"/>
@@ -1029,11 +1581,11 @@
       <w:szCs w:val="32"/>
     </w:rPr>
   </w:style>
-  <w:style w:type="paragraph" w:styleId="Ttulo2">
+  <w:style w:type="paragraph" w:styleId="Heading2">
     <w:name w:val="heading 2"/>
     <w:basedOn w:val="Normal"/>
     <w:next w:val="Normal"/>
-    <w:link w:val="Ttulo2Car"/>
+    <w:link w:val="Heading2Char"/>
     <w:uiPriority w:val="9"/>
     <w:unhideWhenUsed/>
     <w:qFormat/>
@@ -1051,11 +1603,11 @@
       <w:szCs w:val="26"/>
     </w:rPr>
   </w:style>
-  <w:style w:type="paragraph" w:styleId="Ttulo3">
+  <w:style w:type="paragraph" w:styleId="Heading3">
     <w:name w:val="heading 3"/>
     <w:basedOn w:val="Normal"/>
     <w:next w:val="Normal"/>
-    <w:link w:val="Ttulo3Car"/>
+    <w:link w:val="Heading3Char"/>
     <w:uiPriority w:val="9"/>
     <w:unhideWhenUsed/>
     <w:qFormat/>
@@ -1073,13 +1625,13 @@
       <w:szCs w:val="24"/>
     </w:rPr>
   </w:style>
-  <w:style w:type="character" w:default="1" w:styleId="Fuentedeprrafopredeter">
+  <w:style w:type="character" w:default="1" w:styleId="DefaultParagraphFont">
     <w:name w:val="Default Paragraph Font"/>
     <w:uiPriority w:val="1"/>
     <w:semiHidden/>
     <w:unhideWhenUsed/>
   </w:style>
-  <w:style w:type="table" w:default="1" w:styleId="Tablanormal">
+  <w:style w:type="table" w:default="1" w:styleId="TableNormal">
     <w:name w:val="Normal Table"/>
     <w:uiPriority w:val="99"/>
     <w:semiHidden/>
@@ -1094,16 +1646,16 @@
       </w:tblCellMar>
     </w:tblPr>
   </w:style>
-  <w:style w:type="numbering" w:default="1" w:styleId="Sinlista">
+  <w:style w:type="numbering" w:default="1" w:styleId="NoList">
     <w:name w:val="No List"/>
     <w:uiPriority w:val="99"/>
     <w:semiHidden/>
     <w:unhideWhenUsed/>
   </w:style>
-  <w:style w:type="character" w:customStyle="1" w:styleId="Ttulo1Car">
-    <w:name w:val="Título 1 Car"/>
-    <w:basedOn w:val="Fuentedeprrafopredeter"/>
-    <w:link w:val="Ttulo1"/>
+  <w:style w:type="character" w:customStyle="1" w:styleId="Heading1Char">
+    <w:name w:val="Heading 1 Char"/>
+    <w:basedOn w:val="DefaultParagraphFont"/>
+    <w:link w:val="Heading1"/>
     <w:uiPriority w:val="9"/>
     <w:rsid w:val="00AF1E9C"/>
     <w:rPr>
@@ -1113,10 +1665,10 @@
       <w:szCs w:val="32"/>
     </w:rPr>
   </w:style>
-  <w:style w:type="character" w:customStyle="1" w:styleId="Ttulo2Car">
-    <w:name w:val="Título 2 Car"/>
-    <w:basedOn w:val="Fuentedeprrafopredeter"/>
-    <w:link w:val="Ttulo2"/>
+  <w:style w:type="character" w:customStyle="1" w:styleId="Heading2Char">
+    <w:name w:val="Heading 2 Char"/>
+    <w:basedOn w:val="DefaultParagraphFont"/>
+    <w:link w:val="Heading2"/>
     <w:uiPriority w:val="9"/>
     <w:rsid w:val="00AF1E9C"/>
     <w:rPr>
@@ -1126,9 +1678,9 @@
       <w:szCs w:val="26"/>
     </w:rPr>
   </w:style>
-  <w:style w:type="character" w:styleId="Hipervnculo">
+  <w:style w:type="character" w:styleId="Hyperlink">
     <w:name w:val="Hyperlink"/>
-    <w:basedOn w:val="Fuentedeprrafopredeter"/>
+    <w:basedOn w:val="DefaultParagraphFont"/>
     <w:uiPriority w:val="99"/>
     <w:unhideWhenUsed/>
     <w:rsid w:val="00AF1E9C"/>
@@ -1137,9 +1689,9 @@
       <w:u w:val="single"/>
     </w:rPr>
   </w:style>
-  <w:style w:type="character" w:styleId="Mencinsinresolver">
+  <w:style w:type="character" w:styleId="UnresolvedMention">
     <w:name w:val="Unresolved Mention"/>
-    <w:basedOn w:val="Fuentedeprrafopredeter"/>
+    <w:basedOn w:val="DefaultParagraphFont"/>
     <w:uiPriority w:val="99"/>
     <w:semiHidden/>
     <w:unhideWhenUsed/>
@@ -1149,7 +1701,7 @@
       <w:shd w:val="clear" w:color="auto" w:fill="E1DFDD"/>
     </w:rPr>
   </w:style>
-  <w:style w:type="paragraph" w:styleId="Prrafodelista">
+  <w:style w:type="paragraph" w:styleId="ListParagraph">
     <w:name w:val="List Paragraph"/>
     <w:basedOn w:val="Normal"/>
     <w:uiPriority w:val="34"/>
@@ -1160,10 +1712,10 @@
       <w:contextualSpacing/>
     </w:pPr>
   </w:style>
-  <w:style w:type="character" w:customStyle="1" w:styleId="Ttulo3Car">
-    <w:name w:val="Título 3 Car"/>
-    <w:basedOn w:val="Fuentedeprrafopredeter"/>
-    <w:link w:val="Ttulo3"/>
+  <w:style w:type="character" w:customStyle="1" w:styleId="Heading3Char">
+    <w:name w:val="Heading 3 Char"/>
+    <w:basedOn w:val="DefaultParagraphFont"/>
+    <w:link w:val="Heading3"/>
     <w:uiPriority w:val="9"/>
     <w:rsid w:val="00701EF7"/>
     <w:rPr>
@@ -1172,6 +1724,81 @@
       <w:sz w:val="24"/>
       <w:szCs w:val="24"/>
     </w:rPr>
+  </w:style>
+  <w:style w:type="paragraph" w:styleId="Title">
+    <w:name w:val="Title"/>
+    <w:basedOn w:val="Normal"/>
+    <w:next w:val="Normal"/>
+    <w:link w:val="TitleChar"/>
+    <w:uiPriority w:val="10"/>
+    <w:qFormat/>
+    <w:rsid w:val="00A25112"/>
+    <w:pPr>
+      <w:spacing w:after="0" w:line="240" w:lineRule="auto"/>
+      <w:contextualSpacing/>
+    </w:pPr>
+    <w:rPr>
+      <w:rFonts w:asciiTheme="majorHAnsi" w:eastAsiaTheme="majorEastAsia" w:hAnsiTheme="majorHAnsi" w:cstheme="majorBidi"/>
+      <w:spacing w:val="-10"/>
+      <w:kern w:val="28"/>
+      <w:sz w:val="56"/>
+      <w:szCs w:val="56"/>
+    </w:rPr>
+  </w:style>
+  <w:style w:type="character" w:customStyle="1" w:styleId="TitleChar">
+    <w:name w:val="Title Char"/>
+    <w:basedOn w:val="DefaultParagraphFont"/>
+    <w:link w:val="Title"/>
+    <w:uiPriority w:val="10"/>
+    <w:rsid w:val="00A25112"/>
+    <w:rPr>
+      <w:rFonts w:asciiTheme="majorHAnsi" w:eastAsiaTheme="majorEastAsia" w:hAnsiTheme="majorHAnsi" w:cstheme="majorBidi"/>
+      <w:spacing w:val="-10"/>
+      <w:kern w:val="28"/>
+      <w:sz w:val="56"/>
+      <w:szCs w:val="56"/>
+    </w:rPr>
+  </w:style>
+  <w:style w:type="paragraph" w:styleId="TOCHeading">
+    <w:name w:val="TOC Heading"/>
+    <w:basedOn w:val="Heading1"/>
+    <w:next w:val="Normal"/>
+    <w:uiPriority w:val="39"/>
+    <w:unhideWhenUsed/>
+    <w:qFormat/>
+    <w:rsid w:val="00A25112"/>
+    <w:pPr>
+      <w:outlineLvl w:val="9"/>
+    </w:pPr>
+    <w:rPr>
+      <w:lang w:eastAsia="es-ES"/>
+    </w:rPr>
+  </w:style>
+  <w:style w:type="paragraph" w:styleId="TOC2">
+    <w:name w:val="toc 2"/>
+    <w:basedOn w:val="Normal"/>
+    <w:next w:val="Normal"/>
+    <w:autoRedefine/>
+    <w:uiPriority w:val="39"/>
+    <w:unhideWhenUsed/>
+    <w:rsid w:val="00A25112"/>
+    <w:pPr>
+      <w:spacing w:after="100"/>
+      <w:ind w:left="220"/>
+    </w:pPr>
+  </w:style>
+  <w:style w:type="paragraph" w:styleId="TOC3">
+    <w:name w:val="toc 3"/>
+    <w:basedOn w:val="Normal"/>
+    <w:next w:val="Normal"/>
+    <w:autoRedefine/>
+    <w:uiPriority w:val="39"/>
+    <w:unhideWhenUsed/>
+    <w:rsid w:val="00A25112"/>
+    <w:pPr>
+      <w:spacing w:after="100"/>
+      <w:ind w:left="440"/>
+    </w:pPr>
   </w:style>
 </w:styles>
 </file>
@@ -1469,4 +2096,16 @@
     </a:ext>
   </a:extLst>
 </a:theme>
+</file>
+
+<file path=customXml/item1.xml><?xml version="1.0" encoding="utf-8"?>
+<b:Sources xmlns:b="http://schemas.openxmlformats.org/officeDocument/2006/bibliography" xmlns="http://schemas.openxmlformats.org/officeDocument/2006/bibliography" SelectedStyle="\APASixthEditionOfficeOnline.xsl" StyleName="APA" Version="6"/>
+</file>
+
+<file path=customXml/itemProps1.xml><?xml version="1.0" encoding="utf-8"?>
+<ds:datastoreItem xmlns:ds="http://schemas.openxmlformats.org/officeDocument/2006/customXml" ds:itemID="{36376837-F33B-427F-8D83-C113DE7E32E8}">
+  <ds:schemaRefs>
+    <ds:schemaRef ds:uri="http://schemas.openxmlformats.org/officeDocument/2006/bibliography"/>
+  </ds:schemaRefs>
+</ds:datastoreItem>
 </file>
</xml_diff>

<commit_message>
New method for publishing data
</commit_message>
<xml_diff>
--- a/Documentation/General/Notes.docx
+++ b/Documentation/General/Notes.docx
@@ -37,11 +37,9 @@
           <w:pPr>
             <w:pStyle w:val="TOCHeading"/>
           </w:pPr>
-          <w:proofErr w:type="spellStart"/>
           <w:r>
             <w:t>Contents</w:t>
           </w:r>
-          <w:proofErr w:type="spellEnd"/>
         </w:p>
         <w:p>
           <w:pPr>
@@ -517,7 +515,7 @@
         </w:rPr>
         <w:t>Arduino MKR 1010 Wifi (</w:t>
       </w:r>
-      <w:hyperlink r:id="rId6" w:history="1">
+      <w:hyperlink r:id="rId9" w:history="1">
         <w:r>
           <w:rPr>
             <w:rStyle w:val="Hyperlink"/>
@@ -534,13 +532,8 @@
       </w:r>
     </w:p>
     <w:p>
-      <w:proofErr w:type="spellStart"/>
-      <w:r>
-        <w:t>Sensors</w:t>
-      </w:r>
-      <w:proofErr w:type="spellEnd"/>
-      <w:r>
-        <w:t>:</w:t>
+      <w:r>
+        <w:t>Sensors:</w:t>
       </w:r>
     </w:p>
     <w:p>
@@ -560,7 +553,7 @@
         </w:rPr>
         <w:t>Rain (</w:t>
       </w:r>
-      <w:hyperlink r:id="rId7" w:history="1">
+      <w:hyperlink r:id="rId10" w:history="1">
         <w:r>
           <w:rPr>
             <w:rStyle w:val="Hyperlink"/>
@@ -593,7 +586,7 @@
         </w:rPr>
         <w:t>Light (</w:t>
       </w:r>
-      <w:hyperlink r:id="rId8" w:history="1">
+      <w:hyperlink r:id="rId11" w:history="1">
         <w:r>
           <w:rPr>
             <w:rStyle w:val="Hyperlink"/>
@@ -617,15 +610,10 @@
           <w:numId w:val="1"/>
         </w:numPr>
       </w:pPr>
-      <w:proofErr w:type="spellStart"/>
-      <w:r>
-        <w:t>Temperature</w:t>
-      </w:r>
-      <w:proofErr w:type="spellEnd"/>
-      <w:r>
-        <w:t xml:space="preserve"> (</w:t>
-      </w:r>
-      <w:hyperlink r:id="rId9" w:history="1">
+      <w:r>
+        <w:t>Temperature (</w:t>
+      </w:r>
+      <w:hyperlink r:id="rId12" w:history="1">
         <w:r>
           <w:rPr>
             <w:rStyle w:val="Hyperlink"/>
@@ -645,23 +633,10 @@
           <w:numId w:val="1"/>
         </w:numPr>
       </w:pPr>
-      <w:proofErr w:type="spellStart"/>
-      <w:r>
-        <w:t>Soil</w:t>
-      </w:r>
-      <w:proofErr w:type="spellEnd"/>
-      <w:r>
-        <w:t xml:space="preserve"> </w:t>
-      </w:r>
-      <w:proofErr w:type="spellStart"/>
-      <w:r>
-        <w:t>moisture</w:t>
-      </w:r>
-      <w:proofErr w:type="spellEnd"/>
-      <w:r>
-        <w:t xml:space="preserve"> (</w:t>
-      </w:r>
-      <w:hyperlink r:id="rId10" w:history="1">
+      <w:r>
+        <w:t>Soil moisture (</w:t>
+      </w:r>
+      <w:hyperlink r:id="rId13" w:history="1">
         <w:r>
           <w:rPr>
             <w:rStyle w:val="Hyperlink"/>
@@ -677,7 +652,7 @@
       <w:r>
         <w:t>Arduino kit (</w:t>
       </w:r>
-      <w:hyperlink r:id="rId11" w:history="1">
+      <w:hyperlink r:id="rId14" w:history="1">
         <w:r>
           <w:rPr>
             <w:rStyle w:val="Hyperlink"/>
@@ -691,17 +666,9 @@
     </w:p>
     <w:p>
       <w:r>
-        <w:t xml:space="preserve">Arduino </w:t>
-      </w:r>
-      <w:proofErr w:type="spellStart"/>
-      <w:r>
-        <w:t>batteries</w:t>
-      </w:r>
-      <w:proofErr w:type="spellEnd"/>
-      <w:r>
-        <w:t xml:space="preserve"> (</w:t>
-      </w:r>
-      <w:hyperlink r:id="rId12" w:history="1">
+        <w:t>Arduino batteries (</w:t>
+      </w:r>
+      <w:hyperlink r:id="rId15" w:history="1">
         <w:r>
           <w:rPr>
             <w:rStyle w:val="Hyperlink"/>
@@ -742,7 +709,13 @@
         <w:rPr>
           <w:lang w:val="en-GB"/>
         </w:rPr>
-        <w:t>WiFI Config</w:t>
+        <w:t>Initial</w:t>
+      </w:r>
+      <w:r>
+        <w:rPr>
+          <w:lang w:val="en-GB"/>
+        </w:rPr>
+        <w:t xml:space="preserve"> Config</w:t>
       </w:r>
       <w:bookmarkEnd w:id="2"/>
     </w:p>
@@ -758,7 +731,7 @@
         </w:rPr>
         <w:t>First Arduino IDE installation, add Arduino SAMD Core, add drivers and finish config (</w:t>
       </w:r>
-      <w:hyperlink r:id="rId13" w:history="1">
+      <w:hyperlink r:id="rId16" w:history="1">
         <w:r>
           <w:rPr>
             <w:rStyle w:val="Hyperlink"/>
@@ -776,37 +749,522 @@
     </w:p>
     <w:p>
       <w:pPr>
-        <w:rPr>
-          <w:lang w:val="en-GB"/>
-        </w:rPr>
-      </w:pPr>
+        <w:pStyle w:val="Heading3"/>
+        <w:rPr>
+          <w:lang w:val="en-GB"/>
+        </w:rPr>
+      </w:pPr>
+      <w:r>
+        <w:rPr>
+          <w:lang w:val="en-GB"/>
+        </w:rPr>
+        <w:t>Tutorials</w:t>
+      </w:r>
+    </w:p>
+    <w:p>
+      <w:pPr>
+        <w:pStyle w:val="ListParagraph"/>
+        <w:numPr>
+          <w:ilvl w:val="0"/>
+          <w:numId w:val="3"/>
+        </w:numPr>
+        <w:rPr>
+          <w:lang w:val="en-GB"/>
+        </w:rPr>
+      </w:pPr>
+      <w:r>
+        <w:rPr>
+          <w:lang w:val="en-GB"/>
+        </w:rPr>
+        <w:t>Connecting MKR WiFi 1010 to a Wi-Fi network</w:t>
+      </w:r>
+      <w:r>
+        <w:rPr>
+          <w:lang w:val="en-GB"/>
+        </w:rPr>
+        <w:t xml:space="preserve"> </w:t>
+      </w:r>
+      <w:r>
+        <w:rPr>
+          <w:color w:val="70AD47" w:themeColor="accent6"/>
+          <w:lang w:val="en-GB"/>
+        </w:rPr>
+        <w:t xml:space="preserve">DONE </w:t>
+      </w:r>
+      <w:r>
+        <w:rPr>
+          <w:lang w:val="en-GB"/>
+        </w:rPr>
+        <w:t>(</w:t>
+      </w:r>
+      <w:hyperlink r:id="rId17" w:history="1">
+        <w:r>
+          <w:rPr>
+            <w:rStyle w:val="Hyperlink"/>
+            <w:lang w:val="en-GB"/>
+          </w:rPr>
+          <w:t>https://www.arduino.cc/en/Guide/MKRWiFi1010/connecting-to-wifi-network/</w:t>
+        </w:r>
+      </w:hyperlink>
+      <w:r>
+        <w:rPr>
+          <w:lang w:val="en-GB"/>
+        </w:rPr>
+        <w:t xml:space="preserve">) </w:t>
+      </w:r>
+    </w:p>
+    <w:p>
+      <w:pPr>
+        <w:pStyle w:val="ListParagraph"/>
+        <w:numPr>
+          <w:ilvl w:val="0"/>
+          <w:numId w:val="3"/>
+        </w:numPr>
+        <w:rPr>
+          <w:lang w:val="en-GB"/>
+        </w:rPr>
+      </w:pPr>
+      <w:r>
+        <w:rPr>
+          <w:lang w:val="en-GB"/>
+        </w:rPr>
+        <w:t>Powering MKR WiFi 1010 with batteries</w:t>
+      </w:r>
+      <w:r>
+        <w:rPr>
+          <w:lang w:val="en-GB"/>
+        </w:rPr>
+        <w:t xml:space="preserve"> (</w:t>
+      </w:r>
+      <w:hyperlink r:id="rId18" w:history="1">
+        <w:r>
+          <w:rPr>
+            <w:rStyle w:val="Hyperlink"/>
+            <w:lang w:val="en-GB"/>
+          </w:rPr>
+          <w:t>https://www.arduino.cc/en/Guide/MKRWiFi1010/powering-with-batteries/</w:t>
+        </w:r>
+      </w:hyperlink>
+      <w:r>
+        <w:rPr>
+          <w:lang w:val="en-GB"/>
+        </w:rPr>
+        <w:t>)</w:t>
+      </w:r>
+    </w:p>
+    <w:p>
+      <w:pPr>
+        <w:pStyle w:val="ListParagraph"/>
+        <w:numPr>
+          <w:ilvl w:val="0"/>
+          <w:numId w:val="3"/>
+        </w:numPr>
+        <w:rPr>
+          <w:lang w:val="en-GB"/>
+        </w:rPr>
+      </w:pPr>
+      <w:r>
+        <w:rPr>
+          <w:lang w:val="en-GB"/>
+        </w:rPr>
+        <w:t>Host a web server on the MKR WiFi 1010</w:t>
+      </w:r>
+      <w:r>
+        <w:rPr>
+          <w:lang w:val="en-GB"/>
+        </w:rPr>
+        <w:t xml:space="preserve"> (</w:t>
+      </w:r>
+      <w:hyperlink r:id="rId19" w:history="1">
+        <w:r>
+          <w:rPr>
+            <w:rStyle w:val="Hyperlink"/>
+            <w:lang w:val="en-GB"/>
+          </w:rPr>
+          <w:t>https://www.arduino.cc/en/Guide/MKRWiFi1010/hosting-a-webserver/</w:t>
+        </w:r>
+      </w:hyperlink>
+      <w:r>
+        <w:rPr>
+          <w:lang w:val="en-GB"/>
+        </w:rPr>
+        <w:t>)</w:t>
+      </w:r>
+    </w:p>
+    <w:p>
+      <w:pPr>
+        <w:pStyle w:val="ListParagraph"/>
+        <w:numPr>
+          <w:ilvl w:val="0"/>
+          <w:numId w:val="3"/>
+        </w:numPr>
+        <w:rPr>
+          <w:lang w:val="en-GB"/>
+        </w:rPr>
+      </w:pPr>
+      <w:r>
+        <w:rPr>
+          <w:lang w:val="en-GB"/>
+        </w:rPr>
+        <w:t>How to connect sensors to the MKR WiFi 1010</w:t>
+      </w:r>
+      <w:r>
+        <w:rPr>
+          <w:lang w:val="en-GB"/>
+        </w:rPr>
+        <w:t xml:space="preserve"> (</w:t>
+      </w:r>
+      <w:hyperlink r:id="rId20" w:history="1">
+        <w:r>
+          <w:rPr>
+            <w:rStyle w:val="Hyperlink"/>
+            <w:lang w:val="en-GB"/>
+          </w:rPr>
+          <w:t>https://www.arduino.cc/en/Guide/MKRWiFi1010/connecting-sensors/</w:t>
+        </w:r>
+      </w:hyperlink>
+      <w:r>
+        <w:rPr>
+          <w:lang w:val="en-GB"/>
+        </w:rPr>
+        <w:t xml:space="preserve">) </w:t>
+      </w:r>
+    </w:p>
+    <w:p>
+      <w:pPr>
+        <w:pStyle w:val="ListParagraph"/>
+        <w:numPr>
+          <w:ilvl w:val="0"/>
+          <w:numId w:val="3"/>
+        </w:numPr>
+        <w:rPr>
+          <w:lang w:val="en-GB"/>
+        </w:rPr>
+      </w:pPr>
+      <w:r>
+        <w:rPr>
+          <w:lang w:val="en-GB"/>
+        </w:rPr>
+        <w:t>How to detect MAC address for Arduino (</w:t>
+      </w:r>
+      <w:hyperlink r:id="rId21" w:history="1">
+        <w:r>
+          <w:rPr>
+            <w:rStyle w:val="Hyperlink"/>
+            <w:lang w:val="en-GB"/>
+          </w:rPr>
+          <w:t>https://www.arduino.cc/en/Reference/WiFiNINAScanNetworks</w:t>
+        </w:r>
+      </w:hyperlink>
+      <w:r>
+        <w:rPr>
+          <w:lang w:val="en-GB"/>
+        </w:rPr>
+        <w:t>)</w:t>
+      </w:r>
+    </w:p>
+    <w:p>
+      <w:pPr>
+        <w:pStyle w:val="ListParagraph"/>
+        <w:numPr>
+          <w:ilvl w:val="0"/>
+          <w:numId w:val="3"/>
+        </w:numPr>
+        <w:rPr>
+          <w:lang w:val="en-GB"/>
+        </w:rPr>
+      </w:pPr>
+      <w:r>
+        <w:rPr>
+          <w:lang w:val="en-GB"/>
+        </w:rPr>
+        <w:t>Give static IP address to the board (</w:t>
+      </w:r>
+      <w:hyperlink r:id="rId22" w:history="1">
+        <w:r>
+          <w:rPr>
+            <w:rStyle w:val="Hyperlink"/>
+            <w:lang w:val="en-GB"/>
+          </w:rPr>
+          <w:t>https://www.arduino.cc/en/Reference/WiFiConfig</w:t>
+        </w:r>
+      </w:hyperlink>
+      <w:r>
+        <w:rPr>
+          <w:lang w:val="en-GB"/>
+        </w:rPr>
+        <w:t>)</w:t>
+      </w:r>
+    </w:p>
+    <w:p>
+      <w:pPr>
+        <w:pStyle w:val="ListParagraph"/>
+        <w:numPr>
+          <w:ilvl w:val="0"/>
+          <w:numId w:val="3"/>
+        </w:numPr>
+        <w:rPr>
+          <w:lang w:val="en-GB"/>
+        </w:rPr>
+      </w:pPr>
+      <w:r>
+        <w:rPr>
+          <w:lang w:val="en-GB"/>
+        </w:rPr>
+        <w:t>Getting started with Arduino hardware in Simulink (</w:t>
+      </w:r>
+      <w:hyperlink r:id="rId23" w:history="1">
+        <w:r>
+          <w:rPr>
+            <w:rStyle w:val="Hyperlink"/>
+            <w:lang w:val="en-GB"/>
+          </w:rPr>
+          <w:t>https://es.mathworks.com/help/supportpkg/arduino/ref/getting-started-with-arduino-hardware.html</w:t>
+        </w:r>
+      </w:hyperlink>
+      <w:r>
+        <w:rPr>
+          <w:lang w:val="en-GB"/>
+        </w:rPr>
+        <w:t xml:space="preserve">) </w:t>
+      </w:r>
+    </w:p>
+    <w:p>
+      <w:pPr>
+        <w:pStyle w:val="ListParagraph"/>
+        <w:numPr>
+          <w:ilvl w:val="0"/>
+          <w:numId w:val="3"/>
+        </w:numPr>
+        <w:rPr>
+          <w:lang w:val="en-GB"/>
+        </w:rPr>
+      </w:pPr>
+      <w:r>
+        <w:rPr>
+          <w:lang w:val="en-GB"/>
+        </w:rPr>
+        <w:t>Arduino based watering plants (</w:t>
+      </w:r>
+      <w:hyperlink r:id="rId24" w:history="1">
+        <w:r>
+          <w:rPr>
+            <w:rStyle w:val="Hyperlink"/>
+            <w:lang w:val="en-GB"/>
+          </w:rPr>
+          <w:t>https://es.mathworks.com/help/supportpkg/arduino/ref/arduino-based-smart-watering-of-plants.html</w:t>
+        </w:r>
+      </w:hyperlink>
+      <w:r>
+        <w:rPr>
+          <w:lang w:val="en-GB"/>
+        </w:rPr>
+        <w:t xml:space="preserve">) </w:t>
+      </w:r>
+    </w:p>
+    <w:p>
+      <w:pPr>
+        <w:pStyle w:val="Heading3"/>
+        <w:rPr>
+          <w:lang w:val="en-GB"/>
+        </w:rPr>
+      </w:pPr>
+      <w:r>
+        <w:rPr>
+          <w:lang w:val="en-GB"/>
+        </w:rPr>
+        <w:t>Connect to WiFi mobile net</w:t>
+      </w:r>
+      <w:r>
+        <w:rPr>
+          <w:lang w:val="en-GB"/>
+        </w:rPr>
+        <w:t>, send to ThingSpeak</w:t>
+      </w:r>
+    </w:p>
+    <w:p>
+      <w:pPr>
+        <w:rPr>
+          <w:lang w:val="en-GB"/>
+        </w:rPr>
+      </w:pPr>
+      <w:r>
+        <w:rPr>
+          <w:lang w:val="en-GB"/>
+        </w:rPr>
+        <w:t xml:space="preserve">Configure MatLab for recognizing </w:t>
+      </w:r>
+      <w:r>
+        <w:rPr>
+          <w:lang w:val="en-GB"/>
+        </w:rPr>
+        <w:t xml:space="preserve">this specific board in USB mode. </w:t>
+      </w:r>
+      <w:r>
+        <w:rPr>
+          <w:lang w:val="en-GB"/>
+        </w:rPr>
+        <w:t>Simluation -&gt; Model Settings -&gt; Hardware (Select board, and configure WiFi)</w:t>
+      </w:r>
+    </w:p>
+    <w:p>
+      <w:pPr>
+        <w:rPr>
+          <w:lang w:val="en-GB"/>
+        </w:rPr>
+      </w:pPr>
+      <w:r>
+        <w:rPr>
+          <w:lang w:val="en-GB"/>
+        </w:rPr>
+        <w:t>Set ThingSpeak channel</w:t>
+      </w:r>
+    </w:p>
+    <w:p>
+      <w:pPr>
+        <w:rPr>
+          <w:lang w:val="en-GB"/>
+        </w:rPr>
+      </w:pPr>
+      <w:r>
+        <w:rPr>
+          <w:lang w:val="en-GB"/>
+        </w:rPr>
+        <w:t>Sdlrtkernet -setup</w:t>
+      </w:r>
+    </w:p>
+    <w:p>
+      <w:pPr>
+        <w:rPr>
+          <w:lang w:val="en-GB"/>
+        </w:rPr>
+      </w:pPr>
+      <w:r>
+        <w:rPr>
+          <w:lang w:val="en-GB"/>
+        </w:rPr>
+        <w:t>Configure Analog out (soil moisture) to ThingSpeak write</w:t>
+      </w:r>
+      <w:r>
+        <w:rPr>
+          <w:lang w:val="en-GB"/>
+        </w:rPr>
+        <w:t xml:space="preserve"> (standard Thingspeak write is working but cannot be integrated in Arduino, just simulation, Arduino specific Thingspeak write is sending 0 always as the value </w:t>
+      </w:r>
+      <w:hyperlink r:id="rId25" w:history="1">
+        <w:r>
+          <w:rPr>
+            <w:rStyle w:val="Hyperlink"/>
+            <w:lang w:val="en-GB"/>
+          </w:rPr>
+          <w:t>https://es.mathworks.com/help/supp</w:t>
+        </w:r>
+        <w:r>
+          <w:rPr>
+            <w:rStyle w:val="Hyperlink"/>
+            <w:lang w:val="en-GB"/>
+          </w:rPr>
+          <w:t>ortpkg/arduino/ref/wifithingspeakwrite.html</w:t>
+        </w:r>
+      </w:hyperlink>
+      <w:r>
+        <w:rPr>
+          <w:lang w:val="en-GB"/>
+        </w:rPr>
+        <w:t xml:space="preserve"> even that they have the same values) </w:t>
+      </w:r>
+    </w:p>
+    <w:p>
+      <w:pPr>
+        <w:rPr>
+          <w:lang w:val="en-GB"/>
+        </w:rPr>
+      </w:pPr>
+      <w:r>
+        <w:rPr>
+          <w:lang w:val="en-GB"/>
+        </w:rPr>
+        <w:t>Finally using a library (</w:t>
+      </w:r>
+      <w:hyperlink r:id="rId26" w:history="1">
+        <w:r>
+          <w:rPr>
+            <w:rStyle w:val="Hyperlink"/>
+            <w:lang w:val="en-GB"/>
+          </w:rPr>
+          <w:t>https://github.com/mathworks/thingspeak-arduino</w:t>
+        </w:r>
+      </w:hyperlink>
+      <w:r>
+        <w:rPr>
+          <w:lang w:val="en-GB"/>
+        </w:rPr>
+        <w:t>) created by MathWorks that permits writing and reading from ThingSpeak through the Arduino IDE I get a program that publish there correctly.</w:t>
+      </w:r>
+      <w:r>
+        <w:rPr>
+          <w:lang w:val="en-GB"/>
+        </w:rPr>
+        <w:t xml:space="preserve"> After installing ThingSpeak library in the IDE.</w:t>
+      </w:r>
+    </w:p>
+    <w:p>
+      <w:pPr>
+        <w:rPr>
+          <w:lang w:val="en-GB"/>
+        </w:rPr>
+      </w:pPr>
+      <w:r>
+        <w:rPr>
+          <w:lang w:val="en-GB"/>
+        </w:rPr>
+        <w:t>Now I’m publishing correctly in the channel, but if the board is running on batteries, it’s not working, so I’m in the same situation as before but with a more complicated code than Simulink.</w:t>
+      </w:r>
+    </w:p>
+    <w:p>
+      <w:pPr>
+        <w:rPr>
+          <w:lang w:val="en-GB"/>
+        </w:rPr>
+      </w:pPr>
+      <w:r>
+        <w:rPr>
+          <w:lang w:val="en-GB"/>
+        </w:rPr>
+        <w:t>Modified part of the code, now is running on batteries correctly.</w:t>
+      </w:r>
     </w:p>
     <w:p>
       <w:pPr>
         <w:pStyle w:val="Heading2"/>
+        <w:rPr>
+          <w:lang w:val="en-GB"/>
+        </w:rPr>
       </w:pPr>
       <w:bookmarkStart w:id="3" w:name="_Toc66527186"/>
       <w:r>
-        <w:t>Matlab/</w:t>
-      </w:r>
-      <w:proofErr w:type="spellStart"/>
-      <w:r>
-        <w:t>Simulink</w:t>
+        <w:rPr>
+          <w:lang w:val="en-GB"/>
+        </w:rPr>
+        <w:t>Matlab/Simulink</w:t>
       </w:r>
       <w:bookmarkEnd w:id="3"/>
-      <w:proofErr w:type="spellEnd"/>
     </w:p>
     <w:p>
       <w:pPr>
         <w:pStyle w:val="Heading3"/>
+        <w:rPr>
+          <w:lang w:val="en-GB"/>
+        </w:rPr>
       </w:pPr>
       <w:bookmarkStart w:id="4" w:name="_Toc66527187"/>
-      <w:proofErr w:type="spellStart"/>
-      <w:r>
+      <w:r>
+        <w:rPr>
+          <w:lang w:val="en-GB"/>
+        </w:rPr>
         <w:t>Packages</w:t>
       </w:r>
       <w:bookmarkEnd w:id="4"/>
-      <w:proofErr w:type="spellEnd"/>
     </w:p>
     <w:p>
       <w:pPr>
@@ -834,21 +1292,9 @@
           <w:numId w:val="2"/>
         </w:numPr>
       </w:pPr>
-      <w:proofErr w:type="spellStart"/>
-      <w:r>
-        <w:t>MinGW</w:t>
-      </w:r>
-      <w:proofErr w:type="spellEnd"/>
-      <w:r>
-        <w:t xml:space="preserve"> (C/C++ </w:t>
-      </w:r>
-      <w:proofErr w:type="spellStart"/>
-      <w:r>
-        <w:t>compiler</w:t>
-      </w:r>
-      <w:proofErr w:type="spellEnd"/>
-      <w:r>
-        <w:t>)</w:t>
+      <w:r>
+        <w:lastRenderedPageBreak/>
+        <w:t>MinGW (C/C++ compiler)</w:t>
       </w:r>
     </w:p>
     <w:p>
@@ -859,29 +1305,32 @@
           <w:numId w:val="2"/>
         </w:numPr>
       </w:pPr>
-      <w:proofErr w:type="spellStart"/>
-      <w:r>
-        <w:t>Support</w:t>
-      </w:r>
-      <w:proofErr w:type="spellEnd"/>
-      <w:r>
-        <w:t xml:space="preserve"> </w:t>
-      </w:r>
-      <w:proofErr w:type="spellStart"/>
-      <w:r>
-        <w:t>Package</w:t>
-      </w:r>
-      <w:proofErr w:type="spellEnd"/>
-      <w:r>
-        <w:t xml:space="preserve"> </w:t>
-      </w:r>
-      <w:proofErr w:type="spellStart"/>
-      <w:r>
-        <w:t>for</w:t>
-      </w:r>
-      <w:proofErr w:type="spellEnd"/>
-      <w:r>
-        <w:t xml:space="preserve"> Arduino</w:t>
+      <w:r>
+        <w:t>Support Package for Arduino</w:t>
+      </w:r>
+    </w:p>
+    <w:p>
+      <w:pPr>
+        <w:pStyle w:val="ListParagraph"/>
+        <w:numPr>
+          <w:ilvl w:val="0"/>
+          <w:numId w:val="2"/>
+        </w:numPr>
+        <w:rPr>
+          <w:lang w:val="en-GB"/>
+        </w:rPr>
+      </w:pPr>
+      <w:r>
+        <w:rPr>
+          <w:lang w:val="en-GB"/>
+        </w:rPr>
+        <w:t>Simulink Support Package for A</w:t>
+      </w:r>
+      <w:r>
+        <w:rPr>
+          <w:lang w:val="en-GB"/>
+        </w:rPr>
+        <w:t>rduino Hardware</w:t>
       </w:r>
     </w:p>
     <w:p>
@@ -889,21 +1338,8 @@
         <w:pStyle w:val="Heading3"/>
       </w:pPr>
       <w:bookmarkStart w:id="5" w:name="_Toc66527188"/>
-      <w:proofErr w:type="spellStart"/>
-      <w:r>
-        <w:t>Connection</w:t>
-      </w:r>
-      <w:proofErr w:type="spellEnd"/>
-      <w:r>
-        <w:t xml:space="preserve"> </w:t>
-      </w:r>
-      <w:proofErr w:type="spellStart"/>
-      <w:r>
-        <w:t>with</w:t>
-      </w:r>
-      <w:proofErr w:type="spellEnd"/>
-      <w:r>
-        <w:t xml:space="preserve"> Arduino</w:t>
+      <w:r>
+        <w:t>Connection with Arduino</w:t>
       </w:r>
       <w:bookmarkEnd w:id="5"/>
     </w:p>
@@ -1152,11 +1588,127 @@
       </w:rPr>
     </w:lvl>
   </w:abstractNum>
+  <w:abstractNum w:abstractNumId="2" w15:restartNumberingAfterBreak="0">
+    <w:nsid w:val="15D11D21"/>
+    <w:multiLevelType w:val="hybridMultilevel"/>
+    <w:tmpl w:val="85385C58"/>
+    <w:lvl w:ilvl="0" w:tplc="08090001">
+      <w:start w:val="1"/>
+      <w:numFmt w:val="bullet"/>
+      <w:lvlText w:val=""/>
+      <w:lvlJc w:val="left"/>
+      <w:pPr>
+        <w:ind w:left="720" w:hanging="360"/>
+      </w:pPr>
+      <w:rPr>
+        <w:rFonts w:ascii="Symbol" w:hAnsi="Symbol" w:hint="default"/>
+      </w:rPr>
+    </w:lvl>
+    <w:lvl w:ilvl="1" w:tplc="08090003" w:tentative="1">
+      <w:start w:val="1"/>
+      <w:numFmt w:val="bullet"/>
+      <w:lvlText w:val="o"/>
+      <w:lvlJc w:val="left"/>
+      <w:pPr>
+        <w:ind w:left="1440" w:hanging="360"/>
+      </w:pPr>
+      <w:rPr>
+        <w:rFonts w:ascii="Courier New" w:hAnsi="Courier New" w:cs="Courier New" w:hint="default"/>
+      </w:rPr>
+    </w:lvl>
+    <w:lvl w:ilvl="2" w:tplc="08090005" w:tentative="1">
+      <w:start w:val="1"/>
+      <w:numFmt w:val="bullet"/>
+      <w:lvlText w:val=""/>
+      <w:lvlJc w:val="left"/>
+      <w:pPr>
+        <w:ind w:left="2160" w:hanging="360"/>
+      </w:pPr>
+      <w:rPr>
+        <w:rFonts w:ascii="Wingdings" w:hAnsi="Wingdings" w:hint="default"/>
+      </w:rPr>
+    </w:lvl>
+    <w:lvl w:ilvl="3" w:tplc="08090001" w:tentative="1">
+      <w:start w:val="1"/>
+      <w:numFmt w:val="bullet"/>
+      <w:lvlText w:val=""/>
+      <w:lvlJc w:val="left"/>
+      <w:pPr>
+        <w:ind w:left="2880" w:hanging="360"/>
+      </w:pPr>
+      <w:rPr>
+        <w:rFonts w:ascii="Symbol" w:hAnsi="Symbol" w:hint="default"/>
+      </w:rPr>
+    </w:lvl>
+    <w:lvl w:ilvl="4" w:tplc="08090003" w:tentative="1">
+      <w:start w:val="1"/>
+      <w:numFmt w:val="bullet"/>
+      <w:lvlText w:val="o"/>
+      <w:lvlJc w:val="left"/>
+      <w:pPr>
+        <w:ind w:left="3600" w:hanging="360"/>
+      </w:pPr>
+      <w:rPr>
+        <w:rFonts w:ascii="Courier New" w:hAnsi="Courier New" w:cs="Courier New" w:hint="default"/>
+      </w:rPr>
+    </w:lvl>
+    <w:lvl w:ilvl="5" w:tplc="08090005" w:tentative="1">
+      <w:start w:val="1"/>
+      <w:numFmt w:val="bullet"/>
+      <w:lvlText w:val=""/>
+      <w:lvlJc w:val="left"/>
+      <w:pPr>
+        <w:ind w:left="4320" w:hanging="360"/>
+      </w:pPr>
+      <w:rPr>
+        <w:rFonts w:ascii="Wingdings" w:hAnsi="Wingdings" w:hint="default"/>
+      </w:rPr>
+    </w:lvl>
+    <w:lvl w:ilvl="6" w:tplc="08090001" w:tentative="1">
+      <w:start w:val="1"/>
+      <w:numFmt w:val="bullet"/>
+      <w:lvlText w:val=""/>
+      <w:lvlJc w:val="left"/>
+      <w:pPr>
+        <w:ind w:left="5040" w:hanging="360"/>
+      </w:pPr>
+      <w:rPr>
+        <w:rFonts w:ascii="Symbol" w:hAnsi="Symbol" w:hint="default"/>
+      </w:rPr>
+    </w:lvl>
+    <w:lvl w:ilvl="7" w:tplc="08090003" w:tentative="1">
+      <w:start w:val="1"/>
+      <w:numFmt w:val="bullet"/>
+      <w:lvlText w:val="o"/>
+      <w:lvlJc w:val="left"/>
+      <w:pPr>
+        <w:ind w:left="5760" w:hanging="360"/>
+      </w:pPr>
+      <w:rPr>
+        <w:rFonts w:ascii="Courier New" w:hAnsi="Courier New" w:cs="Courier New" w:hint="default"/>
+      </w:rPr>
+    </w:lvl>
+    <w:lvl w:ilvl="8" w:tplc="08090005" w:tentative="1">
+      <w:start w:val="1"/>
+      <w:numFmt w:val="bullet"/>
+      <w:lvlText w:val=""/>
+      <w:lvlJc w:val="left"/>
+      <w:pPr>
+        <w:ind w:left="6480" w:hanging="360"/>
+      </w:pPr>
+      <w:rPr>
+        <w:rFonts w:ascii="Wingdings" w:hAnsi="Wingdings" w:hint="default"/>
+      </w:rPr>
+    </w:lvl>
+  </w:abstractNum>
   <w:num w:numId="1">
     <w:abstractNumId w:val="1"/>
   </w:num>
   <w:num w:numId="2">
     <w:abstractNumId w:val="0"/>
+  </w:num>
+  <w:num w:numId="3">
+    <w:abstractNumId w:val="2"/>
   </w:num>
 </w:numbering>
 </file>
@@ -1800,6 +2352,27 @@
       <w:ind w:left="440"/>
     </w:pPr>
   </w:style>
+  <w:style w:type="paragraph" w:styleId="NoSpacing">
+    <w:name w:val="No Spacing"/>
+    <w:uiPriority w:val="1"/>
+    <w:qFormat/>
+    <w:rsid w:val="00980ED4"/>
+    <w:pPr>
+      <w:spacing w:after="0" w:line="240" w:lineRule="auto"/>
+    </w:pPr>
+  </w:style>
+  <w:style w:type="character" w:styleId="FollowedHyperlink">
+    <w:name w:val="FollowedHyperlink"/>
+    <w:basedOn w:val="DefaultParagraphFont"/>
+    <w:uiPriority w:val="99"/>
+    <w:semiHidden/>
+    <w:unhideWhenUsed/>
+    <w:rsid w:val="004442FB"/>
+    <w:rPr>
+      <w:color w:val="954F72" w:themeColor="followedHyperlink"/>
+      <w:u w:val="single"/>
+    </w:rPr>
+  </w:style>
 </w:styles>
 </file>
 
@@ -2102,10 +2675,278 @@
 <b:Sources xmlns:b="http://schemas.openxmlformats.org/officeDocument/2006/bibliography" xmlns="http://schemas.openxmlformats.org/officeDocument/2006/bibliography" SelectedStyle="\APASixthEditionOfficeOnline.xsl" StyleName="APA" Version="6"/>
 </file>
 
+<file path=customXml/item2.xml><?xml version="1.0" encoding="utf-8"?>
+<p:properties xmlns:p="http://schemas.microsoft.com/office/2006/metadata/properties" xmlns:xsi="http://www.w3.org/2001/XMLSchema-instance" xmlns:pc="http://schemas.microsoft.com/office/infopath/2007/PartnerControls">
+  <documentManagement/>
+</p:properties>
+</file>
+
+<file path=customXml/item3.xml><?xml version="1.0" encoding="utf-8"?>
+<?mso-contentType ?>
+<FormTemplates xmlns="http://schemas.microsoft.com/sharepoint/v3/contenttype/forms">
+  <Display>DocumentLibraryForm</Display>
+  <Edit>DocumentLibraryForm</Edit>
+  <New>DocumentLibraryForm</New>
+</FormTemplates>
+</file>
+
+<file path=customXml/item4.xml><?xml version="1.0" encoding="utf-8"?>
+<ct:contentTypeSchema xmlns:ct="http://schemas.microsoft.com/office/2006/metadata/contentType" xmlns:ma="http://schemas.microsoft.com/office/2006/metadata/properties/metaAttributes" ct:_="" ma:_="" ma:contentTypeName="Documento" ma:contentTypeID="0x010100476C80DBA2A885449FD8B645A4D4C6FE" ma:contentTypeVersion="12" ma:contentTypeDescription="Crear nuevo documento." ma:contentTypeScope="" ma:versionID="c694e10bb6fe923b7bf09275a2383295">
+  <xsd:schema xmlns:xsd="http://www.w3.org/2001/XMLSchema" xmlns:xs="http://www.w3.org/2001/XMLSchema" xmlns:p="http://schemas.microsoft.com/office/2006/metadata/properties" xmlns:ns3="f161e47d-169b-4aff-b47c-84b5e15d4deb" xmlns:ns4="5e6cfdc5-b52e-4221-a343-85db301e0661" targetNamespace="http://schemas.microsoft.com/office/2006/metadata/properties" ma:root="true" ma:fieldsID="ef5fedb621caa12722fd75c7929cb79a" ns3:_="" ns4:_="">
+    <xsd:import namespace="f161e47d-169b-4aff-b47c-84b5e15d4deb"/>
+    <xsd:import namespace="5e6cfdc5-b52e-4221-a343-85db301e0661"/>
+    <xsd:element name="properties">
+      <xsd:complexType>
+        <xsd:sequence>
+          <xsd:element name="documentManagement">
+            <xsd:complexType>
+              <xsd:all>
+                <xsd:element ref="ns3:MediaServiceMetadata" minOccurs="0"/>
+                <xsd:element ref="ns3:MediaServiceFastMetadata" minOccurs="0"/>
+                <xsd:element ref="ns3:MediaServiceDateTaken" minOccurs="0"/>
+                <xsd:element ref="ns3:MediaServiceAutoTags" minOccurs="0"/>
+                <xsd:element ref="ns3:MediaServiceOCR" minOccurs="0"/>
+                <xsd:element ref="ns4:SharedWithUsers" minOccurs="0"/>
+                <xsd:element ref="ns4:SharedWithDetails" minOccurs="0"/>
+                <xsd:element ref="ns4:SharingHintHash" minOccurs="0"/>
+                <xsd:element ref="ns3:MediaServiceAutoKeyPoints" minOccurs="0"/>
+                <xsd:element ref="ns3:MediaServiceKeyPoints" minOccurs="0"/>
+                <xsd:element ref="ns3:MediaServiceGenerationTime" minOccurs="0"/>
+                <xsd:element ref="ns3:MediaServiceEventHashCode" minOccurs="0"/>
+              </xsd:all>
+            </xsd:complexType>
+          </xsd:element>
+        </xsd:sequence>
+      </xsd:complexType>
+    </xsd:element>
+  </xsd:schema>
+  <xsd:schema xmlns:xsd="http://www.w3.org/2001/XMLSchema" xmlns:xs="http://www.w3.org/2001/XMLSchema" xmlns:dms="http://schemas.microsoft.com/office/2006/documentManagement/types" xmlns:pc="http://schemas.microsoft.com/office/infopath/2007/PartnerControls" targetNamespace="f161e47d-169b-4aff-b47c-84b5e15d4deb" elementFormDefault="qualified">
+    <xsd:import namespace="http://schemas.microsoft.com/office/2006/documentManagement/types"/>
+    <xsd:import namespace="http://schemas.microsoft.com/office/infopath/2007/PartnerControls"/>
+    <xsd:element name="MediaServiceMetadata" ma:index="8" nillable="true" ma:displayName="MediaServiceMetadata" ma:description="" ma:hidden="true" ma:internalName="MediaServiceMetadata" ma:readOnly="true">
+      <xsd:simpleType>
+        <xsd:restriction base="dms:Note"/>
+      </xsd:simpleType>
+    </xsd:element>
+    <xsd:element name="MediaServiceFastMetadata" ma:index="9" nillable="true" ma:displayName="MediaServiceFastMetadata" ma:description="" ma:hidden="true" ma:internalName="MediaServiceFastMetadata" ma:readOnly="true">
+      <xsd:simpleType>
+        <xsd:restriction base="dms:Note"/>
+      </xsd:simpleType>
+    </xsd:element>
+    <xsd:element name="MediaServiceDateTaken" ma:index="10" nillable="true" ma:displayName="MediaServiceDateTaken" ma:description="" ma:hidden="true" ma:internalName="MediaServiceDateTaken" ma:readOnly="true">
+      <xsd:simpleType>
+        <xsd:restriction base="dms:Text"/>
+      </xsd:simpleType>
+    </xsd:element>
+    <xsd:element name="MediaServiceAutoTags" ma:index="11" nillable="true" ma:displayName="MediaServiceAutoTags" ma:description="" ma:internalName="MediaServiceAutoTags" ma:readOnly="true">
+      <xsd:simpleType>
+        <xsd:restriction base="dms:Text"/>
+      </xsd:simpleType>
+    </xsd:element>
+    <xsd:element name="MediaServiceOCR" ma:index="12" nillable="true" ma:displayName="MediaServiceOCR" ma:internalName="MediaServiceOCR" ma:readOnly="true">
+      <xsd:simpleType>
+        <xsd:restriction base="dms:Note">
+          <xsd:maxLength value="255"/>
+        </xsd:restriction>
+      </xsd:simpleType>
+    </xsd:element>
+    <xsd:element name="MediaServiceAutoKeyPoints" ma:index="16" nillable="true" ma:displayName="MediaServiceAutoKeyPoints" ma:hidden="true" ma:internalName="MediaServiceAutoKeyPoints" ma:readOnly="true">
+      <xsd:simpleType>
+        <xsd:restriction base="dms:Note"/>
+      </xsd:simpleType>
+    </xsd:element>
+    <xsd:element name="MediaServiceKeyPoints" ma:index="17" nillable="true" ma:displayName="KeyPoints" ma:internalName="MediaServiceKeyPoints" ma:readOnly="true">
+      <xsd:simpleType>
+        <xsd:restriction base="dms:Note">
+          <xsd:maxLength value="255"/>
+        </xsd:restriction>
+      </xsd:simpleType>
+    </xsd:element>
+    <xsd:element name="MediaServiceGenerationTime" ma:index="18" nillable="true" ma:displayName="MediaServiceGenerationTime" ma:hidden="true" ma:internalName="MediaServiceGenerationTime" ma:readOnly="true">
+      <xsd:simpleType>
+        <xsd:restriction base="dms:Text"/>
+      </xsd:simpleType>
+    </xsd:element>
+    <xsd:element name="MediaServiceEventHashCode" ma:index="19" nillable="true" ma:displayName="MediaServiceEventHashCode" ma:hidden="true" ma:internalName="MediaServiceEventHashCode" ma:readOnly="true">
+      <xsd:simpleType>
+        <xsd:restriction base="dms:Text"/>
+      </xsd:simpleType>
+    </xsd:element>
+  </xsd:schema>
+  <xsd:schema xmlns:xsd="http://www.w3.org/2001/XMLSchema" xmlns:xs="http://www.w3.org/2001/XMLSchema" xmlns:dms="http://schemas.microsoft.com/office/2006/documentManagement/types" xmlns:pc="http://schemas.microsoft.com/office/infopath/2007/PartnerControls" targetNamespace="5e6cfdc5-b52e-4221-a343-85db301e0661" elementFormDefault="qualified">
+    <xsd:import namespace="http://schemas.microsoft.com/office/2006/documentManagement/types"/>
+    <xsd:import namespace="http://schemas.microsoft.com/office/infopath/2007/PartnerControls"/>
+    <xsd:element name="SharedWithUsers" ma:index="13" nillable="true" ma:displayName="Compartido con" ma:internalName="SharedWithUsers" ma:readOnly="true">
+      <xsd:complexType>
+        <xsd:complexContent>
+          <xsd:extension base="dms:UserMulti">
+            <xsd:sequence>
+              <xsd:element name="UserInfo" minOccurs="0" maxOccurs="unbounded">
+                <xsd:complexType>
+                  <xsd:sequence>
+                    <xsd:element name="DisplayName" type="xsd:string" minOccurs="0"/>
+                    <xsd:element name="AccountId" type="dms:UserId" minOccurs="0" nillable="true"/>
+                    <xsd:element name="AccountType" type="xsd:string" minOccurs="0"/>
+                  </xsd:sequence>
+                </xsd:complexType>
+              </xsd:element>
+            </xsd:sequence>
+          </xsd:extension>
+        </xsd:complexContent>
+      </xsd:complexType>
+    </xsd:element>
+    <xsd:element name="SharedWithDetails" ma:index="14" nillable="true" ma:displayName="Detalles de uso compartido" ma:internalName="SharedWithDetails" ma:readOnly="true">
+      <xsd:simpleType>
+        <xsd:restriction base="dms:Note">
+          <xsd:maxLength value="255"/>
+        </xsd:restriction>
+      </xsd:simpleType>
+    </xsd:element>
+    <xsd:element name="SharingHintHash" ma:index="15" nillable="true" ma:displayName="Hash de la sugerencia para compartir" ma:hidden="true" ma:internalName="SharingHintHash" ma:readOnly="true">
+      <xsd:simpleType>
+        <xsd:restriction base="dms:Text"/>
+      </xsd:simpleType>
+    </xsd:element>
+  </xsd:schema>
+  <xsd:schema xmlns="http://schemas.openxmlformats.org/package/2006/metadata/core-properties" xmlns:xsd="http://www.w3.org/2001/XMLSchema" xmlns:xsi="http://www.w3.org/2001/XMLSchema-instance" xmlns:dc="http://purl.org/dc/elements/1.1/" xmlns:dcterms="http://purl.org/dc/terms/" xmlns:odoc="http://schemas.microsoft.com/internal/obd" targetNamespace="http://schemas.openxmlformats.org/package/2006/metadata/core-properties" elementFormDefault="qualified" attributeFormDefault="unqualified" blockDefault="#all">
+    <xsd:import namespace="http://purl.org/dc/elements/1.1/" schemaLocation="http://dublincore.org/schemas/xmls/qdc/2003/04/02/dc.xsd"/>
+    <xsd:import namespace="http://purl.org/dc/terms/" schemaLocation="http://dublincore.org/schemas/xmls/qdc/2003/04/02/dcterms.xsd"/>
+    <xsd:element name="coreProperties" type="CT_coreProperties"/>
+    <xsd:complexType name="CT_coreProperties">
+      <xsd:all>
+        <xsd:element ref="dc:creator" minOccurs="0" maxOccurs="1"/>
+        <xsd:element ref="dcterms:created" minOccurs="0" maxOccurs="1"/>
+        <xsd:element ref="dc:identifier" minOccurs="0" maxOccurs="1"/>
+        <xsd:element name="contentType" minOccurs="0" maxOccurs="1" type="xsd:string" ma:index="0" ma:displayName="Tipo de contenido"/>
+        <xsd:element ref="dc:title" minOccurs="0" maxOccurs="1" ma:index="4" ma:displayName="Título"/>
+        <xsd:element ref="dc:subject" minOccurs="0" maxOccurs="1"/>
+        <xsd:element ref="dc:description" minOccurs="0" maxOccurs="1"/>
+        <xsd:element name="keywords" minOccurs="0" maxOccurs="1" type="xsd:string"/>
+        <xsd:element ref="dc:language" minOccurs="0" maxOccurs="1"/>
+        <xsd:element name="category" minOccurs="0" maxOccurs="1" type="xsd:string"/>
+        <xsd:element name="version" minOccurs="0" maxOccurs="1" type="xsd:string"/>
+        <xsd:element name="revision" minOccurs="0" maxOccurs="1" type="xsd:string">
+          <xsd:annotation>
+            <xsd:documentation>
+                        This value indicates the number of saves or revisions. The application is responsible for updating this value after each revision.
+                    </xsd:documentation>
+          </xsd:annotation>
+        </xsd:element>
+        <xsd:element name="lastModifiedBy" minOccurs="0" maxOccurs="1" type="xsd:string"/>
+        <xsd:element ref="dcterms:modified" minOccurs="0" maxOccurs="1"/>
+        <xsd:element name="contentStatus" minOccurs="0" maxOccurs="1" type="xsd:string"/>
+      </xsd:all>
+    </xsd:complexType>
+  </xsd:schema>
+  <xs:schema xmlns:pc="http://schemas.microsoft.com/office/infopath/2007/PartnerControls" xmlns:xs="http://www.w3.org/2001/XMLSchema" targetNamespace="http://schemas.microsoft.com/office/infopath/2007/PartnerControls" elementFormDefault="qualified" attributeFormDefault="unqualified">
+    <xs:element name="Person">
+      <xs:complexType>
+        <xs:sequence>
+          <xs:element ref="pc:DisplayName" minOccurs="0"/>
+          <xs:element ref="pc:AccountId" minOccurs="0"/>
+          <xs:element ref="pc:AccountType" minOccurs="0"/>
+        </xs:sequence>
+      </xs:complexType>
+    </xs:element>
+    <xs:element name="DisplayName" type="xs:string"/>
+    <xs:element name="AccountId" type="xs:string"/>
+    <xs:element name="AccountType" type="xs:string"/>
+    <xs:element name="BDCAssociatedEntity">
+      <xs:complexType>
+        <xs:sequence>
+          <xs:element ref="pc:BDCEntity" minOccurs="0" maxOccurs="unbounded"/>
+        </xs:sequence>
+        <xs:attribute ref="pc:EntityNamespace"/>
+        <xs:attribute ref="pc:EntityName"/>
+        <xs:attribute ref="pc:SystemInstanceName"/>
+        <xs:attribute ref="pc:AssociationName"/>
+      </xs:complexType>
+    </xs:element>
+    <xs:attribute name="EntityNamespace" type="xs:string"/>
+    <xs:attribute name="EntityName" type="xs:string"/>
+    <xs:attribute name="SystemInstanceName" type="xs:string"/>
+    <xs:attribute name="AssociationName" type="xs:string"/>
+    <xs:element name="BDCEntity">
+      <xs:complexType>
+        <xs:sequence>
+          <xs:element ref="pc:EntityDisplayName" minOccurs="0"/>
+          <xs:element ref="pc:EntityInstanceReference" minOccurs="0"/>
+          <xs:element ref="pc:EntityId1" minOccurs="0"/>
+          <xs:element ref="pc:EntityId2" minOccurs="0"/>
+          <xs:element ref="pc:EntityId3" minOccurs="0"/>
+          <xs:element ref="pc:EntityId4" minOccurs="0"/>
+          <xs:element ref="pc:EntityId5" minOccurs="0"/>
+        </xs:sequence>
+      </xs:complexType>
+    </xs:element>
+    <xs:element name="EntityDisplayName" type="xs:string"/>
+    <xs:element name="EntityInstanceReference" type="xs:string"/>
+    <xs:element name="EntityId1" type="xs:string"/>
+    <xs:element name="EntityId2" type="xs:string"/>
+    <xs:element name="EntityId3" type="xs:string"/>
+    <xs:element name="EntityId4" type="xs:string"/>
+    <xs:element name="EntityId5" type="xs:string"/>
+    <xs:element name="Terms">
+      <xs:complexType>
+        <xs:sequence>
+          <xs:element ref="pc:TermInfo" minOccurs="0" maxOccurs="unbounded"/>
+        </xs:sequence>
+      </xs:complexType>
+    </xs:element>
+    <xs:element name="TermInfo">
+      <xs:complexType>
+        <xs:sequence>
+          <xs:element ref="pc:TermName" minOccurs="0"/>
+          <xs:element ref="pc:TermId" minOccurs="0"/>
+        </xs:sequence>
+      </xs:complexType>
+    </xs:element>
+    <xs:element name="TermName" type="xs:string"/>
+    <xs:element name="TermId" type="xs:string"/>
+  </xs:schema>
+</ct:contentTypeSchema>
+</file>
+
 <file path=customXml/itemProps1.xml><?xml version="1.0" encoding="utf-8"?>
 <ds:datastoreItem xmlns:ds="http://schemas.openxmlformats.org/officeDocument/2006/customXml" ds:itemID="{36376837-F33B-427F-8D83-C113DE7E32E8}">
   <ds:schemaRefs>
     <ds:schemaRef ds:uri="http://schemas.openxmlformats.org/officeDocument/2006/bibliography"/>
   </ds:schemaRefs>
 </ds:datastoreItem>
+</file>
+
+<file path=customXml/itemProps2.xml><?xml version="1.0" encoding="utf-8"?>
+<ds:datastoreItem xmlns:ds="http://schemas.openxmlformats.org/officeDocument/2006/customXml" ds:itemID="{57A0A09F-D7A2-43D0-A17E-3CCE9A625C60}">
+  <ds:schemaRefs>
+    <ds:schemaRef ds:uri="http://schemas.microsoft.com/office/2006/metadata/properties"/>
+    <ds:schemaRef ds:uri="http://schemas.microsoft.com/office/infopath/2007/PartnerControls"/>
+  </ds:schemaRefs>
+</ds:datastoreItem>
+</file>
+
+<file path=customXml/itemProps3.xml><?xml version="1.0" encoding="utf-8"?>
+<ds:datastoreItem xmlns:ds="http://schemas.openxmlformats.org/officeDocument/2006/customXml" ds:itemID="{69B63455-D79A-4881-AE27-C458E95494A8}">
+  <ds:schemaRefs>
+    <ds:schemaRef ds:uri="http://schemas.microsoft.com/sharepoint/v3/contenttype/forms"/>
+  </ds:schemaRefs>
+</ds:datastoreItem>
+</file>
+
+<file path=customXml/itemProps4.xml><?xml version="1.0" encoding="utf-8"?>
+<ds:datastoreItem xmlns:ds="http://schemas.openxmlformats.org/officeDocument/2006/customXml" ds:itemID="{0B2E499F-48D1-41DE-8858-034DC7EBF65E}">
+  <ds:schemaRefs>
+    <ds:schemaRef ds:uri="http://schemas.microsoft.com/office/2006/metadata/contentType"/>
+    <ds:schemaRef ds:uri="http://schemas.microsoft.com/office/2006/metadata/properties/metaAttributes"/>
+    <ds:schemaRef ds:uri="http://www.w3.org/2001/XMLSchema"/>
+    <ds:schemaRef ds:uri="http://schemas.microsoft.com/office/2006/metadata/properties"/>
+    <ds:schemaRef ds:uri="f161e47d-169b-4aff-b47c-84b5e15d4deb"/>
+    <ds:schemaRef ds:uri="5e6cfdc5-b52e-4221-a343-85db301e0661"/>
+    <ds:schemaRef ds:uri="http://schemas.microsoft.com/office/2006/documentManagement/types"/>
+    <ds:schemaRef ds:uri="http://schemas.microsoft.com/office/infopath/2007/PartnerControls"/>
+    <ds:schemaRef ds:uri="http://schemas.openxmlformats.org/package/2006/metadata/core-properties"/>
+    <ds:schemaRef ds:uri="http://purl.org/dc/elements/1.1/"/>
+    <ds:schemaRef ds:uri="http://purl.org/dc/terms/"/>
+    <ds:schemaRef ds:uri="http://schemas.microsoft.com/internal/obd"/>
+  </ds:schemaRefs>
+</ds:datastoreItem>
 </file>
</xml_diff>

<commit_message>
Added new Unity proyect working with vr cardboard
</commit_message>
<xml_diff>
--- a/Documentation/General/Notes.docx
+++ b/Documentation/General/Notes.docx
@@ -37,11 +37,9 @@
           <w:pPr>
             <w:pStyle w:val="TOCHeading"/>
           </w:pPr>
-          <w:proofErr w:type="spellStart"/>
           <w:r>
             <w:t>Contents</w:t>
           </w:r>
-          <w:proofErr w:type="spellEnd"/>
         </w:p>
         <w:p>
           <w:pPr>
@@ -802,21 +800,7 @@
         <w:rPr>
           <w:lang w:val="en-GB"/>
         </w:rPr>
-        <w:t xml:space="preserve">Arduino MKR 1010 </w:t>
-      </w:r>
-      <w:proofErr w:type="spellStart"/>
-      <w:r>
-        <w:rPr>
-          <w:lang w:val="en-GB"/>
-        </w:rPr>
-        <w:t>Wifi</w:t>
-      </w:r>
-      <w:proofErr w:type="spellEnd"/>
-      <w:r>
-        <w:rPr>
-          <w:lang w:val="en-GB"/>
-        </w:rPr>
-        <w:t xml:space="preserve"> (</w:t>
+        <w:t>Arduino MKR 1010 Wifi (</w:t>
       </w:r>
       <w:hyperlink r:id="rId9" w:history="1">
         <w:r>
@@ -835,13 +819,8 @@
       </w:r>
     </w:p>
     <w:p>
-      <w:proofErr w:type="spellStart"/>
-      <w:r>
-        <w:t>Sensors</w:t>
-      </w:r>
-      <w:proofErr w:type="spellEnd"/>
-      <w:r>
-        <w:t>:</w:t>
+      <w:r>
+        <w:t>Sensors:</w:t>
       </w:r>
     </w:p>
     <w:p>
@@ -918,13 +897,8 @@
           <w:numId w:val="1"/>
         </w:numPr>
       </w:pPr>
-      <w:proofErr w:type="spellStart"/>
-      <w:r>
-        <w:t>Temperature</w:t>
-      </w:r>
-      <w:proofErr w:type="spellEnd"/>
-      <w:r>
-        <w:t xml:space="preserve"> (</w:t>
+      <w:r>
+        <w:t>Temperature (</w:t>
       </w:r>
       <w:hyperlink r:id="rId12" w:history="1">
         <w:r>
@@ -946,21 +920,8 @@
           <w:numId w:val="1"/>
         </w:numPr>
       </w:pPr>
-      <w:proofErr w:type="spellStart"/>
-      <w:r>
-        <w:t>Soil</w:t>
-      </w:r>
-      <w:proofErr w:type="spellEnd"/>
-      <w:r>
-        <w:t xml:space="preserve"> </w:t>
-      </w:r>
-      <w:proofErr w:type="spellStart"/>
-      <w:r>
-        <w:t>moisture</w:t>
-      </w:r>
-      <w:proofErr w:type="spellEnd"/>
-      <w:r>
-        <w:t xml:space="preserve"> (</w:t>
+      <w:r>
+        <w:t>Soil moisture (</w:t>
       </w:r>
       <w:hyperlink r:id="rId13" w:history="1">
         <w:r>
@@ -993,15 +954,7 @@
     <w:p>
       <w:r>
         <w:lastRenderedPageBreak/>
-        <w:t xml:space="preserve">Arduino </w:t>
-      </w:r>
-      <w:proofErr w:type="spellStart"/>
-      <w:r>
-        <w:t>batteries</w:t>
-      </w:r>
-      <w:proofErr w:type="spellEnd"/>
-      <w:r>
-        <w:t xml:space="preserve"> (</w:t>
+        <w:t>Arduino batteries (</w:t>
       </w:r>
       <w:hyperlink r:id="rId15" w:history="1">
         <w:r>
@@ -1112,21 +1065,7 @@
         <w:rPr>
           <w:lang w:val="en-GB"/>
         </w:rPr>
-        <w:t xml:space="preserve">Connecting MKR </w:t>
-      </w:r>
-      <w:proofErr w:type="spellStart"/>
-      <w:r>
-        <w:rPr>
-          <w:lang w:val="en-GB"/>
-        </w:rPr>
-        <w:t>WiFi</w:t>
-      </w:r>
-      <w:proofErr w:type="spellEnd"/>
-      <w:r>
-        <w:rPr>
-          <w:lang w:val="en-GB"/>
-        </w:rPr>
-        <w:t xml:space="preserve"> 1010 to a Wi-Fi network</w:t>
+        <w:t>Connecting MKR WiFi 1010 to a Wi-Fi network</w:t>
       </w:r>
       <w:r>
         <w:rPr>
@@ -1178,21 +1117,7 @@
         <w:rPr>
           <w:lang w:val="en-GB"/>
         </w:rPr>
-        <w:t xml:space="preserve">Powering MKR </w:t>
-      </w:r>
-      <w:proofErr w:type="spellStart"/>
-      <w:r>
-        <w:rPr>
-          <w:lang w:val="en-GB"/>
-        </w:rPr>
-        <w:t>WiFi</w:t>
-      </w:r>
-      <w:proofErr w:type="spellEnd"/>
-      <w:r>
-        <w:rPr>
-          <w:lang w:val="en-GB"/>
-        </w:rPr>
-        <w:t xml:space="preserve"> 1010 with batteries</w:t>
+        <w:t>Powering MKR WiFi 1010 with batteries</w:t>
       </w:r>
       <w:r>
         <w:rPr>
@@ -1231,21 +1156,7 @@
         <w:rPr>
           <w:lang w:val="en-GB"/>
         </w:rPr>
-        <w:t xml:space="preserve">Host a web server on the MKR </w:t>
-      </w:r>
-      <w:proofErr w:type="spellStart"/>
-      <w:r>
-        <w:rPr>
-          <w:lang w:val="en-GB"/>
-        </w:rPr>
-        <w:t>WiFi</w:t>
-      </w:r>
-      <w:proofErr w:type="spellEnd"/>
-      <w:r>
-        <w:rPr>
-          <w:lang w:val="en-GB"/>
-        </w:rPr>
-        <w:t xml:space="preserve"> 1010</w:t>
+        <w:t>Host a web server on the MKR WiFi 1010</w:t>
       </w:r>
       <w:r>
         <w:rPr>
@@ -1284,21 +1195,7 @@
         <w:rPr>
           <w:lang w:val="en-GB"/>
         </w:rPr>
-        <w:t xml:space="preserve">How to connect sensors to the MKR </w:t>
-      </w:r>
-      <w:proofErr w:type="spellStart"/>
-      <w:r>
-        <w:rPr>
-          <w:lang w:val="en-GB"/>
-        </w:rPr>
-        <w:t>WiFi</w:t>
-      </w:r>
-      <w:proofErr w:type="spellEnd"/>
-      <w:r>
-        <w:rPr>
-          <w:lang w:val="en-GB"/>
-        </w:rPr>
-        <w:t xml:space="preserve"> 1010</w:t>
+        <w:t>How to connect sensors to the MKR WiFi 1010</w:t>
       </w:r>
       <w:r>
         <w:rPr>
@@ -1466,21 +1363,7 @@
         <w:rPr>
           <w:lang w:val="en-GB"/>
         </w:rPr>
-        <w:t xml:space="preserve">Connect to </w:t>
-      </w:r>
-      <w:proofErr w:type="spellStart"/>
-      <w:r>
-        <w:rPr>
-          <w:lang w:val="en-GB"/>
-        </w:rPr>
-        <w:t>WiFi</w:t>
-      </w:r>
-      <w:proofErr w:type="spellEnd"/>
-      <w:r>
-        <w:rPr>
-          <w:lang w:val="en-GB"/>
-        </w:rPr>
-        <w:t xml:space="preserve"> mobile net</w:t>
+        <w:t>Connect to WiFi mobile net</w:t>
       </w:r>
       <w:r>
         <w:rPr>
@@ -1488,7 +1371,6 @@
         </w:rPr>
         <w:t xml:space="preserve">, send to </w:t>
       </w:r>
-      <w:proofErr w:type="spellStart"/>
       <w:proofErr w:type="gramStart"/>
       <w:r>
         <w:rPr>
@@ -1497,7 +1379,6 @@
         <w:t>ThingSpeak</w:t>
       </w:r>
       <w:bookmarkEnd w:id="4"/>
-      <w:proofErr w:type="spellEnd"/>
       <w:proofErr w:type="gramEnd"/>
     </w:p>
     <w:p>
@@ -1510,21 +1391,7 @@
         <w:rPr>
           <w:lang w:val="en-GB"/>
         </w:rPr>
-        <w:t xml:space="preserve">Configure </w:t>
-      </w:r>
-      <w:proofErr w:type="spellStart"/>
-      <w:r>
-        <w:rPr>
-          <w:lang w:val="en-GB"/>
-        </w:rPr>
-        <w:t>MatLab</w:t>
-      </w:r>
-      <w:proofErr w:type="spellEnd"/>
-      <w:r>
-        <w:rPr>
-          <w:lang w:val="en-GB"/>
-        </w:rPr>
-        <w:t xml:space="preserve"> for recognizing </w:t>
+        <w:t xml:space="preserve">Configure MatLab for recognizing </w:t>
       </w:r>
       <w:r>
         <w:rPr>
@@ -1532,142 +1399,56 @@
         </w:rPr>
         <w:t xml:space="preserve">this specific board in USB mode. </w:t>
       </w:r>
-      <w:proofErr w:type="spellStart"/>
-      <w:r>
-        <w:rPr>
-          <w:lang w:val="en-GB"/>
-        </w:rPr>
-        <w:t>Simluation</w:t>
-      </w:r>
-      <w:proofErr w:type="spellEnd"/>
-      <w:r>
-        <w:rPr>
-          <w:lang w:val="en-GB"/>
-        </w:rPr>
-        <w:t xml:space="preserve"> -&gt; Model Settings -&gt; Hardware (Select board, and configure </w:t>
-      </w:r>
-      <w:proofErr w:type="spellStart"/>
-      <w:r>
-        <w:rPr>
-          <w:lang w:val="en-GB"/>
-        </w:rPr>
-        <w:t>WiFi</w:t>
-      </w:r>
-      <w:proofErr w:type="spellEnd"/>
-      <w:r>
-        <w:rPr>
-          <w:lang w:val="en-GB"/>
-        </w:rPr>
-        <w:t>)</w:t>
-      </w:r>
-    </w:p>
-    <w:p>
-      <w:pPr>
-        <w:rPr>
-          <w:lang w:val="en-GB"/>
-        </w:rPr>
-      </w:pPr>
-      <w:r>
-        <w:rPr>
-          <w:lang w:val="en-GB"/>
-        </w:rPr>
-        <w:t xml:space="preserve">Set </w:t>
-      </w:r>
-      <w:proofErr w:type="spellStart"/>
-      <w:r>
-        <w:rPr>
-          <w:lang w:val="en-GB"/>
-        </w:rPr>
-        <w:t>ThingSpeak</w:t>
-      </w:r>
-      <w:proofErr w:type="spellEnd"/>
-      <w:r>
-        <w:rPr>
-          <w:lang w:val="en-GB"/>
-        </w:rPr>
-        <w:t xml:space="preserve"> channel</w:t>
-      </w:r>
-    </w:p>
-    <w:p>
-      <w:pPr>
-        <w:rPr>
-          <w:lang w:val="en-GB"/>
-        </w:rPr>
-      </w:pPr>
-      <w:proofErr w:type="spellStart"/>
-      <w:r>
-        <w:rPr>
-          <w:lang w:val="en-GB"/>
-        </w:rPr>
-        <w:t>Sdlrtkernet</w:t>
-      </w:r>
-      <w:proofErr w:type="spellEnd"/>
-      <w:r>
-        <w:rPr>
-          <w:lang w:val="en-GB"/>
-        </w:rPr>
-        <w:t xml:space="preserve"> -setup</w:t>
-      </w:r>
-    </w:p>
-    <w:p>
-      <w:pPr>
-        <w:rPr>
-          <w:lang w:val="en-GB"/>
-        </w:rPr>
-      </w:pPr>
-      <w:r>
-        <w:rPr>
-          <w:lang w:val="en-GB"/>
-        </w:rPr>
-        <w:t xml:space="preserve">Configure Analog out (soil moisture) to </w:t>
-      </w:r>
-      <w:proofErr w:type="spellStart"/>
-      <w:r>
-        <w:rPr>
-          <w:lang w:val="en-GB"/>
-        </w:rPr>
-        <w:t>ThingSpeak</w:t>
-      </w:r>
-      <w:proofErr w:type="spellEnd"/>
-      <w:r>
-        <w:rPr>
-          <w:lang w:val="en-GB"/>
-        </w:rPr>
-        <w:t xml:space="preserve"> write</w:t>
-      </w:r>
-      <w:r>
-        <w:rPr>
-          <w:lang w:val="en-GB"/>
-        </w:rPr>
-        <w:t xml:space="preserve"> (standard </w:t>
-      </w:r>
-      <w:proofErr w:type="spellStart"/>
-      <w:r>
-        <w:rPr>
-          <w:lang w:val="en-GB"/>
-        </w:rPr>
-        <w:t>Thingspeak</w:t>
-      </w:r>
-      <w:proofErr w:type="spellEnd"/>
-      <w:r>
-        <w:rPr>
-          <w:lang w:val="en-GB"/>
-        </w:rPr>
-        <w:t xml:space="preserve"> write is working but cannot be integrated in Arduino, just simulation, Arduino specific </w:t>
-      </w:r>
-      <w:proofErr w:type="spellStart"/>
-      <w:r>
-        <w:rPr>
-          <w:lang w:val="en-GB"/>
-        </w:rPr>
-        <w:t>Thingspeak</w:t>
-      </w:r>
-      <w:proofErr w:type="spellEnd"/>
-      <w:r>
-        <w:rPr>
-          <w:lang w:val="en-GB"/>
-        </w:rPr>
-        <w:t xml:space="preserve"> write is sending 0 always as the value </w:t>
+      <w:r>
+        <w:rPr>
+          <w:lang w:val="en-GB"/>
+        </w:rPr>
+        <w:t>Simluation -&gt; Model Settings -&gt; Hardware (Select board, and configure WiFi)</w:t>
+      </w:r>
+    </w:p>
+    <w:p>
+      <w:pPr>
+        <w:rPr>
+          <w:lang w:val="en-GB"/>
+        </w:rPr>
+      </w:pPr>
+      <w:r>
+        <w:rPr>
+          <w:lang w:val="en-GB"/>
+        </w:rPr>
+        <w:t>Set ThingSpeak channel</w:t>
+      </w:r>
+    </w:p>
+    <w:p>
+      <w:pPr>
+        <w:rPr>
+          <w:lang w:val="en-GB"/>
+        </w:rPr>
+      </w:pPr>
+      <w:r>
+        <w:rPr>
+          <w:lang w:val="en-GB"/>
+        </w:rPr>
+        <w:t>Sdlrtkernet -setup</w:t>
+      </w:r>
+    </w:p>
+    <w:p>
+      <w:pPr>
+        <w:rPr>
+          <w:lang w:val="en-GB"/>
+        </w:rPr>
+      </w:pPr>
+      <w:r>
+        <w:rPr>
+          <w:lang w:val="en-GB"/>
+        </w:rPr>
+        <w:t>Configure Analog out (soil moisture) to ThingSpeak write</w:t>
+      </w:r>
+      <w:r>
+        <w:rPr>
+          <w:lang w:val="en-GB"/>
+        </w:rPr>
+        <w:t xml:space="preserve"> (standard Thingspeak write is working but cannot be integrated in Arduino, just simulation, Arduino specific Thingspeak write is sending 0 always as the value </w:t>
       </w:r>
       <w:hyperlink r:id="rId25" w:history="1">
         <w:r>
@@ -1710,55 +1491,13 @@
         <w:rPr>
           <w:lang w:val="en-GB"/>
         </w:rPr>
-        <w:t xml:space="preserve">) created by MathWorks that permits writing and reading from </w:t>
-      </w:r>
-      <w:proofErr w:type="spellStart"/>
-      <w:r>
-        <w:rPr>
-          <w:lang w:val="en-GB"/>
-        </w:rPr>
-        <w:t>ThingSpeak</w:t>
-      </w:r>
-      <w:proofErr w:type="spellEnd"/>
-      <w:r>
-        <w:rPr>
-          <w:lang w:val="en-GB"/>
-        </w:rPr>
-        <w:t xml:space="preserve"> through the Arduino IDE I get a program that publish </w:t>
-      </w:r>
-      <w:proofErr w:type="spellStart"/>
-      <w:r>
-        <w:rPr>
-          <w:lang w:val="en-GB"/>
-        </w:rPr>
-        <w:t>there</w:t>
-      </w:r>
-      <w:proofErr w:type="spellEnd"/>
-      <w:r>
-        <w:rPr>
-          <w:lang w:val="en-GB"/>
-        </w:rPr>
-        <w:t xml:space="preserve"> correctly.</w:t>
-      </w:r>
-      <w:r>
-        <w:rPr>
-          <w:lang w:val="en-GB"/>
-        </w:rPr>
-        <w:t xml:space="preserve"> After installing </w:t>
-      </w:r>
-      <w:proofErr w:type="spellStart"/>
-      <w:r>
-        <w:rPr>
-          <w:lang w:val="en-GB"/>
-        </w:rPr>
-        <w:t>ThingSpeak</w:t>
-      </w:r>
-      <w:proofErr w:type="spellEnd"/>
-      <w:r>
-        <w:rPr>
-          <w:lang w:val="en-GB"/>
-        </w:rPr>
-        <w:t xml:space="preserve"> library in the IDE.</w:t>
+        <w:t>) created by MathWorks that permits writing and reading from ThingSpeak through the Arduino IDE I get a program that publish there correctly.</w:t>
+      </w:r>
+      <w:r>
+        <w:rPr>
+          <w:lang w:val="en-GB"/>
+        </w:rPr>
+        <w:t xml:space="preserve"> After installing ThingSpeak library in the IDE.</w:t>
       </w:r>
     </w:p>
     <w:p>
@@ -1817,20 +1556,12 @@
         </w:rPr>
       </w:pPr>
       <w:bookmarkStart w:id="5" w:name="_Toc67265583"/>
-      <w:proofErr w:type="spellStart"/>
       <w:r>
         <w:rPr>
           <w:lang w:val="en-GB"/>
         </w:rPr>
         <w:lastRenderedPageBreak/>
-        <w:t>Matlab</w:t>
-      </w:r>
-      <w:proofErr w:type="spellEnd"/>
-      <w:r>
-        <w:rPr>
-          <w:lang w:val="en-GB"/>
-        </w:rPr>
-        <w:t>/Simulink</w:t>
+        <w:t>Matlab/Simulink</w:t>
       </w:r>
       <w:bookmarkEnd w:id="5"/>
     </w:p>
@@ -1865,21 +1596,7 @@
         <w:rPr>
           <w:lang w:val="en-GB"/>
         </w:rPr>
-        <w:t xml:space="preserve">Installation including all </w:t>
-      </w:r>
-      <w:proofErr w:type="spellStart"/>
-      <w:r>
-        <w:rPr>
-          <w:lang w:val="en-GB"/>
-        </w:rPr>
-        <w:t>simulink</w:t>
-      </w:r>
-      <w:proofErr w:type="spellEnd"/>
-      <w:r>
-        <w:rPr>
-          <w:lang w:val="en-GB"/>
-        </w:rPr>
-        <w:t xml:space="preserve"> components.</w:t>
+        <w:t>Installation including all simulink components.</w:t>
       </w:r>
     </w:p>
     <w:p>
@@ -1890,21 +1607,8 @@
           <w:numId w:val="2"/>
         </w:numPr>
       </w:pPr>
-      <w:proofErr w:type="spellStart"/>
-      <w:r>
-        <w:t>MinGW</w:t>
-      </w:r>
-      <w:proofErr w:type="spellEnd"/>
-      <w:r>
-        <w:t xml:space="preserve"> (C/C++ </w:t>
-      </w:r>
-      <w:proofErr w:type="spellStart"/>
-      <w:r>
-        <w:t>compiler</w:t>
-      </w:r>
-      <w:proofErr w:type="spellEnd"/>
-      <w:r>
-        <w:t>)</w:t>
+      <w:r>
+        <w:t>MinGW (C/C++ compiler)</w:t>
       </w:r>
     </w:p>
     <w:p>
@@ -1915,29 +1619,8 @@
           <w:numId w:val="2"/>
         </w:numPr>
       </w:pPr>
-      <w:proofErr w:type="spellStart"/>
-      <w:r>
-        <w:t>Support</w:t>
-      </w:r>
-      <w:proofErr w:type="spellEnd"/>
-      <w:r>
-        <w:t xml:space="preserve"> </w:t>
-      </w:r>
-      <w:proofErr w:type="spellStart"/>
-      <w:r>
-        <w:t>Package</w:t>
-      </w:r>
-      <w:proofErr w:type="spellEnd"/>
-      <w:r>
-        <w:t xml:space="preserve"> </w:t>
-      </w:r>
-      <w:proofErr w:type="spellStart"/>
-      <w:r>
-        <w:t>for</w:t>
-      </w:r>
-      <w:proofErr w:type="spellEnd"/>
-      <w:r>
-        <w:t xml:space="preserve"> Arduino</w:t>
+      <w:r>
+        <w:t>Support Package for Arduino</w:t>
       </w:r>
     </w:p>
     <w:p>
@@ -2011,19 +1694,11 @@
         </w:rPr>
       </w:pPr>
       <w:bookmarkStart w:id="9" w:name="_Toc67265587"/>
-      <w:proofErr w:type="spellStart"/>
-      <w:r>
-        <w:rPr>
-          <w:lang w:val="en-GB"/>
-        </w:rPr>
-        <w:t>Thingspeak</w:t>
-      </w:r>
-      <w:proofErr w:type="spellEnd"/>
-      <w:r>
-        <w:rPr>
-          <w:lang w:val="en-GB"/>
-        </w:rPr>
-        <w:t xml:space="preserve"> data</w:t>
+      <w:r>
+        <w:rPr>
+          <w:lang w:val="en-GB"/>
+        </w:rPr>
+        <w:t>Thingspeak data</w:t>
       </w:r>
       <w:r>
         <w:rPr>
@@ -2043,21 +1718,7 @@
         <w:rPr>
           <w:lang w:val="en-GB"/>
         </w:rPr>
-        <w:t xml:space="preserve">Starting with the first demo following what Victor </w:t>
-      </w:r>
-      <w:proofErr w:type="spellStart"/>
-      <w:r>
-        <w:rPr>
-          <w:lang w:val="en-GB"/>
-        </w:rPr>
-        <w:t>tought</w:t>
-      </w:r>
-      <w:proofErr w:type="spellEnd"/>
-      <w:r>
-        <w:rPr>
-          <w:lang w:val="en-GB"/>
-        </w:rPr>
-        <w:t xml:space="preserve"> us about a simple app displaying a cube that I already had, I start investigating about how to run a Python script in Unity.</w:t>
+        <w:t>Starting with the first demo following what Victor tought us about a simple app displaying a cube that I already had, I start investigating about how to run a Python script in Unity.</w:t>
       </w:r>
     </w:p>
     <w:p>
@@ -2212,7 +1873,27 @@
             <w:shd w:val="clear" w:color="auto" w:fill="FAFAFA"/>
             <w:lang w:val="en-GB"/>
           </w:rPr>
-          <w:t>https://developers.google.com/cardboard/develop/unity/quickstart</w:t>
+          <w:t>https://developers.google.c</w:t>
+        </w:r>
+        <w:r>
+          <w:rPr>
+            <w:rStyle w:val="Hyperlink"/>
+            <w:rFonts w:ascii="Arial" w:hAnsi="Arial" w:cs="Arial"/>
+            <w:color w:val="5284BD"/>
+            <w:shd w:val="clear" w:color="auto" w:fill="FAFAFA"/>
+            <w:lang w:val="en-GB"/>
+          </w:rPr>
+          <w:t>o</w:t>
+        </w:r>
+        <w:r>
+          <w:rPr>
+            <w:rStyle w:val="Hyperlink"/>
+            <w:rFonts w:ascii="Arial" w:hAnsi="Arial" w:cs="Arial"/>
+            <w:color w:val="5284BD"/>
+            <w:shd w:val="clear" w:color="auto" w:fill="FAFAFA"/>
+            <w:lang w:val="en-GB"/>
+          </w:rPr>
+          <w:t>m/cardboard/develop/unity/quickstart</w:t>
         </w:r>
       </w:hyperlink>
       <w:r>
@@ -2238,27 +1919,7 @@
           <w:shd w:val="clear" w:color="auto" w:fill="FAFAFA"/>
           <w:lang w:val="en-GB"/>
         </w:rPr>
-        <w:t xml:space="preserve">See </w:t>
-      </w:r>
-      <w:proofErr w:type="spellStart"/>
-      <w:r>
-        <w:rPr>
-          <w:rFonts w:ascii="Arial" w:hAnsi="Arial" w:cs="Arial"/>
-          <w:color w:val="333333"/>
-          <w:shd w:val="clear" w:color="auto" w:fill="FAFAFA"/>
-          <w:lang w:val="en-GB"/>
-        </w:rPr>
-        <w:t>google's</w:t>
-      </w:r>
-      <w:proofErr w:type="spellEnd"/>
-      <w:r>
-        <w:rPr>
-          <w:rFonts w:ascii="Arial" w:hAnsi="Arial" w:cs="Arial"/>
-          <w:color w:val="333333"/>
-          <w:shd w:val="clear" w:color="auto" w:fill="FAFAFA"/>
-          <w:lang w:val="en-GB"/>
-        </w:rPr>
-        <w:t xml:space="preserve"> suggestions here: </w:t>
+        <w:t>See google's suggestions here: </w:t>
       </w:r>
       <w:hyperlink r:id="rId30" w:tgtFrame="_blank" w:history="1">
         <w:r>
@@ -2299,6 +1960,195 @@
           <w:lang w:val="en-GB"/>
         </w:rPr>
         <w:t>), we cannot use Google VR for Unity as defined in the guide.</w:t>
+      </w:r>
+    </w:p>
+    <w:p>
+      <w:pPr>
+        <w:rPr>
+          <w:lang w:val="en-GB"/>
+        </w:rPr>
+      </w:pPr>
+      <w:r>
+        <w:rPr>
+          <w:lang w:val="en-GB"/>
+        </w:rPr>
+        <w:t>Mixed reality library for Unity and Google Cardboard (</w:t>
+      </w:r>
+      <w:hyperlink r:id="rId32" w:history="1">
+        <w:r>
+          <w:rPr>
+            <w:rStyle w:val="Hyperlink"/>
+            <w:lang w:val="en-GB"/>
+          </w:rPr>
+          <w:t>https://assetstore.unity.com/packages/templates/systems/ar-vr-mr-camera-mixed-reality-with-google-cardboard-xr-plugin-ar-179433?aid=1100lGft&amp;utm_source=aff</w:t>
+        </w:r>
+      </w:hyperlink>
+      <w:r>
+        <w:rPr>
+          <w:lang w:val="en-GB"/>
+        </w:rPr>
+        <w:t xml:space="preserve">) </w:t>
+      </w:r>
+    </w:p>
+    <w:p>
+      <w:pPr>
+        <w:rPr>
+          <w:lang w:val="en-GB"/>
+        </w:rPr>
+      </w:pPr>
+      <w:r>
+        <w:rPr>
+          <w:lang w:val="en-GB"/>
+        </w:rPr>
+        <w:t>Import Hello Cardboad from the Package Manager</w:t>
+      </w:r>
+    </w:p>
+    <w:p>
+      <w:pPr>
+        <w:rPr>
+          <w:lang w:val="en-GB"/>
+        </w:rPr>
+      </w:pPr>
+      <w:r>
+        <w:rPr>
+          <w:lang w:val="en-GB"/>
+        </w:rPr>
+        <w:t>Tutorial for integrating Python Script Editor in Unity with small example (</w:t>
+      </w:r>
+      <w:hyperlink r:id="rId33" w:history="1">
+        <w:r>
+          <w:rPr>
+            <w:rStyle w:val="Hyperlink"/>
+            <w:lang w:val="en-GB"/>
+          </w:rPr>
+          <w:t>https://www.youtube.com/watch?v=3UOlN8FcNbE&amp;ab_channel=Indie-Pixel</w:t>
+        </w:r>
+      </w:hyperlink>
+      <w:r>
+        <w:rPr>
+          <w:lang w:val="en-GB"/>
+        </w:rPr>
+        <w:t xml:space="preserve">) </w:t>
+      </w:r>
+    </w:p>
+    <w:p>
+      <w:pPr>
+        <w:rPr>
+          <w:lang w:val="en-GB"/>
+        </w:rPr>
+      </w:pPr>
+      <w:r>
+        <w:rPr>
+          <w:lang w:val="en-GB"/>
+        </w:rPr>
+        <w:t>Guide for installing Python in Unity (</w:t>
+      </w:r>
+      <w:hyperlink r:id="rId34" w:history="1">
+        <w:r>
+          <w:rPr>
+            <w:rStyle w:val="Hyperlink"/>
+            <w:lang w:val="en-GB"/>
+          </w:rPr>
+          <w:t>https://docs.unity3d.com/Packages/com.unity.scripting.python@2.1/manual/installation.html</w:t>
+        </w:r>
+      </w:hyperlink>
+      <w:r>
+        <w:rPr>
+          <w:lang w:val="en-GB"/>
+        </w:rPr>
+        <w:t xml:space="preserve">) </w:t>
+      </w:r>
+    </w:p>
+    <w:p>
+      <w:pPr>
+        <w:rPr>
+          <w:lang w:val="en-GB"/>
+        </w:rPr>
+      </w:pPr>
+      <w:r>
+        <w:rPr>
+          <w:lang w:val="en-GB"/>
+        </w:rPr>
+        <w:lastRenderedPageBreak/>
+        <w:t xml:space="preserve">Python for Unity </w:t>
+      </w:r>
+      <w:r>
+        <w:rPr>
+          <w:lang w:val="en-GB"/>
+        </w:rPr>
+        <w:t>does not</w:t>
+      </w:r>
+      <w:r>
+        <w:rPr>
+          <w:lang w:val="en-GB"/>
+        </w:rPr>
+        <w:t xml:space="preserve"> work with Python 3, only Python 2.</w:t>
+      </w:r>
+      <w:r>
+        <w:rPr>
+          <w:lang w:val="en-GB"/>
+        </w:rPr>
+        <w:t xml:space="preserve"> I use </w:t>
+      </w:r>
+      <w:r>
+        <w:rPr>
+          <w:lang w:val="en-GB"/>
+        </w:rPr>
+        <w:t>Python 2.7.16</w:t>
+      </w:r>
+      <w:r>
+        <w:rPr>
+          <w:lang w:val="en-GB"/>
+        </w:rPr>
+        <w:t>, remember to add it to the PATH.</w:t>
+      </w:r>
+    </w:p>
+    <w:p>
+      <w:pPr>
+        <w:rPr>
+          <w:lang w:val="en-GB"/>
+        </w:rPr>
+      </w:pPr>
+      <w:r>
+        <w:rPr>
+          <w:lang w:val="en-GB"/>
+        </w:rPr>
+        <w:t>Install pip from this site (</w:t>
+      </w:r>
+      <w:hyperlink r:id="rId35" w:history="1">
+        <w:r>
+          <w:rPr>
+            <w:rStyle w:val="Hyperlink"/>
+            <w:lang w:val="en-GB"/>
+          </w:rPr>
+          <w:t>https://bootstrap.pypa.io/pip/2.7/get-pip.py</w:t>
+        </w:r>
+      </w:hyperlink>
+      <w:r>
+        <w:rPr>
+          <w:lang w:val="en-GB"/>
+        </w:rPr>
+        <w:t xml:space="preserve">) </w:t>
+      </w:r>
+      <w:proofErr w:type="gramStart"/>
+      <w:r>
+        <w:rPr>
+          <w:lang w:val="en-GB"/>
+        </w:rPr>
+        <w:t>in order to</w:t>
+      </w:r>
+      <w:proofErr w:type="gramEnd"/>
+      <w:r>
+        <w:rPr>
+          <w:lang w:val="en-GB"/>
+        </w:rPr>
+        <w:t xml:space="preserve"> work with Python 2.7</w:t>
+      </w:r>
+      <w:r>
+        <w:rPr>
+          <w:lang w:val="en-GB"/>
+        </w:rPr>
+        <w:t>.</w:t>
       </w:r>
     </w:p>
     <w:p>
@@ -3862,6 +3712,12 @@
 </file>
 
 <file path=customXml/item1.xml><?xml version="1.0" encoding="utf-8"?>
+<p:properties xmlns:p="http://schemas.microsoft.com/office/2006/metadata/properties" xmlns:xsi="http://www.w3.org/2001/XMLSchema-instance" xmlns:pc="http://schemas.microsoft.com/office/infopath/2007/PartnerControls">
+  <documentManagement/>
+</p:properties>
+</file>
+
+<file path=customXml/item2.xml><?xml version="1.0" encoding="utf-8"?>
 <?mso-contentType ?>
 <FormTemplates xmlns="http://schemas.microsoft.com/sharepoint/v3/contenttype/forms">
   <Display>DocumentLibraryForm</Display>
@@ -3870,17 +3726,7 @@
 </FormTemplates>
 </file>
 
-<file path=customXml/item2.xml><?xml version="1.0" encoding="utf-8"?>
-<p:properties xmlns:p="http://schemas.microsoft.com/office/2006/metadata/properties" xmlns:xsi="http://www.w3.org/2001/XMLSchema-instance" xmlns:pc="http://schemas.microsoft.com/office/infopath/2007/PartnerControls">
-  <documentManagement/>
-</p:properties>
-</file>
-
 <file path=customXml/item3.xml><?xml version="1.0" encoding="utf-8"?>
-<b:Sources xmlns:b="http://schemas.openxmlformats.org/officeDocument/2006/bibliography" xmlns="http://schemas.openxmlformats.org/officeDocument/2006/bibliography" SelectedStyle="\APASixthEditionOfficeOnline.xsl" StyleName="APA" Version="6"/>
-</file>
-
-<file path=customXml/item4.xml><?xml version="1.0" encoding="utf-8"?>
 <ct:contentTypeSchema xmlns:ct="http://schemas.microsoft.com/office/2006/metadata/contentType" xmlns:ma="http://schemas.microsoft.com/office/2006/metadata/properties/metaAttributes" ct:_="" ma:_="" ma:contentTypeName="Documento" ma:contentTypeID="0x010100476C80DBA2A885449FD8B645A4D4C6FE" ma:contentTypeVersion="12" ma:contentTypeDescription="Crear nuevo documento." ma:contentTypeScope="" ma:versionID="c694e10bb6fe923b7bf09275a2383295">
   <xsd:schema xmlns:xsd="http://www.w3.org/2001/XMLSchema" xmlns:xs="http://www.w3.org/2001/XMLSchema" xmlns:p="http://schemas.microsoft.com/office/2006/metadata/properties" xmlns:ns3="f161e47d-169b-4aff-b47c-84b5e15d4deb" xmlns:ns4="5e6cfdc5-b52e-4221-a343-85db301e0661" targetNamespace="http://schemas.microsoft.com/office/2006/metadata/properties" ma:root="true" ma:fieldsID="ef5fedb621caa12722fd75c7929cb79a" ns3:_="" ns4:_="">
     <xsd:import namespace="f161e47d-169b-4aff-b47c-84b5e15d4deb"/>
@@ -4097,15 +3943,11 @@
 </ct:contentTypeSchema>
 </file>
 
-<file path=customXml/itemProps1.xml><?xml version="1.0" encoding="utf-8"?>
-<ds:datastoreItem xmlns:ds="http://schemas.openxmlformats.org/officeDocument/2006/customXml" ds:itemID="{69B63455-D79A-4881-AE27-C458E95494A8}">
-  <ds:schemaRefs>
-    <ds:schemaRef ds:uri="http://schemas.microsoft.com/sharepoint/v3/contenttype/forms"/>
-  </ds:schemaRefs>
-</ds:datastoreItem>
+<file path=customXml/item4.xml><?xml version="1.0" encoding="utf-8"?>
+<b:Sources xmlns:b="http://schemas.openxmlformats.org/officeDocument/2006/bibliography" xmlns="http://schemas.openxmlformats.org/officeDocument/2006/bibliography" SelectedStyle="\APASixthEditionOfficeOnline.xsl" StyleName="APA" Version="6"/>
 </file>
 
-<file path=customXml/itemProps2.xml><?xml version="1.0" encoding="utf-8"?>
+<file path=customXml/itemProps1.xml><?xml version="1.0" encoding="utf-8"?>
 <ds:datastoreItem xmlns:ds="http://schemas.openxmlformats.org/officeDocument/2006/customXml" ds:itemID="{57A0A09F-D7A2-43D0-A17E-3CCE9A625C60}">
   <ds:schemaRefs>
     <ds:schemaRef ds:uri="http://schemas.microsoft.com/office/2006/metadata/properties"/>
@@ -4114,15 +3956,15 @@
 </ds:datastoreItem>
 </file>
 
-<file path=customXml/itemProps3.xml><?xml version="1.0" encoding="utf-8"?>
-<ds:datastoreItem xmlns:ds="http://schemas.openxmlformats.org/officeDocument/2006/customXml" ds:itemID="{36376837-F33B-427F-8D83-C113DE7E32E8}">
+<file path=customXml/itemProps2.xml><?xml version="1.0" encoding="utf-8"?>
+<ds:datastoreItem xmlns:ds="http://schemas.openxmlformats.org/officeDocument/2006/customXml" ds:itemID="{69B63455-D79A-4881-AE27-C458E95494A8}">
   <ds:schemaRefs>
-    <ds:schemaRef ds:uri="http://schemas.openxmlformats.org/officeDocument/2006/bibliography"/>
+    <ds:schemaRef ds:uri="http://schemas.microsoft.com/sharepoint/v3/contenttype/forms"/>
   </ds:schemaRefs>
 </ds:datastoreItem>
 </file>
 
-<file path=customXml/itemProps4.xml><?xml version="1.0" encoding="utf-8"?>
+<file path=customXml/itemProps3.xml><?xml version="1.0" encoding="utf-8"?>
 <ds:datastoreItem xmlns:ds="http://schemas.openxmlformats.org/officeDocument/2006/customXml" ds:itemID="{0B2E499F-48D1-41DE-8858-034DC7EBF65E}">
   <ds:schemaRefs>
     <ds:schemaRef ds:uri="http://schemas.microsoft.com/office/2006/metadata/contentType"/>
@@ -4139,4 +3981,12 @@
     <ds:schemaRef ds:uri="http://schemas.microsoft.com/internal/obd"/>
   </ds:schemaRefs>
 </ds:datastoreItem>
+</file>
+
+<file path=customXml/itemProps4.xml><?xml version="1.0" encoding="utf-8"?>
+<ds:datastoreItem xmlns:ds="http://schemas.openxmlformats.org/officeDocument/2006/customXml" ds:itemID="{36376837-F33B-427F-8D83-C113DE7E32E8}">
+  <ds:schemaRefs>
+    <ds:schemaRef ds:uri="http://schemas.openxmlformats.org/officeDocument/2006/bibliography"/>
+  </ds:schemaRefs>
+</ds:datastoreItem>
 </file>
</xml_diff>

<commit_message>
Added Python for Unity, solution not viable, change to C#
</commit_message>
<xml_diff>
--- a/Documentation/General/Notes.docx
+++ b/Documentation/General/Notes.docx
@@ -37,9 +37,11 @@
           <w:pPr>
             <w:pStyle w:val="TOCHeading"/>
           </w:pPr>
+          <w:proofErr w:type="spellStart"/>
           <w:r>
             <w:t>Contents</w:t>
           </w:r>
+          <w:proofErr w:type="spellEnd"/>
         </w:p>
         <w:p>
           <w:pPr>
@@ -62,7 +64,7 @@
           <w:r>
             <w:fldChar w:fldCharType="separate"/>
           </w:r>
-          <w:hyperlink w:anchor="_Toc67265578" w:history="1">
+          <w:hyperlink w:anchor="_Toc67349880" w:history="1">
             <w:r>
               <w:rPr>
                 <w:rStyle w:val="Hyperlink"/>
@@ -90,7 +92,7 @@
                 <w:noProof/>
                 <w:webHidden/>
               </w:rPr>
-              <w:instrText xml:space="preserve"> PAGEREF _Toc67265578 \h </w:instrText>
+              <w:instrText xml:space="preserve"> PAGEREF _Toc67349880 \h </w:instrText>
             </w:r>
             <w:r>
               <w:rPr>
@@ -133,7 +135,7 @@
               <w:lang w:val="en-GB" w:eastAsia="en-GB"/>
             </w:rPr>
           </w:pPr>
-          <w:hyperlink w:anchor="_Toc67265579" w:history="1">
+          <w:hyperlink w:anchor="_Toc67349881" w:history="1">
             <w:r>
               <w:rPr>
                 <w:rStyle w:val="Hyperlink"/>
@@ -161,7 +163,7 @@
                 <w:noProof/>
                 <w:webHidden/>
               </w:rPr>
-              <w:instrText xml:space="preserve"> PAGEREF _Toc67265579 \h </w:instrText>
+              <w:instrText xml:space="preserve"> PAGEREF _Toc67349881 \h </w:instrText>
             </w:r>
             <w:r>
               <w:rPr>
@@ -204,7 +206,7 @@
               <w:lang w:val="en-GB" w:eastAsia="en-GB"/>
             </w:rPr>
           </w:pPr>
-          <w:hyperlink w:anchor="_Toc67265580" w:history="1">
+          <w:hyperlink w:anchor="_Toc67349882" w:history="1">
             <w:r>
               <w:rPr>
                 <w:rStyle w:val="Hyperlink"/>
@@ -232,7 +234,7 @@
                 <w:noProof/>
                 <w:webHidden/>
               </w:rPr>
-              <w:instrText xml:space="preserve"> PAGEREF _Toc67265580 \h </w:instrText>
+              <w:instrText xml:space="preserve"> PAGEREF _Toc67349882 \h </w:instrText>
             </w:r>
             <w:r>
               <w:rPr>
@@ -275,7 +277,7 @@
               <w:lang w:val="en-GB" w:eastAsia="en-GB"/>
             </w:rPr>
           </w:pPr>
-          <w:hyperlink w:anchor="_Toc67265581" w:history="1">
+          <w:hyperlink w:anchor="_Toc67349883" w:history="1">
             <w:r>
               <w:rPr>
                 <w:rStyle w:val="Hyperlink"/>
@@ -303,7 +305,7 @@
                 <w:noProof/>
                 <w:webHidden/>
               </w:rPr>
-              <w:instrText xml:space="preserve"> PAGEREF _Toc67265581 \h </w:instrText>
+              <w:instrText xml:space="preserve"> PAGEREF _Toc67349883 \h </w:instrText>
             </w:r>
             <w:r>
               <w:rPr>
@@ -346,7 +348,7 @@
               <w:lang w:val="en-GB" w:eastAsia="en-GB"/>
             </w:rPr>
           </w:pPr>
-          <w:hyperlink w:anchor="_Toc67265582" w:history="1">
+          <w:hyperlink w:anchor="_Toc67349884" w:history="1">
             <w:r>
               <w:rPr>
                 <w:rStyle w:val="Hyperlink"/>
@@ -374,7 +376,7 @@
                 <w:noProof/>
                 <w:webHidden/>
               </w:rPr>
-              <w:instrText xml:space="preserve"> PAGEREF _Toc67265582 \h </w:instrText>
+              <w:instrText xml:space="preserve"> PAGEREF _Toc67349884 \h </w:instrText>
             </w:r>
             <w:r>
               <w:rPr>
@@ -417,7 +419,7 @@
               <w:lang w:val="en-GB" w:eastAsia="en-GB"/>
             </w:rPr>
           </w:pPr>
-          <w:hyperlink w:anchor="_Toc67265583" w:history="1">
+          <w:hyperlink w:anchor="_Toc67349885" w:history="1">
             <w:r>
               <w:rPr>
                 <w:rStyle w:val="Hyperlink"/>
@@ -445,7 +447,7 @@
                 <w:noProof/>
                 <w:webHidden/>
               </w:rPr>
-              <w:instrText xml:space="preserve"> PAGEREF _Toc67265583 \h </w:instrText>
+              <w:instrText xml:space="preserve"> PAGEREF _Toc67349885 \h </w:instrText>
             </w:r>
             <w:r>
               <w:rPr>
@@ -488,7 +490,7 @@
               <w:lang w:val="en-GB" w:eastAsia="en-GB"/>
             </w:rPr>
           </w:pPr>
-          <w:hyperlink w:anchor="_Toc67265584" w:history="1">
+          <w:hyperlink w:anchor="_Toc67349886" w:history="1">
             <w:r>
               <w:rPr>
                 <w:rStyle w:val="Hyperlink"/>
@@ -516,7 +518,7 @@
                 <w:noProof/>
                 <w:webHidden/>
               </w:rPr>
-              <w:instrText xml:space="preserve"> PAGEREF _Toc67265584 \h </w:instrText>
+              <w:instrText xml:space="preserve"> PAGEREF _Toc67349886 \h </w:instrText>
             </w:r>
             <w:r>
               <w:rPr>
@@ -559,7 +561,7 @@
               <w:lang w:val="en-GB" w:eastAsia="en-GB"/>
             </w:rPr>
           </w:pPr>
-          <w:hyperlink w:anchor="_Toc67265585" w:history="1">
+          <w:hyperlink w:anchor="_Toc67349887" w:history="1">
             <w:r>
               <w:rPr>
                 <w:rStyle w:val="Hyperlink"/>
@@ -587,7 +589,7 @@
                 <w:noProof/>
                 <w:webHidden/>
               </w:rPr>
-              <w:instrText xml:space="preserve"> PAGEREF _Toc67265585 \h </w:instrText>
+              <w:instrText xml:space="preserve"> PAGEREF _Toc67349887 \h </w:instrText>
             </w:r>
             <w:r>
               <w:rPr>
@@ -630,7 +632,7 @@
               <w:lang w:val="en-GB" w:eastAsia="en-GB"/>
             </w:rPr>
           </w:pPr>
-          <w:hyperlink w:anchor="_Toc67265586" w:history="1">
+          <w:hyperlink w:anchor="_Toc67349888" w:history="1">
             <w:r>
               <w:rPr>
                 <w:rStyle w:val="Hyperlink"/>
@@ -658,7 +660,7 @@
                 <w:noProof/>
                 <w:webHidden/>
               </w:rPr>
-              <w:instrText xml:space="preserve"> PAGEREF _Toc67265586 \h </w:instrText>
+              <w:instrText xml:space="preserve"> PAGEREF _Toc67349888 \h </w:instrText>
             </w:r>
             <w:r>
               <w:rPr>
@@ -701,7 +703,7 @@
               <w:lang w:val="en-GB" w:eastAsia="en-GB"/>
             </w:rPr>
           </w:pPr>
-          <w:hyperlink w:anchor="_Toc67265587" w:history="1">
+          <w:hyperlink w:anchor="_Toc67349889" w:history="1">
             <w:r>
               <w:rPr>
                 <w:rStyle w:val="Hyperlink"/>
@@ -729,7 +731,7 @@
                 <w:noProof/>
                 <w:webHidden/>
               </w:rPr>
-              <w:instrText xml:space="preserve"> PAGEREF _Toc67265587 \h </w:instrText>
+              <w:instrText xml:space="preserve"> PAGEREF _Toc67349889 \h </w:instrText>
             </w:r>
             <w:r>
               <w:rPr>
@@ -781,7 +783,7 @@
           <w:lang w:val="en-GB"/>
         </w:rPr>
       </w:pPr>
-      <w:bookmarkStart w:id="0" w:name="_Toc67265578"/>
+      <w:bookmarkStart w:id="0" w:name="_Toc67349880"/>
       <w:r>
         <w:rPr>
           <w:lang w:val="en-GB"/>
@@ -800,7 +802,21 @@
         <w:rPr>
           <w:lang w:val="en-GB"/>
         </w:rPr>
-        <w:t>Arduino MKR 1010 Wifi (</w:t>
+        <w:t xml:space="preserve">Arduino MKR 1010 </w:t>
+      </w:r>
+      <w:proofErr w:type="spellStart"/>
+      <w:r>
+        <w:rPr>
+          <w:lang w:val="en-GB"/>
+        </w:rPr>
+        <w:t>Wifi</w:t>
+      </w:r>
+      <w:proofErr w:type="spellEnd"/>
+      <w:r>
+        <w:rPr>
+          <w:lang w:val="en-GB"/>
+        </w:rPr>
+        <w:t xml:space="preserve"> (</w:t>
       </w:r>
       <w:hyperlink r:id="rId9" w:history="1">
         <w:r>
@@ -819,8 +835,13 @@
       </w:r>
     </w:p>
     <w:p>
-      <w:r>
-        <w:t>Sensors:</w:t>
+      <w:proofErr w:type="spellStart"/>
+      <w:r>
+        <w:t>Sensors</w:t>
+      </w:r>
+      <w:proofErr w:type="spellEnd"/>
+      <w:r>
+        <w:t>:</w:t>
       </w:r>
     </w:p>
     <w:p>
@@ -897,8 +918,13 @@
           <w:numId w:val="1"/>
         </w:numPr>
       </w:pPr>
-      <w:r>
-        <w:t>Temperature (</w:t>
+      <w:proofErr w:type="spellStart"/>
+      <w:r>
+        <w:t>Temperature</w:t>
+      </w:r>
+      <w:proofErr w:type="spellEnd"/>
+      <w:r>
+        <w:t xml:space="preserve"> (</w:t>
       </w:r>
       <w:hyperlink r:id="rId12" w:history="1">
         <w:r>
@@ -920,8 +946,21 @@
           <w:numId w:val="1"/>
         </w:numPr>
       </w:pPr>
-      <w:r>
-        <w:t>Soil moisture (</w:t>
+      <w:proofErr w:type="spellStart"/>
+      <w:r>
+        <w:t>Soil</w:t>
+      </w:r>
+      <w:proofErr w:type="spellEnd"/>
+      <w:r>
+        <w:t xml:space="preserve"> </w:t>
+      </w:r>
+      <w:proofErr w:type="spellStart"/>
+      <w:r>
+        <w:t>moisture</w:t>
+      </w:r>
+      <w:proofErr w:type="spellEnd"/>
+      <w:r>
+        <w:t xml:space="preserve"> (</w:t>
       </w:r>
       <w:hyperlink r:id="rId13" w:history="1">
         <w:r>
@@ -954,7 +993,15 @@
     <w:p>
       <w:r>
         <w:lastRenderedPageBreak/>
-        <w:t>Arduino batteries (</w:t>
+        <w:t xml:space="preserve">Arduino </w:t>
+      </w:r>
+      <w:proofErr w:type="spellStart"/>
+      <w:r>
+        <w:t>batteries</w:t>
+      </w:r>
+      <w:proofErr w:type="spellEnd"/>
+      <w:r>
+        <w:t xml:space="preserve"> (</w:t>
       </w:r>
       <w:hyperlink r:id="rId15" w:history="1">
         <w:r>
@@ -975,7 +1022,7 @@
           <w:lang w:val="en-GB"/>
         </w:rPr>
       </w:pPr>
-      <w:bookmarkStart w:id="1" w:name="_Toc67265579"/>
+      <w:bookmarkStart w:id="1" w:name="_Toc67349881"/>
       <w:r>
         <w:rPr>
           <w:lang w:val="en-GB"/>
@@ -991,7 +1038,7 @@
           <w:lang w:val="en-GB"/>
         </w:rPr>
       </w:pPr>
-      <w:bookmarkStart w:id="2" w:name="_Toc67265580"/>
+      <w:bookmarkStart w:id="2" w:name="_Toc67349882"/>
       <w:r>
         <w:rPr>
           <w:lang w:val="en-GB"/>
@@ -1041,7 +1088,7 @@
           <w:lang w:val="en-GB"/>
         </w:rPr>
       </w:pPr>
-      <w:bookmarkStart w:id="3" w:name="_Toc67265581"/>
+      <w:bookmarkStart w:id="3" w:name="_Toc67349883"/>
       <w:r>
         <w:rPr>
           <w:lang w:val="en-GB"/>
@@ -1065,7 +1112,21 @@
         <w:rPr>
           <w:lang w:val="en-GB"/>
         </w:rPr>
-        <w:t>Connecting MKR WiFi 1010 to a Wi-Fi network</w:t>
+        <w:t xml:space="preserve">Connecting MKR </w:t>
+      </w:r>
+      <w:proofErr w:type="spellStart"/>
+      <w:r>
+        <w:rPr>
+          <w:lang w:val="en-GB"/>
+        </w:rPr>
+        <w:t>WiFi</w:t>
+      </w:r>
+      <w:proofErr w:type="spellEnd"/>
+      <w:r>
+        <w:rPr>
+          <w:lang w:val="en-GB"/>
+        </w:rPr>
+        <w:t xml:space="preserve"> 1010 to a Wi-Fi network</w:t>
       </w:r>
       <w:r>
         <w:rPr>
@@ -1117,7 +1178,21 @@
         <w:rPr>
           <w:lang w:val="en-GB"/>
         </w:rPr>
-        <w:t>Powering MKR WiFi 1010 with batteries</w:t>
+        <w:t xml:space="preserve">Powering MKR </w:t>
+      </w:r>
+      <w:proofErr w:type="spellStart"/>
+      <w:r>
+        <w:rPr>
+          <w:lang w:val="en-GB"/>
+        </w:rPr>
+        <w:t>WiFi</w:t>
+      </w:r>
+      <w:proofErr w:type="spellEnd"/>
+      <w:r>
+        <w:rPr>
+          <w:lang w:val="en-GB"/>
+        </w:rPr>
+        <w:t xml:space="preserve"> 1010 with batteries</w:t>
       </w:r>
       <w:r>
         <w:rPr>
@@ -1156,7 +1231,21 @@
         <w:rPr>
           <w:lang w:val="en-GB"/>
         </w:rPr>
-        <w:t>Host a web server on the MKR WiFi 1010</w:t>
+        <w:t xml:space="preserve">Host a web server on the MKR </w:t>
+      </w:r>
+      <w:proofErr w:type="spellStart"/>
+      <w:r>
+        <w:rPr>
+          <w:lang w:val="en-GB"/>
+        </w:rPr>
+        <w:t>WiFi</w:t>
+      </w:r>
+      <w:proofErr w:type="spellEnd"/>
+      <w:r>
+        <w:rPr>
+          <w:lang w:val="en-GB"/>
+        </w:rPr>
+        <w:t xml:space="preserve"> 1010</w:t>
       </w:r>
       <w:r>
         <w:rPr>
@@ -1195,7 +1284,21 @@
         <w:rPr>
           <w:lang w:val="en-GB"/>
         </w:rPr>
-        <w:t>How to connect sensors to the MKR WiFi 1010</w:t>
+        <w:t xml:space="preserve">How to connect sensors to the MKR </w:t>
+      </w:r>
+      <w:proofErr w:type="spellStart"/>
+      <w:r>
+        <w:rPr>
+          <w:lang w:val="en-GB"/>
+        </w:rPr>
+        <w:t>WiFi</w:t>
+      </w:r>
+      <w:proofErr w:type="spellEnd"/>
+      <w:r>
+        <w:rPr>
+          <w:lang w:val="en-GB"/>
+        </w:rPr>
+        <w:t xml:space="preserve"> 1010</w:t>
       </w:r>
       <w:r>
         <w:rPr>
@@ -1358,12 +1461,26 @@
           <w:lang w:val="en-GB"/>
         </w:rPr>
       </w:pPr>
-      <w:bookmarkStart w:id="4" w:name="_Toc67265582"/>
-      <w:r>
-        <w:rPr>
-          <w:lang w:val="en-GB"/>
-        </w:rPr>
-        <w:t>Connect to WiFi mobile net</w:t>
+      <w:bookmarkStart w:id="4" w:name="_Toc67349884"/>
+      <w:r>
+        <w:rPr>
+          <w:lang w:val="en-GB"/>
+        </w:rPr>
+        <w:t xml:space="preserve">Connect to </w:t>
+      </w:r>
+      <w:proofErr w:type="spellStart"/>
+      <w:r>
+        <w:rPr>
+          <w:lang w:val="en-GB"/>
+        </w:rPr>
+        <w:t>WiFi</w:t>
+      </w:r>
+      <w:proofErr w:type="spellEnd"/>
+      <w:r>
+        <w:rPr>
+          <w:lang w:val="en-GB"/>
+        </w:rPr>
+        <w:t xml:space="preserve"> mobile net</w:t>
       </w:r>
       <w:r>
         <w:rPr>
@@ -1371,6 +1488,7 @@
         </w:rPr>
         <w:t xml:space="preserve">, send to </w:t>
       </w:r>
+      <w:proofErr w:type="spellStart"/>
       <w:proofErr w:type="gramStart"/>
       <w:r>
         <w:rPr>
@@ -1379,6 +1497,7 @@
         <w:t>ThingSpeak</w:t>
       </w:r>
       <w:bookmarkEnd w:id="4"/>
+      <w:proofErr w:type="spellEnd"/>
       <w:proofErr w:type="gramEnd"/>
     </w:p>
     <w:p>
@@ -1391,7 +1510,21 @@
         <w:rPr>
           <w:lang w:val="en-GB"/>
         </w:rPr>
-        <w:t xml:space="preserve">Configure MatLab for recognizing </w:t>
+        <w:t xml:space="preserve">Configure </w:t>
+      </w:r>
+      <w:proofErr w:type="spellStart"/>
+      <w:r>
+        <w:rPr>
+          <w:lang w:val="en-GB"/>
+        </w:rPr>
+        <w:t>MatLab</w:t>
+      </w:r>
+      <w:proofErr w:type="spellEnd"/>
+      <w:r>
+        <w:rPr>
+          <w:lang w:val="en-GB"/>
+        </w:rPr>
+        <w:t xml:space="preserve"> for recognizing </w:t>
       </w:r>
       <w:r>
         <w:rPr>
@@ -1399,56 +1532,142 @@
         </w:rPr>
         <w:t xml:space="preserve">this specific board in USB mode. </w:t>
       </w:r>
-      <w:r>
-        <w:rPr>
-          <w:lang w:val="en-GB"/>
-        </w:rPr>
-        <w:t>Simluation -&gt; Model Settings -&gt; Hardware (Select board, and configure WiFi)</w:t>
-      </w:r>
-    </w:p>
-    <w:p>
-      <w:pPr>
-        <w:rPr>
-          <w:lang w:val="en-GB"/>
-        </w:rPr>
-      </w:pPr>
-      <w:r>
-        <w:rPr>
-          <w:lang w:val="en-GB"/>
-        </w:rPr>
-        <w:t>Set ThingSpeak channel</w:t>
-      </w:r>
-    </w:p>
-    <w:p>
-      <w:pPr>
-        <w:rPr>
-          <w:lang w:val="en-GB"/>
-        </w:rPr>
-      </w:pPr>
-      <w:r>
-        <w:rPr>
-          <w:lang w:val="en-GB"/>
-        </w:rPr>
-        <w:t>Sdlrtkernet -setup</w:t>
-      </w:r>
-    </w:p>
-    <w:p>
-      <w:pPr>
-        <w:rPr>
-          <w:lang w:val="en-GB"/>
-        </w:rPr>
-      </w:pPr>
-      <w:r>
-        <w:rPr>
-          <w:lang w:val="en-GB"/>
-        </w:rPr>
-        <w:t>Configure Analog out (soil moisture) to ThingSpeak write</w:t>
-      </w:r>
-      <w:r>
-        <w:rPr>
-          <w:lang w:val="en-GB"/>
-        </w:rPr>
-        <w:t xml:space="preserve"> (standard Thingspeak write is working but cannot be integrated in Arduino, just simulation, Arduino specific Thingspeak write is sending 0 always as the value </w:t>
+      <w:proofErr w:type="spellStart"/>
+      <w:r>
+        <w:rPr>
+          <w:lang w:val="en-GB"/>
+        </w:rPr>
+        <w:t>Simluation</w:t>
+      </w:r>
+      <w:proofErr w:type="spellEnd"/>
+      <w:r>
+        <w:rPr>
+          <w:lang w:val="en-GB"/>
+        </w:rPr>
+        <w:t xml:space="preserve"> -&gt; Model Settings -&gt; Hardware (Select board, and configure </w:t>
+      </w:r>
+      <w:proofErr w:type="spellStart"/>
+      <w:r>
+        <w:rPr>
+          <w:lang w:val="en-GB"/>
+        </w:rPr>
+        <w:t>WiFi</w:t>
+      </w:r>
+      <w:proofErr w:type="spellEnd"/>
+      <w:r>
+        <w:rPr>
+          <w:lang w:val="en-GB"/>
+        </w:rPr>
+        <w:t>)</w:t>
+      </w:r>
+    </w:p>
+    <w:p>
+      <w:pPr>
+        <w:rPr>
+          <w:lang w:val="en-GB"/>
+        </w:rPr>
+      </w:pPr>
+      <w:r>
+        <w:rPr>
+          <w:lang w:val="en-GB"/>
+        </w:rPr>
+        <w:t xml:space="preserve">Set </w:t>
+      </w:r>
+      <w:proofErr w:type="spellStart"/>
+      <w:r>
+        <w:rPr>
+          <w:lang w:val="en-GB"/>
+        </w:rPr>
+        <w:t>ThingSpeak</w:t>
+      </w:r>
+      <w:proofErr w:type="spellEnd"/>
+      <w:r>
+        <w:rPr>
+          <w:lang w:val="en-GB"/>
+        </w:rPr>
+        <w:t xml:space="preserve"> channel</w:t>
+      </w:r>
+    </w:p>
+    <w:p>
+      <w:pPr>
+        <w:rPr>
+          <w:lang w:val="en-GB"/>
+        </w:rPr>
+      </w:pPr>
+      <w:proofErr w:type="spellStart"/>
+      <w:r>
+        <w:rPr>
+          <w:lang w:val="en-GB"/>
+        </w:rPr>
+        <w:t>Sdlrtkernet</w:t>
+      </w:r>
+      <w:proofErr w:type="spellEnd"/>
+      <w:r>
+        <w:rPr>
+          <w:lang w:val="en-GB"/>
+        </w:rPr>
+        <w:t xml:space="preserve"> -setup</w:t>
+      </w:r>
+    </w:p>
+    <w:p>
+      <w:pPr>
+        <w:rPr>
+          <w:lang w:val="en-GB"/>
+        </w:rPr>
+      </w:pPr>
+      <w:r>
+        <w:rPr>
+          <w:lang w:val="en-GB"/>
+        </w:rPr>
+        <w:t xml:space="preserve">Configure Analog out (soil moisture) to </w:t>
+      </w:r>
+      <w:proofErr w:type="spellStart"/>
+      <w:r>
+        <w:rPr>
+          <w:lang w:val="en-GB"/>
+        </w:rPr>
+        <w:t>ThingSpeak</w:t>
+      </w:r>
+      <w:proofErr w:type="spellEnd"/>
+      <w:r>
+        <w:rPr>
+          <w:lang w:val="en-GB"/>
+        </w:rPr>
+        <w:t xml:space="preserve"> write</w:t>
+      </w:r>
+      <w:r>
+        <w:rPr>
+          <w:lang w:val="en-GB"/>
+        </w:rPr>
+        <w:t xml:space="preserve"> (standard </w:t>
+      </w:r>
+      <w:proofErr w:type="spellStart"/>
+      <w:r>
+        <w:rPr>
+          <w:lang w:val="en-GB"/>
+        </w:rPr>
+        <w:t>Thingspeak</w:t>
+      </w:r>
+      <w:proofErr w:type="spellEnd"/>
+      <w:r>
+        <w:rPr>
+          <w:lang w:val="en-GB"/>
+        </w:rPr>
+        <w:t xml:space="preserve"> write is working but cannot be integrated in Arduino, just simulation, Arduino specific </w:t>
+      </w:r>
+      <w:proofErr w:type="spellStart"/>
+      <w:r>
+        <w:rPr>
+          <w:lang w:val="en-GB"/>
+        </w:rPr>
+        <w:t>Thingspeak</w:t>
+      </w:r>
+      <w:proofErr w:type="spellEnd"/>
+      <w:r>
+        <w:rPr>
+          <w:lang w:val="en-GB"/>
+        </w:rPr>
+        <w:t xml:space="preserve"> write is sending 0 always as the value </w:t>
       </w:r>
       <w:hyperlink r:id="rId25" w:history="1">
         <w:r>
@@ -1491,13 +1710,55 @@
         <w:rPr>
           <w:lang w:val="en-GB"/>
         </w:rPr>
-        <w:t>) created by MathWorks that permits writing and reading from ThingSpeak through the Arduino IDE I get a program that publish there correctly.</w:t>
-      </w:r>
-      <w:r>
-        <w:rPr>
-          <w:lang w:val="en-GB"/>
-        </w:rPr>
-        <w:t xml:space="preserve"> After installing ThingSpeak library in the IDE.</w:t>
+        <w:t xml:space="preserve">) created by MathWorks that permits writing and reading from </w:t>
+      </w:r>
+      <w:proofErr w:type="spellStart"/>
+      <w:r>
+        <w:rPr>
+          <w:lang w:val="en-GB"/>
+        </w:rPr>
+        <w:t>ThingSpeak</w:t>
+      </w:r>
+      <w:proofErr w:type="spellEnd"/>
+      <w:r>
+        <w:rPr>
+          <w:lang w:val="en-GB"/>
+        </w:rPr>
+        <w:t xml:space="preserve"> through the Arduino IDE I get a program that publish </w:t>
+      </w:r>
+      <w:proofErr w:type="spellStart"/>
+      <w:r>
+        <w:rPr>
+          <w:lang w:val="en-GB"/>
+        </w:rPr>
+        <w:t>there</w:t>
+      </w:r>
+      <w:proofErr w:type="spellEnd"/>
+      <w:r>
+        <w:rPr>
+          <w:lang w:val="en-GB"/>
+        </w:rPr>
+        <w:t xml:space="preserve"> correctly.</w:t>
+      </w:r>
+      <w:r>
+        <w:rPr>
+          <w:lang w:val="en-GB"/>
+        </w:rPr>
+        <w:t xml:space="preserve"> After installing </w:t>
+      </w:r>
+      <w:proofErr w:type="spellStart"/>
+      <w:r>
+        <w:rPr>
+          <w:lang w:val="en-GB"/>
+        </w:rPr>
+        <w:t>ThingSpeak</w:t>
+      </w:r>
+      <w:proofErr w:type="spellEnd"/>
+      <w:r>
+        <w:rPr>
+          <w:lang w:val="en-GB"/>
+        </w:rPr>
+        <w:t xml:space="preserve"> library in the IDE.</w:t>
       </w:r>
     </w:p>
     <w:p>
@@ -1555,13 +1816,21 @@
           <w:lang w:val="en-GB"/>
         </w:rPr>
       </w:pPr>
-      <w:bookmarkStart w:id="5" w:name="_Toc67265583"/>
+      <w:bookmarkStart w:id="5" w:name="_Toc67349885"/>
+      <w:proofErr w:type="spellStart"/>
       <w:r>
         <w:rPr>
           <w:lang w:val="en-GB"/>
         </w:rPr>
         <w:lastRenderedPageBreak/>
-        <w:t>Matlab/Simulink</w:t>
+        <w:t>Matlab</w:t>
+      </w:r>
+      <w:proofErr w:type="spellEnd"/>
+      <w:r>
+        <w:rPr>
+          <w:lang w:val="en-GB"/>
+        </w:rPr>
+        <w:t>/Simulink</w:t>
       </w:r>
       <w:bookmarkEnd w:id="5"/>
     </w:p>
@@ -1572,7 +1841,7 @@
           <w:lang w:val="en-GB"/>
         </w:rPr>
       </w:pPr>
-      <w:bookmarkStart w:id="6" w:name="_Toc67265584"/>
+      <w:bookmarkStart w:id="6" w:name="_Toc67349886"/>
       <w:r>
         <w:rPr>
           <w:lang w:val="en-GB"/>
@@ -1596,7 +1865,21 @@
         <w:rPr>
           <w:lang w:val="en-GB"/>
         </w:rPr>
-        <w:t>Installation including all simulink components.</w:t>
+        <w:t xml:space="preserve">Installation including all </w:t>
+      </w:r>
+      <w:proofErr w:type="spellStart"/>
+      <w:r>
+        <w:rPr>
+          <w:lang w:val="en-GB"/>
+        </w:rPr>
+        <w:t>simulink</w:t>
+      </w:r>
+      <w:proofErr w:type="spellEnd"/>
+      <w:r>
+        <w:rPr>
+          <w:lang w:val="en-GB"/>
+        </w:rPr>
+        <w:t xml:space="preserve"> components.</w:t>
       </w:r>
     </w:p>
     <w:p>
@@ -1607,8 +1890,21 @@
           <w:numId w:val="2"/>
         </w:numPr>
       </w:pPr>
-      <w:r>
-        <w:t>MinGW (C/C++ compiler)</w:t>
+      <w:proofErr w:type="spellStart"/>
+      <w:r>
+        <w:t>MinGW</w:t>
+      </w:r>
+      <w:proofErr w:type="spellEnd"/>
+      <w:r>
+        <w:t xml:space="preserve"> (C/C++ </w:t>
+      </w:r>
+      <w:proofErr w:type="spellStart"/>
+      <w:r>
+        <w:t>compiler</w:t>
+      </w:r>
+      <w:proofErr w:type="spellEnd"/>
+      <w:r>
+        <w:t>)</w:t>
       </w:r>
     </w:p>
     <w:p>
@@ -1619,8 +1915,29 @@
           <w:numId w:val="2"/>
         </w:numPr>
       </w:pPr>
-      <w:r>
-        <w:t>Support Package for Arduino</w:t>
+      <w:proofErr w:type="spellStart"/>
+      <w:r>
+        <w:t>Support</w:t>
+      </w:r>
+      <w:proofErr w:type="spellEnd"/>
+      <w:r>
+        <w:t xml:space="preserve"> </w:t>
+      </w:r>
+      <w:proofErr w:type="spellStart"/>
+      <w:r>
+        <w:t>Package</w:t>
+      </w:r>
+      <w:proofErr w:type="spellEnd"/>
+      <w:r>
+        <w:t xml:space="preserve"> </w:t>
+      </w:r>
+      <w:proofErr w:type="spellStart"/>
+      <w:r>
+        <w:t>for</w:t>
+      </w:r>
+      <w:proofErr w:type="spellEnd"/>
+      <w:r>
+        <w:t xml:space="preserve"> Arduino</w:t>
       </w:r>
     </w:p>
     <w:p>
@@ -1654,7 +1971,7 @@
           <w:lang w:val="en-GB"/>
         </w:rPr>
       </w:pPr>
-      <w:bookmarkStart w:id="7" w:name="_Toc67265585"/>
+      <w:bookmarkStart w:id="7" w:name="_Toc67349887"/>
       <w:r>
         <w:rPr>
           <w:lang w:val="en-GB"/>
@@ -1677,7 +1994,7 @@
           <w:lang w:val="en-GB"/>
         </w:rPr>
       </w:pPr>
-      <w:bookmarkStart w:id="8" w:name="_Toc67265586"/>
+      <w:bookmarkStart w:id="8" w:name="_Toc67349888"/>
       <w:r>
         <w:rPr>
           <w:lang w:val="en-GB"/>
@@ -1693,12 +2010,20 @@
           <w:lang w:val="en-GB"/>
         </w:rPr>
       </w:pPr>
-      <w:bookmarkStart w:id="9" w:name="_Toc67265587"/>
-      <w:r>
-        <w:rPr>
-          <w:lang w:val="en-GB"/>
-        </w:rPr>
-        <w:t>Thingspeak data</w:t>
+      <w:bookmarkStart w:id="9" w:name="_Toc67349889"/>
+      <w:proofErr w:type="spellStart"/>
+      <w:r>
+        <w:rPr>
+          <w:lang w:val="en-GB"/>
+        </w:rPr>
+        <w:t>Thingspeak</w:t>
+      </w:r>
+      <w:proofErr w:type="spellEnd"/>
+      <w:r>
+        <w:rPr>
+          <w:lang w:val="en-GB"/>
+        </w:rPr>
+        <w:t xml:space="preserve"> data</w:t>
       </w:r>
       <w:r>
         <w:rPr>
@@ -1710,15 +2035,43 @@
     </w:p>
     <w:p>
       <w:pPr>
-        <w:rPr>
-          <w:lang w:val="en-GB"/>
-        </w:rPr>
-      </w:pPr>
-      <w:r>
-        <w:rPr>
-          <w:lang w:val="en-GB"/>
-        </w:rPr>
-        <w:t>Starting with the first demo following what Victor tought us about a simple app displaying a cube that I already had, I start investigating about how to run a Python script in Unity.</w:t>
+        <w:pStyle w:val="Heading4"/>
+        <w:rPr>
+          <w:lang w:val="en-GB"/>
+        </w:rPr>
+      </w:pPr>
+      <w:r>
+        <w:rPr>
+          <w:lang w:val="en-GB"/>
+        </w:rPr>
+        <w:t>Python in Unity</w:t>
+      </w:r>
+    </w:p>
+    <w:p>
+      <w:pPr>
+        <w:rPr>
+          <w:lang w:val="en-GB"/>
+        </w:rPr>
+      </w:pPr>
+      <w:r>
+        <w:rPr>
+          <w:lang w:val="en-GB"/>
+        </w:rPr>
+        <w:t xml:space="preserve">Starting with the first demo following what Victor </w:t>
+      </w:r>
+      <w:proofErr w:type="spellStart"/>
+      <w:r>
+        <w:rPr>
+          <w:lang w:val="en-GB"/>
+        </w:rPr>
+        <w:t>tought</w:t>
+      </w:r>
+      <w:proofErr w:type="spellEnd"/>
+      <w:r>
+        <w:rPr>
+          <w:lang w:val="en-GB"/>
+        </w:rPr>
+        <w:t xml:space="preserve"> us about a simple app displaying a cube that I already had, I start investigating about how to run a Python script in Unity.</w:t>
       </w:r>
     </w:p>
     <w:p>
@@ -1873,27 +2226,7 @@
             <w:shd w:val="clear" w:color="auto" w:fill="FAFAFA"/>
             <w:lang w:val="en-GB"/>
           </w:rPr>
-          <w:t>https://developers.google.c</w:t>
-        </w:r>
-        <w:r>
-          <w:rPr>
-            <w:rStyle w:val="Hyperlink"/>
-            <w:rFonts w:ascii="Arial" w:hAnsi="Arial" w:cs="Arial"/>
-            <w:color w:val="5284BD"/>
-            <w:shd w:val="clear" w:color="auto" w:fill="FAFAFA"/>
-            <w:lang w:val="en-GB"/>
-          </w:rPr>
-          <w:t>o</w:t>
-        </w:r>
-        <w:r>
-          <w:rPr>
-            <w:rStyle w:val="Hyperlink"/>
-            <w:rFonts w:ascii="Arial" w:hAnsi="Arial" w:cs="Arial"/>
-            <w:color w:val="5284BD"/>
-            <w:shd w:val="clear" w:color="auto" w:fill="FAFAFA"/>
-            <w:lang w:val="en-GB"/>
-          </w:rPr>
-          <w:t>m/cardboard/develop/unity/quickstart</w:t>
+          <w:t>https://developers.google.com/cardboard/develop/unity/quickstart</w:t>
         </w:r>
       </w:hyperlink>
       <w:r>
@@ -1919,7 +2252,27 @@
           <w:shd w:val="clear" w:color="auto" w:fill="FAFAFA"/>
           <w:lang w:val="en-GB"/>
         </w:rPr>
-        <w:t>See google's suggestions here: </w:t>
+        <w:t xml:space="preserve">See </w:t>
+      </w:r>
+      <w:proofErr w:type="spellStart"/>
+      <w:r>
+        <w:rPr>
+          <w:rFonts w:ascii="Arial" w:hAnsi="Arial" w:cs="Arial"/>
+          <w:color w:val="333333"/>
+          <w:shd w:val="clear" w:color="auto" w:fill="FAFAFA"/>
+          <w:lang w:val="en-GB"/>
+        </w:rPr>
+        <w:t>google's</w:t>
+      </w:r>
+      <w:proofErr w:type="spellEnd"/>
+      <w:r>
+        <w:rPr>
+          <w:rFonts w:ascii="Arial" w:hAnsi="Arial" w:cs="Arial"/>
+          <w:color w:val="333333"/>
+          <w:shd w:val="clear" w:color="auto" w:fill="FAFAFA"/>
+          <w:lang w:val="en-GB"/>
+        </w:rPr>
+        <w:t xml:space="preserve"> suggestions here: </w:t>
       </w:r>
       <w:hyperlink r:id="rId30" w:tgtFrame="_blank" w:history="1">
         <w:r>
@@ -2000,7 +2353,21 @@
         <w:rPr>
           <w:lang w:val="en-GB"/>
         </w:rPr>
-        <w:t>Import Hello Cardboad from the Package Manager</w:t>
+        <w:t xml:space="preserve">Import Hello </w:t>
+      </w:r>
+      <w:proofErr w:type="spellStart"/>
+      <w:r>
+        <w:rPr>
+          <w:lang w:val="en-GB"/>
+        </w:rPr>
+        <w:t>Cardboad</w:t>
+      </w:r>
+      <w:proofErr w:type="spellEnd"/>
+      <w:r>
+        <w:rPr>
+          <w:lang w:val="en-GB"/>
+        </w:rPr>
+        <w:t xml:space="preserve"> from the Package Manager</w:t>
       </w:r>
     </w:p>
     <w:p>
@@ -2041,6 +2408,7 @@
         <w:rPr>
           <w:lang w:val="en-GB"/>
         </w:rPr>
+        <w:lastRenderedPageBreak/>
         <w:t>Guide for installing Python in Unity (</w:t>
       </w:r>
       <w:hyperlink r:id="rId34" w:history="1">
@@ -2069,7 +2437,6 @@
         <w:rPr>
           <w:lang w:val="en-GB"/>
         </w:rPr>
-        <w:lastRenderedPageBreak/>
         <w:t xml:space="preserve">Python for Unity </w:t>
       </w:r>
       <w:r>
@@ -2150,6 +2517,120 @@
         </w:rPr>
         <w:t>.</w:t>
       </w:r>
+      <w:r>
+        <w:rPr>
+          <w:lang w:val="en-GB"/>
+        </w:rPr>
+        <w:t xml:space="preserve"> </w:t>
+      </w:r>
+      <w:proofErr w:type="gramStart"/>
+      <w:r>
+        <w:rPr>
+          <w:lang w:val="en-GB"/>
+        </w:rPr>
+        <w:t>In order to</w:t>
+      </w:r>
+      <w:proofErr w:type="gramEnd"/>
+      <w:r>
+        <w:rPr>
+          <w:lang w:val="en-GB"/>
+        </w:rPr>
+        <w:t xml:space="preserve"> work, add it to the PATH (</w:t>
+      </w:r>
+      <w:hyperlink r:id="rId36" w:history="1">
+        <w:r>
+          <w:rPr>
+            <w:rStyle w:val="Hyperlink"/>
+            <w:lang w:val="en-GB"/>
+          </w:rPr>
+          <w:t>https://appuals.com/fix-pip-is-not-recognized-as-an-internal-or-external-command</w:t>
+        </w:r>
+      </w:hyperlink>
+      <w:r>
+        <w:rPr>
+          <w:lang w:val="en-GB"/>
+        </w:rPr>
+        <w:t>) C:\Python27\Scripts</w:t>
+      </w:r>
+    </w:p>
+    <w:p>
+      <w:pPr>
+        <w:rPr>
+          <w:lang w:val="en-GB"/>
+        </w:rPr>
+      </w:pPr>
+      <w:r>
+        <w:rPr>
+          <w:lang w:val="en-GB"/>
+        </w:rPr>
+        <w:t xml:space="preserve">We should add the dependency manually to </w:t>
+      </w:r>
+      <w:proofErr w:type="gramStart"/>
+      <w:r>
+        <w:rPr>
+          <w:lang w:val="en-GB"/>
+        </w:rPr>
+        <w:t>VAR_AUB\Packages\</w:t>
+      </w:r>
+      <w:proofErr w:type="spellStart"/>
+      <w:r>
+        <w:rPr>
+          <w:lang w:val="en-GB"/>
+        </w:rPr>
+        <w:t>manifest.json</w:t>
+      </w:r>
+      <w:proofErr w:type="spellEnd"/>
+      <w:proofErr w:type="gramEnd"/>
+    </w:p>
+    <w:p>
+      <w:pPr>
+        <w:rPr>
+          <w:b/>
+          <w:bCs/>
+          <w:lang w:val="en-GB"/>
+        </w:rPr>
+      </w:pPr>
+      <w:r>
+        <w:rPr>
+          <w:lang w:val="en-GB"/>
+        </w:rPr>
+        <w:t>Python editor in Unity is just an editor for the moment, not for runtime executions</w:t>
+      </w:r>
+      <w:r>
+        <w:rPr>
+          <w:lang w:val="en-GB"/>
+        </w:rPr>
+        <w:t>.</w:t>
+      </w:r>
+      <w:r>
+        <w:rPr>
+          <w:b/>
+          <w:bCs/>
+          <w:lang w:val="en-GB"/>
+        </w:rPr>
+        <w:t xml:space="preserve"> I discard this idea.</w:t>
+      </w:r>
+    </w:p>
+    <w:p>
+      <w:pPr>
+        <w:pStyle w:val="Heading4"/>
+        <w:rPr>
+          <w:lang w:val="en-GB"/>
+        </w:rPr>
+      </w:pPr>
+      <w:r>
+        <w:rPr>
+          <w:lang w:val="en-GB"/>
+        </w:rPr>
+        <w:t>C# in Unity</w:t>
+      </w:r>
+    </w:p>
+    <w:p>
+      <w:pPr>
+        <w:rPr>
+          <w:lang w:val="en-GB"/>
+        </w:rPr>
+      </w:pPr>
     </w:p>
     <w:p>
       <w:pPr>
@@ -3217,6 +3698,28 @@
       <w:szCs w:val="24"/>
     </w:rPr>
   </w:style>
+  <w:style w:type="paragraph" w:styleId="Heading4">
+    <w:name w:val="heading 4"/>
+    <w:basedOn w:val="Normal"/>
+    <w:next w:val="Normal"/>
+    <w:link w:val="Heading4Char"/>
+    <w:uiPriority w:val="9"/>
+    <w:unhideWhenUsed/>
+    <w:qFormat/>
+    <w:rsid w:val="00422D6A"/>
+    <w:pPr>
+      <w:keepNext/>
+      <w:keepLines/>
+      <w:spacing w:before="40" w:after="0"/>
+      <w:outlineLvl w:val="3"/>
+    </w:pPr>
+    <w:rPr>
+      <w:rFonts w:asciiTheme="majorHAnsi" w:eastAsiaTheme="majorEastAsia" w:hAnsiTheme="majorHAnsi" w:cstheme="majorBidi"/>
+      <w:i/>
+      <w:iCs/>
+      <w:color w:val="2F5496" w:themeColor="accent1" w:themeShade="BF"/>
+    </w:rPr>
+  </w:style>
   <w:style w:type="character" w:default="1" w:styleId="DefaultParagraphFont">
     <w:name w:val="Default Paragraph Font"/>
     <w:uiPriority w:val="1"/>
@@ -3411,6 +3914,19 @@
     <w:rPr>
       <w:color w:val="954F72" w:themeColor="followedHyperlink"/>
       <w:u w:val="single"/>
+    </w:rPr>
+  </w:style>
+  <w:style w:type="character" w:customStyle="1" w:styleId="Heading4Char">
+    <w:name w:val="Heading 4 Char"/>
+    <w:basedOn w:val="DefaultParagraphFont"/>
+    <w:link w:val="Heading4"/>
+    <w:uiPriority w:val="9"/>
+    <w:rsid w:val="00422D6A"/>
+    <w:rPr>
+      <w:rFonts w:asciiTheme="majorHAnsi" w:eastAsiaTheme="majorEastAsia" w:hAnsiTheme="majorHAnsi" w:cstheme="majorBidi"/>
+      <w:i/>
+      <w:iCs/>
+      <w:color w:val="2F5496" w:themeColor="accent1" w:themeShade="BF"/>
     </w:rPr>
   </w:style>
 </w:styles>
@@ -3712,12 +4228,6 @@
 </file>
 
 <file path=customXml/item1.xml><?xml version="1.0" encoding="utf-8"?>
-<p:properties xmlns:p="http://schemas.microsoft.com/office/2006/metadata/properties" xmlns:xsi="http://www.w3.org/2001/XMLSchema-instance" xmlns:pc="http://schemas.microsoft.com/office/infopath/2007/PartnerControls">
-  <documentManagement/>
-</p:properties>
-</file>
-
-<file path=customXml/item2.xml><?xml version="1.0" encoding="utf-8"?>
 <?mso-contentType ?>
 <FormTemplates xmlns="http://schemas.microsoft.com/sharepoint/v3/contenttype/forms">
   <Display>DocumentLibraryForm</Display>
@@ -3726,7 +4236,17 @@
 </FormTemplates>
 </file>
 
+<file path=customXml/item2.xml><?xml version="1.0" encoding="utf-8"?>
+<p:properties xmlns:p="http://schemas.microsoft.com/office/2006/metadata/properties" xmlns:xsi="http://www.w3.org/2001/XMLSchema-instance" xmlns:pc="http://schemas.microsoft.com/office/infopath/2007/PartnerControls">
+  <documentManagement/>
+</p:properties>
+</file>
+
 <file path=customXml/item3.xml><?xml version="1.0" encoding="utf-8"?>
+<b:Sources xmlns:b="http://schemas.openxmlformats.org/officeDocument/2006/bibliography" xmlns="http://schemas.openxmlformats.org/officeDocument/2006/bibliography" SelectedStyle="\APASixthEditionOfficeOnline.xsl" StyleName="APA" Version="6"/>
+</file>
+
+<file path=customXml/item4.xml><?xml version="1.0" encoding="utf-8"?>
 <ct:contentTypeSchema xmlns:ct="http://schemas.microsoft.com/office/2006/metadata/contentType" xmlns:ma="http://schemas.microsoft.com/office/2006/metadata/properties/metaAttributes" ct:_="" ma:_="" ma:contentTypeName="Documento" ma:contentTypeID="0x010100476C80DBA2A885449FD8B645A4D4C6FE" ma:contentTypeVersion="12" ma:contentTypeDescription="Crear nuevo documento." ma:contentTypeScope="" ma:versionID="c694e10bb6fe923b7bf09275a2383295">
   <xsd:schema xmlns:xsd="http://www.w3.org/2001/XMLSchema" xmlns:xs="http://www.w3.org/2001/XMLSchema" xmlns:p="http://schemas.microsoft.com/office/2006/metadata/properties" xmlns:ns3="f161e47d-169b-4aff-b47c-84b5e15d4deb" xmlns:ns4="5e6cfdc5-b52e-4221-a343-85db301e0661" targetNamespace="http://schemas.microsoft.com/office/2006/metadata/properties" ma:root="true" ma:fieldsID="ef5fedb621caa12722fd75c7929cb79a" ns3:_="" ns4:_="">
     <xsd:import namespace="f161e47d-169b-4aff-b47c-84b5e15d4deb"/>
@@ -3943,11 +4463,15 @@
 </ct:contentTypeSchema>
 </file>
 
-<file path=customXml/item4.xml><?xml version="1.0" encoding="utf-8"?>
-<b:Sources xmlns:b="http://schemas.openxmlformats.org/officeDocument/2006/bibliography" xmlns="http://schemas.openxmlformats.org/officeDocument/2006/bibliography" SelectedStyle="\APASixthEditionOfficeOnline.xsl" StyleName="APA" Version="6"/>
+<file path=customXml/itemProps1.xml><?xml version="1.0" encoding="utf-8"?>
+<ds:datastoreItem xmlns:ds="http://schemas.openxmlformats.org/officeDocument/2006/customXml" ds:itemID="{69B63455-D79A-4881-AE27-C458E95494A8}">
+  <ds:schemaRefs>
+    <ds:schemaRef ds:uri="http://schemas.microsoft.com/sharepoint/v3/contenttype/forms"/>
+  </ds:schemaRefs>
+</ds:datastoreItem>
 </file>
 
-<file path=customXml/itemProps1.xml><?xml version="1.0" encoding="utf-8"?>
+<file path=customXml/itemProps2.xml><?xml version="1.0" encoding="utf-8"?>
 <ds:datastoreItem xmlns:ds="http://schemas.openxmlformats.org/officeDocument/2006/customXml" ds:itemID="{57A0A09F-D7A2-43D0-A17E-3CCE9A625C60}">
   <ds:schemaRefs>
     <ds:schemaRef ds:uri="http://schemas.microsoft.com/office/2006/metadata/properties"/>
@@ -3956,15 +4480,15 @@
 </ds:datastoreItem>
 </file>
 
-<file path=customXml/itemProps2.xml><?xml version="1.0" encoding="utf-8"?>
-<ds:datastoreItem xmlns:ds="http://schemas.openxmlformats.org/officeDocument/2006/customXml" ds:itemID="{69B63455-D79A-4881-AE27-C458E95494A8}">
+<file path=customXml/itemProps3.xml><?xml version="1.0" encoding="utf-8"?>
+<ds:datastoreItem xmlns:ds="http://schemas.openxmlformats.org/officeDocument/2006/customXml" ds:itemID="{36376837-F33B-427F-8D83-C113DE7E32E8}">
   <ds:schemaRefs>
-    <ds:schemaRef ds:uri="http://schemas.microsoft.com/sharepoint/v3/contenttype/forms"/>
+    <ds:schemaRef ds:uri="http://schemas.openxmlformats.org/officeDocument/2006/bibliography"/>
   </ds:schemaRefs>
 </ds:datastoreItem>
 </file>
 
-<file path=customXml/itemProps3.xml><?xml version="1.0" encoding="utf-8"?>
+<file path=customXml/itemProps4.xml><?xml version="1.0" encoding="utf-8"?>
 <ds:datastoreItem xmlns:ds="http://schemas.openxmlformats.org/officeDocument/2006/customXml" ds:itemID="{0B2E499F-48D1-41DE-8858-034DC7EBF65E}">
   <ds:schemaRefs>
     <ds:schemaRef ds:uri="http://schemas.microsoft.com/office/2006/metadata/contentType"/>
@@ -3981,12 +4505,4 @@
     <ds:schemaRef ds:uri="http://schemas.microsoft.com/internal/obd"/>
   </ds:schemaRefs>
 </ds:datastoreItem>
-</file>
-
-<file path=customXml/itemProps4.xml><?xml version="1.0" encoding="utf-8"?>
-<ds:datastoreItem xmlns:ds="http://schemas.openxmlformats.org/officeDocument/2006/customXml" ds:itemID="{36376837-F33B-427F-8D83-C113DE7E32E8}">
-  <ds:schemaRefs>
-    <ds:schemaRef ds:uri="http://schemas.openxmlformats.org/officeDocument/2006/bibliography"/>
-  </ds:schemaRefs>
-</ds:datastoreItem>
 </file>
</xml_diff>

<commit_message>
Add C# Thingspeak retrieve data
</commit_message>
<xml_diff>
--- a/Documentation/General/Notes.docx
+++ b/Documentation/General/Notes.docx
@@ -37,11 +37,9 @@
           <w:pPr>
             <w:pStyle w:val="TOCHeading"/>
           </w:pPr>
-          <w:proofErr w:type="spellStart"/>
           <w:r>
             <w:t>Contents</w:t>
           </w:r>
-          <w:proofErr w:type="spellEnd"/>
         </w:p>
         <w:p>
           <w:pPr>
@@ -802,21 +800,7 @@
         <w:rPr>
           <w:lang w:val="en-GB"/>
         </w:rPr>
-        <w:t xml:space="preserve">Arduino MKR 1010 </w:t>
-      </w:r>
-      <w:proofErr w:type="spellStart"/>
-      <w:r>
-        <w:rPr>
-          <w:lang w:val="en-GB"/>
-        </w:rPr>
-        <w:t>Wifi</w:t>
-      </w:r>
-      <w:proofErr w:type="spellEnd"/>
-      <w:r>
-        <w:rPr>
-          <w:lang w:val="en-GB"/>
-        </w:rPr>
-        <w:t xml:space="preserve"> (</w:t>
+        <w:t>Arduino MKR 1010 Wifi (</w:t>
       </w:r>
       <w:hyperlink r:id="rId9" w:history="1">
         <w:r>
@@ -835,13 +819,8 @@
       </w:r>
     </w:p>
     <w:p>
-      <w:proofErr w:type="spellStart"/>
-      <w:r>
-        <w:t>Sensors</w:t>
-      </w:r>
-      <w:proofErr w:type="spellEnd"/>
-      <w:r>
-        <w:t>:</w:t>
+      <w:r>
+        <w:t>Sensors:</w:t>
       </w:r>
     </w:p>
     <w:p>
@@ -918,13 +897,8 @@
           <w:numId w:val="1"/>
         </w:numPr>
       </w:pPr>
-      <w:proofErr w:type="spellStart"/>
-      <w:r>
-        <w:t>Temperature</w:t>
-      </w:r>
-      <w:proofErr w:type="spellEnd"/>
-      <w:r>
-        <w:t xml:space="preserve"> (</w:t>
+      <w:r>
+        <w:t>Temperature (</w:t>
       </w:r>
       <w:hyperlink r:id="rId12" w:history="1">
         <w:r>
@@ -946,21 +920,14 @@
           <w:numId w:val="1"/>
         </w:numPr>
       </w:pPr>
-      <w:proofErr w:type="spellStart"/>
-      <w:r>
-        <w:t>Soil</w:t>
-      </w:r>
-      <w:proofErr w:type="spellEnd"/>
-      <w:r>
-        <w:t xml:space="preserve"> </w:t>
-      </w:r>
-      <w:proofErr w:type="spellStart"/>
-      <w:r>
-        <w:t>moisture</w:t>
-      </w:r>
-      <w:proofErr w:type="spellEnd"/>
-      <w:r>
-        <w:t xml:space="preserve"> (</w:t>
+      <w:r>
+        <w:t xml:space="preserve">Soil moisture </w:t>
+      </w:r>
+      <w:r>
+        <w:t xml:space="preserve">(ml/cubic centimetre) </w:t>
+      </w:r>
+      <w:r>
+        <w:t>(</w:t>
       </w:r>
       <w:hyperlink r:id="rId13" w:history="1">
         <w:r>
@@ -993,15 +960,7 @@
     <w:p>
       <w:r>
         <w:lastRenderedPageBreak/>
-        <w:t xml:space="preserve">Arduino </w:t>
-      </w:r>
-      <w:proofErr w:type="spellStart"/>
-      <w:r>
-        <w:t>batteries</w:t>
-      </w:r>
-      <w:proofErr w:type="spellEnd"/>
-      <w:r>
-        <w:t xml:space="preserve"> (</w:t>
+        <w:t>Arduino batteries (</w:t>
       </w:r>
       <w:hyperlink r:id="rId15" w:history="1">
         <w:r>
@@ -1112,21 +1071,7 @@
         <w:rPr>
           <w:lang w:val="en-GB"/>
         </w:rPr>
-        <w:t xml:space="preserve">Connecting MKR </w:t>
-      </w:r>
-      <w:proofErr w:type="spellStart"/>
-      <w:r>
-        <w:rPr>
-          <w:lang w:val="en-GB"/>
-        </w:rPr>
-        <w:t>WiFi</w:t>
-      </w:r>
-      <w:proofErr w:type="spellEnd"/>
-      <w:r>
-        <w:rPr>
-          <w:lang w:val="en-GB"/>
-        </w:rPr>
-        <w:t xml:space="preserve"> 1010 to a Wi-Fi network</w:t>
+        <w:t>Connecting MKR WiFi 1010 to a Wi-Fi network</w:t>
       </w:r>
       <w:r>
         <w:rPr>
@@ -1178,21 +1123,7 @@
         <w:rPr>
           <w:lang w:val="en-GB"/>
         </w:rPr>
-        <w:t xml:space="preserve">Powering MKR </w:t>
-      </w:r>
-      <w:proofErr w:type="spellStart"/>
-      <w:r>
-        <w:rPr>
-          <w:lang w:val="en-GB"/>
-        </w:rPr>
-        <w:t>WiFi</w:t>
-      </w:r>
-      <w:proofErr w:type="spellEnd"/>
-      <w:r>
-        <w:rPr>
-          <w:lang w:val="en-GB"/>
-        </w:rPr>
-        <w:t xml:space="preserve"> 1010 with batteries</w:t>
+        <w:t>Powering MKR WiFi 1010 with batteries</w:t>
       </w:r>
       <w:r>
         <w:rPr>
@@ -1231,21 +1162,7 @@
         <w:rPr>
           <w:lang w:val="en-GB"/>
         </w:rPr>
-        <w:t xml:space="preserve">Host a web server on the MKR </w:t>
-      </w:r>
-      <w:proofErr w:type="spellStart"/>
-      <w:r>
-        <w:rPr>
-          <w:lang w:val="en-GB"/>
-        </w:rPr>
-        <w:t>WiFi</w:t>
-      </w:r>
-      <w:proofErr w:type="spellEnd"/>
-      <w:r>
-        <w:rPr>
-          <w:lang w:val="en-GB"/>
-        </w:rPr>
-        <w:t xml:space="preserve"> 1010</w:t>
+        <w:t>Host a web server on the MKR WiFi 1010</w:t>
       </w:r>
       <w:r>
         <w:rPr>
@@ -1284,21 +1201,7 @@
         <w:rPr>
           <w:lang w:val="en-GB"/>
         </w:rPr>
-        <w:t xml:space="preserve">How to connect sensors to the MKR </w:t>
-      </w:r>
-      <w:proofErr w:type="spellStart"/>
-      <w:r>
-        <w:rPr>
-          <w:lang w:val="en-GB"/>
-        </w:rPr>
-        <w:t>WiFi</w:t>
-      </w:r>
-      <w:proofErr w:type="spellEnd"/>
-      <w:r>
-        <w:rPr>
-          <w:lang w:val="en-GB"/>
-        </w:rPr>
-        <w:t xml:space="preserve"> 1010</w:t>
+        <w:t>How to connect sensors to the MKR WiFi 1010</w:t>
       </w:r>
       <w:r>
         <w:rPr>
@@ -1466,65 +1369,27 @@
         <w:rPr>
           <w:lang w:val="en-GB"/>
         </w:rPr>
-        <w:t xml:space="preserve">Connect to </w:t>
-      </w:r>
-      <w:proofErr w:type="spellStart"/>
-      <w:r>
-        <w:rPr>
-          <w:lang w:val="en-GB"/>
-        </w:rPr>
-        <w:t>WiFi</w:t>
-      </w:r>
-      <w:proofErr w:type="spellEnd"/>
-      <w:r>
-        <w:rPr>
-          <w:lang w:val="en-GB"/>
-        </w:rPr>
-        <w:t xml:space="preserve"> mobile net</w:t>
-      </w:r>
-      <w:r>
-        <w:rPr>
-          <w:lang w:val="en-GB"/>
-        </w:rPr>
-        <w:t xml:space="preserve">, send to </w:t>
-      </w:r>
-      <w:proofErr w:type="spellStart"/>
-      <w:proofErr w:type="gramStart"/>
-      <w:r>
-        <w:rPr>
-          <w:lang w:val="en-GB"/>
-        </w:rPr>
-        <w:t>ThingSpeak</w:t>
+        <w:t>Connect to WiFi mobile net</w:t>
+      </w:r>
+      <w:r>
+        <w:rPr>
+          <w:lang w:val="en-GB"/>
+        </w:rPr>
+        <w:t>, send to ThingSpeak</w:t>
       </w:r>
       <w:bookmarkEnd w:id="4"/>
-      <w:proofErr w:type="spellEnd"/>
-      <w:proofErr w:type="gramEnd"/>
-    </w:p>
-    <w:p>
-      <w:pPr>
-        <w:rPr>
-          <w:lang w:val="en-GB"/>
-        </w:rPr>
-      </w:pPr>
-      <w:r>
-        <w:rPr>
-          <w:lang w:val="en-GB"/>
-        </w:rPr>
-        <w:t xml:space="preserve">Configure </w:t>
-      </w:r>
-      <w:proofErr w:type="spellStart"/>
-      <w:r>
-        <w:rPr>
-          <w:lang w:val="en-GB"/>
-        </w:rPr>
-        <w:t>MatLab</w:t>
-      </w:r>
-      <w:proofErr w:type="spellEnd"/>
-      <w:r>
-        <w:rPr>
-          <w:lang w:val="en-GB"/>
-        </w:rPr>
-        <w:t xml:space="preserve"> for recognizing </w:t>
+    </w:p>
+    <w:p>
+      <w:pPr>
+        <w:rPr>
+          <w:lang w:val="en-GB"/>
+        </w:rPr>
+      </w:pPr>
+      <w:r>
+        <w:rPr>
+          <w:lang w:val="en-GB"/>
+        </w:rPr>
+        <w:t xml:space="preserve">Configure MatLab for recognizing </w:t>
       </w:r>
       <w:r>
         <w:rPr>
@@ -1532,142 +1397,56 @@
         </w:rPr>
         <w:t xml:space="preserve">this specific board in USB mode. </w:t>
       </w:r>
-      <w:proofErr w:type="spellStart"/>
-      <w:r>
-        <w:rPr>
-          <w:lang w:val="en-GB"/>
-        </w:rPr>
-        <w:t>Simluation</w:t>
-      </w:r>
-      <w:proofErr w:type="spellEnd"/>
-      <w:r>
-        <w:rPr>
-          <w:lang w:val="en-GB"/>
-        </w:rPr>
-        <w:t xml:space="preserve"> -&gt; Model Settings -&gt; Hardware (Select board, and configure </w:t>
-      </w:r>
-      <w:proofErr w:type="spellStart"/>
-      <w:r>
-        <w:rPr>
-          <w:lang w:val="en-GB"/>
-        </w:rPr>
-        <w:t>WiFi</w:t>
-      </w:r>
-      <w:proofErr w:type="spellEnd"/>
-      <w:r>
-        <w:rPr>
-          <w:lang w:val="en-GB"/>
-        </w:rPr>
-        <w:t>)</w:t>
-      </w:r>
-    </w:p>
-    <w:p>
-      <w:pPr>
-        <w:rPr>
-          <w:lang w:val="en-GB"/>
-        </w:rPr>
-      </w:pPr>
-      <w:r>
-        <w:rPr>
-          <w:lang w:val="en-GB"/>
-        </w:rPr>
-        <w:t xml:space="preserve">Set </w:t>
-      </w:r>
-      <w:proofErr w:type="spellStart"/>
-      <w:r>
-        <w:rPr>
-          <w:lang w:val="en-GB"/>
-        </w:rPr>
-        <w:t>ThingSpeak</w:t>
-      </w:r>
-      <w:proofErr w:type="spellEnd"/>
-      <w:r>
-        <w:rPr>
-          <w:lang w:val="en-GB"/>
-        </w:rPr>
-        <w:t xml:space="preserve"> channel</w:t>
-      </w:r>
-    </w:p>
-    <w:p>
-      <w:pPr>
-        <w:rPr>
-          <w:lang w:val="en-GB"/>
-        </w:rPr>
-      </w:pPr>
-      <w:proofErr w:type="spellStart"/>
-      <w:r>
-        <w:rPr>
-          <w:lang w:val="en-GB"/>
-        </w:rPr>
-        <w:t>Sdlrtkernet</w:t>
-      </w:r>
-      <w:proofErr w:type="spellEnd"/>
-      <w:r>
-        <w:rPr>
-          <w:lang w:val="en-GB"/>
-        </w:rPr>
-        <w:t xml:space="preserve"> -setup</w:t>
-      </w:r>
-    </w:p>
-    <w:p>
-      <w:pPr>
-        <w:rPr>
-          <w:lang w:val="en-GB"/>
-        </w:rPr>
-      </w:pPr>
-      <w:r>
-        <w:rPr>
-          <w:lang w:val="en-GB"/>
-        </w:rPr>
-        <w:t xml:space="preserve">Configure Analog out (soil moisture) to </w:t>
-      </w:r>
-      <w:proofErr w:type="spellStart"/>
-      <w:r>
-        <w:rPr>
-          <w:lang w:val="en-GB"/>
-        </w:rPr>
-        <w:t>ThingSpeak</w:t>
-      </w:r>
-      <w:proofErr w:type="spellEnd"/>
-      <w:r>
-        <w:rPr>
-          <w:lang w:val="en-GB"/>
-        </w:rPr>
-        <w:t xml:space="preserve"> write</w:t>
-      </w:r>
-      <w:r>
-        <w:rPr>
-          <w:lang w:val="en-GB"/>
-        </w:rPr>
-        <w:t xml:space="preserve"> (standard </w:t>
-      </w:r>
-      <w:proofErr w:type="spellStart"/>
-      <w:r>
-        <w:rPr>
-          <w:lang w:val="en-GB"/>
-        </w:rPr>
-        <w:t>Thingspeak</w:t>
-      </w:r>
-      <w:proofErr w:type="spellEnd"/>
-      <w:r>
-        <w:rPr>
-          <w:lang w:val="en-GB"/>
-        </w:rPr>
-        <w:t xml:space="preserve"> write is working but cannot be integrated in Arduino, just simulation, Arduino specific </w:t>
-      </w:r>
-      <w:proofErr w:type="spellStart"/>
-      <w:r>
-        <w:rPr>
-          <w:lang w:val="en-GB"/>
-        </w:rPr>
-        <w:t>Thingspeak</w:t>
-      </w:r>
-      <w:proofErr w:type="spellEnd"/>
-      <w:r>
-        <w:rPr>
-          <w:lang w:val="en-GB"/>
-        </w:rPr>
-        <w:t xml:space="preserve"> write is sending 0 always as the value </w:t>
+      <w:r>
+        <w:rPr>
+          <w:lang w:val="en-GB"/>
+        </w:rPr>
+        <w:t>Simluation -&gt; Model Settings -&gt; Hardware (Select board, and configure WiFi)</w:t>
+      </w:r>
+    </w:p>
+    <w:p>
+      <w:pPr>
+        <w:rPr>
+          <w:lang w:val="en-GB"/>
+        </w:rPr>
+      </w:pPr>
+      <w:r>
+        <w:rPr>
+          <w:lang w:val="en-GB"/>
+        </w:rPr>
+        <w:t>Set ThingSpeak channel</w:t>
+      </w:r>
+    </w:p>
+    <w:p>
+      <w:pPr>
+        <w:rPr>
+          <w:lang w:val="en-GB"/>
+        </w:rPr>
+      </w:pPr>
+      <w:r>
+        <w:rPr>
+          <w:lang w:val="en-GB"/>
+        </w:rPr>
+        <w:t>Sdlrtkernet -setup</w:t>
+      </w:r>
+    </w:p>
+    <w:p>
+      <w:pPr>
+        <w:rPr>
+          <w:lang w:val="en-GB"/>
+        </w:rPr>
+      </w:pPr>
+      <w:r>
+        <w:rPr>
+          <w:lang w:val="en-GB"/>
+        </w:rPr>
+        <w:t>Configure Analog out (soil moisture) to ThingSpeak write</w:t>
+      </w:r>
+      <w:r>
+        <w:rPr>
+          <w:lang w:val="en-GB"/>
+        </w:rPr>
+        <w:t xml:space="preserve"> (standard Thingspeak write is working but cannot be integrated in Arduino, just simulation, Arduino specific Thingspeak write is sending 0 always as the value </w:t>
       </w:r>
       <w:hyperlink r:id="rId25" w:history="1">
         <w:r>
@@ -1710,103 +1489,39 @@
         <w:rPr>
           <w:lang w:val="en-GB"/>
         </w:rPr>
-        <w:t xml:space="preserve">) created by MathWorks that permits writing and reading from </w:t>
-      </w:r>
-      <w:proofErr w:type="spellStart"/>
-      <w:r>
-        <w:rPr>
-          <w:lang w:val="en-GB"/>
-        </w:rPr>
-        <w:t>ThingSpeak</w:t>
-      </w:r>
-      <w:proofErr w:type="spellEnd"/>
-      <w:r>
-        <w:rPr>
-          <w:lang w:val="en-GB"/>
-        </w:rPr>
-        <w:t xml:space="preserve"> through the Arduino IDE I get a program that publish </w:t>
-      </w:r>
-      <w:proofErr w:type="spellStart"/>
-      <w:r>
-        <w:rPr>
-          <w:lang w:val="en-GB"/>
-        </w:rPr>
-        <w:t>there</w:t>
-      </w:r>
-      <w:proofErr w:type="spellEnd"/>
-      <w:r>
-        <w:rPr>
-          <w:lang w:val="en-GB"/>
-        </w:rPr>
-        <w:t xml:space="preserve"> correctly.</w:t>
-      </w:r>
-      <w:r>
-        <w:rPr>
-          <w:lang w:val="en-GB"/>
-        </w:rPr>
-        <w:t xml:space="preserve"> After installing </w:t>
-      </w:r>
-      <w:proofErr w:type="spellStart"/>
-      <w:r>
-        <w:rPr>
-          <w:lang w:val="en-GB"/>
-        </w:rPr>
-        <w:t>ThingSpeak</w:t>
-      </w:r>
-      <w:proofErr w:type="spellEnd"/>
-      <w:r>
-        <w:rPr>
-          <w:lang w:val="en-GB"/>
-        </w:rPr>
-        <w:t xml:space="preserve"> library in the IDE.</w:t>
-      </w:r>
-    </w:p>
-    <w:p>
-      <w:pPr>
-        <w:rPr>
-          <w:lang w:val="en-GB"/>
-        </w:rPr>
-      </w:pPr>
-      <w:r>
-        <w:rPr>
-          <w:lang w:val="en-GB"/>
-        </w:rPr>
-        <w:t xml:space="preserve">Now </w:t>
-      </w:r>
-      <w:proofErr w:type="gramStart"/>
-      <w:r>
-        <w:rPr>
-          <w:lang w:val="en-GB"/>
-        </w:rPr>
-        <w:t>I’m</w:t>
-      </w:r>
-      <w:proofErr w:type="gramEnd"/>
-      <w:r>
-        <w:rPr>
-          <w:lang w:val="en-GB"/>
-        </w:rPr>
-        <w:t xml:space="preserve"> publishing correctly in the channel, but if the board is running on batteries, it’s not working, so I’m in the same situation as before but with a more complicated code than Simulink.</w:t>
-      </w:r>
-    </w:p>
-    <w:p>
-      <w:pPr>
-        <w:rPr>
-          <w:lang w:val="en-GB"/>
-        </w:rPr>
-      </w:pPr>
-      <w:proofErr w:type="gramStart"/>
-      <w:r>
-        <w:rPr>
-          <w:lang w:val="en-GB"/>
-        </w:rPr>
-        <w:t>Modified part of the code,</w:t>
-      </w:r>
-      <w:proofErr w:type="gramEnd"/>
-      <w:r>
-        <w:rPr>
-          <w:lang w:val="en-GB"/>
-        </w:rPr>
-        <w:t xml:space="preserve"> now is running on batteries correctly.</w:t>
+        <w:t>) created by MathWorks that permits writing and reading from ThingSpeak through the Arduino IDE I get a program that publish there correctly.</w:t>
+      </w:r>
+      <w:r>
+        <w:rPr>
+          <w:lang w:val="en-GB"/>
+        </w:rPr>
+        <w:t xml:space="preserve"> After installing ThingSpeak library in the IDE.</w:t>
+      </w:r>
+    </w:p>
+    <w:p>
+      <w:pPr>
+        <w:rPr>
+          <w:lang w:val="en-GB"/>
+        </w:rPr>
+      </w:pPr>
+      <w:r>
+        <w:rPr>
+          <w:lang w:val="en-GB"/>
+        </w:rPr>
+        <w:t>Now I’m publishing correctly in the channel, but if the board is running on batteries, it’s not working, so I’m in the same situation as before but with a more complicated code than Simulink.</w:t>
+      </w:r>
+    </w:p>
+    <w:p>
+      <w:pPr>
+        <w:rPr>
+          <w:lang w:val="en-GB"/>
+        </w:rPr>
+      </w:pPr>
+      <w:r>
+        <w:rPr>
+          <w:lang w:val="en-GB"/>
+        </w:rPr>
+        <w:t>Modified part of the code, now is running on batteries correctly.</w:t>
       </w:r>
     </w:p>
     <w:p>
@@ -1817,20 +1532,12 @@
         </w:rPr>
       </w:pPr>
       <w:bookmarkStart w:id="5" w:name="_Toc67349885"/>
-      <w:proofErr w:type="spellStart"/>
       <w:r>
         <w:rPr>
           <w:lang w:val="en-GB"/>
         </w:rPr>
         <w:lastRenderedPageBreak/>
-        <w:t>Matlab</w:t>
-      </w:r>
-      <w:proofErr w:type="spellEnd"/>
-      <w:r>
-        <w:rPr>
-          <w:lang w:val="en-GB"/>
-        </w:rPr>
-        <w:t>/Simulink</w:t>
+        <w:t>Matlab/Simulink</w:t>
       </w:r>
       <w:bookmarkEnd w:id="5"/>
     </w:p>
@@ -1865,21 +1572,7 @@
         <w:rPr>
           <w:lang w:val="en-GB"/>
         </w:rPr>
-        <w:t xml:space="preserve">Installation including all </w:t>
-      </w:r>
-      <w:proofErr w:type="spellStart"/>
-      <w:r>
-        <w:rPr>
-          <w:lang w:val="en-GB"/>
-        </w:rPr>
-        <w:t>simulink</w:t>
-      </w:r>
-      <w:proofErr w:type="spellEnd"/>
-      <w:r>
-        <w:rPr>
-          <w:lang w:val="en-GB"/>
-        </w:rPr>
-        <w:t xml:space="preserve"> components.</w:t>
+        <w:t>Installation including all simulink components.</w:t>
       </w:r>
     </w:p>
     <w:p>
@@ -1890,21 +1583,8 @@
           <w:numId w:val="2"/>
         </w:numPr>
       </w:pPr>
-      <w:proofErr w:type="spellStart"/>
-      <w:r>
-        <w:t>MinGW</w:t>
-      </w:r>
-      <w:proofErr w:type="spellEnd"/>
-      <w:r>
-        <w:t xml:space="preserve"> (C/C++ </w:t>
-      </w:r>
-      <w:proofErr w:type="spellStart"/>
-      <w:r>
-        <w:t>compiler</w:t>
-      </w:r>
-      <w:proofErr w:type="spellEnd"/>
-      <w:r>
-        <w:t>)</w:t>
+      <w:r>
+        <w:t>MinGW (C/C++ compiler)</w:t>
       </w:r>
     </w:p>
     <w:p>
@@ -1915,29 +1595,8 @@
           <w:numId w:val="2"/>
         </w:numPr>
       </w:pPr>
-      <w:proofErr w:type="spellStart"/>
-      <w:r>
-        <w:t>Support</w:t>
-      </w:r>
-      <w:proofErr w:type="spellEnd"/>
-      <w:r>
-        <w:t xml:space="preserve"> </w:t>
-      </w:r>
-      <w:proofErr w:type="spellStart"/>
-      <w:r>
-        <w:t>Package</w:t>
-      </w:r>
-      <w:proofErr w:type="spellEnd"/>
-      <w:r>
-        <w:t xml:space="preserve"> </w:t>
-      </w:r>
-      <w:proofErr w:type="spellStart"/>
-      <w:r>
-        <w:t>for</w:t>
-      </w:r>
-      <w:proofErr w:type="spellEnd"/>
-      <w:r>
-        <w:t xml:space="preserve"> Arduino</w:t>
+      <w:r>
+        <w:t>Support Package for Arduino</w:t>
       </w:r>
     </w:p>
     <w:p>
@@ -2011,19 +1670,11 @@
         </w:rPr>
       </w:pPr>
       <w:bookmarkStart w:id="9" w:name="_Toc67349889"/>
-      <w:proofErr w:type="spellStart"/>
-      <w:r>
-        <w:rPr>
-          <w:lang w:val="en-GB"/>
-        </w:rPr>
-        <w:t>Thingspeak</w:t>
-      </w:r>
-      <w:proofErr w:type="spellEnd"/>
-      <w:r>
-        <w:rPr>
-          <w:lang w:val="en-GB"/>
-        </w:rPr>
-        <w:t xml:space="preserve"> data</w:t>
+      <w:r>
+        <w:rPr>
+          <w:lang w:val="en-GB"/>
+        </w:rPr>
+        <w:t>Thingspeak data</w:t>
       </w:r>
       <w:r>
         <w:rPr>
@@ -2057,21 +1708,7 @@
         <w:rPr>
           <w:lang w:val="en-GB"/>
         </w:rPr>
-        <w:t xml:space="preserve">Starting with the first demo following what Victor </w:t>
-      </w:r>
-      <w:proofErr w:type="spellStart"/>
-      <w:r>
-        <w:rPr>
-          <w:lang w:val="en-GB"/>
-        </w:rPr>
-        <w:t>tought</w:t>
-      </w:r>
-      <w:proofErr w:type="spellEnd"/>
-      <w:r>
-        <w:rPr>
-          <w:lang w:val="en-GB"/>
-        </w:rPr>
-        <w:t xml:space="preserve"> us about a simple app displaying a cube that I already had, I start investigating about how to run a Python script in Unity.</w:t>
+        <w:t>Starting with the first demo following what Victor tought us about a simple app displaying a cube that I already had, I start investigating about how to run a Python script in Unity.</w:t>
       </w:r>
     </w:p>
     <w:p>
@@ -2252,27 +1889,7 @@
           <w:shd w:val="clear" w:color="auto" w:fill="FAFAFA"/>
           <w:lang w:val="en-GB"/>
         </w:rPr>
-        <w:t xml:space="preserve">See </w:t>
-      </w:r>
-      <w:proofErr w:type="spellStart"/>
-      <w:r>
-        <w:rPr>
-          <w:rFonts w:ascii="Arial" w:hAnsi="Arial" w:cs="Arial"/>
-          <w:color w:val="333333"/>
-          <w:shd w:val="clear" w:color="auto" w:fill="FAFAFA"/>
-          <w:lang w:val="en-GB"/>
-        </w:rPr>
-        <w:t>google's</w:t>
-      </w:r>
-      <w:proofErr w:type="spellEnd"/>
-      <w:r>
-        <w:rPr>
-          <w:rFonts w:ascii="Arial" w:hAnsi="Arial" w:cs="Arial"/>
-          <w:color w:val="333333"/>
-          <w:shd w:val="clear" w:color="auto" w:fill="FAFAFA"/>
-          <w:lang w:val="en-GB"/>
-        </w:rPr>
-        <w:t xml:space="preserve"> suggestions here: </w:t>
+        <w:t>See google's suggestions here: </w:t>
       </w:r>
       <w:hyperlink r:id="rId30" w:tgtFrame="_blank" w:history="1">
         <w:r>
@@ -2353,21 +1970,7 @@
         <w:rPr>
           <w:lang w:val="en-GB"/>
         </w:rPr>
-        <w:t xml:space="preserve">Import Hello </w:t>
-      </w:r>
-      <w:proofErr w:type="spellStart"/>
-      <w:r>
-        <w:rPr>
-          <w:lang w:val="en-GB"/>
-        </w:rPr>
-        <w:t>Cardboad</w:t>
-      </w:r>
-      <w:proofErr w:type="spellEnd"/>
-      <w:r>
-        <w:rPr>
-          <w:lang w:val="en-GB"/>
-        </w:rPr>
-        <w:t xml:space="preserve"> from the Package Manager</w:t>
+        <w:t>Import Hello Cardboad from the Package Manager</w:t>
       </w:r>
     </w:p>
     <w:p>
@@ -2495,21 +2098,7 @@
         <w:rPr>
           <w:lang w:val="en-GB"/>
         </w:rPr>
-        <w:t xml:space="preserve">) </w:t>
-      </w:r>
-      <w:proofErr w:type="gramStart"/>
-      <w:r>
-        <w:rPr>
-          <w:lang w:val="en-GB"/>
-        </w:rPr>
-        <w:t>in order to</w:t>
-      </w:r>
-      <w:proofErr w:type="gramEnd"/>
-      <w:r>
-        <w:rPr>
-          <w:lang w:val="en-GB"/>
-        </w:rPr>
-        <w:t xml:space="preserve"> work with Python 2.7</w:t>
+        <w:t>) in order to work with Python 2.7</w:t>
       </w:r>
       <w:r>
         <w:rPr>
@@ -2521,21 +2110,7 @@
         <w:rPr>
           <w:lang w:val="en-GB"/>
         </w:rPr>
-        <w:t xml:space="preserve"> </w:t>
-      </w:r>
-      <w:proofErr w:type="gramStart"/>
-      <w:r>
-        <w:rPr>
-          <w:lang w:val="en-GB"/>
-        </w:rPr>
-        <w:t>In order to</w:t>
-      </w:r>
-      <w:proofErr w:type="gramEnd"/>
-      <w:r>
-        <w:rPr>
-          <w:lang w:val="en-GB"/>
-        </w:rPr>
-        <w:t xml:space="preserve"> work, add it to the PATH (</w:t>
+        <w:t xml:space="preserve"> In order to work, add it to the PATH (</w:t>
       </w:r>
       <w:hyperlink r:id="rId36" w:history="1">
         <w:r>
@@ -2563,24 +2138,8 @@
         <w:rPr>
           <w:lang w:val="en-GB"/>
         </w:rPr>
-        <w:t xml:space="preserve">We should add the dependency manually to </w:t>
-      </w:r>
-      <w:proofErr w:type="gramStart"/>
-      <w:r>
-        <w:rPr>
-          <w:lang w:val="en-GB"/>
-        </w:rPr>
-        <w:t>VAR_AUB\Packages\</w:t>
-      </w:r>
-      <w:proofErr w:type="spellStart"/>
-      <w:r>
-        <w:rPr>
-          <w:lang w:val="en-GB"/>
-        </w:rPr>
-        <w:t>manifest.json</w:t>
-      </w:r>
-      <w:proofErr w:type="spellEnd"/>
-      <w:proofErr w:type="gramEnd"/>
+        <w:t>We should add the dependency manually to VAR_AUB\Packages\manifest.json</w:t>
+      </w:r>
     </w:p>
     <w:p>
       <w:pPr>
@@ -2627,10 +2186,214 @@
     </w:p>
     <w:p>
       <w:pPr>
-        <w:rPr>
-          <w:lang w:val="en-GB"/>
-        </w:rPr>
-      </w:pPr>
+        <w:pStyle w:val="Heading5"/>
+        <w:rPr>
+          <w:lang w:val="en-GB"/>
+        </w:rPr>
+      </w:pPr>
+      <w:r>
+        <w:rPr>
+          <w:lang w:val="en-GB"/>
+        </w:rPr>
+        <w:t>C# script prototype</w:t>
+      </w:r>
+    </w:p>
+    <w:p>
+      <w:pPr>
+        <w:rPr>
+          <w:lang w:val="en-GB"/>
+        </w:rPr>
+      </w:pPr>
+      <w:r>
+        <w:rPr>
+          <w:lang w:val="en-GB"/>
+        </w:rPr>
+        <w:t>In Visual Studio Community, C# package.</w:t>
+      </w:r>
+    </w:p>
+    <w:p>
+      <w:pPr>
+        <w:rPr>
+          <w:lang w:val="en-GB"/>
+        </w:rPr>
+      </w:pPr>
+      <w:r>
+        <w:rPr>
+          <w:lang w:val="en-GB"/>
+        </w:rPr>
+        <w:t>First a demo of C# program that get’s thingspeak data to the console.</w:t>
+      </w:r>
+      <w:r>
+        <w:rPr>
+          <w:lang w:val="en-GB"/>
+        </w:rPr>
+        <w:t xml:space="preserve"> </w:t>
+      </w:r>
+    </w:p>
+    <w:p>
+      <w:pPr>
+        <w:rPr>
+          <w:lang w:val="en-GB"/>
+        </w:rPr>
+      </w:pPr>
+      <w:r>
+        <w:rPr>
+          <w:lang w:val="en-GB"/>
+        </w:rPr>
+        <w:t>Then get the data from Thingspeak in JSON</w:t>
+      </w:r>
+      <w:r>
+        <w:rPr>
+          <w:lang w:val="en-GB"/>
+        </w:rPr>
+        <w:t xml:space="preserve"> </w:t>
+      </w:r>
+      <w:r>
+        <w:rPr>
+          <w:lang w:val="en-GB"/>
+        </w:rPr>
+        <w:t>using their API (</w:t>
+      </w:r>
+      <w:hyperlink r:id="rId37" w:history="1">
+        <w:r>
+          <w:rPr>
+            <w:rStyle w:val="Hyperlink"/>
+            <w:lang w:val="en-GB"/>
+          </w:rPr>
+          <w:t>https://community.thingspeak.com/documentation%20.../api/</w:t>
+        </w:r>
+      </w:hyperlink>
+      <w:r>
+        <w:rPr>
+          <w:lang w:val="en-GB"/>
+        </w:rPr>
+        <w:t xml:space="preserve">) </w:t>
+      </w:r>
+    </w:p>
+    <w:p>
+      <w:pPr>
+        <w:rPr>
+          <w:lang w:val="en-GB"/>
+        </w:rPr>
+      </w:pPr>
+      <w:r>
+        <w:rPr>
+          <w:lang w:val="en-GB"/>
+        </w:rPr>
+        <w:t>This as an example (</w:t>
+      </w:r>
+      <w:hyperlink r:id="rId38" w:history="1">
+        <w:r>
+          <w:rPr>
+            <w:rStyle w:val="Hyperlink"/>
+            <w:lang w:val="en-GB"/>
+          </w:rPr>
+          <w:t>https://stackoverflow.com/questions/33224357/how-to-parse-json-to-c-sharp-and-read-values</w:t>
+        </w:r>
+      </w:hyperlink>
+      <w:r>
+        <w:rPr>
+          <w:lang w:val="en-GB"/>
+        </w:rPr>
+        <w:t xml:space="preserve">) </w:t>
+      </w:r>
+    </w:p>
+    <w:p>
+      <w:pPr>
+        <w:rPr>
+          <w:lang w:val="en-GB"/>
+        </w:rPr>
+      </w:pPr>
+      <w:r>
+        <w:rPr>
+          <w:lang w:val="en-GB"/>
+        </w:rPr>
+        <w:t xml:space="preserve">We need to use </w:t>
+      </w:r>
+      <w:r>
+        <w:rPr>
+          <w:lang w:val="en-GB"/>
+        </w:rPr>
+        <w:t xml:space="preserve">the </w:t>
+      </w:r>
+      <w:r>
+        <w:rPr>
+          <w:lang w:val="en-GB"/>
+        </w:rPr>
+        <w:t>Newtonsoft.Json</w:t>
+      </w:r>
+      <w:r>
+        <w:rPr>
+          <w:lang w:val="en-GB"/>
+        </w:rPr>
+        <w:t xml:space="preserve"> library (using </w:t>
+      </w:r>
+      <w:r>
+        <w:rPr>
+          <w:lang w:val="en-GB"/>
+        </w:rPr>
+        <w:t>Newtonsoft.Json.Linq</w:t>
+      </w:r>
+      <w:r>
+        <w:rPr>
+          <w:lang w:val="en-GB"/>
+        </w:rPr>
+        <w:t>)</w:t>
+      </w:r>
+      <w:r>
+        <w:rPr>
+          <w:lang w:val="en-GB"/>
+        </w:rPr>
+        <w:t xml:space="preserve"> </w:t>
+      </w:r>
+      <w:r>
+        <w:rPr>
+          <w:lang w:val="en-GB"/>
+        </w:rPr>
+        <w:t>(</w:t>
+      </w:r>
+      <w:hyperlink r:id="rId39" w:history="1">
+        <w:r>
+          <w:rPr>
+            <w:rStyle w:val="Hyperlink"/>
+            <w:lang w:val="en-GB"/>
+          </w:rPr>
+          <w:t>https://www.nuget.org/packages/Newtonsoft.Json</w:t>
+        </w:r>
+      </w:hyperlink>
+      <w:r>
+        <w:rPr>
+          <w:lang w:val="en-GB"/>
+        </w:rPr>
+        <w:t>)</w:t>
+      </w:r>
+    </w:p>
+    <w:p>
+      <w:pPr>
+        <w:pStyle w:val="Heading5"/>
+        <w:rPr>
+          <w:lang w:val="en-GB"/>
+        </w:rPr>
+      </w:pPr>
+      <w:r>
+        <w:rPr>
+          <w:lang w:val="en-GB"/>
+        </w:rPr>
+        <w:t>Implement this script associated to a Unity object</w:t>
+      </w:r>
+    </w:p>
+    <w:p>
+      <w:pPr>
+        <w:rPr>
+          <w:lang w:val="en-GB"/>
+        </w:rPr>
+      </w:pPr>
+      <w:r>
+        <w:rPr>
+          <w:lang w:val="en-GB"/>
+        </w:rPr>
+        <w:t>First I create a progress bar in Unity.</w:t>
+      </w:r>
     </w:p>
     <w:p>
       <w:pPr>
@@ -2652,70 +2415,26 @@
           <w:lang w:val="en-GB"/>
         </w:rPr>
       </w:pPr>
-      <w:proofErr w:type="gramStart"/>
-      <w:r>
-        <w:rPr>
-          <w:lang w:val="en-GB"/>
-        </w:rPr>
-        <w:t>I’m</w:t>
-      </w:r>
-      <w:proofErr w:type="gramEnd"/>
-      <w:r>
-        <w:rPr>
-          <w:lang w:val="en-GB"/>
-        </w:rPr>
-        <w:t xml:space="preserve"> going to create a telegram bot that answers with the possible fields stored in </w:t>
-      </w:r>
-      <w:proofErr w:type="spellStart"/>
-      <w:r>
-        <w:rPr>
-          <w:lang w:val="en-GB"/>
-        </w:rPr>
-        <w:t>ThingSpeak</w:t>
-      </w:r>
-      <w:proofErr w:type="spellEnd"/>
-      <w:r>
-        <w:rPr>
-          <w:lang w:val="en-GB"/>
-        </w:rPr>
-        <w:t xml:space="preserve"> in buttons form and then when one is pressed answer with the latest value and date.</w:t>
-      </w:r>
-    </w:p>
-    <w:p>
-      <w:pPr>
-        <w:rPr>
-          <w:lang w:val="en-GB"/>
-        </w:rPr>
-      </w:pPr>
-      <w:proofErr w:type="gramStart"/>
-      <w:r>
-        <w:rPr>
-          <w:lang w:val="en-GB"/>
-        </w:rPr>
-        <w:t>In order to</w:t>
-      </w:r>
-      <w:proofErr w:type="gramEnd"/>
-      <w:r>
-        <w:rPr>
-          <w:lang w:val="en-GB"/>
-        </w:rPr>
-        <w:t xml:space="preserve"> do it I create a bot using </w:t>
-      </w:r>
-      <w:proofErr w:type="spellStart"/>
-      <w:r>
-        <w:rPr>
-          <w:lang w:val="en-GB"/>
-        </w:rPr>
-        <w:t>BotFather</w:t>
-      </w:r>
-      <w:proofErr w:type="spellEnd"/>
-      <w:r>
-        <w:rPr>
-          <w:lang w:val="en-GB"/>
-        </w:rPr>
-        <w:t xml:space="preserve"> (</w:t>
-      </w:r>
-      <w:hyperlink r:id="rId37" w:history="1">
+      <w:r>
+        <w:rPr>
+          <w:lang w:val="en-GB"/>
+        </w:rPr>
+        <w:t>I’m going to create a telegram bot that answers with the possible fields stored in ThingSpeak in buttons form and then when one is pressed answer with the latest value and date.</w:t>
+      </w:r>
+    </w:p>
+    <w:p>
+      <w:pPr>
+        <w:rPr>
+          <w:lang w:val="en-GB"/>
+        </w:rPr>
+      </w:pPr>
+      <w:r>
+        <w:rPr>
+          <w:lang w:val="en-GB"/>
+        </w:rPr>
+        <w:t>In order to do it I create a bot using BotFather (</w:t>
+      </w:r>
+      <w:hyperlink r:id="rId40" w:history="1">
         <w:r>
           <w:rPr>
             <w:rStyle w:val="Hyperlink"/>
@@ -2753,23 +2472,9 @@
         <w:rPr>
           <w:lang w:val="en-GB"/>
         </w:rPr>
-        <w:t xml:space="preserve">Then using </w:t>
-      </w:r>
-      <w:proofErr w:type="spellStart"/>
-      <w:r>
-        <w:rPr>
-          <w:lang w:val="en-GB"/>
-        </w:rPr>
-        <w:t>telepot</w:t>
-      </w:r>
-      <w:proofErr w:type="spellEnd"/>
-      <w:r>
-        <w:rPr>
-          <w:lang w:val="en-GB"/>
-        </w:rPr>
-        <w:t xml:space="preserve"> python library (</w:t>
-      </w:r>
-      <w:hyperlink r:id="rId38" w:history="1">
+        <w:t>Then using telepot python library (</w:t>
+      </w:r>
+      <w:hyperlink r:id="rId41" w:history="1">
         <w:r>
           <w:rPr>
             <w:rStyle w:val="Hyperlink"/>
@@ -2790,46 +2495,24 @@
         </w:rPr>
         <w:t xml:space="preserve"> </w:t>
       </w:r>
-      <w:proofErr w:type="gramStart"/>
-      <w:r>
-        <w:rPr>
-          <w:lang w:val="en-GB"/>
-        </w:rPr>
-        <w:t>in order to</w:t>
-      </w:r>
-      <w:proofErr w:type="gramEnd"/>
-      <w:r>
-        <w:rPr>
-          <w:lang w:val="en-GB"/>
-        </w:rPr>
-        <w:t xml:space="preserve"> make the communication easier with the bot.</w:t>
-      </w:r>
-    </w:p>
-    <w:p>
-      <w:pPr>
-        <w:rPr>
-          <w:lang w:val="en-GB"/>
-        </w:rPr>
-      </w:pPr>
-      <w:r>
-        <w:rPr>
-          <w:lang w:val="en-GB"/>
-        </w:rPr>
-        <w:t xml:space="preserve">Lastly using the </w:t>
-      </w:r>
-      <w:proofErr w:type="spellStart"/>
-      <w:r>
-        <w:rPr>
-          <w:lang w:val="en-GB"/>
-        </w:rPr>
-        <w:t>thingspeak</w:t>
-      </w:r>
-      <w:proofErr w:type="spellEnd"/>
-      <w:r>
-        <w:rPr>
-          <w:lang w:val="en-GB"/>
-        </w:rPr>
-        <w:t xml:space="preserve"> python library</w:t>
+      <w:r>
+        <w:rPr>
+          <w:lang w:val="en-GB"/>
+        </w:rPr>
+        <w:t>in order to make the communication easier with the bot.</w:t>
+      </w:r>
+    </w:p>
+    <w:p>
+      <w:pPr>
+        <w:rPr>
+          <w:lang w:val="en-GB"/>
+        </w:rPr>
+      </w:pPr>
+      <w:r>
+        <w:rPr>
+          <w:lang w:val="en-GB"/>
+        </w:rPr>
+        <w:t>Lastly using the thingspeak python library</w:t>
       </w:r>
       <w:r>
         <w:rPr>
@@ -2837,7 +2520,7 @@
         </w:rPr>
         <w:t xml:space="preserve"> (</w:t>
       </w:r>
-      <w:hyperlink r:id="rId39" w:history="1">
+      <w:hyperlink r:id="rId42" w:history="1">
         <w:r>
           <w:rPr>
             <w:rStyle w:val="Hyperlink"/>
@@ -2858,60 +2541,24 @@
         </w:rPr>
         <w:t xml:space="preserve"> </w:t>
       </w:r>
-      <w:proofErr w:type="gramStart"/>
-      <w:r>
-        <w:rPr>
-          <w:lang w:val="en-GB"/>
-        </w:rPr>
-        <w:t>in order to</w:t>
-      </w:r>
-      <w:proofErr w:type="gramEnd"/>
-      <w:r>
-        <w:rPr>
-          <w:lang w:val="en-GB"/>
-        </w:rPr>
-        <w:t xml:space="preserve"> get data from my channel as JSON and then process it to get the asked values.</w:t>
-      </w:r>
-    </w:p>
-    <w:p>
-      <w:pPr>
-        <w:rPr>
-          <w:lang w:val="en-GB"/>
-        </w:rPr>
-      </w:pPr>
-      <w:r>
-        <w:rPr>
-          <w:lang w:val="en-GB"/>
-        </w:rPr>
-        <w:t xml:space="preserve">When </w:t>
-      </w:r>
-      <w:proofErr w:type="gramStart"/>
-      <w:r>
-        <w:rPr>
-          <w:lang w:val="en-GB"/>
-        </w:rPr>
-        <w:t>it’s</w:t>
-      </w:r>
-      <w:proofErr w:type="gramEnd"/>
-      <w:r>
-        <w:rPr>
-          <w:lang w:val="en-GB"/>
-        </w:rPr>
-        <w:t xml:space="preserve"> running, talk to </w:t>
-      </w:r>
-      <w:proofErr w:type="spellStart"/>
-      <w:r>
-        <w:rPr>
-          <w:lang w:val="en-GB"/>
-        </w:rPr>
-        <w:t>VAR_AUB_bot</w:t>
-      </w:r>
-      <w:proofErr w:type="spellEnd"/>
-      <w:r>
-        <w:rPr>
-          <w:lang w:val="en-GB"/>
-        </w:rPr>
-        <w:t xml:space="preserve"> </w:t>
+      <w:r>
+        <w:rPr>
+          <w:lang w:val="en-GB"/>
+        </w:rPr>
+        <w:t>in order to get data from my channel as JSON and then process it to get the asked values.</w:t>
+      </w:r>
+    </w:p>
+    <w:p>
+      <w:pPr>
+        <w:rPr>
+          <w:lang w:val="en-GB"/>
+        </w:rPr>
+      </w:pPr>
+      <w:r>
+        <w:rPr>
+          <w:lang w:val="en-GB"/>
+        </w:rPr>
+        <w:t xml:space="preserve">When it’s running, talk to VAR_AUB_bot </w:t>
       </w:r>
       <w:r>
         <w:rPr>
@@ -2919,7 +2566,7 @@
         </w:rPr>
         <w:t>(</w:t>
       </w:r>
-      <w:hyperlink r:id="rId40" w:tgtFrame="_blank" w:history="1">
+      <w:hyperlink r:id="rId43" w:tgtFrame="_blank" w:history="1">
         <w:r>
           <w:rPr>
             <w:rStyle w:val="Hyperlink"/>
@@ -2930,35 +2577,82 @@
             <w:shd w:val="clear" w:color="auto" w:fill="FFFFFF"/>
             <w:lang w:val="en-GB"/>
           </w:rPr>
-          <w:t>t.me/</w:t>
+          <w:t>t.me/var_aub_bot</w:t>
         </w:r>
-        <w:proofErr w:type="spellStart"/>
+      </w:hyperlink>
+      <w:r>
+        <w:rPr>
+          <w:lang w:val="en-GB"/>
+        </w:rPr>
+        <w:t xml:space="preserve">) </w:t>
+      </w:r>
+      <w:r>
+        <w:rPr>
+          <w:lang w:val="en-GB"/>
+        </w:rPr>
+        <w:t>in telegram and it will answer with the possible options.</w:t>
+      </w:r>
+    </w:p>
+    <w:p>
+      <w:pPr>
+        <w:pStyle w:val="Heading2"/>
+        <w:rPr>
+          <w:lang w:val="en-GB"/>
+        </w:rPr>
+      </w:pPr>
+      <w:r>
+        <w:rPr>
+          <w:lang w:val="en-GB"/>
+        </w:rPr>
+        <w:t>Interest links</w:t>
+      </w:r>
+    </w:p>
+    <w:p>
+      <w:pPr>
+        <w:pStyle w:val="ListParagraph"/>
+        <w:numPr>
+          <w:ilvl w:val="0"/>
+          <w:numId w:val="4"/>
+        </w:numPr>
+        <w:rPr>
+          <w:lang w:val="en-GB"/>
+        </w:rPr>
+      </w:pPr>
+      <w:hyperlink r:id="rId44" w:history="1">
         <w:r>
           <w:rPr>
             <w:rStyle w:val="Hyperlink"/>
-            <w:rFonts w:ascii="Tahoma" w:hAnsi="Tahoma" w:cs="Tahoma"/>
-            <w:color w:val="3A6D99"/>
-            <w:sz w:val="20"/>
-            <w:szCs w:val="20"/>
-            <w:shd w:val="clear" w:color="auto" w:fill="FFFFFF"/>
             <w:lang w:val="en-GB"/>
           </w:rPr>
-          <w:t>var_aub_bot</w:t>
+          <w:t>https://nothans.com/thingspeak-tutorials/netduino/create-your-own-web-of-things-using-the-netduino-plus-and-thingspeak</w:t>
         </w:r>
-        <w:proofErr w:type="spellEnd"/>
       </w:hyperlink>
-      <w:r>
-        <w:rPr>
-          <w:lang w:val="en-GB"/>
-        </w:rPr>
-        <w:t xml:space="preserve">) </w:t>
-      </w:r>
-      <w:r>
-        <w:rPr>
-          <w:lang w:val="en-GB"/>
-        </w:rPr>
-        <w:t>in telegram and it will answer with the possible options.</w:t>
-      </w:r>
+    </w:p>
+    <w:p>
+      <w:pPr>
+        <w:pStyle w:val="ListParagraph"/>
+        <w:numPr>
+          <w:ilvl w:val="0"/>
+          <w:numId w:val="4"/>
+        </w:numPr>
+        <w:rPr>
+          <w:lang w:val="en-GB"/>
+        </w:rPr>
+      </w:pPr>
+    </w:p>
+    <w:p>
+      <w:pPr>
+        <w:rPr>
+          <w:lang w:val="en-GB"/>
+        </w:rPr>
+      </w:pPr>
+    </w:p>
+    <w:p>
+      <w:pPr>
+        <w:rPr>
+          <w:lang w:val="en-GB"/>
+        </w:rPr>
+      </w:pPr>
     </w:p>
     <w:p>
       <w:pPr>
@@ -3434,7 +3128,7 @@
   <w:abstractNum w:abstractNumId="4" w15:restartNumberingAfterBreak="0">
     <w:nsid w:val="6B141BB0"/>
     <w:multiLevelType w:val="hybridMultilevel"/>
-    <w:tmpl w:val="3718F422"/>
+    <w:tmpl w:val="64EAFEE4"/>
     <w:lvl w:ilvl="0" w:tplc="08090001">
       <w:start w:val="1"/>
       <w:numFmt w:val="bullet"/>
@@ -4048,10 +3742,29 @@
       <w:color w:val="2F5496" w:themeColor="accent1" w:themeShade="BF"/>
     </w:rPr>
   </w:style>
+  <w:style w:type="paragraph" w:styleId="Heading5">
+    <w:name w:val="heading 5"/>
+    <w:basedOn w:val="Normal"/>
+    <w:next w:val="Normal"/>
+    <w:link w:val="Heading5Char"/>
+    <w:uiPriority w:val="9"/>
+    <w:unhideWhenUsed/>
+    <w:qFormat/>
+    <w:rsid w:val="0055408D"/>
+    <w:pPr>
+      <w:keepNext/>
+      <w:keepLines/>
+      <w:spacing w:before="40" w:after="0"/>
+      <w:outlineLvl w:val="4"/>
+    </w:pPr>
+    <w:rPr>
+      <w:rFonts w:asciiTheme="majorHAnsi" w:eastAsiaTheme="majorEastAsia" w:hAnsiTheme="majorHAnsi" w:cstheme="majorBidi"/>
+      <w:color w:val="2F5496" w:themeColor="accent1" w:themeShade="BF"/>
+    </w:rPr>
+  </w:style>
   <w:style w:type="character" w:default="1" w:styleId="DefaultParagraphFont">
     <w:name w:val="Default Paragraph Font"/>
     <w:uiPriority w:val="1"/>
-    <w:semiHidden/>
     <w:unhideWhenUsed/>
   </w:style>
   <w:style w:type="table" w:default="1" w:styleId="TableNormal">
@@ -4254,6 +3967,17 @@
       <w:rFonts w:asciiTheme="majorHAnsi" w:eastAsiaTheme="majorEastAsia" w:hAnsiTheme="majorHAnsi" w:cstheme="majorBidi"/>
       <w:i/>
       <w:iCs/>
+      <w:color w:val="2F5496" w:themeColor="accent1" w:themeShade="BF"/>
+    </w:rPr>
+  </w:style>
+  <w:style w:type="character" w:customStyle="1" w:styleId="Heading5Char">
+    <w:name w:val="Heading 5 Char"/>
+    <w:basedOn w:val="DefaultParagraphFont"/>
+    <w:link w:val="Heading5"/>
+    <w:uiPriority w:val="9"/>
+    <w:rsid w:val="0055408D"/>
+    <w:rPr>
+      <w:rFonts w:asciiTheme="majorHAnsi" w:eastAsiaTheme="majorEastAsia" w:hAnsiTheme="majorHAnsi" w:cstheme="majorBidi"/>
       <w:color w:val="2F5496" w:themeColor="accent1" w:themeShade="BF"/>
     </w:rPr>
   </w:style>

</xml_diff>

<commit_message>
Better reading from soil moisture sensor
</commit_message>
<xml_diff>
--- a/Documentation/General/Notes.docx
+++ b/Documentation/General/Notes.docx
@@ -1537,6 +1537,159 @@
           <w:lang w:val="en-GB"/>
         </w:rPr>
         <w:lastRenderedPageBreak/>
+        <w:t>Arduino IDE</w:t>
+      </w:r>
+    </w:p>
+    <w:p>
+      <w:pPr>
+        <w:rPr>
+          <w:lang w:val="en-GB"/>
+        </w:rPr>
+      </w:pPr>
+      <w:r>
+        <w:rPr>
+          <w:lang w:val="en-GB"/>
+        </w:rPr>
+        <w:t>Using the ThingsSpeak library</w:t>
+      </w:r>
+      <w:r>
+        <w:rPr>
+          <w:lang w:val="en-GB"/>
+        </w:rPr>
+        <w:t xml:space="preserve"> (</w:t>
+      </w:r>
+      <w:hyperlink r:id="rId27" w:history="1">
+        <w:r>
+          <w:rPr>
+            <w:rStyle w:val="Hyperlink"/>
+            <w:lang w:val="en-GB"/>
+          </w:rPr>
+          <w:t>https://github.com/mathworks/thingspeak-arduino</w:t>
+        </w:r>
+      </w:hyperlink>
+      <w:r>
+        <w:rPr>
+          <w:lang w:val="en-GB"/>
+        </w:rPr>
+        <w:t xml:space="preserve">) </w:t>
+      </w:r>
+      <w:r>
+        <w:rPr>
+          <w:lang w:val="en-GB"/>
+        </w:rPr>
+        <w:t>for Arduino IDE (1.8.13) I send data from my soil moisture analog</w:t>
+      </w:r>
+      <w:r>
+        <w:rPr>
+          <w:lang w:val="en-GB"/>
+        </w:rPr>
+        <w:t>ic</w:t>
+      </w:r>
+      <w:r>
+        <w:rPr>
+          <w:lang w:val="en-GB"/>
+        </w:rPr>
+        <w:t xml:space="preserve"> sensor to my ThingSpeak channel, channel 1 (Soil moisture). </w:t>
+      </w:r>
+    </w:p>
+    <w:p>
+      <w:pPr>
+        <w:rPr>
+          <w:lang w:val="en-GB"/>
+        </w:rPr>
+      </w:pPr>
+      <w:r>
+        <w:rPr>
+          <w:lang w:val="en-GB"/>
+        </w:rPr>
+        <w:t>It works fine, so Matlab/Simulink is discarded for the moment.</w:t>
+      </w:r>
+    </w:p>
+    <w:p>
+      <w:pPr>
+        <w:rPr>
+          <w:lang w:val="en-GB"/>
+        </w:rPr>
+      </w:pPr>
+      <w:r>
+        <w:rPr>
+          <w:lang w:val="en-GB"/>
+        </w:rPr>
+        <w:t>As it’s an analog</w:t>
+      </w:r>
+      <w:r>
+        <w:rPr>
+          <w:lang w:val="en-GB"/>
+        </w:rPr>
+        <w:t>ic</w:t>
+      </w:r>
+      <w:r>
+        <w:rPr>
+          <w:lang w:val="en-GB"/>
+        </w:rPr>
+        <w:t xml:space="preserve"> sensor it should produce values between 0 and 1023, but we should map these values as a percentage of soil moisture from 0% to 100%. Using this examples I do it (</w:t>
+      </w:r>
+      <w:hyperlink r:id="rId28" w:history="1">
+        <w:r>
+          <w:rPr>
+            <w:rStyle w:val="Hyperlink"/>
+            <w:lang w:val="en-GB"/>
+          </w:rPr>
+          <w:t>https://www.instructables.com/How-to-Use-the-Soil-Hygrometer-Module-Arduino-Tuto/</w:t>
+        </w:r>
+      </w:hyperlink>
+      <w:r>
+        <w:rPr>
+          <w:lang w:val="en-GB"/>
+        </w:rPr>
+        <w:t xml:space="preserve"> , </w:t>
+      </w:r>
+      <w:hyperlink r:id="rId29" w:history="1">
+        <w:r>
+          <w:rPr>
+            <w:rStyle w:val="Hyperlink"/>
+            <w:lang w:val="en-GB"/>
+          </w:rPr>
+          <w:t>https://create.arduino.cc/projecthub/asmodeus_eous/using-a-soil-hygrometer-sensor-with-arduino-fad704?ref=part&amp;ref_id=8233&amp;offset=43</w:t>
+        </w:r>
+      </w:hyperlink>
+      <w:r>
+        <w:rPr>
+          <w:lang w:val="en-GB"/>
+        </w:rPr>
+        <w:t xml:space="preserve">) </w:t>
+      </w:r>
+    </w:p>
+    <w:p>
+      <w:pPr>
+        <w:rPr>
+          <w:lang w:val="en-GB"/>
+        </w:rPr>
+      </w:pPr>
+      <w:r>
+        <w:rPr>
+          <w:lang w:val="en-GB"/>
+        </w:rPr>
+        <w:t>My sensor range goes from 675 when inside water to 1023 completely dried</w:t>
+      </w:r>
+      <w:r>
+        <w:rPr>
+          <w:lang w:val="en-GB"/>
+        </w:rPr>
+        <w:t>, so I map it from 0 to 1023 and send this data to Thingspeak.</w:t>
+      </w:r>
+    </w:p>
+    <w:p>
+      <w:pPr>
+        <w:pStyle w:val="Heading2"/>
+        <w:rPr>
+          <w:lang w:val="en-GB"/>
+        </w:rPr>
+      </w:pPr>
+      <w:r>
+        <w:rPr>
+          <w:lang w:val="en-GB"/>
+        </w:rPr>
         <w:t>Matlab/Simulink</w:t>
       </w:r>
       <w:bookmarkEnd w:id="5"/>
@@ -1728,7 +1881,7 @@
         </w:rPr>
         <w:t>4 ways of running Python in Unity (</w:t>
       </w:r>
-      <w:hyperlink r:id="rId27" w:history="1">
+      <w:hyperlink r:id="rId30" w:history="1">
         <w:r>
           <w:rPr>
             <w:rStyle w:val="Hyperlink"/>
@@ -1773,7 +1926,7 @@
         </w:rPr>
         <w:t>(</w:t>
       </w:r>
-      <w:hyperlink r:id="rId28" w:history="1">
+      <w:hyperlink r:id="rId31" w:history="1">
         <w:r>
           <w:rPr>
             <w:rStyle w:val="Hyperlink"/>
@@ -1854,7 +2007,7 @@
         </w:rPr>
         <w:t>Daydream support was removed in 2020.1. Google released an open source cardboard plugin for 2020.1+ which they recommend using as a replacement: </w:t>
       </w:r>
-      <w:hyperlink r:id="rId29" w:tgtFrame="_blank" w:history="1">
+      <w:hyperlink r:id="rId32" w:tgtFrame="_blank" w:history="1">
         <w:r>
           <w:rPr>
             <w:rStyle w:val="Hyperlink"/>
@@ -1891,7 +2044,7 @@
         </w:rPr>
         <w:t>See google's suggestions here: </w:t>
       </w:r>
-      <w:hyperlink r:id="rId30" w:tgtFrame="_blank" w:history="1">
+      <w:hyperlink r:id="rId33" w:tgtFrame="_blank" w:history="1">
         <w:r>
           <w:rPr>
             <w:rStyle w:val="Hyperlink"/>
@@ -1914,9 +2067,10 @@
         <w:rPr>
           <w:lang w:val="en-GB"/>
         </w:rPr>
+        <w:lastRenderedPageBreak/>
         <w:t>Here is written how to use the new cardboard plugin (</w:t>
       </w:r>
-      <w:hyperlink r:id="rId31" w:history="1">
+      <w:hyperlink r:id="rId34" w:history="1">
         <w:r>
           <w:rPr>
             <w:rStyle w:val="Hyperlink"/>
@@ -1944,7 +2098,7 @@
         </w:rPr>
         <w:t>Mixed reality library for Unity and Google Cardboard (</w:t>
       </w:r>
-      <w:hyperlink r:id="rId32" w:history="1">
+      <w:hyperlink r:id="rId35" w:history="1">
         <w:r>
           <w:rPr>
             <w:rStyle w:val="Hyperlink"/>
@@ -1985,7 +2139,7 @@
         </w:rPr>
         <w:t>Tutorial for integrating Python Script Editor in Unity with small example (</w:t>
       </w:r>
-      <w:hyperlink r:id="rId33" w:history="1">
+      <w:hyperlink r:id="rId36" w:history="1">
         <w:r>
           <w:rPr>
             <w:rStyle w:val="Hyperlink"/>
@@ -2011,10 +2165,9 @@
         <w:rPr>
           <w:lang w:val="en-GB"/>
         </w:rPr>
-        <w:lastRenderedPageBreak/>
         <w:t>Guide for installing Python in Unity (</w:t>
       </w:r>
-      <w:hyperlink r:id="rId34" w:history="1">
+      <w:hyperlink r:id="rId37" w:history="1">
         <w:r>
           <w:rPr>
             <w:rStyle w:val="Hyperlink"/>
@@ -2085,7 +2238,7 @@
         </w:rPr>
         <w:t>Install pip from this site (</w:t>
       </w:r>
-      <w:hyperlink r:id="rId35" w:history="1">
+      <w:hyperlink r:id="rId38" w:history="1">
         <w:r>
           <w:rPr>
             <w:rStyle w:val="Hyperlink"/>
@@ -2112,7 +2265,7 @@
         </w:rPr>
         <w:t xml:space="preserve"> In order to work, add it to the PATH (</w:t>
       </w:r>
-      <w:hyperlink r:id="rId36" w:history="1">
+      <w:hyperlink r:id="rId39" w:history="1">
         <w:r>
           <w:rPr>
             <w:rStyle w:val="Hyperlink"/>
@@ -2254,7 +2407,7 @@
         </w:rPr>
         <w:t>using their API (</w:t>
       </w:r>
-      <w:hyperlink r:id="rId37" w:history="1">
+      <w:hyperlink r:id="rId40" w:history="1">
         <w:r>
           <w:rPr>
             <w:rStyle w:val="Hyperlink"/>
@@ -2282,7 +2435,7 @@
         </w:rPr>
         <w:t>This as an example (</w:t>
       </w:r>
-      <w:hyperlink r:id="rId38" w:history="1">
+      <w:hyperlink r:id="rId41" w:history="1">
         <w:r>
           <w:rPr>
             <w:rStyle w:val="Hyperlink"/>
@@ -2314,31 +2467,7 @@
         <w:rPr>
           <w:lang w:val="en-GB"/>
         </w:rPr>
-        <w:t xml:space="preserve">the </w:t>
-      </w:r>
-      <w:r>
-        <w:rPr>
-          <w:lang w:val="en-GB"/>
-        </w:rPr>
-        <w:t>Newtonsoft.Json</w:t>
-      </w:r>
-      <w:r>
-        <w:rPr>
-          <w:lang w:val="en-GB"/>
-        </w:rPr>
-        <w:t xml:space="preserve"> library (using </w:t>
-      </w:r>
-      <w:r>
-        <w:rPr>
-          <w:lang w:val="en-GB"/>
-        </w:rPr>
-        <w:t>Newtonsoft.Json.Linq</w:t>
-      </w:r>
-      <w:r>
-        <w:rPr>
-          <w:lang w:val="en-GB"/>
-        </w:rPr>
-        <w:t>)</w:t>
+        <w:t>the Newtonsoft.Json library (using Newtonsoft.Json.Linq)</w:t>
       </w:r>
       <w:r>
         <w:rPr>
@@ -2352,7 +2481,7 @@
         </w:rPr>
         <w:t>(</w:t>
       </w:r>
-      <w:hyperlink r:id="rId39" w:history="1">
+      <w:hyperlink r:id="rId42" w:history="1">
         <w:r>
           <w:rPr>
             <w:rStyle w:val="Hyperlink"/>
@@ -2434,7 +2563,7 @@
         </w:rPr>
         <w:t>In order to do it I create a bot using BotFather (</w:t>
       </w:r>
-      <w:hyperlink r:id="rId40" w:history="1">
+      <w:hyperlink r:id="rId43" w:history="1">
         <w:r>
           <w:rPr>
             <w:rStyle w:val="Hyperlink"/>
@@ -2472,9 +2601,10 @@
         <w:rPr>
           <w:lang w:val="en-GB"/>
         </w:rPr>
+        <w:lastRenderedPageBreak/>
         <w:t>Then using telepot python library (</w:t>
       </w:r>
-      <w:hyperlink r:id="rId41" w:history="1">
+      <w:hyperlink r:id="rId44" w:history="1">
         <w:r>
           <w:rPr>
             <w:rStyle w:val="Hyperlink"/>
@@ -2520,7 +2650,7 @@
         </w:rPr>
         <w:t xml:space="preserve"> (</w:t>
       </w:r>
-      <w:hyperlink r:id="rId42" w:history="1">
+      <w:hyperlink r:id="rId45" w:history="1">
         <w:r>
           <w:rPr>
             <w:rStyle w:val="Hyperlink"/>
@@ -2566,7 +2696,7 @@
         </w:rPr>
         <w:t>(</w:t>
       </w:r>
-      <w:hyperlink r:id="rId43" w:tgtFrame="_blank" w:history="1">
+      <w:hyperlink r:id="rId46" w:tgtFrame="_blank" w:history="1">
         <w:r>
           <w:rPr>
             <w:rStyle w:val="Hyperlink"/>
@@ -2618,7 +2748,7 @@
           <w:lang w:val="en-GB"/>
         </w:rPr>
       </w:pPr>
-      <w:hyperlink r:id="rId44" w:history="1">
+      <w:hyperlink r:id="rId47" w:history="1">
         <w:r>
           <w:rPr>
             <w:rStyle w:val="Hyperlink"/>
@@ -3765,6 +3895,7 @@
   <w:style w:type="character" w:default="1" w:styleId="DefaultParagraphFont">
     <w:name w:val="Default Paragraph Font"/>
     <w:uiPriority w:val="1"/>
+    <w:semiHidden/>
     <w:unhideWhenUsed/>
   </w:style>
   <w:style w:type="table" w:default="1" w:styleId="TableNormal">
@@ -4280,6 +4411,12 @@
 </file>
 
 <file path=customXml/item1.xml><?xml version="1.0" encoding="utf-8"?>
+<p:properties xmlns:p="http://schemas.microsoft.com/office/2006/metadata/properties" xmlns:xsi="http://www.w3.org/2001/XMLSchema-instance" xmlns:pc="http://schemas.microsoft.com/office/infopath/2007/PartnerControls">
+  <documentManagement/>
+</p:properties>
+</file>
+
+<file path=customXml/item2.xml><?xml version="1.0" encoding="utf-8"?>
 <?mso-contentType ?>
 <FormTemplates xmlns="http://schemas.microsoft.com/sharepoint/v3/contenttype/forms">
   <Display>DocumentLibraryForm</Display>
@@ -4288,17 +4425,7 @@
 </FormTemplates>
 </file>
 
-<file path=customXml/item2.xml><?xml version="1.0" encoding="utf-8"?>
-<p:properties xmlns:p="http://schemas.microsoft.com/office/2006/metadata/properties" xmlns:xsi="http://www.w3.org/2001/XMLSchema-instance" xmlns:pc="http://schemas.microsoft.com/office/infopath/2007/PartnerControls">
-  <documentManagement/>
-</p:properties>
-</file>
-
 <file path=customXml/item3.xml><?xml version="1.0" encoding="utf-8"?>
-<b:Sources xmlns:b="http://schemas.openxmlformats.org/officeDocument/2006/bibliography" xmlns="http://schemas.openxmlformats.org/officeDocument/2006/bibliography" SelectedStyle="\APASixthEditionOfficeOnline.xsl" StyleName="APA" Version="6"/>
-</file>
-
-<file path=customXml/item4.xml><?xml version="1.0" encoding="utf-8"?>
 <ct:contentTypeSchema xmlns:ct="http://schemas.microsoft.com/office/2006/metadata/contentType" xmlns:ma="http://schemas.microsoft.com/office/2006/metadata/properties/metaAttributes" ct:_="" ma:_="" ma:contentTypeName="Documento" ma:contentTypeID="0x010100476C80DBA2A885449FD8B645A4D4C6FE" ma:contentTypeVersion="12" ma:contentTypeDescription="Crear nuevo documento." ma:contentTypeScope="" ma:versionID="c694e10bb6fe923b7bf09275a2383295">
   <xsd:schema xmlns:xsd="http://www.w3.org/2001/XMLSchema" xmlns:xs="http://www.w3.org/2001/XMLSchema" xmlns:p="http://schemas.microsoft.com/office/2006/metadata/properties" xmlns:ns3="f161e47d-169b-4aff-b47c-84b5e15d4deb" xmlns:ns4="5e6cfdc5-b52e-4221-a343-85db301e0661" targetNamespace="http://schemas.microsoft.com/office/2006/metadata/properties" ma:root="true" ma:fieldsID="ef5fedb621caa12722fd75c7929cb79a" ns3:_="" ns4:_="">
     <xsd:import namespace="f161e47d-169b-4aff-b47c-84b5e15d4deb"/>
@@ -4515,15 +4642,11 @@
 </ct:contentTypeSchema>
 </file>
 
-<file path=customXml/itemProps1.xml><?xml version="1.0" encoding="utf-8"?>
-<ds:datastoreItem xmlns:ds="http://schemas.openxmlformats.org/officeDocument/2006/customXml" ds:itemID="{69B63455-D79A-4881-AE27-C458E95494A8}">
-  <ds:schemaRefs>
-    <ds:schemaRef ds:uri="http://schemas.microsoft.com/sharepoint/v3/contenttype/forms"/>
-  </ds:schemaRefs>
-</ds:datastoreItem>
+<file path=customXml/item4.xml><?xml version="1.0" encoding="utf-8"?>
+<b:Sources xmlns:b="http://schemas.openxmlformats.org/officeDocument/2006/bibliography" xmlns="http://schemas.openxmlformats.org/officeDocument/2006/bibliography" SelectedStyle="\APASixthEditionOfficeOnline.xsl" StyleName="APA" Version="6"/>
 </file>
 
-<file path=customXml/itemProps2.xml><?xml version="1.0" encoding="utf-8"?>
+<file path=customXml/itemProps1.xml><?xml version="1.0" encoding="utf-8"?>
 <ds:datastoreItem xmlns:ds="http://schemas.openxmlformats.org/officeDocument/2006/customXml" ds:itemID="{57A0A09F-D7A2-43D0-A17E-3CCE9A625C60}">
   <ds:schemaRefs>
     <ds:schemaRef ds:uri="http://schemas.microsoft.com/office/2006/metadata/properties"/>
@@ -4532,15 +4655,15 @@
 </ds:datastoreItem>
 </file>
 
-<file path=customXml/itemProps3.xml><?xml version="1.0" encoding="utf-8"?>
-<ds:datastoreItem xmlns:ds="http://schemas.openxmlformats.org/officeDocument/2006/customXml" ds:itemID="{36376837-F33B-427F-8D83-C113DE7E32E8}">
+<file path=customXml/itemProps2.xml><?xml version="1.0" encoding="utf-8"?>
+<ds:datastoreItem xmlns:ds="http://schemas.openxmlformats.org/officeDocument/2006/customXml" ds:itemID="{69B63455-D79A-4881-AE27-C458E95494A8}">
   <ds:schemaRefs>
-    <ds:schemaRef ds:uri="http://schemas.openxmlformats.org/officeDocument/2006/bibliography"/>
+    <ds:schemaRef ds:uri="http://schemas.microsoft.com/sharepoint/v3/contenttype/forms"/>
   </ds:schemaRefs>
 </ds:datastoreItem>
 </file>
 
-<file path=customXml/itemProps4.xml><?xml version="1.0" encoding="utf-8"?>
+<file path=customXml/itemProps3.xml><?xml version="1.0" encoding="utf-8"?>
 <ds:datastoreItem xmlns:ds="http://schemas.openxmlformats.org/officeDocument/2006/customXml" ds:itemID="{0B2E499F-48D1-41DE-8858-034DC7EBF65E}">
   <ds:schemaRefs>
     <ds:schemaRef ds:uri="http://schemas.microsoft.com/office/2006/metadata/contentType"/>
@@ -4557,4 +4680,12 @@
     <ds:schemaRef ds:uri="http://schemas.microsoft.com/internal/obd"/>
   </ds:schemaRefs>
 </ds:datastoreItem>
+</file>
+
+<file path=customXml/itemProps4.xml><?xml version="1.0" encoding="utf-8"?>
+<ds:datastoreItem xmlns:ds="http://schemas.openxmlformats.org/officeDocument/2006/customXml" ds:itemID="{36376837-F33B-427F-8D83-C113DE7E32E8}">
+  <ds:schemaRefs>
+    <ds:schemaRef ds:uri="http://schemas.openxmlformats.org/officeDocument/2006/bibliography"/>
+  </ds:schemaRefs>
+</ds:datastoreItem>
 </file>
</xml_diff>

<commit_message>
Light sensor data added
</commit_message>
<xml_diff>
--- a/Documentation/General/Notes.docx
+++ b/Documentation/General/Notes.docx
@@ -1,6 +1,6 @@
 
 <file path=word/document.xml><?xml version="1.0" encoding="utf-8"?>
-<w:document xmlns:wpc="http://schemas.microsoft.com/office/word/2010/wordprocessingCanvas" xmlns:cx="http://schemas.microsoft.com/office/drawing/2014/chartex" xmlns:cx1="http://schemas.microsoft.com/office/drawing/2015/9/8/chartex" xmlns:cx2="http://schemas.microsoft.com/office/drawing/2015/10/21/chartex" xmlns:cx3="http://schemas.microsoft.com/office/drawing/2016/5/9/chartex" xmlns:cx4="http://schemas.microsoft.com/office/drawing/2016/5/10/chartex" xmlns:cx5="http://schemas.microsoft.com/office/drawing/2016/5/11/chartex" xmlns:cx6="http://schemas.microsoft.com/office/drawing/2016/5/12/chartex" xmlns:cx7="http://schemas.microsoft.com/office/drawing/2016/5/13/chartex" xmlns:cx8="http://schemas.microsoft.com/office/drawing/2016/5/14/chartex" xmlns:mc="http://schemas.openxmlformats.org/markup-compatibility/2006" xmlns:aink="http://schemas.microsoft.com/office/drawing/2016/ink" xmlns:am3d="http://schemas.microsoft.com/office/drawing/2017/model3d" xmlns:o="urn:schemas-microsoft-com:office:office" xmlns:r="http://schemas.openxmlformats.org/officeDocument/2006/relationships" xmlns:m="http://schemas.openxmlformats.org/officeDocument/2006/math" xmlns:v="urn:schemas-microsoft-com:vml" xmlns:wp14="http://schemas.microsoft.com/office/word/2010/wordprocessingDrawing" xmlns:wp="http://schemas.openxmlformats.org/drawingml/2006/wordprocessingDrawing" xmlns:w10="urn:schemas-microsoft-com:office:word" xmlns:w="http://schemas.openxmlformats.org/wordprocessingml/2006/main" xmlns:w14="http://schemas.microsoft.com/office/word/2010/wordml" xmlns:w15="http://schemas.microsoft.com/office/word/2012/wordml" xmlns:w16cex="http://schemas.microsoft.com/office/word/2018/wordml/cex" xmlns:w16cid="http://schemas.microsoft.com/office/word/2016/wordml/cid" xmlns:w16="http://schemas.microsoft.com/office/word/2018/wordml" xmlns:w16se="http://schemas.microsoft.com/office/word/2015/wordml/symex" xmlns:wpg="http://schemas.microsoft.com/office/word/2010/wordprocessingGroup" xmlns:wpi="http://schemas.microsoft.com/office/word/2010/wordprocessingInk" xmlns:wne="http://schemas.microsoft.com/office/word/2006/wordml" xmlns:wps="http://schemas.microsoft.com/office/word/2010/wordprocessingShape" mc:Ignorable="w14 w15 w16se w16cid w16 w16cex wp14">
+<w:document xmlns:wpc="http://schemas.microsoft.com/office/word/2010/wordprocessingCanvas" xmlns:cx="http://schemas.microsoft.com/office/drawing/2014/chartex" xmlns:cx1="http://schemas.microsoft.com/office/drawing/2015/9/8/chartex" xmlns:cx2="http://schemas.microsoft.com/office/drawing/2015/10/21/chartex" xmlns:cx3="http://schemas.microsoft.com/office/drawing/2016/5/9/chartex" xmlns:cx4="http://schemas.microsoft.com/office/drawing/2016/5/10/chartex" xmlns:cx5="http://schemas.microsoft.com/office/drawing/2016/5/11/chartex" xmlns:cx6="http://schemas.microsoft.com/office/drawing/2016/5/12/chartex" xmlns:cx7="http://schemas.microsoft.com/office/drawing/2016/5/13/chartex" xmlns:cx8="http://schemas.microsoft.com/office/drawing/2016/5/14/chartex" xmlns:mc="http://schemas.openxmlformats.org/markup-compatibility/2006" xmlns:aink="http://schemas.microsoft.com/office/drawing/2016/ink" xmlns:am3d="http://schemas.microsoft.com/office/drawing/2017/model3d" xmlns:o="urn:schemas-microsoft-com:office:office" xmlns:r="http://schemas.openxmlformats.org/officeDocument/2006/relationships" xmlns:m="http://schemas.openxmlformats.org/officeDocument/2006/math" xmlns:v="urn:schemas-microsoft-com:vml" xmlns:wp14="http://schemas.microsoft.com/office/word/2010/wordprocessingDrawing" xmlns:wp="http://schemas.openxmlformats.org/drawingml/2006/wordprocessingDrawing" xmlns:w10="urn:schemas-microsoft-com:office:word" xmlns:w="http://schemas.openxmlformats.org/wordprocessingml/2006/main" xmlns:w14="http://schemas.microsoft.com/office/word/2010/wordml" xmlns:w15="http://schemas.microsoft.com/office/word/2012/wordml" xmlns:w16cex="http://schemas.microsoft.com/office/word/2018/wordml/cex" xmlns:w16cid="http://schemas.microsoft.com/office/word/2016/wordml/cid" xmlns:w16="http://schemas.microsoft.com/office/word/2018/wordml" xmlns:w16sdtdh="http://schemas.microsoft.com/office/word/2020/wordml/sdtdatahash" xmlns:w16se="http://schemas.microsoft.com/office/word/2015/wordml/symex" xmlns:wpg="http://schemas.microsoft.com/office/word/2010/wordprocessingGroup" xmlns:wpi="http://schemas.microsoft.com/office/word/2010/wordprocessingInk" xmlns:wne="http://schemas.microsoft.com/office/word/2006/wordml" xmlns:wps="http://schemas.microsoft.com/office/word/2010/wordprocessingShape" mc:Ignorable="w14 w15 w16se w16cid w16 w16cex w16sdtdh wp14">
   <w:body>
     <w:p>
       <w:pPr>
@@ -37,11 +37,9 @@
           <w:pPr>
             <w:pStyle w:val="TOCHeading"/>
           </w:pPr>
-          <w:proofErr w:type="spellStart"/>
           <w:r>
             <w:t>Contents</w:t>
           </w:r>
-          <w:proofErr w:type="spellEnd"/>
         </w:p>
         <w:p>
           <w:pPr>
@@ -64,7 +62,7 @@
           <w:r>
             <w:fldChar w:fldCharType="separate"/>
           </w:r>
-          <w:hyperlink w:anchor="_Toc67349880" w:history="1">
+          <w:hyperlink w:anchor="_Toc70501311" w:history="1">
             <w:r>
               <w:rPr>
                 <w:rStyle w:val="Hyperlink"/>
@@ -92,7 +90,7 @@
                 <w:noProof/>
                 <w:webHidden/>
               </w:rPr>
-              <w:instrText xml:space="preserve"> PAGEREF _Toc67349880 \h </w:instrText>
+              <w:instrText xml:space="preserve"> PAGEREF _Toc70501311 \h </w:instrText>
             </w:r>
             <w:r>
               <w:rPr>
@@ -135,7 +133,7 @@
               <w:lang w:val="en-GB" w:eastAsia="en-GB"/>
             </w:rPr>
           </w:pPr>
-          <w:hyperlink w:anchor="_Toc67349881" w:history="1">
+          <w:hyperlink w:anchor="_Toc70501312" w:history="1">
             <w:r>
               <w:rPr>
                 <w:rStyle w:val="Hyperlink"/>
@@ -163,7 +161,7 @@
                 <w:noProof/>
                 <w:webHidden/>
               </w:rPr>
-              <w:instrText xml:space="preserve"> PAGEREF _Toc67349881 \h </w:instrText>
+              <w:instrText xml:space="preserve"> PAGEREF _Toc70501312 \h </w:instrText>
             </w:r>
             <w:r>
               <w:rPr>
@@ -206,7 +204,7 @@
               <w:lang w:val="en-GB" w:eastAsia="en-GB"/>
             </w:rPr>
           </w:pPr>
-          <w:hyperlink w:anchor="_Toc67349882" w:history="1">
+          <w:hyperlink w:anchor="_Toc70501313" w:history="1">
             <w:r>
               <w:rPr>
                 <w:rStyle w:val="Hyperlink"/>
@@ -234,7 +232,7 @@
                 <w:noProof/>
                 <w:webHidden/>
               </w:rPr>
-              <w:instrText xml:space="preserve"> PAGEREF _Toc67349882 \h </w:instrText>
+              <w:instrText xml:space="preserve"> PAGEREF _Toc70501313 \h </w:instrText>
             </w:r>
             <w:r>
               <w:rPr>
@@ -277,7 +275,7 @@
               <w:lang w:val="en-GB" w:eastAsia="en-GB"/>
             </w:rPr>
           </w:pPr>
-          <w:hyperlink w:anchor="_Toc67349883" w:history="1">
+          <w:hyperlink w:anchor="_Toc70501314" w:history="1">
             <w:r>
               <w:rPr>
                 <w:rStyle w:val="Hyperlink"/>
@@ -305,7 +303,7 @@
                 <w:noProof/>
                 <w:webHidden/>
               </w:rPr>
-              <w:instrText xml:space="preserve"> PAGEREF _Toc67349883 \h </w:instrText>
+              <w:instrText xml:space="preserve"> PAGEREF _Toc70501314 \h </w:instrText>
             </w:r>
             <w:r>
               <w:rPr>
@@ -348,7 +346,7 @@
               <w:lang w:val="en-GB" w:eastAsia="en-GB"/>
             </w:rPr>
           </w:pPr>
-          <w:hyperlink w:anchor="_Toc67349884" w:history="1">
+          <w:hyperlink w:anchor="_Toc70501315" w:history="1">
             <w:r>
               <w:rPr>
                 <w:rStyle w:val="Hyperlink"/>
@@ -376,7 +374,7 @@
                 <w:noProof/>
                 <w:webHidden/>
               </w:rPr>
-              <w:instrText xml:space="preserve"> PAGEREF _Toc67349884 \h </w:instrText>
+              <w:instrText xml:space="preserve"> PAGEREF _Toc70501315 \h </w:instrText>
             </w:r>
             <w:r>
               <w:rPr>
@@ -419,14 +417,14 @@
               <w:lang w:val="en-GB" w:eastAsia="en-GB"/>
             </w:rPr>
           </w:pPr>
-          <w:hyperlink w:anchor="_Toc67349885" w:history="1">
+          <w:hyperlink w:anchor="_Toc70501316" w:history="1">
             <w:r>
               <w:rPr>
                 <w:rStyle w:val="Hyperlink"/>
                 <w:noProof/>
                 <w:lang w:val="en-GB"/>
               </w:rPr>
-              <w:t>Matlab/Simulink</w:t>
+              <w:t>Arduino IDE</w:t>
             </w:r>
             <w:r>
               <w:rPr>
@@ -447,7 +445,7 @@
                 <w:noProof/>
                 <w:webHidden/>
               </w:rPr>
-              <w:instrText xml:space="preserve"> PAGEREF _Toc67349885 \h </w:instrText>
+              <w:instrText xml:space="preserve"> PAGEREF _Toc70501316 \h </w:instrText>
             </w:r>
             <w:r>
               <w:rPr>
@@ -490,14 +488,14 @@
               <w:lang w:val="en-GB" w:eastAsia="en-GB"/>
             </w:rPr>
           </w:pPr>
-          <w:hyperlink w:anchor="_Toc67349886" w:history="1">
+          <w:hyperlink w:anchor="_Toc70501317" w:history="1">
             <w:r>
               <w:rPr>
                 <w:rStyle w:val="Hyperlink"/>
                 <w:noProof/>
                 <w:lang w:val="en-GB"/>
               </w:rPr>
-              <w:t>Packages</w:t>
+              <w:t>Sensors</w:t>
             </w:r>
             <w:r>
               <w:rPr>
@@ -518,7 +516,78 @@
                 <w:noProof/>
                 <w:webHidden/>
               </w:rPr>
-              <w:instrText xml:space="preserve"> PAGEREF _Toc67349886 \h </w:instrText>
+              <w:instrText xml:space="preserve"> PAGEREF _Toc70501317 \h </w:instrText>
+            </w:r>
+            <w:r>
+              <w:rPr>
+                <w:noProof/>
+                <w:webHidden/>
+              </w:rPr>
+            </w:r>
+            <w:r>
+              <w:rPr>
+                <w:noProof/>
+                <w:webHidden/>
+              </w:rPr>
+              <w:fldChar w:fldCharType="separate"/>
+            </w:r>
+            <w:r>
+              <w:rPr>
+                <w:noProof/>
+                <w:webHidden/>
+              </w:rPr>
+              <w:t>3</w:t>
+            </w:r>
+            <w:r>
+              <w:rPr>
+                <w:noProof/>
+                <w:webHidden/>
+              </w:rPr>
+              <w:fldChar w:fldCharType="end"/>
+            </w:r>
+          </w:hyperlink>
+        </w:p>
+        <w:p>
+          <w:pPr>
+            <w:pStyle w:val="TOC2"/>
+            <w:tabs>
+              <w:tab w:val="right" w:leader="dot" w:pos="8494"/>
+            </w:tabs>
+            <w:rPr>
+              <w:rFonts w:eastAsiaTheme="minorEastAsia"/>
+              <w:noProof/>
+              <w:lang w:val="en-GB" w:eastAsia="en-GB"/>
+            </w:rPr>
+          </w:pPr>
+          <w:hyperlink w:anchor="_Toc70501318" w:history="1">
+            <w:r>
+              <w:rPr>
+                <w:rStyle w:val="Hyperlink"/>
+                <w:noProof/>
+                <w:lang w:val="en-GB"/>
+              </w:rPr>
+              <w:t>Matlab/Simulink</w:t>
+            </w:r>
+            <w:r>
+              <w:rPr>
+                <w:noProof/>
+                <w:webHidden/>
+              </w:rPr>
+              <w:tab/>
+            </w:r>
+            <w:r>
+              <w:rPr>
+                <w:noProof/>
+                <w:webHidden/>
+              </w:rPr>
+              <w:fldChar w:fldCharType="begin"/>
+            </w:r>
+            <w:r>
+              <w:rPr>
+                <w:noProof/>
+                <w:webHidden/>
+              </w:rPr>
+              <w:instrText xml:space="preserve"> PAGEREF _Toc70501318 \h </w:instrText>
             </w:r>
             <w:r>
               <w:rPr>
@@ -561,13 +630,84 @@
               <w:lang w:val="en-GB" w:eastAsia="en-GB"/>
             </w:rPr>
           </w:pPr>
-          <w:hyperlink w:anchor="_Toc67349887" w:history="1">
+          <w:hyperlink w:anchor="_Toc70501319" w:history="1">
             <w:r>
               <w:rPr>
                 <w:rStyle w:val="Hyperlink"/>
                 <w:noProof/>
                 <w:lang w:val="en-GB"/>
               </w:rPr>
+              <w:t>Packages</w:t>
+            </w:r>
+            <w:r>
+              <w:rPr>
+                <w:noProof/>
+                <w:webHidden/>
+              </w:rPr>
+              <w:tab/>
+            </w:r>
+            <w:r>
+              <w:rPr>
+                <w:noProof/>
+                <w:webHidden/>
+              </w:rPr>
+              <w:fldChar w:fldCharType="begin"/>
+            </w:r>
+            <w:r>
+              <w:rPr>
+                <w:noProof/>
+                <w:webHidden/>
+              </w:rPr>
+              <w:instrText xml:space="preserve"> PAGEREF _Toc70501319 \h </w:instrText>
+            </w:r>
+            <w:r>
+              <w:rPr>
+                <w:noProof/>
+                <w:webHidden/>
+              </w:rPr>
+            </w:r>
+            <w:r>
+              <w:rPr>
+                <w:noProof/>
+                <w:webHidden/>
+              </w:rPr>
+              <w:fldChar w:fldCharType="separate"/>
+            </w:r>
+            <w:r>
+              <w:rPr>
+                <w:noProof/>
+                <w:webHidden/>
+              </w:rPr>
+              <w:t>3</w:t>
+            </w:r>
+            <w:r>
+              <w:rPr>
+                <w:noProof/>
+                <w:webHidden/>
+              </w:rPr>
+              <w:fldChar w:fldCharType="end"/>
+            </w:r>
+          </w:hyperlink>
+        </w:p>
+        <w:p>
+          <w:pPr>
+            <w:pStyle w:val="TOC3"/>
+            <w:tabs>
+              <w:tab w:val="right" w:leader="dot" w:pos="8494"/>
+            </w:tabs>
+            <w:rPr>
+              <w:rFonts w:eastAsiaTheme="minorEastAsia"/>
+              <w:noProof/>
+              <w:lang w:val="en-GB" w:eastAsia="en-GB"/>
+            </w:rPr>
+          </w:pPr>
+          <w:hyperlink w:anchor="_Toc70501320" w:history="1">
+            <w:r>
+              <w:rPr>
+                <w:rStyle w:val="Hyperlink"/>
+                <w:noProof/>
+                <w:lang w:val="en-GB"/>
+              </w:rPr>
               <w:t>Connection with Arduino</w:t>
             </w:r>
             <w:r>
@@ -589,7 +729,7 @@
                 <w:noProof/>
                 <w:webHidden/>
               </w:rPr>
-              <w:instrText xml:space="preserve"> PAGEREF _Toc67349887 \h </w:instrText>
+              <w:instrText xml:space="preserve"> PAGEREF _Toc70501320 \h </w:instrText>
             </w:r>
             <w:r>
               <w:rPr>
@@ -632,7 +772,7 @@
               <w:lang w:val="en-GB" w:eastAsia="en-GB"/>
             </w:rPr>
           </w:pPr>
-          <w:hyperlink w:anchor="_Toc67349888" w:history="1">
+          <w:hyperlink w:anchor="_Toc70501321" w:history="1">
             <w:r>
               <w:rPr>
                 <w:rStyle w:val="Hyperlink"/>
@@ -660,7 +800,7 @@
                 <w:noProof/>
                 <w:webHidden/>
               </w:rPr>
-              <w:instrText xml:space="preserve"> PAGEREF _Toc67349888 \h </w:instrText>
+              <w:instrText xml:space="preserve"> PAGEREF _Toc70501321 \h </w:instrText>
             </w:r>
             <w:r>
               <w:rPr>
@@ -680,7 +820,7 @@
                 <w:noProof/>
                 <w:webHidden/>
               </w:rPr>
-              <w:t>3</w:t>
+              <w:t>4</w:t>
             </w:r>
             <w:r>
               <w:rPr>
@@ -703,7 +843,7 @@
               <w:lang w:val="en-GB" w:eastAsia="en-GB"/>
             </w:rPr>
           </w:pPr>
-          <w:hyperlink w:anchor="_Toc67349889" w:history="1">
+          <w:hyperlink w:anchor="_Toc70501322" w:history="1">
             <w:r>
               <w:rPr>
                 <w:rStyle w:val="Hyperlink"/>
@@ -731,7 +871,7 @@
                 <w:noProof/>
                 <w:webHidden/>
               </w:rPr>
-              <w:instrText xml:space="preserve"> PAGEREF _Toc67349889 \h </w:instrText>
+              <w:instrText xml:space="preserve"> PAGEREF _Toc70501322 \h </w:instrText>
             </w:r>
             <w:r>
               <w:rPr>
@@ -751,7 +891,289 @@
                 <w:noProof/>
                 <w:webHidden/>
               </w:rPr>
-              <w:t>3</w:t>
+              <w:t>4</w:t>
+            </w:r>
+            <w:r>
+              <w:rPr>
+                <w:noProof/>
+                <w:webHidden/>
+              </w:rPr>
+              <w:fldChar w:fldCharType="end"/>
+            </w:r>
+          </w:hyperlink>
+        </w:p>
+        <w:p>
+          <w:pPr>
+            <w:pStyle w:val="TOC2"/>
+            <w:tabs>
+              <w:tab w:val="right" w:leader="dot" w:pos="8494"/>
+            </w:tabs>
+            <w:rPr>
+              <w:rFonts w:eastAsiaTheme="minorEastAsia"/>
+              <w:noProof/>
+              <w:lang w:val="en-GB" w:eastAsia="en-GB"/>
+            </w:rPr>
+          </w:pPr>
+          <w:hyperlink w:anchor="_Toc70501323" w:history="1">
+            <w:r>
+              <w:rPr>
+                <w:rStyle w:val="Hyperlink"/>
+                <w:noProof/>
+                <w:lang w:val="en-GB"/>
+              </w:rPr>
+              <w:t>Telegram bot</w:t>
+            </w:r>
+            <w:r>
+              <w:rPr>
+                <w:noProof/>
+                <w:webHidden/>
+              </w:rPr>
+              <w:tab/>
+            </w:r>
+            <w:r>
+              <w:rPr>
+                <w:noProof/>
+                <w:webHidden/>
+              </w:rPr>
+              <w:fldChar w:fldCharType="begin"/>
+            </w:r>
+            <w:r>
+              <w:rPr>
+                <w:noProof/>
+                <w:webHidden/>
+              </w:rPr>
+              <w:instrText xml:space="preserve"> PAGEREF _Toc70501323 \h </w:instrText>
+            </w:r>
+            <w:r>
+              <w:rPr>
+                <w:noProof/>
+                <w:webHidden/>
+              </w:rPr>
+            </w:r>
+            <w:r>
+              <w:rPr>
+                <w:noProof/>
+                <w:webHidden/>
+              </w:rPr>
+              <w:fldChar w:fldCharType="separate"/>
+            </w:r>
+            <w:r>
+              <w:rPr>
+                <w:noProof/>
+                <w:webHidden/>
+              </w:rPr>
+              <w:t>5</w:t>
+            </w:r>
+            <w:r>
+              <w:rPr>
+                <w:noProof/>
+                <w:webHidden/>
+              </w:rPr>
+              <w:fldChar w:fldCharType="end"/>
+            </w:r>
+          </w:hyperlink>
+        </w:p>
+        <w:p>
+          <w:pPr>
+            <w:pStyle w:val="TOC2"/>
+            <w:tabs>
+              <w:tab w:val="right" w:leader="dot" w:pos="8494"/>
+            </w:tabs>
+            <w:rPr>
+              <w:rFonts w:eastAsiaTheme="minorEastAsia"/>
+              <w:noProof/>
+              <w:lang w:val="en-GB" w:eastAsia="en-GB"/>
+            </w:rPr>
+          </w:pPr>
+          <w:hyperlink w:anchor="_Toc70501324" w:history="1">
+            <w:r>
+              <w:rPr>
+                <w:rStyle w:val="Hyperlink"/>
+                <w:noProof/>
+                <w:lang w:val="en-GB"/>
+              </w:rPr>
+              <w:t>ThingSpeak visualization</w:t>
+            </w:r>
+            <w:r>
+              <w:rPr>
+                <w:noProof/>
+                <w:webHidden/>
+              </w:rPr>
+              <w:tab/>
+            </w:r>
+            <w:r>
+              <w:rPr>
+                <w:noProof/>
+                <w:webHidden/>
+              </w:rPr>
+              <w:fldChar w:fldCharType="begin"/>
+            </w:r>
+            <w:r>
+              <w:rPr>
+                <w:noProof/>
+                <w:webHidden/>
+              </w:rPr>
+              <w:instrText xml:space="preserve"> PAGEREF _Toc70501324 \h </w:instrText>
+            </w:r>
+            <w:r>
+              <w:rPr>
+                <w:noProof/>
+                <w:webHidden/>
+              </w:rPr>
+            </w:r>
+            <w:r>
+              <w:rPr>
+                <w:noProof/>
+                <w:webHidden/>
+              </w:rPr>
+              <w:fldChar w:fldCharType="separate"/>
+            </w:r>
+            <w:r>
+              <w:rPr>
+                <w:noProof/>
+                <w:webHidden/>
+              </w:rPr>
+              <w:t>6</w:t>
+            </w:r>
+            <w:r>
+              <w:rPr>
+                <w:noProof/>
+                <w:webHidden/>
+              </w:rPr>
+              <w:fldChar w:fldCharType="end"/>
+            </w:r>
+          </w:hyperlink>
+        </w:p>
+        <w:p>
+          <w:pPr>
+            <w:pStyle w:val="TOC2"/>
+            <w:tabs>
+              <w:tab w:val="right" w:leader="dot" w:pos="8494"/>
+            </w:tabs>
+            <w:rPr>
+              <w:rFonts w:eastAsiaTheme="minorEastAsia"/>
+              <w:noProof/>
+              <w:lang w:val="en-GB" w:eastAsia="en-GB"/>
+            </w:rPr>
+          </w:pPr>
+          <w:hyperlink w:anchor="_Toc70501325" w:history="1">
+            <w:r>
+              <w:rPr>
+                <w:rStyle w:val="Hyperlink"/>
+                <w:noProof/>
+                <w:lang w:val="en-GB"/>
+              </w:rPr>
+              <w:t>Interest links</w:t>
+            </w:r>
+            <w:r>
+              <w:rPr>
+                <w:noProof/>
+                <w:webHidden/>
+              </w:rPr>
+              <w:tab/>
+            </w:r>
+            <w:r>
+              <w:rPr>
+                <w:noProof/>
+                <w:webHidden/>
+              </w:rPr>
+              <w:fldChar w:fldCharType="begin"/>
+            </w:r>
+            <w:r>
+              <w:rPr>
+                <w:noProof/>
+                <w:webHidden/>
+              </w:rPr>
+              <w:instrText xml:space="preserve"> PAGEREF _Toc70501325 \h </w:instrText>
+            </w:r>
+            <w:r>
+              <w:rPr>
+                <w:noProof/>
+                <w:webHidden/>
+              </w:rPr>
+            </w:r>
+            <w:r>
+              <w:rPr>
+                <w:noProof/>
+                <w:webHidden/>
+              </w:rPr>
+              <w:fldChar w:fldCharType="separate"/>
+            </w:r>
+            <w:r>
+              <w:rPr>
+                <w:noProof/>
+                <w:webHidden/>
+              </w:rPr>
+              <w:t>6</w:t>
+            </w:r>
+            <w:r>
+              <w:rPr>
+                <w:noProof/>
+                <w:webHidden/>
+              </w:rPr>
+              <w:fldChar w:fldCharType="end"/>
+            </w:r>
+          </w:hyperlink>
+        </w:p>
+        <w:p>
+          <w:pPr>
+            <w:pStyle w:val="TOC1"/>
+            <w:tabs>
+              <w:tab w:val="right" w:leader="dot" w:pos="8494"/>
+            </w:tabs>
+            <w:rPr>
+              <w:noProof/>
+            </w:rPr>
+          </w:pPr>
+          <w:hyperlink w:anchor="_Toc70501326" w:history="1">
+            <w:r>
+              <w:rPr>
+                <w:rStyle w:val="Hyperlink"/>
+                <w:noProof/>
+                <w:lang w:val="en-GB"/>
+              </w:rPr>
+              <w:t>Things to improve</w:t>
+            </w:r>
+            <w:r>
+              <w:rPr>
+                <w:noProof/>
+                <w:webHidden/>
+              </w:rPr>
+              <w:tab/>
+            </w:r>
+            <w:r>
+              <w:rPr>
+                <w:noProof/>
+                <w:webHidden/>
+              </w:rPr>
+              <w:fldChar w:fldCharType="begin"/>
+            </w:r>
+            <w:r>
+              <w:rPr>
+                <w:noProof/>
+                <w:webHidden/>
+              </w:rPr>
+              <w:instrText xml:space="preserve"> PAGEREF _Toc70501326 \h </w:instrText>
+            </w:r>
+            <w:r>
+              <w:rPr>
+                <w:noProof/>
+                <w:webHidden/>
+              </w:rPr>
+            </w:r>
+            <w:r>
+              <w:rPr>
+                <w:noProof/>
+                <w:webHidden/>
+              </w:rPr>
+              <w:fldChar w:fldCharType="separate"/>
+            </w:r>
+            <w:r>
+              <w:rPr>
+                <w:noProof/>
+                <w:webHidden/>
+              </w:rPr>
+              <w:t>6</w:t>
             </w:r>
             <w:r>
               <w:rPr>
@@ -778,12 +1200,12 @@
     <w:p/>
     <w:p>
       <w:pPr>
-        <w:pStyle w:val="Heading2"/>
-        <w:rPr>
-          <w:lang w:val="en-GB"/>
-        </w:rPr>
-      </w:pPr>
-      <w:bookmarkStart w:id="0" w:name="_Toc67349880"/>
+        <w:pStyle w:val="Heading1"/>
+        <w:rPr>
+          <w:lang w:val="en-GB"/>
+        </w:rPr>
+      </w:pPr>
+      <w:bookmarkStart w:id="0" w:name="_Toc70501311"/>
       <w:r>
         <w:rPr>
           <w:lang w:val="en-GB"/>
@@ -802,21 +1224,7 @@
         <w:rPr>
           <w:lang w:val="en-GB"/>
         </w:rPr>
-        <w:t xml:space="preserve">Arduino MKR 1010 </w:t>
-      </w:r>
-      <w:proofErr w:type="spellStart"/>
-      <w:r>
-        <w:rPr>
-          <w:lang w:val="en-GB"/>
-        </w:rPr>
-        <w:t>Wifi</w:t>
-      </w:r>
-      <w:proofErr w:type="spellEnd"/>
-      <w:r>
-        <w:rPr>
-          <w:lang w:val="en-GB"/>
-        </w:rPr>
-        <w:t xml:space="preserve"> (</w:t>
+        <w:t>Arduino MKR 1010 Wifi (</w:t>
       </w:r>
       <w:hyperlink r:id="rId9" w:history="1">
         <w:r>
@@ -835,13 +1243,8 @@
       </w:r>
     </w:p>
     <w:p>
-      <w:proofErr w:type="spellStart"/>
-      <w:r>
-        <w:t>Sensors</w:t>
-      </w:r>
-      <w:proofErr w:type="spellEnd"/>
-      <w:r>
-        <w:t>:</w:t>
+      <w:r>
+        <w:t>Sensors:</w:t>
       </w:r>
     </w:p>
     <w:p>
@@ -918,13 +1321,8 @@
           <w:numId w:val="1"/>
         </w:numPr>
       </w:pPr>
-      <w:proofErr w:type="spellStart"/>
-      <w:r>
-        <w:t>Temperature</w:t>
-      </w:r>
-      <w:proofErr w:type="spellEnd"/>
-      <w:r>
-        <w:t xml:space="preserve"> (</w:t>
+      <w:r>
+        <w:t>Temperature (</w:t>
       </w:r>
       <w:hyperlink r:id="rId12" w:history="1">
         <w:r>
@@ -946,40 +1344,12 @@
           <w:numId w:val="1"/>
         </w:numPr>
       </w:pPr>
-      <w:proofErr w:type="spellStart"/>
-      <w:r>
-        <w:t>Soil</w:t>
-      </w:r>
-      <w:proofErr w:type="spellEnd"/>
-      <w:r>
-        <w:t xml:space="preserve"> </w:t>
-      </w:r>
-      <w:proofErr w:type="spellStart"/>
-      <w:r>
-        <w:t>moisture</w:t>
-      </w:r>
-      <w:proofErr w:type="spellEnd"/>
-      <w:r>
-        <w:t xml:space="preserve"> </w:t>
-      </w:r>
-      <w:r>
-        <w:t>(ml/</w:t>
-      </w:r>
-      <w:proofErr w:type="spellStart"/>
-      <w:r>
-        <w:t>cubic</w:t>
-      </w:r>
-      <w:proofErr w:type="spellEnd"/>
-      <w:r>
-        <w:t xml:space="preserve"> </w:t>
-      </w:r>
-      <w:proofErr w:type="spellStart"/>
-      <w:r>
-        <w:t>centimetre</w:t>
-      </w:r>
-      <w:proofErr w:type="spellEnd"/>
-      <w:r>
-        <w:t xml:space="preserve">) </w:t>
+      <w:r>
+        <w:lastRenderedPageBreak/>
+        <w:t xml:space="preserve">Soil moisture </w:t>
+      </w:r>
+      <w:r>
+        <w:t xml:space="preserve">(ml/cubic centimetre) </w:t>
       </w:r>
       <w:r>
         <w:t>(</w:t>
@@ -1014,16 +1384,7 @@
     </w:p>
     <w:p>
       <w:r>
-        <w:lastRenderedPageBreak/>
-        <w:t xml:space="preserve">Arduino </w:t>
-      </w:r>
-      <w:proofErr w:type="spellStart"/>
-      <w:r>
-        <w:t>batteries</w:t>
-      </w:r>
-      <w:proofErr w:type="spellEnd"/>
-      <w:r>
-        <w:t xml:space="preserve"> (</w:t>
+        <w:t>Arduino batteries (</w:t>
       </w:r>
       <w:hyperlink r:id="rId15" w:history="1">
         <w:r>
@@ -1044,7 +1405,7 @@
           <w:lang w:val="en-GB"/>
         </w:rPr>
       </w:pPr>
-      <w:bookmarkStart w:id="1" w:name="_Toc67349881"/>
+      <w:bookmarkStart w:id="1" w:name="_Toc70501312"/>
       <w:r>
         <w:rPr>
           <w:lang w:val="en-GB"/>
@@ -1060,7 +1421,7 @@
           <w:lang w:val="en-GB"/>
         </w:rPr>
       </w:pPr>
-      <w:bookmarkStart w:id="2" w:name="_Toc67349882"/>
+      <w:bookmarkStart w:id="2" w:name="_Toc70501313"/>
       <w:r>
         <w:rPr>
           <w:lang w:val="en-GB"/>
@@ -1110,7 +1471,7 @@
           <w:lang w:val="en-GB"/>
         </w:rPr>
       </w:pPr>
-      <w:bookmarkStart w:id="3" w:name="_Toc67349883"/>
+      <w:bookmarkStart w:id="3" w:name="_Toc70501314"/>
       <w:r>
         <w:rPr>
           <w:lang w:val="en-GB"/>
@@ -1134,21 +1495,7 @@
         <w:rPr>
           <w:lang w:val="en-GB"/>
         </w:rPr>
-        <w:t xml:space="preserve">Connecting MKR </w:t>
-      </w:r>
-      <w:proofErr w:type="spellStart"/>
-      <w:r>
-        <w:rPr>
-          <w:lang w:val="en-GB"/>
-        </w:rPr>
-        <w:t>WiFi</w:t>
-      </w:r>
-      <w:proofErr w:type="spellEnd"/>
-      <w:r>
-        <w:rPr>
-          <w:lang w:val="en-GB"/>
-        </w:rPr>
-        <w:t xml:space="preserve"> 1010 to a Wi-Fi network</w:t>
+        <w:t>Connecting MKR WiFi 1010 to a Wi-Fi network</w:t>
       </w:r>
       <w:r>
         <w:rPr>
@@ -1200,21 +1547,7 @@
         <w:rPr>
           <w:lang w:val="en-GB"/>
         </w:rPr>
-        <w:t xml:space="preserve">Powering MKR </w:t>
-      </w:r>
-      <w:proofErr w:type="spellStart"/>
-      <w:r>
-        <w:rPr>
-          <w:lang w:val="en-GB"/>
-        </w:rPr>
-        <w:t>WiFi</w:t>
-      </w:r>
-      <w:proofErr w:type="spellEnd"/>
-      <w:r>
-        <w:rPr>
-          <w:lang w:val="en-GB"/>
-        </w:rPr>
-        <w:t xml:space="preserve"> 1010 with batteries</w:t>
+        <w:t>Powering MKR WiFi 1010 with batteries</w:t>
       </w:r>
       <w:r>
         <w:rPr>
@@ -1253,21 +1586,7 @@
         <w:rPr>
           <w:lang w:val="en-GB"/>
         </w:rPr>
-        <w:t xml:space="preserve">Host a web server on the MKR </w:t>
-      </w:r>
-      <w:proofErr w:type="spellStart"/>
-      <w:r>
-        <w:rPr>
-          <w:lang w:val="en-GB"/>
-        </w:rPr>
-        <w:t>WiFi</w:t>
-      </w:r>
-      <w:proofErr w:type="spellEnd"/>
-      <w:r>
-        <w:rPr>
-          <w:lang w:val="en-GB"/>
-        </w:rPr>
-        <w:t xml:space="preserve"> 1010</w:t>
+        <w:t>Host a web server on the MKR WiFi 1010</w:t>
       </w:r>
       <w:r>
         <w:rPr>
@@ -1306,21 +1625,7 @@
         <w:rPr>
           <w:lang w:val="en-GB"/>
         </w:rPr>
-        <w:t xml:space="preserve">How to connect sensors to the MKR </w:t>
-      </w:r>
-      <w:proofErr w:type="spellStart"/>
-      <w:r>
-        <w:rPr>
-          <w:lang w:val="en-GB"/>
-        </w:rPr>
-        <w:t>WiFi</w:t>
-      </w:r>
-      <w:proofErr w:type="spellEnd"/>
-      <w:r>
-        <w:rPr>
-          <w:lang w:val="en-GB"/>
-        </w:rPr>
-        <w:t xml:space="preserve"> 1010</w:t>
+        <w:t>How to connect sensors to the MKR WiFi 1010</w:t>
       </w:r>
       <w:r>
         <w:rPr>
@@ -1483,26 +1788,12 @@
           <w:lang w:val="en-GB"/>
         </w:rPr>
       </w:pPr>
-      <w:bookmarkStart w:id="4" w:name="_Toc67349884"/>
-      <w:r>
-        <w:rPr>
-          <w:lang w:val="en-GB"/>
-        </w:rPr>
-        <w:t xml:space="preserve">Connect to </w:t>
-      </w:r>
-      <w:proofErr w:type="spellStart"/>
-      <w:r>
-        <w:rPr>
-          <w:lang w:val="en-GB"/>
-        </w:rPr>
-        <w:t>WiFi</w:t>
-      </w:r>
-      <w:proofErr w:type="spellEnd"/>
-      <w:r>
-        <w:rPr>
-          <w:lang w:val="en-GB"/>
-        </w:rPr>
-        <w:t xml:space="preserve"> mobile net</w:t>
+      <w:bookmarkStart w:id="4" w:name="_Toc70501315"/>
+      <w:r>
+        <w:rPr>
+          <w:lang w:val="en-GB"/>
+        </w:rPr>
+        <w:t>Connect to WiFi mobile net</w:t>
       </w:r>
       <w:r>
         <w:rPr>
@@ -1522,21 +1813,7 @@
         <w:rPr>
           <w:lang w:val="en-GB"/>
         </w:rPr>
-        <w:t xml:space="preserve">Configure </w:t>
-      </w:r>
-      <w:proofErr w:type="spellStart"/>
-      <w:r>
-        <w:rPr>
-          <w:lang w:val="en-GB"/>
-        </w:rPr>
-        <w:t>MatLab</w:t>
-      </w:r>
-      <w:proofErr w:type="spellEnd"/>
-      <w:r>
-        <w:rPr>
-          <w:lang w:val="en-GB"/>
-        </w:rPr>
-        <w:t xml:space="preserve"> for recognizing </w:t>
+        <w:t xml:space="preserve">Configure MatLab for recognizing </w:t>
       </w:r>
       <w:r>
         <w:rPr>
@@ -1544,33 +1821,11 @@
         </w:rPr>
         <w:t xml:space="preserve">this specific board in USB mode. </w:t>
       </w:r>
-      <w:proofErr w:type="spellStart"/>
-      <w:r>
-        <w:rPr>
-          <w:lang w:val="en-GB"/>
-        </w:rPr>
-        <w:t>Simluation</w:t>
-      </w:r>
-      <w:proofErr w:type="spellEnd"/>
-      <w:r>
-        <w:rPr>
-          <w:lang w:val="en-GB"/>
-        </w:rPr>
-        <w:t xml:space="preserve"> -&gt; Model Settings -&gt; Hardware (Select board, and configure </w:t>
-      </w:r>
-      <w:proofErr w:type="spellStart"/>
-      <w:r>
-        <w:rPr>
-          <w:lang w:val="en-GB"/>
-        </w:rPr>
-        <w:t>WiFi</w:t>
-      </w:r>
-      <w:proofErr w:type="spellEnd"/>
-      <w:r>
-        <w:rPr>
-          <w:lang w:val="en-GB"/>
-        </w:rPr>
-        <w:t>)</w:t>
+      <w:r>
+        <w:rPr>
+          <w:lang w:val="en-GB"/>
+        </w:rPr>
+        <w:t>Simluation -&gt; Model Settings -&gt; Hardware (Select board, and configure WiFi)</w:t>
       </w:r>
     </w:p>
     <w:p>
@@ -1592,19 +1847,11 @@
           <w:lang w:val="en-GB"/>
         </w:rPr>
       </w:pPr>
-      <w:proofErr w:type="spellStart"/>
-      <w:r>
-        <w:rPr>
-          <w:lang w:val="en-GB"/>
-        </w:rPr>
-        <w:t>Sdlrtkernet</w:t>
-      </w:r>
-      <w:proofErr w:type="spellEnd"/>
-      <w:r>
-        <w:rPr>
-          <w:lang w:val="en-GB"/>
-        </w:rPr>
-        <w:t xml:space="preserve"> -setup</w:t>
+      <w:r>
+        <w:rPr>
+          <w:lang w:val="en-GB"/>
+        </w:rPr>
+        <w:t>Sdlrtkernet -setup</w:t>
       </w:r>
     </w:p>
     <w:p>
@@ -1623,35 +1870,7 @@
         <w:rPr>
           <w:lang w:val="en-GB"/>
         </w:rPr>
-        <w:t xml:space="preserve"> (standard </w:t>
-      </w:r>
-      <w:proofErr w:type="spellStart"/>
-      <w:r>
-        <w:rPr>
-          <w:lang w:val="en-GB"/>
-        </w:rPr>
-        <w:t>Thingspeak</w:t>
-      </w:r>
-      <w:proofErr w:type="spellEnd"/>
-      <w:r>
-        <w:rPr>
-          <w:lang w:val="en-GB"/>
-        </w:rPr>
-        <w:t xml:space="preserve"> write is working but cannot be integrated in Arduino, just simulation, Arduino specific </w:t>
-      </w:r>
-      <w:proofErr w:type="spellStart"/>
-      <w:r>
-        <w:rPr>
-          <w:lang w:val="en-GB"/>
-        </w:rPr>
-        <w:t>Thingspeak</w:t>
-      </w:r>
-      <w:proofErr w:type="spellEnd"/>
-      <w:r>
-        <w:rPr>
-          <w:lang w:val="en-GB"/>
-        </w:rPr>
-        <w:t xml:space="preserve"> write is sending 0 always as the value </w:t>
+        <w:t xml:space="preserve"> (standard Thingspeak write is working but cannot be integrated in Arduino, just simulation, Arduino specific Thingspeak write is sending 0 always as the value </w:t>
       </w:r>
       <w:hyperlink r:id="rId25" w:history="1">
         <w:r>
@@ -1679,6 +1898,7 @@
         <w:rPr>
           <w:lang w:val="en-GB"/>
         </w:rPr>
+        <w:lastRenderedPageBreak/>
         <w:t>Finally using a library (</w:t>
       </w:r>
       <w:hyperlink r:id="rId26" w:history="1">
@@ -1694,21 +1914,7 @@
         <w:rPr>
           <w:lang w:val="en-GB"/>
         </w:rPr>
-        <w:t xml:space="preserve">) created by MathWorks that permits writing and reading from ThingSpeak through the Arduino IDE I get a program that publish </w:t>
-      </w:r>
-      <w:proofErr w:type="spellStart"/>
-      <w:r>
-        <w:rPr>
-          <w:lang w:val="en-GB"/>
-        </w:rPr>
-        <w:t>there</w:t>
-      </w:r>
-      <w:proofErr w:type="spellEnd"/>
-      <w:r>
-        <w:rPr>
-          <w:lang w:val="en-GB"/>
-        </w:rPr>
-        <w:t xml:space="preserve"> correctly.</w:t>
+        <w:t>) created by MathWorks that permits writing and reading from ThingSpeak through the Arduino IDE I get a program that publish there correctly.</w:t>
       </w:r>
       <w:r>
         <w:rPr>
@@ -1750,40 +1956,26 @@
           <w:lang w:val="en-GB"/>
         </w:rPr>
       </w:pPr>
-      <w:bookmarkStart w:id="5" w:name="_Toc67349885"/>
-      <w:r>
-        <w:rPr>
-          <w:lang w:val="en-GB"/>
-        </w:rPr>
-        <w:lastRenderedPageBreak/>
+      <w:bookmarkStart w:id="5" w:name="_Toc70501316"/>
+      <w:r>
+        <w:rPr>
+          <w:lang w:val="en-GB"/>
+        </w:rPr>
         <w:t>Arduino IDE</w:t>
       </w:r>
-    </w:p>
-    <w:p>
-      <w:pPr>
-        <w:rPr>
-          <w:lang w:val="en-GB"/>
-        </w:rPr>
-      </w:pPr>
-      <w:r>
-        <w:rPr>
-          <w:lang w:val="en-GB"/>
-        </w:rPr>
-        <w:t xml:space="preserve">Using the </w:t>
-      </w:r>
-      <w:proofErr w:type="spellStart"/>
-      <w:r>
-        <w:rPr>
-          <w:lang w:val="en-GB"/>
-        </w:rPr>
-        <w:t>ThingsSpeak</w:t>
-      </w:r>
-      <w:proofErr w:type="spellEnd"/>
-      <w:r>
-        <w:rPr>
-          <w:lang w:val="en-GB"/>
-        </w:rPr>
-        <w:t xml:space="preserve"> library</w:t>
+      <w:bookmarkEnd w:id="5"/>
+    </w:p>
+    <w:p>
+      <w:pPr>
+        <w:rPr>
+          <w:lang w:val="en-GB"/>
+        </w:rPr>
+      </w:pPr>
+      <w:r>
+        <w:rPr>
+          <w:lang w:val="en-GB"/>
+        </w:rPr>
+        <w:t>Using the ThingsSpeak library</w:t>
       </w:r>
       <w:r>
         <w:rPr>
@@ -1835,21 +2027,37 @@
         <w:rPr>
           <w:lang w:val="en-GB"/>
         </w:rPr>
-        <w:t xml:space="preserve">It works fine, so </w:t>
-      </w:r>
-      <w:proofErr w:type="spellStart"/>
-      <w:r>
-        <w:rPr>
-          <w:lang w:val="en-GB"/>
-        </w:rPr>
-        <w:t>Matlab</w:t>
-      </w:r>
-      <w:proofErr w:type="spellEnd"/>
-      <w:r>
-        <w:rPr>
-          <w:lang w:val="en-GB"/>
-        </w:rPr>
-        <w:t>/Simulink is discarded for the moment.</w:t>
+        <w:t>It works fine, so Matlab/Simulink is discarded for the moment.</w:t>
+      </w:r>
+    </w:p>
+    <w:p>
+      <w:pPr>
+        <w:pStyle w:val="Heading3"/>
+        <w:rPr>
+          <w:lang w:val="en-GB"/>
+        </w:rPr>
+      </w:pPr>
+      <w:bookmarkStart w:id="6" w:name="_Toc70501317"/>
+      <w:r>
+        <w:rPr>
+          <w:lang w:val="en-GB"/>
+        </w:rPr>
+        <w:t>Sensors</w:t>
+      </w:r>
+      <w:bookmarkEnd w:id="6"/>
+    </w:p>
+    <w:p>
+      <w:pPr>
+        <w:pStyle w:val="Heading4"/>
+        <w:rPr>
+          <w:lang w:val="en-GB"/>
+        </w:rPr>
+      </w:pPr>
+      <w:r>
+        <w:rPr>
+          <w:lang w:val="en-GB"/>
+        </w:rPr>
+        <w:t>Soil moisture sensor</w:t>
       </w:r>
     </w:p>
     <w:p>
@@ -1923,21 +2131,136 @@
         <w:rPr>
           <w:lang w:val="en-GB"/>
         </w:rPr>
-        <w:t xml:space="preserve">, so I map it from 0 to 1023 and send this data to </w:t>
-      </w:r>
-      <w:proofErr w:type="spellStart"/>
-      <w:r>
-        <w:rPr>
-          <w:lang w:val="en-GB"/>
-        </w:rPr>
-        <w:t>Thingspeak</w:t>
-      </w:r>
-      <w:proofErr w:type="spellEnd"/>
-      <w:r>
-        <w:rPr>
-          <w:lang w:val="en-GB"/>
-        </w:rPr>
-        <w:t>.</w:t>
+        <w:t>, so I map it from 0 to 1023 and send this data to Thingspeak.</w:t>
+      </w:r>
+    </w:p>
+    <w:p>
+      <w:pPr>
+        <w:pStyle w:val="Heading4"/>
+        <w:rPr>
+          <w:lang w:val="en-GB"/>
+        </w:rPr>
+      </w:pPr>
+      <w:r>
+        <w:rPr>
+          <w:lang w:val="en-GB"/>
+        </w:rPr>
+        <w:t>Light sensor</w:t>
+      </w:r>
+    </w:p>
+    <w:p>
+      <w:pPr>
+        <w:rPr>
+          <w:lang w:val="en-GB"/>
+        </w:rPr>
+      </w:pPr>
+      <w:r>
+        <w:rPr>
+          <w:lang w:val="en-GB"/>
+        </w:rPr>
+        <w:t xml:space="preserve">As there is no info from the vendor about this sensor, following the indications on it I connect it to the Arduino. </w:t>
+      </w:r>
+    </w:p>
+    <w:p>
+      <w:pPr>
+        <w:rPr>
+          <w:lang w:val="en-GB"/>
+        </w:rPr>
+      </w:pPr>
+      <w:hyperlink r:id="rId30" w:history="1">
+        <w:r>
+          <w:rPr>
+            <w:rStyle w:val="Hyperlink"/>
+            <w:lang w:val="en-GB"/>
+          </w:rPr>
+          <w:t>https://arduinogetstarted.com/tutorials/arduino-light-sensor</w:t>
+        </w:r>
+      </w:hyperlink>
+    </w:p>
+    <w:p>
+      <w:pPr>
+        <w:rPr>
+          <w:lang w:val="en-GB"/>
+        </w:rPr>
+      </w:pPr>
+      <w:r>
+        <w:rPr>
+          <w:lang w:val="en-GB"/>
+        </w:rPr>
+        <w:t>When trying to upload both values to my thingspeak channel, the second one is not working as expected.</w:t>
+      </w:r>
+    </w:p>
+    <w:p>
+      <w:pPr>
+        <w:rPr>
+          <w:lang w:val="en-GB"/>
+        </w:rPr>
+      </w:pPr>
+      <w:r>
+        <w:rPr>
+          <w:lang w:val="en-GB"/>
+        </w:rPr>
+        <w:t>It has to be first using setField for each of the values you want to upload and then writeFields for writing together all</w:t>
+      </w:r>
+      <w:r>
+        <w:rPr>
+          <w:lang w:val="en-GB"/>
+        </w:rPr>
+        <w:t xml:space="preserve"> (</w:t>
+      </w:r>
+      <w:hyperlink r:id="rId31" w:history="1">
+        <w:r>
+          <w:rPr>
+            <w:rStyle w:val="Hyperlink"/>
+            <w:lang w:val="en-GB"/>
+          </w:rPr>
+          <w:t>https://github.com/mathworks/thingspeak-arduino#documentation</w:t>
+        </w:r>
+      </w:hyperlink>
+      <w:r>
+        <w:rPr>
+          <w:lang w:val="en-GB"/>
+        </w:rPr>
+        <w:t xml:space="preserve">) </w:t>
+      </w:r>
+    </w:p>
+    <w:p>
+      <w:pPr>
+        <w:pStyle w:val="Heading4"/>
+        <w:rPr>
+          <w:lang w:val="en-GB"/>
+        </w:rPr>
+      </w:pPr>
+      <w:r>
+        <w:rPr>
+          <w:lang w:val="en-GB"/>
+        </w:rPr>
+        <w:t>Temperature sensor</w:t>
+      </w:r>
+    </w:p>
+    <w:p>
+      <w:pPr>
+        <w:rPr>
+          <w:lang w:val="en-GB"/>
+        </w:rPr>
+      </w:pPr>
+      <w:r>
+        <w:rPr>
+          <w:lang w:val="en-GB"/>
+        </w:rPr>
+        <w:t xml:space="preserve">My sensor it’s a </w:t>
+      </w:r>
+      <w:r>
+        <w:rPr>
+          <w:lang w:val="en-GB"/>
+        </w:rPr>
+        <w:t>DS18B20</w:t>
+      </w:r>
+      <w:r>
+        <w:rPr>
+          <w:lang w:val="en-GB"/>
+        </w:rPr>
+        <w:t xml:space="preserve"> (Dallas) model, so it needs a library in order to work with Arduino (</w:t>
       </w:r>
     </w:p>
     <w:p>
@@ -1947,21 +2270,14 @@
           <w:lang w:val="en-GB"/>
         </w:rPr>
       </w:pPr>
-      <w:proofErr w:type="spellStart"/>
-      <w:r>
-        <w:rPr>
-          <w:lang w:val="en-GB"/>
-        </w:rPr>
-        <w:t>Matlab</w:t>
-      </w:r>
-      <w:proofErr w:type="spellEnd"/>
-      <w:r>
-        <w:rPr>
-          <w:lang w:val="en-GB"/>
-        </w:rPr>
-        <w:t>/Simulink</w:t>
-      </w:r>
-      <w:bookmarkEnd w:id="5"/>
+      <w:bookmarkStart w:id="7" w:name="_Toc70501318"/>
+      <w:r>
+        <w:rPr>
+          <w:lang w:val="en-GB"/>
+        </w:rPr>
+        <w:t>Matlab/Simulink</w:t>
+      </w:r>
+      <w:bookmarkEnd w:id="7"/>
     </w:p>
     <w:p>
       <w:pPr>
@@ -1970,14 +2286,14 @@
           <w:lang w:val="en-GB"/>
         </w:rPr>
       </w:pPr>
-      <w:bookmarkStart w:id="6" w:name="_Toc67349886"/>
+      <w:bookmarkStart w:id="8" w:name="_Toc70501319"/>
       <w:r>
         <w:rPr>
           <w:lang w:val="en-GB"/>
         </w:rPr>
         <w:t>Packages</w:t>
       </w:r>
-      <w:bookmarkEnd w:id="6"/>
+      <w:bookmarkEnd w:id="8"/>
     </w:p>
     <w:p>
       <w:pPr>
@@ -1994,21 +2310,7 @@
         <w:rPr>
           <w:lang w:val="en-GB"/>
         </w:rPr>
-        <w:t xml:space="preserve">Installation including all </w:t>
-      </w:r>
-      <w:proofErr w:type="spellStart"/>
-      <w:r>
-        <w:rPr>
-          <w:lang w:val="en-GB"/>
-        </w:rPr>
-        <w:t>simulink</w:t>
-      </w:r>
-      <w:proofErr w:type="spellEnd"/>
-      <w:r>
-        <w:rPr>
-          <w:lang w:val="en-GB"/>
-        </w:rPr>
-        <w:t xml:space="preserve"> components.</w:t>
+        <w:t>Installation including all simulink components.</w:t>
       </w:r>
     </w:p>
     <w:p>
@@ -2019,21 +2321,8 @@
           <w:numId w:val="2"/>
         </w:numPr>
       </w:pPr>
-      <w:proofErr w:type="spellStart"/>
-      <w:r>
-        <w:t>MinGW</w:t>
-      </w:r>
-      <w:proofErr w:type="spellEnd"/>
-      <w:r>
-        <w:t xml:space="preserve"> (C/C++ </w:t>
-      </w:r>
-      <w:proofErr w:type="spellStart"/>
-      <w:r>
-        <w:t>compiler</w:t>
-      </w:r>
-      <w:proofErr w:type="spellEnd"/>
-      <w:r>
-        <w:t>)</w:t>
+      <w:r>
+        <w:t>MinGW (C/C++ compiler)</w:t>
       </w:r>
     </w:p>
     <w:p>
@@ -2044,29 +2333,8 @@
           <w:numId w:val="2"/>
         </w:numPr>
       </w:pPr>
-      <w:proofErr w:type="spellStart"/>
-      <w:r>
-        <w:t>Support</w:t>
-      </w:r>
-      <w:proofErr w:type="spellEnd"/>
-      <w:r>
-        <w:t xml:space="preserve"> </w:t>
-      </w:r>
-      <w:proofErr w:type="spellStart"/>
-      <w:r>
-        <w:t>Package</w:t>
-      </w:r>
-      <w:proofErr w:type="spellEnd"/>
-      <w:r>
-        <w:t xml:space="preserve"> </w:t>
-      </w:r>
-      <w:proofErr w:type="spellStart"/>
-      <w:r>
-        <w:t>for</w:t>
-      </w:r>
-      <w:proofErr w:type="spellEnd"/>
-      <w:r>
-        <w:t xml:space="preserve"> Arduino</w:t>
+      <w:r>
+        <w:t>Support Package for Arduino</w:t>
       </w:r>
     </w:p>
     <w:p>
@@ -2100,14 +2368,14 @@
           <w:lang w:val="en-GB"/>
         </w:rPr>
       </w:pPr>
-      <w:bookmarkStart w:id="7" w:name="_Toc67349887"/>
+      <w:bookmarkStart w:id="9" w:name="_Toc70501320"/>
       <w:r>
         <w:rPr>
           <w:lang w:val="en-GB"/>
         </w:rPr>
         <w:t>Connection with Arduino</w:t>
       </w:r>
-      <w:bookmarkEnd w:id="7"/>
+      <w:bookmarkEnd w:id="9"/>
     </w:p>
     <w:p>
       <w:pPr>
@@ -2123,14 +2391,15 @@
           <w:lang w:val="en-GB"/>
         </w:rPr>
       </w:pPr>
-      <w:bookmarkStart w:id="8" w:name="_Toc67349888"/>
-      <w:r>
-        <w:rPr>
-          <w:lang w:val="en-GB"/>
-        </w:rPr>
+      <w:bookmarkStart w:id="10" w:name="_Toc70501321"/>
+      <w:r>
+        <w:rPr>
+          <w:lang w:val="en-GB"/>
+        </w:rPr>
+        <w:lastRenderedPageBreak/>
         <w:t>Data visualization</w:t>
       </w:r>
-      <w:bookmarkEnd w:id="8"/>
+      <w:bookmarkEnd w:id="10"/>
     </w:p>
     <w:p>
       <w:pPr>
@@ -2139,20 +2408,12 @@
           <w:lang w:val="en-GB"/>
         </w:rPr>
       </w:pPr>
-      <w:bookmarkStart w:id="9" w:name="_Toc67349889"/>
-      <w:proofErr w:type="spellStart"/>
-      <w:r>
-        <w:rPr>
-          <w:lang w:val="en-GB"/>
-        </w:rPr>
-        <w:t>Thingspeak</w:t>
-      </w:r>
-      <w:proofErr w:type="spellEnd"/>
-      <w:r>
-        <w:rPr>
-          <w:lang w:val="en-GB"/>
-        </w:rPr>
-        <w:t xml:space="preserve"> data</w:t>
+      <w:bookmarkStart w:id="11" w:name="_Toc70501322"/>
+      <w:r>
+        <w:rPr>
+          <w:lang w:val="en-GB"/>
+        </w:rPr>
+        <w:t>Thingspeak data</w:t>
       </w:r>
       <w:r>
         <w:rPr>
@@ -2160,7 +2421,7 @@
         </w:rPr>
         <w:t xml:space="preserve"> in Unity</w:t>
       </w:r>
-      <w:bookmarkEnd w:id="9"/>
+      <w:bookmarkEnd w:id="11"/>
     </w:p>
     <w:p>
       <w:pPr>
@@ -2186,21 +2447,7 @@
         <w:rPr>
           <w:lang w:val="en-GB"/>
         </w:rPr>
-        <w:t xml:space="preserve">Starting with the first demo following what Victor </w:t>
-      </w:r>
-      <w:proofErr w:type="spellStart"/>
-      <w:r>
-        <w:rPr>
-          <w:lang w:val="en-GB"/>
-        </w:rPr>
-        <w:t>tought</w:t>
-      </w:r>
-      <w:proofErr w:type="spellEnd"/>
-      <w:r>
-        <w:rPr>
-          <w:lang w:val="en-GB"/>
-        </w:rPr>
-        <w:t xml:space="preserve"> us about a simple app displaying a cube that I already had, I start investigating about how to run a Python script in Unity.</w:t>
+        <w:t>Starting with the first demo following what Victor tought us about a simple app displaying a cube that I already had, I start investigating about how to run a Python script in Unity.</w:t>
       </w:r>
     </w:p>
     <w:p>
@@ -2220,7 +2467,7 @@
         </w:rPr>
         <w:t>4 ways of running Python in Unity (</w:t>
       </w:r>
-      <w:hyperlink r:id="rId30" w:history="1">
+      <w:hyperlink r:id="rId32" w:history="1">
         <w:r>
           <w:rPr>
             <w:rStyle w:val="Hyperlink"/>
@@ -2265,7 +2512,7 @@
         </w:rPr>
         <w:t>(</w:t>
       </w:r>
-      <w:hyperlink r:id="rId31" w:history="1">
+      <w:hyperlink r:id="rId33" w:history="1">
         <w:r>
           <w:rPr>
             <w:rStyle w:val="Hyperlink"/>
@@ -2346,7 +2593,7 @@
         </w:rPr>
         <w:t>Daydream support was removed in 2020.1. Google released an open source cardboard plugin for 2020.1+ which they recommend using as a replacement: </w:t>
       </w:r>
-      <w:hyperlink r:id="rId32" w:tgtFrame="_blank" w:history="1">
+      <w:hyperlink r:id="rId34" w:tgtFrame="_blank" w:history="1">
         <w:r>
           <w:rPr>
             <w:rStyle w:val="Hyperlink"/>
@@ -2381,29 +2628,9 @@
           <w:shd w:val="clear" w:color="auto" w:fill="FAFAFA"/>
           <w:lang w:val="en-GB"/>
         </w:rPr>
-        <w:t xml:space="preserve">See </w:t>
-      </w:r>
-      <w:proofErr w:type="spellStart"/>
-      <w:r>
-        <w:rPr>
-          <w:rFonts w:ascii="Arial" w:hAnsi="Arial" w:cs="Arial"/>
-          <w:color w:val="333333"/>
-          <w:shd w:val="clear" w:color="auto" w:fill="FAFAFA"/>
-          <w:lang w:val="en-GB"/>
-        </w:rPr>
-        <w:t>google's</w:t>
-      </w:r>
-      <w:proofErr w:type="spellEnd"/>
-      <w:r>
-        <w:rPr>
-          <w:rFonts w:ascii="Arial" w:hAnsi="Arial" w:cs="Arial"/>
-          <w:color w:val="333333"/>
-          <w:shd w:val="clear" w:color="auto" w:fill="FAFAFA"/>
-          <w:lang w:val="en-GB"/>
-        </w:rPr>
-        <w:t xml:space="preserve"> suggestions here: </w:t>
-      </w:r>
-      <w:hyperlink r:id="rId33" w:tgtFrame="_blank" w:history="1">
+        <w:t>See google's suggestions here: </w:t>
+      </w:r>
+      <w:hyperlink r:id="rId35" w:tgtFrame="_blank" w:history="1">
         <w:r>
           <w:rPr>
             <w:rStyle w:val="Hyperlink"/>
@@ -2426,10 +2653,9 @@
         <w:rPr>
           <w:lang w:val="en-GB"/>
         </w:rPr>
-        <w:lastRenderedPageBreak/>
         <w:t>Here is written how to use the new cardboard plugin (</w:t>
       </w:r>
-      <w:hyperlink r:id="rId34" w:history="1">
+      <w:hyperlink r:id="rId36" w:history="1">
         <w:r>
           <w:rPr>
             <w:rStyle w:val="Hyperlink"/>
@@ -2457,7 +2683,7 @@
         </w:rPr>
         <w:t>Mixed reality library for Unity and Google Cardboard (</w:t>
       </w:r>
-      <w:hyperlink r:id="rId35" w:history="1">
+      <w:hyperlink r:id="rId37" w:history="1">
         <w:r>
           <w:rPr>
             <w:rStyle w:val="Hyperlink"/>
@@ -2483,21 +2709,7 @@
         <w:rPr>
           <w:lang w:val="en-GB"/>
         </w:rPr>
-        <w:t xml:space="preserve">Import Hello </w:t>
-      </w:r>
-      <w:proofErr w:type="spellStart"/>
-      <w:r>
-        <w:rPr>
-          <w:lang w:val="en-GB"/>
-        </w:rPr>
-        <w:t>Cardboad</w:t>
-      </w:r>
-      <w:proofErr w:type="spellEnd"/>
-      <w:r>
-        <w:rPr>
-          <w:lang w:val="en-GB"/>
-        </w:rPr>
-        <w:t xml:space="preserve"> from the Package Manager</w:t>
+        <w:t>Import Hello Cardboad from the Package Manager</w:t>
       </w:r>
     </w:p>
     <w:p>
@@ -2512,7 +2724,7 @@
         </w:rPr>
         <w:t>Tutorial for integrating Python Script Editor in Unity with small example (</w:t>
       </w:r>
-      <w:hyperlink r:id="rId36" w:history="1">
+      <w:hyperlink r:id="rId38" w:history="1">
         <w:r>
           <w:rPr>
             <w:rStyle w:val="Hyperlink"/>
@@ -2540,7 +2752,7 @@
         </w:rPr>
         <w:t>Guide for installing Python in Unity (</w:t>
       </w:r>
-      <w:hyperlink r:id="rId37" w:history="1">
+      <w:hyperlink r:id="rId39" w:history="1">
         <w:r>
           <w:rPr>
             <w:rStyle w:val="Hyperlink"/>
@@ -2611,7 +2823,7 @@
         </w:rPr>
         <w:t>Install pip from this site (</w:t>
       </w:r>
-      <w:hyperlink r:id="rId38" w:history="1">
+      <w:hyperlink r:id="rId40" w:history="1">
         <w:r>
           <w:rPr>
             <w:rStyle w:val="Hyperlink"/>
@@ -2638,7 +2850,7 @@
         </w:rPr>
         <w:t xml:space="preserve"> In order to work, add it to the PATH (</w:t>
       </w:r>
-      <w:hyperlink r:id="rId39" w:history="1">
+      <w:hyperlink r:id="rId41" w:history="1">
         <w:r>
           <w:rPr>
             <w:rStyle w:val="Hyperlink"/>
@@ -2664,16 +2876,8 @@
         <w:rPr>
           <w:lang w:val="en-GB"/>
         </w:rPr>
-        <w:t>We should add the dependency manually to VAR_AUB\Packages\</w:t>
-      </w:r>
-      <w:proofErr w:type="spellStart"/>
-      <w:r>
-        <w:rPr>
-          <w:lang w:val="en-GB"/>
-        </w:rPr>
-        <w:t>manifest.json</w:t>
-      </w:r>
-      <w:proofErr w:type="spellEnd"/>
+        <w:t>We should add the dependency manually to VAR_AUB\Packages\manifest.json</w:t>
+      </w:r>
     </w:p>
     <w:p>
       <w:pPr>
@@ -2687,6 +2891,7 @@
         <w:rPr>
           <w:lang w:val="en-GB"/>
         </w:rPr>
+        <w:lastRenderedPageBreak/>
         <w:t>Python editor in Unity is just an editor for the moment, not for runtime executions</w:t>
       </w:r>
       <w:r>
@@ -2755,35 +2960,26 @@
         <w:rPr>
           <w:lang w:val="en-GB"/>
         </w:rPr>
-        <w:t xml:space="preserve">First a demo of C# program that </w:t>
-      </w:r>
-      <w:proofErr w:type="spellStart"/>
-      <w:r>
-        <w:rPr>
-          <w:lang w:val="en-GB"/>
-        </w:rPr>
-        <w:t>get’s</w:t>
-      </w:r>
-      <w:proofErr w:type="spellEnd"/>
+        <w:t>First a demo of C# program that get’s thingspeak data to the console.</w:t>
+      </w:r>
       <w:r>
         <w:rPr>
           <w:lang w:val="en-GB"/>
         </w:rPr>
         <w:t xml:space="preserve"> </w:t>
       </w:r>
-      <w:proofErr w:type="spellStart"/>
-      <w:r>
-        <w:rPr>
-          <w:lang w:val="en-GB"/>
-        </w:rPr>
-        <w:t>thingspeak</w:t>
-      </w:r>
-      <w:proofErr w:type="spellEnd"/>
-      <w:r>
-        <w:rPr>
-          <w:lang w:val="en-GB"/>
-        </w:rPr>
-        <w:t xml:space="preserve"> data to the console.</w:t>
+    </w:p>
+    <w:p>
+      <w:pPr>
+        <w:rPr>
+          <w:lang w:val="en-GB"/>
+        </w:rPr>
+      </w:pPr>
+      <w:r>
+        <w:rPr>
+          <w:lang w:val="en-GB"/>
+        </w:rPr>
+        <w:t>Then get the data from Thingspeak in JSON</w:t>
       </w:r>
       <w:r>
         <w:rPr>
@@ -2791,46 +2987,13 @@
         </w:rPr>
         <w:t xml:space="preserve"> </w:t>
       </w:r>
-    </w:p>
-    <w:p>
-      <w:pPr>
-        <w:rPr>
-          <w:lang w:val="en-GB"/>
-        </w:rPr>
-      </w:pPr>
-      <w:r>
-        <w:rPr>
-          <w:lang w:val="en-GB"/>
-        </w:rPr>
-        <w:t xml:space="preserve">Then get the data from </w:t>
-      </w:r>
-      <w:proofErr w:type="spellStart"/>
-      <w:r>
-        <w:rPr>
-          <w:lang w:val="en-GB"/>
-        </w:rPr>
-        <w:t>Thingspeak</w:t>
-      </w:r>
-      <w:proofErr w:type="spellEnd"/>
-      <w:r>
-        <w:rPr>
-          <w:lang w:val="en-GB"/>
-        </w:rPr>
-        <w:t xml:space="preserve"> in JSON</w:t>
-      </w:r>
-      <w:r>
-        <w:rPr>
-          <w:lang w:val="en-GB"/>
-        </w:rPr>
-        <w:t xml:space="preserve"> </w:t>
-      </w:r>
       <w:r>
         <w:rPr>
           <w:lang w:val="en-GB"/>
         </w:rPr>
         <w:t>using their API (</w:t>
       </w:r>
-      <w:hyperlink r:id="rId40" w:history="1">
+      <w:hyperlink r:id="rId42" w:history="1">
         <w:r>
           <w:rPr>
             <w:rStyle w:val="Hyperlink"/>
@@ -2858,7 +3021,7 @@
         </w:rPr>
         <w:t>This as an example (</w:t>
       </w:r>
-      <w:hyperlink r:id="rId41" w:history="1">
+      <w:hyperlink r:id="rId43" w:history="1">
         <w:r>
           <w:rPr>
             <w:rStyle w:val="Hyperlink"/>
@@ -2890,35 +3053,7 @@
         <w:rPr>
           <w:lang w:val="en-GB"/>
         </w:rPr>
-        <w:t xml:space="preserve">the </w:t>
-      </w:r>
-      <w:proofErr w:type="spellStart"/>
-      <w:r>
-        <w:rPr>
-          <w:lang w:val="en-GB"/>
-        </w:rPr>
-        <w:t>Newtonsoft.Json</w:t>
-      </w:r>
-      <w:proofErr w:type="spellEnd"/>
-      <w:r>
-        <w:rPr>
-          <w:lang w:val="en-GB"/>
-        </w:rPr>
-        <w:t xml:space="preserve"> library (using </w:t>
-      </w:r>
-      <w:proofErr w:type="spellStart"/>
-      <w:r>
-        <w:rPr>
-          <w:lang w:val="en-GB"/>
-        </w:rPr>
-        <w:t>Newtonsoft.Json.Linq</w:t>
-      </w:r>
-      <w:proofErr w:type="spellEnd"/>
-      <w:r>
-        <w:rPr>
-          <w:lang w:val="en-GB"/>
-        </w:rPr>
-        <w:t>)</w:t>
+        <w:t>the Newtonsoft.Json library (using Newtonsoft.Json.Linq)</w:t>
       </w:r>
       <w:r>
         <w:rPr>
@@ -2932,7 +3067,7 @@
         </w:rPr>
         <w:t>(</w:t>
       </w:r>
-      <w:hyperlink r:id="rId42" w:history="1">
+      <w:hyperlink r:id="rId44" w:history="1">
         <w:r>
           <w:rPr>
             <w:rStyle w:val="Hyperlink"/>
@@ -3016,23 +3151,9 @@
         <w:rPr>
           <w:lang w:val="en-GB"/>
         </w:rPr>
-        <w:t xml:space="preserve">For adapting the C# script in Unity I install the </w:t>
-      </w:r>
-      <w:proofErr w:type="spellStart"/>
-      <w:r>
-        <w:rPr>
-          <w:lang w:val="en-GB"/>
-        </w:rPr>
-        <w:t>NuGetUnityPackage</w:t>
-      </w:r>
-      <w:proofErr w:type="spellEnd"/>
-      <w:r>
-        <w:rPr>
-          <w:lang w:val="en-GB"/>
-        </w:rPr>
-        <w:t xml:space="preserve"> (</w:t>
-      </w:r>
-      <w:hyperlink r:id="rId43" w:history="1">
+        <w:t>For adapting the C# script in Unity I install the NuGetUnityPackage (</w:t>
+      </w:r>
+      <w:hyperlink r:id="rId45" w:history="1">
         <w:r>
           <w:rPr>
             <w:rStyle w:val="Hyperlink"/>
@@ -3053,7 +3174,7 @@
         </w:rPr>
         <w:t xml:space="preserve"> and (</w:t>
       </w:r>
-      <w:hyperlink r:id="rId44" w:history="1">
+      <w:hyperlink r:id="rId46" w:history="1">
         <w:r>
           <w:rPr>
             <w:rStyle w:val="Hyperlink"/>
@@ -3091,10 +3212,9 @@
         <w:rPr>
           <w:lang w:val="en-GB"/>
         </w:rPr>
-        <w:lastRenderedPageBreak/>
         <w:t>In order to reference the object I want to move (</w:t>
       </w:r>
-      <w:hyperlink r:id="rId45" w:history="1">
+      <w:hyperlink r:id="rId47" w:history="1">
         <w:r>
           <w:rPr>
             <w:rStyle w:val="Hyperlink"/>
@@ -3122,7 +3242,7 @@
         </w:rPr>
         <w:t>In order to move the object (</w:t>
       </w:r>
-      <w:hyperlink r:id="rId46" w:history="1">
+      <w:hyperlink r:id="rId48" w:history="1">
         <w:r>
           <w:rPr>
             <w:rStyle w:val="Hyperlink"/>
@@ -3150,7 +3270,7 @@
         </w:rPr>
         <w:t>For translating the values obtained from ThingSpeak (0-100) to values needed for modifying the position in Unity (0-2) I create a map function (</w:t>
       </w:r>
-      <w:hyperlink r:id="rId47" w:history="1">
+      <w:hyperlink r:id="rId49" w:history="1">
         <w:r>
           <w:rPr>
             <w:rStyle w:val="Hyperlink"/>
@@ -3178,7 +3298,7 @@
         </w:rPr>
         <w:t>Object from ThingSpeak to int (</w:t>
       </w:r>
-      <w:hyperlink r:id="rId48" w:history="1">
+      <w:hyperlink r:id="rId50" w:history="1">
         <w:r>
           <w:rPr>
             <w:rStyle w:val="Hyperlink"/>
@@ -3206,7 +3326,7 @@
         </w:rPr>
         <w:t>Plant for prototype (</w:t>
       </w:r>
-      <w:hyperlink r:id="rId49" w:history="1">
+      <w:hyperlink r:id="rId51" w:history="1">
         <w:r>
           <w:rPr>
             <w:rStyle w:val="Hyperlink"/>
@@ -3260,12 +3380,14 @@
           <w:lang w:val="en-GB"/>
         </w:rPr>
       </w:pPr>
+      <w:bookmarkStart w:id="12" w:name="_Toc70501323"/>
       <w:r>
         <w:rPr>
           <w:lang w:val="en-GB"/>
         </w:rPr>
         <w:t>Telegram bot</w:t>
       </w:r>
+      <w:bookmarkEnd w:id="12"/>
     </w:p>
     <w:p>
       <w:pPr>
@@ -3290,23 +3412,9 @@
         <w:rPr>
           <w:lang w:val="en-GB"/>
         </w:rPr>
-        <w:t xml:space="preserve">In order to do it I create a bot using </w:t>
-      </w:r>
-      <w:proofErr w:type="spellStart"/>
-      <w:r>
-        <w:rPr>
-          <w:lang w:val="en-GB"/>
-        </w:rPr>
-        <w:t>BotFather</w:t>
-      </w:r>
-      <w:proofErr w:type="spellEnd"/>
-      <w:r>
-        <w:rPr>
-          <w:lang w:val="en-GB"/>
-        </w:rPr>
-        <w:t xml:space="preserve"> (</w:t>
-      </w:r>
-      <w:hyperlink r:id="rId50" w:history="1">
+        <w:t>In order to do it I create a bot using BotFather (</w:t>
+      </w:r>
+      <w:hyperlink r:id="rId52" w:history="1">
         <w:r>
           <w:rPr>
             <w:rStyle w:val="Hyperlink"/>
@@ -3344,23 +3452,10 @@
         <w:rPr>
           <w:lang w:val="en-GB"/>
         </w:rPr>
-        <w:t xml:space="preserve">Then using </w:t>
-      </w:r>
-      <w:proofErr w:type="spellStart"/>
-      <w:r>
-        <w:rPr>
-          <w:lang w:val="en-GB"/>
-        </w:rPr>
-        <w:t>telepot</w:t>
-      </w:r>
-      <w:proofErr w:type="spellEnd"/>
-      <w:r>
-        <w:rPr>
-          <w:lang w:val="en-GB"/>
-        </w:rPr>
-        <w:t xml:space="preserve"> python library (</w:t>
-      </w:r>
-      <w:hyperlink r:id="rId51" w:history="1">
+        <w:lastRenderedPageBreak/>
+        <w:t>Then using telepot python library (</w:t>
+      </w:r>
+      <w:hyperlink r:id="rId53" w:history="1">
         <w:r>
           <w:rPr>
             <w:rStyle w:val="Hyperlink"/>
@@ -3398,21 +3493,7 @@
         <w:rPr>
           <w:lang w:val="en-GB"/>
         </w:rPr>
-        <w:t xml:space="preserve">Lastly using the </w:t>
-      </w:r>
-      <w:proofErr w:type="spellStart"/>
-      <w:r>
-        <w:rPr>
-          <w:lang w:val="en-GB"/>
-        </w:rPr>
-        <w:t>thingspeak</w:t>
-      </w:r>
-      <w:proofErr w:type="spellEnd"/>
-      <w:r>
-        <w:rPr>
-          <w:lang w:val="en-GB"/>
-        </w:rPr>
-        <w:t xml:space="preserve"> python library</w:t>
+        <w:t>Lastly using the thingspeak python library</w:t>
       </w:r>
       <w:r>
         <w:rPr>
@@ -3420,7 +3501,7 @@
         </w:rPr>
         <w:t xml:space="preserve"> (</w:t>
       </w:r>
-      <w:hyperlink r:id="rId52" w:history="1">
+      <w:hyperlink r:id="rId54" w:history="1">
         <w:r>
           <w:rPr>
             <w:rStyle w:val="Hyperlink"/>
@@ -3458,21 +3539,7 @@
         <w:rPr>
           <w:lang w:val="en-GB"/>
         </w:rPr>
-        <w:t xml:space="preserve">When it’s running, talk to </w:t>
-      </w:r>
-      <w:proofErr w:type="spellStart"/>
-      <w:r>
-        <w:rPr>
-          <w:lang w:val="en-GB"/>
-        </w:rPr>
-        <w:t>VAR_AUB_bot</w:t>
-      </w:r>
-      <w:proofErr w:type="spellEnd"/>
-      <w:r>
-        <w:rPr>
-          <w:lang w:val="en-GB"/>
-        </w:rPr>
-        <w:t xml:space="preserve"> </w:t>
+        <w:t xml:space="preserve">When it’s running, talk to VAR_AUB_bot </w:t>
       </w:r>
       <w:r>
         <w:rPr>
@@ -3480,7 +3547,7 @@
         </w:rPr>
         <w:t>(</w:t>
       </w:r>
-      <w:hyperlink r:id="rId53" w:tgtFrame="_blank" w:history="1">
+      <w:hyperlink r:id="rId55" w:tgtFrame="_blank" w:history="1">
         <w:r>
           <w:rPr>
             <w:rStyle w:val="Hyperlink"/>
@@ -3491,22 +3558,8 @@
             <w:shd w:val="clear" w:color="auto" w:fill="FFFFFF"/>
             <w:lang w:val="en-GB"/>
           </w:rPr>
-          <w:t>t.me/</w:t>
+          <w:t>t.me/var_aub_bot</w:t>
         </w:r>
-        <w:proofErr w:type="spellStart"/>
-        <w:r>
-          <w:rPr>
-            <w:rStyle w:val="Hyperlink"/>
-            <w:rFonts w:ascii="Tahoma" w:hAnsi="Tahoma" w:cs="Tahoma"/>
-            <w:color w:val="3A6D99"/>
-            <w:sz w:val="20"/>
-            <w:szCs w:val="20"/>
-            <w:shd w:val="clear" w:color="auto" w:fill="FFFFFF"/>
-            <w:lang w:val="en-GB"/>
-          </w:rPr>
-          <w:t>var_aub_bot</w:t>
-        </w:r>
-        <w:proofErr w:type="spellEnd"/>
       </w:hyperlink>
       <w:r>
         <w:rPr>
@@ -3528,12 +3581,14 @@
           <w:lang w:val="en-GB"/>
         </w:rPr>
       </w:pPr>
+      <w:bookmarkStart w:id="13" w:name="_Toc70501324"/>
       <w:r>
         <w:rPr>
           <w:lang w:val="en-GB"/>
         </w:rPr>
         <w:t>ThingSpeak visualization</w:t>
       </w:r>
+      <w:bookmarkEnd w:id="13"/>
     </w:p>
     <w:p>
       <w:pPr>
@@ -3549,12 +3604,14 @@
           <w:lang w:val="en-GB"/>
         </w:rPr>
       </w:pPr>
+      <w:bookmarkStart w:id="14" w:name="_Toc70501325"/>
       <w:r>
         <w:rPr>
           <w:lang w:val="en-GB"/>
         </w:rPr>
         <w:t>Interest links</w:t>
       </w:r>
+      <w:bookmarkEnd w:id="14"/>
     </w:p>
     <w:p>
       <w:pPr>
@@ -3567,7 +3624,7 @@
           <w:lang w:val="en-GB"/>
         </w:rPr>
       </w:pPr>
-      <w:hyperlink r:id="rId54" w:history="1">
+      <w:hyperlink r:id="rId56" w:history="1">
         <w:r>
           <w:rPr>
             <w:rStyle w:val="Hyperlink"/>
@@ -3598,13 +3655,51 @@
     </w:p>
     <w:p>
       <w:pPr>
-        <w:rPr>
-          <w:lang w:val="en-GB"/>
-        </w:rPr>
-      </w:pPr>
-    </w:p>
-    <w:p>
-      <w:pPr>
+        <w:pStyle w:val="Heading1"/>
+        <w:rPr>
+          <w:lang w:val="en-GB"/>
+        </w:rPr>
+      </w:pPr>
+      <w:bookmarkStart w:id="15" w:name="_Toc70501326"/>
+      <w:r>
+        <w:rPr>
+          <w:lang w:val="en-GB"/>
+        </w:rPr>
+        <w:t>Things to improve</w:t>
+      </w:r>
+      <w:bookmarkEnd w:id="15"/>
+    </w:p>
+    <w:p>
+      <w:pPr>
+        <w:pStyle w:val="ListParagraph"/>
+        <w:numPr>
+          <w:ilvl w:val="0"/>
+          <w:numId w:val="6"/>
+        </w:numPr>
+        <w:rPr>
+          <w:lang w:val="en-GB"/>
+        </w:rPr>
+      </w:pPr>
+      <w:r>
+        <w:rPr>
+          <w:lang w:val="en-GB"/>
+        </w:rPr>
+        <w:t>Adjust some sensors with resistance</w:t>
+      </w:r>
+      <w:r>
+        <w:rPr>
+          <w:lang w:val="en-GB"/>
+        </w:rPr>
+        <w:t>s, use new light sensors and test if it’s better 3.3V or 5V.</w:t>
+      </w:r>
+    </w:p>
+    <w:p>
+      <w:pPr>
+        <w:pStyle w:val="ListParagraph"/>
+        <w:numPr>
+          <w:ilvl w:val="0"/>
+          <w:numId w:val="6"/>
+        </w:numPr>
         <w:rPr>
           <w:lang w:val="en-GB"/>
         </w:rPr>
@@ -3621,7 +3716,7 @@
 </file>
 
 <file path=word/numbering.xml><?xml version="1.0" encoding="utf-8"?>
-<w:numbering xmlns:wpc="http://schemas.microsoft.com/office/word/2010/wordprocessingCanvas" xmlns:cx="http://schemas.microsoft.com/office/drawing/2014/chartex" xmlns:cx1="http://schemas.microsoft.com/office/drawing/2015/9/8/chartex" xmlns:cx2="http://schemas.microsoft.com/office/drawing/2015/10/21/chartex" xmlns:cx3="http://schemas.microsoft.com/office/drawing/2016/5/9/chartex" xmlns:cx4="http://schemas.microsoft.com/office/drawing/2016/5/10/chartex" xmlns:cx5="http://schemas.microsoft.com/office/drawing/2016/5/11/chartex" xmlns:cx6="http://schemas.microsoft.com/office/drawing/2016/5/12/chartex" xmlns:cx7="http://schemas.microsoft.com/office/drawing/2016/5/13/chartex" xmlns:cx8="http://schemas.microsoft.com/office/drawing/2016/5/14/chartex" xmlns:mc="http://schemas.openxmlformats.org/markup-compatibility/2006" xmlns:aink="http://schemas.microsoft.com/office/drawing/2016/ink" xmlns:am3d="http://schemas.microsoft.com/office/drawing/2017/model3d" xmlns:o="urn:schemas-microsoft-com:office:office" xmlns:r="http://schemas.openxmlformats.org/officeDocument/2006/relationships" xmlns:m="http://schemas.openxmlformats.org/officeDocument/2006/math" xmlns:v="urn:schemas-microsoft-com:vml" xmlns:wp14="http://schemas.microsoft.com/office/word/2010/wordprocessingDrawing" xmlns:wp="http://schemas.openxmlformats.org/drawingml/2006/wordprocessingDrawing" xmlns:w10="urn:schemas-microsoft-com:office:word" xmlns:w="http://schemas.openxmlformats.org/wordprocessingml/2006/main" xmlns:w14="http://schemas.microsoft.com/office/word/2010/wordml" xmlns:w15="http://schemas.microsoft.com/office/word/2012/wordml" xmlns:w16cex="http://schemas.microsoft.com/office/word/2018/wordml/cex" xmlns:w16cid="http://schemas.microsoft.com/office/word/2016/wordml/cid" xmlns:w16="http://schemas.microsoft.com/office/word/2018/wordml" xmlns:w16se="http://schemas.microsoft.com/office/word/2015/wordml/symex" xmlns:wpg="http://schemas.microsoft.com/office/word/2010/wordprocessingGroup" xmlns:wpi="http://schemas.microsoft.com/office/word/2010/wordprocessingInk" xmlns:wne="http://schemas.microsoft.com/office/word/2006/wordml" xmlns:wps="http://schemas.microsoft.com/office/word/2010/wordprocessingShape" mc:Ignorable="w14 w15 w16se w16cid w16 w16cex wp14">
+<w:numbering xmlns:wpc="http://schemas.microsoft.com/office/word/2010/wordprocessingCanvas" xmlns:cx="http://schemas.microsoft.com/office/drawing/2014/chartex" xmlns:cx1="http://schemas.microsoft.com/office/drawing/2015/9/8/chartex" xmlns:cx2="http://schemas.microsoft.com/office/drawing/2015/10/21/chartex" xmlns:cx3="http://schemas.microsoft.com/office/drawing/2016/5/9/chartex" xmlns:cx4="http://schemas.microsoft.com/office/drawing/2016/5/10/chartex" xmlns:cx5="http://schemas.microsoft.com/office/drawing/2016/5/11/chartex" xmlns:cx6="http://schemas.microsoft.com/office/drawing/2016/5/12/chartex" xmlns:cx7="http://schemas.microsoft.com/office/drawing/2016/5/13/chartex" xmlns:cx8="http://schemas.microsoft.com/office/drawing/2016/5/14/chartex" xmlns:mc="http://schemas.openxmlformats.org/markup-compatibility/2006" xmlns:aink="http://schemas.microsoft.com/office/drawing/2016/ink" xmlns:am3d="http://schemas.microsoft.com/office/drawing/2017/model3d" xmlns:o="urn:schemas-microsoft-com:office:office" xmlns:r="http://schemas.openxmlformats.org/officeDocument/2006/relationships" xmlns:m="http://schemas.openxmlformats.org/officeDocument/2006/math" xmlns:v="urn:schemas-microsoft-com:vml" xmlns:wp14="http://schemas.microsoft.com/office/word/2010/wordprocessingDrawing" xmlns:wp="http://schemas.openxmlformats.org/drawingml/2006/wordprocessingDrawing" xmlns:w10="urn:schemas-microsoft-com:office:word" xmlns:w="http://schemas.openxmlformats.org/wordprocessingml/2006/main" xmlns:w14="http://schemas.microsoft.com/office/word/2010/wordml" xmlns:w15="http://schemas.microsoft.com/office/word/2012/wordml" xmlns:w16cex="http://schemas.microsoft.com/office/word/2018/wordml/cex" xmlns:w16cid="http://schemas.microsoft.com/office/word/2016/wordml/cid" xmlns:w16="http://schemas.microsoft.com/office/word/2018/wordml" xmlns:w16sdtdh="http://schemas.microsoft.com/office/word/2020/wordml/sdtdatahash" xmlns:w16se="http://schemas.microsoft.com/office/word/2015/wordml/symex" xmlns:wpg="http://schemas.microsoft.com/office/word/2010/wordprocessingGroup" xmlns:wpi="http://schemas.microsoft.com/office/word/2010/wordprocessingInk" xmlns:wne="http://schemas.microsoft.com/office/word/2006/wordml" xmlns:wps="http://schemas.microsoft.com/office/word/2010/wordprocessingShape" mc:Ignorable="w14 w15 w16se w16cid w16 w16cex w16sdtdh wp14">
   <w:abstractNum w:abstractNumId="0" w15:restartNumberingAfterBreak="0">
     <w:nsid w:val="0D1228C4"/>
     <w:multiLevelType w:val="hybridMultilevel"/>
@@ -3962,9 +4057,9 @@
     </w:lvl>
   </w:abstractNum>
   <w:abstractNum w:abstractNumId="3" w15:restartNumberingAfterBreak="0">
-    <w:nsid w:val="468348A4"/>
+    <w:nsid w:val="414E21F7"/>
     <w:multiLevelType w:val="hybridMultilevel"/>
-    <w:tmpl w:val="07E40CEA"/>
+    <w:tmpl w:val="5FA80F8E"/>
     <w:lvl w:ilvl="0" w:tplc="08090001">
       <w:start w:val="1"/>
       <w:numFmt w:val="bullet"/>
@@ -4075,6 +4170,119 @@
     </w:lvl>
   </w:abstractNum>
   <w:abstractNum w:abstractNumId="4" w15:restartNumberingAfterBreak="0">
+    <w:nsid w:val="468348A4"/>
+    <w:multiLevelType w:val="hybridMultilevel"/>
+    <w:tmpl w:val="07E40CEA"/>
+    <w:lvl w:ilvl="0" w:tplc="08090001">
+      <w:start w:val="1"/>
+      <w:numFmt w:val="bullet"/>
+      <w:lvlText w:val=""/>
+      <w:lvlJc w:val="left"/>
+      <w:pPr>
+        <w:ind w:left="720" w:hanging="360"/>
+      </w:pPr>
+      <w:rPr>
+        <w:rFonts w:ascii="Symbol" w:hAnsi="Symbol" w:hint="default"/>
+      </w:rPr>
+    </w:lvl>
+    <w:lvl w:ilvl="1" w:tplc="08090003" w:tentative="1">
+      <w:start w:val="1"/>
+      <w:numFmt w:val="bullet"/>
+      <w:lvlText w:val="o"/>
+      <w:lvlJc w:val="left"/>
+      <w:pPr>
+        <w:ind w:left="1440" w:hanging="360"/>
+      </w:pPr>
+      <w:rPr>
+        <w:rFonts w:ascii="Courier New" w:hAnsi="Courier New" w:cs="Courier New" w:hint="default"/>
+      </w:rPr>
+    </w:lvl>
+    <w:lvl w:ilvl="2" w:tplc="08090005" w:tentative="1">
+      <w:start w:val="1"/>
+      <w:numFmt w:val="bullet"/>
+      <w:lvlText w:val=""/>
+      <w:lvlJc w:val="left"/>
+      <w:pPr>
+        <w:ind w:left="2160" w:hanging="360"/>
+      </w:pPr>
+      <w:rPr>
+        <w:rFonts w:ascii="Wingdings" w:hAnsi="Wingdings" w:hint="default"/>
+      </w:rPr>
+    </w:lvl>
+    <w:lvl w:ilvl="3" w:tplc="08090001" w:tentative="1">
+      <w:start w:val="1"/>
+      <w:numFmt w:val="bullet"/>
+      <w:lvlText w:val=""/>
+      <w:lvlJc w:val="left"/>
+      <w:pPr>
+        <w:ind w:left="2880" w:hanging="360"/>
+      </w:pPr>
+      <w:rPr>
+        <w:rFonts w:ascii="Symbol" w:hAnsi="Symbol" w:hint="default"/>
+      </w:rPr>
+    </w:lvl>
+    <w:lvl w:ilvl="4" w:tplc="08090003" w:tentative="1">
+      <w:start w:val="1"/>
+      <w:numFmt w:val="bullet"/>
+      <w:lvlText w:val="o"/>
+      <w:lvlJc w:val="left"/>
+      <w:pPr>
+        <w:ind w:left="3600" w:hanging="360"/>
+      </w:pPr>
+      <w:rPr>
+        <w:rFonts w:ascii="Courier New" w:hAnsi="Courier New" w:cs="Courier New" w:hint="default"/>
+      </w:rPr>
+    </w:lvl>
+    <w:lvl w:ilvl="5" w:tplc="08090005" w:tentative="1">
+      <w:start w:val="1"/>
+      <w:numFmt w:val="bullet"/>
+      <w:lvlText w:val=""/>
+      <w:lvlJc w:val="left"/>
+      <w:pPr>
+        <w:ind w:left="4320" w:hanging="360"/>
+      </w:pPr>
+      <w:rPr>
+        <w:rFonts w:ascii="Wingdings" w:hAnsi="Wingdings" w:hint="default"/>
+      </w:rPr>
+    </w:lvl>
+    <w:lvl w:ilvl="6" w:tplc="08090001" w:tentative="1">
+      <w:start w:val="1"/>
+      <w:numFmt w:val="bullet"/>
+      <w:lvlText w:val=""/>
+      <w:lvlJc w:val="left"/>
+      <w:pPr>
+        <w:ind w:left="5040" w:hanging="360"/>
+      </w:pPr>
+      <w:rPr>
+        <w:rFonts w:ascii="Symbol" w:hAnsi="Symbol" w:hint="default"/>
+      </w:rPr>
+    </w:lvl>
+    <w:lvl w:ilvl="7" w:tplc="08090003" w:tentative="1">
+      <w:start w:val="1"/>
+      <w:numFmt w:val="bullet"/>
+      <w:lvlText w:val="o"/>
+      <w:lvlJc w:val="left"/>
+      <w:pPr>
+        <w:ind w:left="5760" w:hanging="360"/>
+      </w:pPr>
+      <w:rPr>
+        <w:rFonts w:ascii="Courier New" w:hAnsi="Courier New" w:cs="Courier New" w:hint="default"/>
+      </w:rPr>
+    </w:lvl>
+    <w:lvl w:ilvl="8" w:tplc="08090005" w:tentative="1">
+      <w:start w:val="1"/>
+      <w:numFmt w:val="bullet"/>
+      <w:lvlText w:val=""/>
+      <w:lvlJc w:val="left"/>
+      <w:pPr>
+        <w:ind w:left="6480" w:hanging="360"/>
+      </w:pPr>
+      <w:rPr>
+        <w:rFonts w:ascii="Wingdings" w:hAnsi="Wingdings" w:hint="default"/>
+      </w:rPr>
+    </w:lvl>
+  </w:abstractNum>
+  <w:abstractNum w:abstractNumId="5" w15:restartNumberingAfterBreak="0">
     <w:nsid w:val="6B141BB0"/>
     <w:multiLevelType w:val="hybridMultilevel"/>
     <w:tmpl w:val="64EAFEE4"/>
@@ -4197,16 +4405,19 @@
     <w:abstractNumId w:val="2"/>
   </w:num>
   <w:num w:numId="4">
+    <w:abstractNumId w:val="5"/>
+  </w:num>
+  <w:num w:numId="5">
     <w:abstractNumId w:val="4"/>
   </w:num>
-  <w:num w:numId="5">
+  <w:num w:numId="6">
     <w:abstractNumId w:val="3"/>
   </w:num>
 </w:numbering>
 </file>
 
 <file path=word/styles.xml><?xml version="1.0" encoding="utf-8"?>
-<w:styles xmlns:mc="http://schemas.openxmlformats.org/markup-compatibility/2006" xmlns:r="http://schemas.openxmlformats.org/officeDocument/2006/relationships" xmlns:w="http://schemas.openxmlformats.org/wordprocessingml/2006/main" xmlns:w14="http://schemas.microsoft.com/office/word/2010/wordml" xmlns:w15="http://schemas.microsoft.com/office/word/2012/wordml" xmlns:w16cex="http://schemas.microsoft.com/office/word/2018/wordml/cex" xmlns:w16cid="http://schemas.microsoft.com/office/word/2016/wordml/cid" xmlns:w16="http://schemas.microsoft.com/office/word/2018/wordml" xmlns:w16se="http://schemas.microsoft.com/office/word/2015/wordml/symex" mc:Ignorable="w14 w15 w16se w16cid w16 w16cex">
+<w:styles xmlns:mc="http://schemas.openxmlformats.org/markup-compatibility/2006" xmlns:r="http://schemas.openxmlformats.org/officeDocument/2006/relationships" xmlns:w="http://schemas.openxmlformats.org/wordprocessingml/2006/main" xmlns:w14="http://schemas.microsoft.com/office/word/2010/wordml" xmlns:w15="http://schemas.microsoft.com/office/word/2012/wordml" xmlns:w16cex="http://schemas.microsoft.com/office/word/2018/wordml/cex" xmlns:w16cid="http://schemas.microsoft.com/office/word/2016/wordml/cid" xmlns:w16="http://schemas.microsoft.com/office/word/2018/wordml" xmlns:w16sdtdh="http://schemas.microsoft.com/office/word/2020/wordml/sdtdatahash" xmlns:w16se="http://schemas.microsoft.com/office/word/2015/wordml/symex" mc:Ignorable="w14 w15 w16se w16cid w16 w16cex w16sdtdh">
   <w:docDefaults>
     <w:rPrDefault>
       <w:rPr>
@@ -4931,6 +5142,18 @@
       <w:color w:val="2F5496" w:themeColor="accent1" w:themeShade="BF"/>
     </w:rPr>
   </w:style>
+  <w:style w:type="paragraph" w:styleId="TOC1">
+    <w:name w:val="toc 1"/>
+    <w:basedOn w:val="Normal"/>
+    <w:next w:val="Normal"/>
+    <w:autoRedefine/>
+    <w:uiPriority w:val="39"/>
+    <w:unhideWhenUsed/>
+    <w:rsid w:val="00E71FA5"/>
+    <w:pPr>
+      <w:spacing w:after="100"/>
+    </w:pPr>
+  </w:style>
 </w:styles>
 </file>
 
@@ -5230,18 +5453,16 @@
 </file>
 
 <file path=customXml/item1.xml><?xml version="1.0" encoding="utf-8"?>
-<p:properties xmlns:p="http://schemas.microsoft.com/office/2006/metadata/properties" xmlns:xsi="http://www.w3.org/2001/XMLSchema-instance" xmlns:pc="http://schemas.microsoft.com/office/infopath/2007/PartnerControls">
-  <documentManagement/>
-</p:properties>
-</file>
-
-<file path=customXml/item2.xml><?xml version="1.0" encoding="utf-8"?>
 <?mso-contentType ?>
 <FormTemplates xmlns="http://schemas.microsoft.com/sharepoint/v3/contenttype/forms">
   <Display>DocumentLibraryForm</Display>
   <Edit>DocumentLibraryForm</Edit>
   <New>DocumentLibraryForm</New>
 </FormTemplates>
+</file>
+
+<file path=customXml/item2.xml><?xml version="1.0" encoding="utf-8"?>
+<b:Sources xmlns:b="http://schemas.openxmlformats.org/officeDocument/2006/bibliography" xmlns="http://schemas.openxmlformats.org/officeDocument/2006/bibliography" SelectedStyle="\APASixthEditionOfficeOnline.xsl" StyleName="APA" Version="6"/>
 </file>
 
 <file path=customXml/item3.xml><?xml version="1.0" encoding="utf-8"?>
@@ -5462,22 +5683,23 @@
 </file>
 
 <file path=customXml/item4.xml><?xml version="1.0" encoding="utf-8"?>
-<b:Sources xmlns:b="http://schemas.openxmlformats.org/officeDocument/2006/bibliography" xmlns="http://schemas.openxmlformats.org/officeDocument/2006/bibliography" SelectedStyle="\APASixthEditionOfficeOnline.xsl" StyleName="APA" Version="6"/>
+<p:properties xmlns:p="http://schemas.microsoft.com/office/2006/metadata/properties" xmlns:xsi="http://www.w3.org/2001/XMLSchema-instance" xmlns:pc="http://schemas.microsoft.com/office/infopath/2007/PartnerControls">
+  <documentManagement/>
+</p:properties>
 </file>
 
 <file path=customXml/itemProps1.xml><?xml version="1.0" encoding="utf-8"?>
-<ds:datastoreItem xmlns:ds="http://schemas.openxmlformats.org/officeDocument/2006/customXml" ds:itemID="{57A0A09F-D7A2-43D0-A17E-3CCE9A625C60}">
+<ds:datastoreItem xmlns:ds="http://schemas.openxmlformats.org/officeDocument/2006/customXml" ds:itemID="{69B63455-D79A-4881-AE27-C458E95494A8}">
   <ds:schemaRefs>
-    <ds:schemaRef ds:uri="http://schemas.microsoft.com/office/2006/metadata/properties"/>
-    <ds:schemaRef ds:uri="http://schemas.microsoft.com/office/infopath/2007/PartnerControls"/>
+    <ds:schemaRef ds:uri="http://schemas.microsoft.com/sharepoint/v3/contenttype/forms"/>
   </ds:schemaRefs>
 </ds:datastoreItem>
 </file>
 
 <file path=customXml/itemProps2.xml><?xml version="1.0" encoding="utf-8"?>
-<ds:datastoreItem xmlns:ds="http://schemas.openxmlformats.org/officeDocument/2006/customXml" ds:itemID="{69B63455-D79A-4881-AE27-C458E95494A8}">
+<ds:datastoreItem xmlns:ds="http://schemas.openxmlformats.org/officeDocument/2006/customXml" ds:itemID="{36376837-F33B-427F-8D83-C113DE7E32E8}">
   <ds:schemaRefs>
-    <ds:schemaRef ds:uri="http://schemas.microsoft.com/sharepoint/v3/contenttype/forms"/>
+    <ds:schemaRef ds:uri="http://schemas.openxmlformats.org/officeDocument/2006/bibliography"/>
   </ds:schemaRefs>
 </ds:datastoreItem>
 </file>
@@ -5502,9 +5724,10 @@
 </file>
 
 <file path=customXml/itemProps4.xml><?xml version="1.0" encoding="utf-8"?>
-<ds:datastoreItem xmlns:ds="http://schemas.openxmlformats.org/officeDocument/2006/customXml" ds:itemID="{36376837-F33B-427F-8D83-C113DE7E32E8}">
+<ds:datastoreItem xmlns:ds="http://schemas.openxmlformats.org/officeDocument/2006/customXml" ds:itemID="{57A0A09F-D7A2-43D0-A17E-3CCE9A625C60}">
   <ds:schemaRefs>
-    <ds:schemaRef ds:uri="http://schemas.openxmlformats.org/officeDocument/2006/bibliography"/>
+    <ds:schemaRef ds:uri="http://schemas.microsoft.com/office/2006/metadata/properties"/>
+    <ds:schemaRef ds:uri="http://schemas.microsoft.com/office/infopath/2007/PartnerControls"/>
   </ds:schemaRefs>
 </ds:datastoreItem>
 </file>
</xml_diff>

<commit_message>
All sensors data collected
</commit_message>
<xml_diff>
--- a/Documentation/General/Notes.docx
+++ b/Documentation/General/Notes.docx
@@ -37,9 +37,11 @@
           <w:pPr>
             <w:pStyle w:val="TOCHeading"/>
           </w:pPr>
+          <w:proofErr w:type="spellStart"/>
           <w:r>
             <w:t>Contents</w:t>
           </w:r>
+          <w:proofErr w:type="spellEnd"/>
         </w:p>
         <w:p>
           <w:pPr>
@@ -1224,7 +1226,21 @@
         <w:rPr>
           <w:lang w:val="en-GB"/>
         </w:rPr>
-        <w:t>Arduino MKR 1010 Wifi (</w:t>
+        <w:t xml:space="preserve">Arduino MKR 1010 </w:t>
+      </w:r>
+      <w:proofErr w:type="spellStart"/>
+      <w:r>
+        <w:rPr>
+          <w:lang w:val="en-GB"/>
+        </w:rPr>
+        <w:t>Wifi</w:t>
+      </w:r>
+      <w:proofErr w:type="spellEnd"/>
+      <w:r>
+        <w:rPr>
+          <w:lang w:val="en-GB"/>
+        </w:rPr>
+        <w:t xml:space="preserve"> (</w:t>
       </w:r>
       <w:hyperlink r:id="rId9" w:history="1">
         <w:r>
@@ -1243,8 +1259,13 @@
       </w:r>
     </w:p>
     <w:p>
-      <w:r>
-        <w:t>Sensors:</w:t>
+      <w:proofErr w:type="spellStart"/>
+      <w:r>
+        <w:t>Sensors</w:t>
+      </w:r>
+      <w:proofErr w:type="spellEnd"/>
+      <w:r>
+        <w:t>:</w:t>
       </w:r>
     </w:p>
     <w:p>
@@ -1321,8 +1342,13 @@
           <w:numId w:val="1"/>
         </w:numPr>
       </w:pPr>
-      <w:r>
-        <w:t>Temperature (</w:t>
+      <w:proofErr w:type="spellStart"/>
+      <w:r>
+        <w:t>Temperature</w:t>
+      </w:r>
+      <w:proofErr w:type="spellEnd"/>
+      <w:r>
+        <w:t xml:space="preserve"> (</w:t>
       </w:r>
       <w:hyperlink r:id="rId12" w:history="1">
         <w:r>
@@ -1344,12 +1370,41 @@
           <w:numId w:val="1"/>
         </w:numPr>
       </w:pPr>
+      <w:proofErr w:type="spellStart"/>
       <w:r>
         <w:lastRenderedPageBreak/>
-        <w:t xml:space="preserve">Soil moisture </w:t>
-      </w:r>
-      <w:r>
-        <w:t xml:space="preserve">(ml/cubic centimetre) </w:t>
+        <w:t>Soil</w:t>
+      </w:r>
+      <w:proofErr w:type="spellEnd"/>
+      <w:r>
+        <w:t xml:space="preserve"> </w:t>
+      </w:r>
+      <w:proofErr w:type="spellStart"/>
+      <w:r>
+        <w:t>moisture</w:t>
+      </w:r>
+      <w:proofErr w:type="spellEnd"/>
+      <w:r>
+        <w:t xml:space="preserve"> </w:t>
+      </w:r>
+      <w:r>
+        <w:t>(ml/</w:t>
+      </w:r>
+      <w:proofErr w:type="spellStart"/>
+      <w:r>
+        <w:t>cubic</w:t>
+      </w:r>
+      <w:proofErr w:type="spellEnd"/>
+      <w:r>
+        <w:t xml:space="preserve"> </w:t>
+      </w:r>
+      <w:proofErr w:type="spellStart"/>
+      <w:r>
+        <w:t>centimetre</w:t>
+      </w:r>
+      <w:proofErr w:type="spellEnd"/>
+      <w:r>
+        <w:t xml:space="preserve">) </w:t>
       </w:r>
       <w:r>
         <w:t>(</w:t>
@@ -1384,7 +1439,15 @@
     </w:p>
     <w:p>
       <w:r>
-        <w:t>Arduino batteries (</w:t>
+        <w:t xml:space="preserve">Arduino </w:t>
+      </w:r>
+      <w:proofErr w:type="spellStart"/>
+      <w:r>
+        <w:t>batteries</w:t>
+      </w:r>
+      <w:proofErr w:type="spellEnd"/>
+      <w:r>
+        <w:t xml:space="preserve"> (</w:t>
       </w:r>
       <w:hyperlink r:id="rId15" w:history="1">
         <w:r>
@@ -1495,7 +1558,21 @@
         <w:rPr>
           <w:lang w:val="en-GB"/>
         </w:rPr>
-        <w:t>Connecting MKR WiFi 1010 to a Wi-Fi network</w:t>
+        <w:t xml:space="preserve">Connecting MKR </w:t>
+      </w:r>
+      <w:proofErr w:type="spellStart"/>
+      <w:r>
+        <w:rPr>
+          <w:lang w:val="en-GB"/>
+        </w:rPr>
+        <w:t>WiFi</w:t>
+      </w:r>
+      <w:proofErr w:type="spellEnd"/>
+      <w:r>
+        <w:rPr>
+          <w:lang w:val="en-GB"/>
+        </w:rPr>
+        <w:t xml:space="preserve"> 1010 to a Wi-Fi network</w:t>
       </w:r>
       <w:r>
         <w:rPr>
@@ -1547,7 +1624,21 @@
         <w:rPr>
           <w:lang w:val="en-GB"/>
         </w:rPr>
-        <w:t>Powering MKR WiFi 1010 with batteries</w:t>
+        <w:t xml:space="preserve">Powering MKR </w:t>
+      </w:r>
+      <w:proofErr w:type="spellStart"/>
+      <w:r>
+        <w:rPr>
+          <w:lang w:val="en-GB"/>
+        </w:rPr>
+        <w:t>WiFi</w:t>
+      </w:r>
+      <w:proofErr w:type="spellEnd"/>
+      <w:r>
+        <w:rPr>
+          <w:lang w:val="en-GB"/>
+        </w:rPr>
+        <w:t xml:space="preserve"> 1010 with batteries</w:t>
       </w:r>
       <w:r>
         <w:rPr>
@@ -1586,7 +1677,21 @@
         <w:rPr>
           <w:lang w:val="en-GB"/>
         </w:rPr>
-        <w:t>Host a web server on the MKR WiFi 1010</w:t>
+        <w:t xml:space="preserve">Host a web server on the MKR </w:t>
+      </w:r>
+      <w:proofErr w:type="spellStart"/>
+      <w:r>
+        <w:rPr>
+          <w:lang w:val="en-GB"/>
+        </w:rPr>
+        <w:t>WiFi</w:t>
+      </w:r>
+      <w:proofErr w:type="spellEnd"/>
+      <w:r>
+        <w:rPr>
+          <w:lang w:val="en-GB"/>
+        </w:rPr>
+        <w:t xml:space="preserve"> 1010</w:t>
       </w:r>
       <w:r>
         <w:rPr>
@@ -1625,7 +1730,21 @@
         <w:rPr>
           <w:lang w:val="en-GB"/>
         </w:rPr>
-        <w:t>How to connect sensors to the MKR WiFi 1010</w:t>
+        <w:t xml:space="preserve">How to connect sensors to the MKR </w:t>
+      </w:r>
+      <w:proofErr w:type="spellStart"/>
+      <w:r>
+        <w:rPr>
+          <w:lang w:val="en-GB"/>
+        </w:rPr>
+        <w:t>WiFi</w:t>
+      </w:r>
+      <w:proofErr w:type="spellEnd"/>
+      <w:r>
+        <w:rPr>
+          <w:lang w:val="en-GB"/>
+        </w:rPr>
+        <w:t xml:space="preserve"> 1010</w:t>
       </w:r>
       <w:r>
         <w:rPr>
@@ -1793,7 +1912,21 @@
         <w:rPr>
           <w:lang w:val="en-GB"/>
         </w:rPr>
-        <w:t>Connect to WiFi mobile net</w:t>
+        <w:t xml:space="preserve">Connect to </w:t>
+      </w:r>
+      <w:proofErr w:type="spellStart"/>
+      <w:r>
+        <w:rPr>
+          <w:lang w:val="en-GB"/>
+        </w:rPr>
+        <w:t>WiFi</w:t>
+      </w:r>
+      <w:proofErr w:type="spellEnd"/>
+      <w:r>
+        <w:rPr>
+          <w:lang w:val="en-GB"/>
+        </w:rPr>
+        <w:t xml:space="preserve"> mobile net</w:t>
       </w:r>
       <w:r>
         <w:rPr>
@@ -1813,7 +1946,21 @@
         <w:rPr>
           <w:lang w:val="en-GB"/>
         </w:rPr>
-        <w:t xml:space="preserve">Configure MatLab for recognizing </w:t>
+        <w:t xml:space="preserve">Configure </w:t>
+      </w:r>
+      <w:proofErr w:type="spellStart"/>
+      <w:r>
+        <w:rPr>
+          <w:lang w:val="en-GB"/>
+        </w:rPr>
+        <w:t>MatLab</w:t>
+      </w:r>
+      <w:proofErr w:type="spellEnd"/>
+      <w:r>
+        <w:rPr>
+          <w:lang w:val="en-GB"/>
+        </w:rPr>
+        <w:t xml:space="preserve"> for recognizing </w:t>
       </w:r>
       <w:r>
         <w:rPr>
@@ -1821,11 +1968,33 @@
         </w:rPr>
         <w:t xml:space="preserve">this specific board in USB mode. </w:t>
       </w:r>
-      <w:r>
-        <w:rPr>
-          <w:lang w:val="en-GB"/>
-        </w:rPr>
-        <w:t>Simluation -&gt; Model Settings -&gt; Hardware (Select board, and configure WiFi)</w:t>
+      <w:proofErr w:type="spellStart"/>
+      <w:r>
+        <w:rPr>
+          <w:lang w:val="en-GB"/>
+        </w:rPr>
+        <w:t>Simluation</w:t>
+      </w:r>
+      <w:proofErr w:type="spellEnd"/>
+      <w:r>
+        <w:rPr>
+          <w:lang w:val="en-GB"/>
+        </w:rPr>
+        <w:t xml:space="preserve"> -&gt; Model Settings -&gt; Hardware (Select board, and configure </w:t>
+      </w:r>
+      <w:proofErr w:type="spellStart"/>
+      <w:r>
+        <w:rPr>
+          <w:lang w:val="en-GB"/>
+        </w:rPr>
+        <w:t>WiFi</w:t>
+      </w:r>
+      <w:proofErr w:type="spellEnd"/>
+      <w:r>
+        <w:rPr>
+          <w:lang w:val="en-GB"/>
+        </w:rPr>
+        <w:t>)</w:t>
       </w:r>
     </w:p>
     <w:p>
@@ -1847,11 +2016,19 @@
           <w:lang w:val="en-GB"/>
         </w:rPr>
       </w:pPr>
-      <w:r>
-        <w:rPr>
-          <w:lang w:val="en-GB"/>
-        </w:rPr>
-        <w:t>Sdlrtkernet -setup</w:t>
+      <w:proofErr w:type="spellStart"/>
+      <w:r>
+        <w:rPr>
+          <w:lang w:val="en-GB"/>
+        </w:rPr>
+        <w:t>Sdlrtkernet</w:t>
+      </w:r>
+      <w:proofErr w:type="spellEnd"/>
+      <w:r>
+        <w:rPr>
+          <w:lang w:val="en-GB"/>
+        </w:rPr>
+        <w:t xml:space="preserve"> -setup</w:t>
       </w:r>
     </w:p>
     <w:p>
@@ -1870,7 +2047,35 @@
         <w:rPr>
           <w:lang w:val="en-GB"/>
         </w:rPr>
-        <w:t xml:space="preserve"> (standard Thingspeak write is working but cannot be integrated in Arduino, just simulation, Arduino specific Thingspeak write is sending 0 always as the value </w:t>
+        <w:t xml:space="preserve"> (standard </w:t>
+      </w:r>
+      <w:proofErr w:type="spellStart"/>
+      <w:r>
+        <w:rPr>
+          <w:lang w:val="en-GB"/>
+        </w:rPr>
+        <w:t>Thingspeak</w:t>
+      </w:r>
+      <w:proofErr w:type="spellEnd"/>
+      <w:r>
+        <w:rPr>
+          <w:lang w:val="en-GB"/>
+        </w:rPr>
+        <w:t xml:space="preserve"> write is working but cannot be integrated in Arduino, just simulation, Arduino specific </w:t>
+      </w:r>
+      <w:proofErr w:type="spellStart"/>
+      <w:r>
+        <w:rPr>
+          <w:lang w:val="en-GB"/>
+        </w:rPr>
+        <w:t>Thingspeak</w:t>
+      </w:r>
+      <w:proofErr w:type="spellEnd"/>
+      <w:r>
+        <w:rPr>
+          <w:lang w:val="en-GB"/>
+        </w:rPr>
+        <w:t xml:space="preserve"> write is sending 0 always as the value </w:t>
       </w:r>
       <w:hyperlink r:id="rId25" w:history="1">
         <w:r>
@@ -1914,7 +2119,21 @@
         <w:rPr>
           <w:lang w:val="en-GB"/>
         </w:rPr>
-        <w:t>) created by MathWorks that permits writing and reading from ThingSpeak through the Arduino IDE I get a program that publish there correctly.</w:t>
+        <w:t xml:space="preserve">) created by MathWorks that permits writing and reading from ThingSpeak through the Arduino IDE I get a program that publish </w:t>
+      </w:r>
+      <w:proofErr w:type="spellStart"/>
+      <w:r>
+        <w:rPr>
+          <w:lang w:val="en-GB"/>
+        </w:rPr>
+        <w:t>there</w:t>
+      </w:r>
+      <w:proofErr w:type="spellEnd"/>
+      <w:r>
+        <w:rPr>
+          <w:lang w:val="en-GB"/>
+        </w:rPr>
+        <w:t xml:space="preserve"> correctly.</w:t>
       </w:r>
       <w:r>
         <w:rPr>
@@ -1975,7 +2194,21 @@
         <w:rPr>
           <w:lang w:val="en-GB"/>
         </w:rPr>
-        <w:t>Using the ThingsSpeak library</w:t>
+        <w:t xml:space="preserve">Using the </w:t>
+      </w:r>
+      <w:proofErr w:type="spellStart"/>
+      <w:r>
+        <w:rPr>
+          <w:lang w:val="en-GB"/>
+        </w:rPr>
+        <w:t>ThingsSpeak</w:t>
+      </w:r>
+      <w:proofErr w:type="spellEnd"/>
+      <w:r>
+        <w:rPr>
+          <w:lang w:val="en-GB"/>
+        </w:rPr>
+        <w:t xml:space="preserve"> library</w:t>
       </w:r>
       <w:r>
         <w:rPr>
@@ -2027,7 +2260,21 @@
         <w:rPr>
           <w:lang w:val="en-GB"/>
         </w:rPr>
-        <w:t>It works fine, so Matlab/Simulink is discarded for the moment.</w:t>
+        <w:t xml:space="preserve">It works fine, so </w:t>
+      </w:r>
+      <w:proofErr w:type="spellStart"/>
+      <w:r>
+        <w:rPr>
+          <w:lang w:val="en-GB"/>
+        </w:rPr>
+        <w:t>Matlab</w:t>
+      </w:r>
+      <w:proofErr w:type="spellEnd"/>
+      <w:r>
+        <w:rPr>
+          <w:lang w:val="en-GB"/>
+        </w:rPr>
+        <w:t>/Simulink is discarded for the moment.</w:t>
       </w:r>
     </w:p>
     <w:p>
@@ -2131,7 +2378,21 @@
         <w:rPr>
           <w:lang w:val="en-GB"/>
         </w:rPr>
-        <w:t>, so I map it from 0 to 1023 and send this data to Thingspeak.</w:t>
+        <w:t xml:space="preserve">, so I map it from 0 to 1023 and send this data to </w:t>
+      </w:r>
+      <w:proofErr w:type="spellStart"/>
+      <w:r>
+        <w:rPr>
+          <w:lang w:val="en-GB"/>
+        </w:rPr>
+        <w:t>Thingspeak</w:t>
+      </w:r>
+      <w:proofErr w:type="spellEnd"/>
+      <w:r>
+        <w:rPr>
+          <w:lang w:val="en-GB"/>
+        </w:rPr>
+        <w:t>.</w:t>
       </w:r>
     </w:p>
     <w:p>
@@ -2187,20 +2448,62 @@
         <w:rPr>
           <w:lang w:val="en-GB"/>
         </w:rPr>
-        <w:t>When trying to upload both values to my thingspeak channel, the second one is not working as expected.</w:t>
-      </w:r>
-    </w:p>
-    <w:p>
-      <w:pPr>
-        <w:rPr>
-          <w:lang w:val="en-GB"/>
-        </w:rPr>
-      </w:pPr>
-      <w:r>
-        <w:rPr>
-          <w:lang w:val="en-GB"/>
-        </w:rPr>
-        <w:t>It has to be first using setField for each of the values you want to upload and then writeFields for writing together all</w:t>
+        <w:t xml:space="preserve">When trying to upload both values to my </w:t>
+      </w:r>
+      <w:proofErr w:type="spellStart"/>
+      <w:r>
+        <w:rPr>
+          <w:lang w:val="en-GB"/>
+        </w:rPr>
+        <w:t>thingspeak</w:t>
+      </w:r>
+      <w:proofErr w:type="spellEnd"/>
+      <w:r>
+        <w:rPr>
+          <w:lang w:val="en-GB"/>
+        </w:rPr>
+        <w:t xml:space="preserve"> channel, the second one is not working as expected.</w:t>
+      </w:r>
+    </w:p>
+    <w:p>
+      <w:pPr>
+        <w:rPr>
+          <w:lang w:val="en-GB"/>
+        </w:rPr>
+      </w:pPr>
+      <w:r>
+        <w:rPr>
+          <w:lang w:val="en-GB"/>
+        </w:rPr>
+        <w:t xml:space="preserve">It has to be first using </w:t>
+      </w:r>
+      <w:proofErr w:type="spellStart"/>
+      <w:r>
+        <w:rPr>
+          <w:lang w:val="en-GB"/>
+        </w:rPr>
+        <w:t>setField</w:t>
+      </w:r>
+      <w:proofErr w:type="spellEnd"/>
+      <w:r>
+        <w:rPr>
+          <w:lang w:val="en-GB"/>
+        </w:rPr>
+        <w:t xml:space="preserve"> for each of the values you want to upload and then </w:t>
+      </w:r>
+      <w:proofErr w:type="spellStart"/>
+      <w:r>
+        <w:rPr>
+          <w:lang w:val="en-GB"/>
+        </w:rPr>
+        <w:t>writeFields</w:t>
+      </w:r>
+      <w:proofErr w:type="spellEnd"/>
+      <w:r>
+        <w:rPr>
+          <w:lang w:val="en-GB"/>
+        </w:rPr>
+        <w:t xml:space="preserve"> for writing together all</w:t>
       </w:r>
       <w:r>
         <w:rPr>
@@ -2327,10 +2630,168 @@
     </w:p>
     <w:p>
       <w:pPr>
-        <w:rPr>
-          <w:lang w:val="en-GB"/>
-        </w:rPr>
-      </w:pPr>
+        <w:pStyle w:val="Heading4"/>
+        <w:rPr>
+          <w:lang w:val="en-GB"/>
+        </w:rPr>
+      </w:pPr>
+      <w:r>
+        <w:rPr>
+          <w:lang w:val="en-GB"/>
+        </w:rPr>
+        <w:t>Rain sensor</w:t>
+      </w:r>
+    </w:p>
+    <w:p>
+      <w:pPr>
+        <w:rPr>
+          <w:lang w:val="en-GB"/>
+        </w:rPr>
+      </w:pPr>
+      <w:r>
+        <w:rPr>
+          <w:lang w:val="en-GB"/>
+        </w:rPr>
+        <w:t xml:space="preserve">Connect the sensor according to the vendor’s information. </w:t>
+      </w:r>
+    </w:p>
+    <w:p>
+      <w:pPr>
+        <w:pStyle w:val="Heading4"/>
+        <w:rPr>
+          <w:lang w:val="en-GB"/>
+        </w:rPr>
+      </w:pPr>
+      <w:r>
+        <w:rPr>
+          <w:lang w:val="en-GB"/>
+        </w:rPr>
+        <w:lastRenderedPageBreak/>
+        <w:t>Sensor’s installation</w:t>
+      </w:r>
+    </w:p>
+    <w:p>
+      <w:pPr>
+        <w:rPr>
+          <w:lang w:val="en-GB"/>
+        </w:rPr>
+      </w:pPr>
+      <w:r>
+        <w:rPr>
+          <w:noProof/>
+          <w:lang w:val="en-GB"/>
+        </w:rPr>
+        <w:drawing>
+          <wp:inline distT="0" distB="0" distL="0" distR="0" wp14:anchorId="7A957A66" wp14:editId="015ED8B5">
+            <wp:extent cx="5391150" cy="3028950"/>
+            <wp:effectExtent l="0" t="0" r="0" b="0"/>
+            <wp:docPr id="2" name="Picture 2"/>
+            <wp:cNvGraphicFramePr>
+              <a:graphicFrameLocks xmlns:a="http://schemas.openxmlformats.org/drawingml/2006/main" noChangeAspect="1"/>
+            </wp:cNvGraphicFramePr>
+            <a:graphic xmlns:a="http://schemas.openxmlformats.org/drawingml/2006/main">
+              <a:graphicData uri="http://schemas.openxmlformats.org/drawingml/2006/picture">
+                <pic:pic xmlns:pic="http://schemas.openxmlformats.org/drawingml/2006/picture">
+                  <pic:nvPicPr>
+                    <pic:cNvPr id="0" name="Picture 2"/>
+                    <pic:cNvPicPr>
+                      <a:picLocks noChangeAspect="1" noChangeArrowheads="1"/>
+                    </pic:cNvPicPr>
+                  </pic:nvPicPr>
+                  <pic:blipFill>
+                    <a:blip r:embed="rId34" cstate="print">
+                      <a:extLst>
+                        <a:ext uri="{28A0092B-C50C-407E-A947-70E740481C1C}">
+                          <a14:useLocalDpi xmlns:a14="http://schemas.microsoft.com/office/drawing/2010/main" val="0"/>
+                        </a:ext>
+                      </a:extLst>
+                    </a:blip>
+                    <a:srcRect/>
+                    <a:stretch>
+                      <a:fillRect/>
+                    </a:stretch>
+                  </pic:blipFill>
+                  <pic:spPr bwMode="auto">
+                    <a:xfrm>
+                      <a:off x="0" y="0"/>
+                      <a:ext cx="5391150" cy="3028950"/>
+                    </a:xfrm>
+                    <a:prstGeom prst="rect">
+                      <a:avLst/>
+                    </a:prstGeom>
+                    <a:noFill/>
+                    <a:ln>
+                      <a:noFill/>
+                    </a:ln>
+                  </pic:spPr>
+                </pic:pic>
+              </a:graphicData>
+            </a:graphic>
+          </wp:inline>
+        </w:drawing>
+      </w:r>
+    </w:p>
+    <w:p>
+      <w:pPr>
+        <w:jc w:val="center"/>
+        <w:rPr>
+          <w:lang w:val="en-GB"/>
+        </w:rPr>
+      </w:pPr>
+      <w:r>
+        <w:rPr>
+          <w:noProof/>
+          <w:lang w:val="en-GB"/>
+        </w:rPr>
+        <w:drawing>
+          <wp:inline distT="0" distB="0" distL="0" distR="0" wp14:anchorId="313A0144" wp14:editId="01BEBE6A">
+            <wp:extent cx="2946400" cy="5241372"/>
+            <wp:effectExtent l="0" t="0" r="6350" b="0"/>
+            <wp:docPr id="3" name="Picture 3"/>
+            <wp:cNvGraphicFramePr>
+              <a:graphicFrameLocks xmlns:a="http://schemas.openxmlformats.org/drawingml/2006/main" noChangeAspect="1"/>
+            </wp:cNvGraphicFramePr>
+            <a:graphic xmlns:a="http://schemas.openxmlformats.org/drawingml/2006/main">
+              <a:graphicData uri="http://schemas.openxmlformats.org/drawingml/2006/picture">
+                <pic:pic xmlns:pic="http://schemas.openxmlformats.org/drawingml/2006/picture">
+                  <pic:nvPicPr>
+                    <pic:cNvPr id="0" name="Picture 3"/>
+                    <pic:cNvPicPr>
+                      <a:picLocks noChangeAspect="1" noChangeArrowheads="1"/>
+                    </pic:cNvPicPr>
+                  </pic:nvPicPr>
+                  <pic:blipFill>
+                    <a:blip r:embed="rId35" cstate="print">
+                      <a:extLst>
+                        <a:ext uri="{28A0092B-C50C-407E-A947-70E740481C1C}">
+                          <a14:useLocalDpi xmlns:a14="http://schemas.microsoft.com/office/drawing/2010/main" val="0"/>
+                        </a:ext>
+                      </a:extLst>
+                    </a:blip>
+                    <a:srcRect/>
+                    <a:stretch>
+                      <a:fillRect/>
+                    </a:stretch>
+                  </pic:blipFill>
+                  <pic:spPr bwMode="auto">
+                    <a:xfrm>
+                      <a:off x="0" y="0"/>
+                      <a:ext cx="2952025" cy="5251379"/>
+                    </a:xfrm>
+                    <a:prstGeom prst="rect">
+                      <a:avLst/>
+                    </a:prstGeom>
+                    <a:noFill/>
+                    <a:ln>
+                      <a:noFill/>
+                    </a:ln>
+                  </pic:spPr>
+                </pic:pic>
+              </a:graphicData>
+            </a:graphic>
+          </wp:inline>
+        </w:drawing>
+      </w:r>
     </w:p>
     <w:p>
       <w:pPr>
@@ -2340,12 +2801,20 @@
         </w:rPr>
       </w:pPr>
       <w:bookmarkStart w:id="7" w:name="_Toc70501318"/>
+      <w:proofErr w:type="spellStart"/>
       <w:r>
         <w:rPr>
           <w:lang w:val="en-GB"/>
         </w:rPr>
         <w:lastRenderedPageBreak/>
-        <w:t>Matlab/Simulink</w:t>
+        <w:t>Matlab</w:t>
+      </w:r>
+      <w:proofErr w:type="spellEnd"/>
+      <w:r>
+        <w:rPr>
+          <w:lang w:val="en-GB"/>
+        </w:rPr>
+        <w:t>/Simulink</w:t>
       </w:r>
       <w:bookmarkEnd w:id="7"/>
     </w:p>
@@ -2380,7 +2849,21 @@
         <w:rPr>
           <w:lang w:val="en-GB"/>
         </w:rPr>
-        <w:t>Installation including all simulink components.</w:t>
+        <w:t xml:space="preserve">Installation including all </w:t>
+      </w:r>
+      <w:proofErr w:type="spellStart"/>
+      <w:r>
+        <w:rPr>
+          <w:lang w:val="en-GB"/>
+        </w:rPr>
+        <w:t>simulink</w:t>
+      </w:r>
+      <w:proofErr w:type="spellEnd"/>
+      <w:r>
+        <w:rPr>
+          <w:lang w:val="en-GB"/>
+        </w:rPr>
+        <w:t xml:space="preserve"> components.</w:t>
       </w:r>
     </w:p>
     <w:p>
@@ -2391,8 +2874,21 @@
           <w:numId w:val="2"/>
         </w:numPr>
       </w:pPr>
-      <w:r>
-        <w:t>MinGW (C/C++ compiler)</w:t>
+      <w:proofErr w:type="spellStart"/>
+      <w:r>
+        <w:t>MinGW</w:t>
+      </w:r>
+      <w:proofErr w:type="spellEnd"/>
+      <w:r>
+        <w:t xml:space="preserve"> (C/C++ </w:t>
+      </w:r>
+      <w:proofErr w:type="spellStart"/>
+      <w:r>
+        <w:t>compiler</w:t>
+      </w:r>
+      <w:proofErr w:type="spellEnd"/>
+      <w:r>
+        <w:t>)</w:t>
       </w:r>
     </w:p>
     <w:p>
@@ -2403,8 +2899,29 @@
           <w:numId w:val="2"/>
         </w:numPr>
       </w:pPr>
-      <w:r>
-        <w:t>Support Package for Arduino</w:t>
+      <w:proofErr w:type="spellStart"/>
+      <w:r>
+        <w:t>Support</w:t>
+      </w:r>
+      <w:proofErr w:type="spellEnd"/>
+      <w:r>
+        <w:t xml:space="preserve"> </w:t>
+      </w:r>
+      <w:proofErr w:type="spellStart"/>
+      <w:r>
+        <w:t>Package</w:t>
+      </w:r>
+      <w:proofErr w:type="spellEnd"/>
+      <w:r>
+        <w:t xml:space="preserve"> </w:t>
+      </w:r>
+      <w:proofErr w:type="spellStart"/>
+      <w:r>
+        <w:t>for</w:t>
+      </w:r>
+      <w:proofErr w:type="spellEnd"/>
+      <w:r>
+        <w:t xml:space="preserve"> Arduino</w:t>
       </w:r>
     </w:p>
     <w:p>
@@ -2478,11 +2995,19 @@
         </w:rPr>
       </w:pPr>
       <w:bookmarkStart w:id="11" w:name="_Toc70501322"/>
-      <w:r>
-        <w:rPr>
-          <w:lang w:val="en-GB"/>
-        </w:rPr>
-        <w:t>Thingspeak data</w:t>
+      <w:proofErr w:type="spellStart"/>
+      <w:r>
+        <w:rPr>
+          <w:lang w:val="en-GB"/>
+        </w:rPr>
+        <w:t>Thingspeak</w:t>
+      </w:r>
+      <w:proofErr w:type="spellEnd"/>
+      <w:r>
+        <w:rPr>
+          <w:lang w:val="en-GB"/>
+        </w:rPr>
+        <w:t xml:space="preserve"> data</w:t>
       </w:r>
       <w:r>
         <w:rPr>
@@ -2516,7 +3041,21 @@
         <w:rPr>
           <w:lang w:val="en-GB"/>
         </w:rPr>
-        <w:t>Starting with the first demo following what Victor tought us about a simple app displaying a cube that I already had, I start investigating about how to run a Python script in Unity.</w:t>
+        <w:t xml:space="preserve">Starting with the first demo following what Victor </w:t>
+      </w:r>
+      <w:proofErr w:type="spellStart"/>
+      <w:r>
+        <w:rPr>
+          <w:lang w:val="en-GB"/>
+        </w:rPr>
+        <w:t>tought</w:t>
+      </w:r>
+      <w:proofErr w:type="spellEnd"/>
+      <w:r>
+        <w:rPr>
+          <w:lang w:val="en-GB"/>
+        </w:rPr>
+        <w:t xml:space="preserve"> us about a simple app displaying a cube that I already had, I start investigating about how to run a Python script in Unity.</w:t>
       </w:r>
     </w:p>
     <w:p>
@@ -2536,7 +3075,7 @@
         </w:rPr>
         <w:t>4 ways of running Python in Unity (</w:t>
       </w:r>
-      <w:hyperlink r:id="rId34" w:history="1">
+      <w:hyperlink r:id="rId36" w:history="1">
         <w:r>
           <w:rPr>
             <w:rStyle w:val="Hyperlink"/>
@@ -2581,7 +3120,7 @@
         </w:rPr>
         <w:t>(</w:t>
       </w:r>
-      <w:hyperlink r:id="rId35" w:history="1">
+      <w:hyperlink r:id="rId37" w:history="1">
         <w:r>
           <w:rPr>
             <w:rStyle w:val="Hyperlink"/>
@@ -2662,7 +3201,7 @@
         </w:rPr>
         <w:t>Daydream support was removed in 2020.1. Google released an open source cardboard plugin for 2020.1+ which they recommend using as a replacement: </w:t>
       </w:r>
-      <w:hyperlink r:id="rId36" w:tgtFrame="_blank" w:history="1">
+      <w:hyperlink r:id="rId38" w:tgtFrame="_blank" w:history="1">
         <w:r>
           <w:rPr>
             <w:rStyle w:val="Hyperlink"/>
@@ -2697,9 +3236,29 @@
           <w:shd w:val="clear" w:color="auto" w:fill="FAFAFA"/>
           <w:lang w:val="en-GB"/>
         </w:rPr>
-        <w:t>See google's suggestions here: </w:t>
-      </w:r>
-      <w:hyperlink r:id="rId37" w:tgtFrame="_blank" w:history="1">
+        <w:t xml:space="preserve">See </w:t>
+      </w:r>
+      <w:proofErr w:type="spellStart"/>
+      <w:r>
+        <w:rPr>
+          <w:rFonts w:ascii="Arial" w:hAnsi="Arial" w:cs="Arial"/>
+          <w:color w:val="333333"/>
+          <w:shd w:val="clear" w:color="auto" w:fill="FAFAFA"/>
+          <w:lang w:val="en-GB"/>
+        </w:rPr>
+        <w:t>google's</w:t>
+      </w:r>
+      <w:proofErr w:type="spellEnd"/>
+      <w:r>
+        <w:rPr>
+          <w:rFonts w:ascii="Arial" w:hAnsi="Arial" w:cs="Arial"/>
+          <w:color w:val="333333"/>
+          <w:shd w:val="clear" w:color="auto" w:fill="FAFAFA"/>
+          <w:lang w:val="en-GB"/>
+        </w:rPr>
+        <w:t xml:space="preserve"> suggestions here: </w:t>
+      </w:r>
+      <w:hyperlink r:id="rId39" w:tgtFrame="_blank" w:history="1">
         <w:r>
           <w:rPr>
             <w:rStyle w:val="Hyperlink"/>
@@ -2724,7 +3283,7 @@
         </w:rPr>
         <w:t>Here is written how to use the new cardboard plugin (</w:t>
       </w:r>
-      <w:hyperlink r:id="rId38" w:history="1">
+      <w:hyperlink r:id="rId40" w:history="1">
         <w:r>
           <w:rPr>
             <w:rStyle w:val="Hyperlink"/>
@@ -2752,7 +3311,7 @@
         </w:rPr>
         <w:t>Mixed reality library for Unity and Google Cardboard (</w:t>
       </w:r>
-      <w:hyperlink r:id="rId39" w:history="1">
+      <w:hyperlink r:id="rId41" w:history="1">
         <w:r>
           <w:rPr>
             <w:rStyle w:val="Hyperlink"/>
@@ -2778,7 +3337,21 @@
         <w:rPr>
           <w:lang w:val="en-GB"/>
         </w:rPr>
-        <w:t>Import Hello Cardboad from the Package Manager</w:t>
+        <w:t xml:space="preserve">Import Hello </w:t>
+      </w:r>
+      <w:proofErr w:type="spellStart"/>
+      <w:r>
+        <w:rPr>
+          <w:lang w:val="en-GB"/>
+        </w:rPr>
+        <w:t>Cardboad</w:t>
+      </w:r>
+      <w:proofErr w:type="spellEnd"/>
+      <w:r>
+        <w:rPr>
+          <w:lang w:val="en-GB"/>
+        </w:rPr>
+        <w:t xml:space="preserve"> from the Package Manager</w:t>
       </w:r>
     </w:p>
     <w:p>
@@ -2793,7 +3366,7 @@
         </w:rPr>
         <w:t>Tutorial for integrating Python Script Editor in Unity with small example (</w:t>
       </w:r>
-      <w:hyperlink r:id="rId40" w:history="1">
+      <w:hyperlink r:id="rId42" w:history="1">
         <w:r>
           <w:rPr>
             <w:rStyle w:val="Hyperlink"/>
@@ -2822,7 +3395,7 @@
         <w:lastRenderedPageBreak/>
         <w:t>Guide for installing Python in Unity (</w:t>
       </w:r>
-      <w:hyperlink r:id="rId41" w:history="1">
+      <w:hyperlink r:id="rId43" w:history="1">
         <w:r>
           <w:rPr>
             <w:rStyle w:val="Hyperlink"/>
@@ -2893,7 +3466,7 @@
         </w:rPr>
         <w:t>Install pip from this site (</w:t>
       </w:r>
-      <w:hyperlink r:id="rId42" w:history="1">
+      <w:hyperlink r:id="rId44" w:history="1">
         <w:r>
           <w:rPr>
             <w:rStyle w:val="Hyperlink"/>
@@ -2920,7 +3493,7 @@
         </w:rPr>
         <w:t xml:space="preserve"> In order to work, add it to the PATH (</w:t>
       </w:r>
-      <w:hyperlink r:id="rId43" w:history="1">
+      <w:hyperlink r:id="rId45" w:history="1">
         <w:r>
           <w:rPr>
             <w:rStyle w:val="Hyperlink"/>
@@ -2946,8 +3519,16 @@
         <w:rPr>
           <w:lang w:val="en-GB"/>
         </w:rPr>
-        <w:t>We should add the dependency manually to VAR_AUB\Packages\manifest.json</w:t>
-      </w:r>
+        <w:t>We should add the dependency manually to VAR_AUB\Packages\</w:t>
+      </w:r>
+      <w:proofErr w:type="spellStart"/>
+      <w:r>
+        <w:rPr>
+          <w:lang w:val="en-GB"/>
+        </w:rPr>
+        <w:t>manifest.json</w:t>
+      </w:r>
+      <w:proofErr w:type="spellEnd"/>
     </w:p>
     <w:p>
       <w:pPr>
@@ -3029,26 +3610,35 @@
         <w:rPr>
           <w:lang w:val="en-GB"/>
         </w:rPr>
-        <w:t>First a demo of C# program that get’s thingspeak data to the console.</w:t>
-      </w:r>
+        <w:t xml:space="preserve">First a demo of C# program that </w:t>
+      </w:r>
+      <w:proofErr w:type="spellStart"/>
+      <w:r>
+        <w:rPr>
+          <w:lang w:val="en-GB"/>
+        </w:rPr>
+        <w:t>get’s</w:t>
+      </w:r>
+      <w:proofErr w:type="spellEnd"/>
       <w:r>
         <w:rPr>
           <w:lang w:val="en-GB"/>
         </w:rPr>
         <w:t xml:space="preserve"> </w:t>
       </w:r>
-    </w:p>
-    <w:p>
-      <w:pPr>
-        <w:rPr>
-          <w:lang w:val="en-GB"/>
-        </w:rPr>
-      </w:pPr>
-      <w:r>
-        <w:rPr>
-          <w:lang w:val="en-GB"/>
-        </w:rPr>
-        <w:t>Then get the data from Thingspeak in JSON</w:t>
+      <w:proofErr w:type="spellStart"/>
+      <w:r>
+        <w:rPr>
+          <w:lang w:val="en-GB"/>
+        </w:rPr>
+        <w:t>thingspeak</w:t>
+      </w:r>
+      <w:proofErr w:type="spellEnd"/>
+      <w:r>
+        <w:rPr>
+          <w:lang w:val="en-GB"/>
+        </w:rPr>
+        <w:t xml:space="preserve"> data to the console.</w:t>
       </w:r>
       <w:r>
         <w:rPr>
@@ -3056,13 +3646,46 @@
         </w:rPr>
         <w:t xml:space="preserve"> </w:t>
       </w:r>
+    </w:p>
+    <w:p>
+      <w:pPr>
+        <w:rPr>
+          <w:lang w:val="en-GB"/>
+        </w:rPr>
+      </w:pPr>
+      <w:r>
+        <w:rPr>
+          <w:lang w:val="en-GB"/>
+        </w:rPr>
+        <w:t xml:space="preserve">Then get the data from </w:t>
+      </w:r>
+      <w:proofErr w:type="spellStart"/>
+      <w:r>
+        <w:rPr>
+          <w:lang w:val="en-GB"/>
+        </w:rPr>
+        <w:t>Thingspeak</w:t>
+      </w:r>
+      <w:proofErr w:type="spellEnd"/>
+      <w:r>
+        <w:rPr>
+          <w:lang w:val="en-GB"/>
+        </w:rPr>
+        <w:t xml:space="preserve"> in JSON</w:t>
+      </w:r>
+      <w:r>
+        <w:rPr>
+          <w:lang w:val="en-GB"/>
+        </w:rPr>
+        <w:t xml:space="preserve"> </w:t>
+      </w:r>
       <w:r>
         <w:rPr>
           <w:lang w:val="en-GB"/>
         </w:rPr>
         <w:t>using their API (</w:t>
       </w:r>
-      <w:hyperlink r:id="rId44" w:history="1">
+      <w:hyperlink r:id="rId46" w:history="1">
         <w:r>
           <w:rPr>
             <w:rStyle w:val="Hyperlink"/>
@@ -3090,7 +3713,7 @@
         </w:rPr>
         <w:t>This as an example (</w:t>
       </w:r>
-      <w:hyperlink r:id="rId45" w:history="1">
+      <w:hyperlink r:id="rId47" w:history="1">
         <w:r>
           <w:rPr>
             <w:rStyle w:val="Hyperlink"/>
@@ -3122,7 +3745,35 @@
         <w:rPr>
           <w:lang w:val="en-GB"/>
         </w:rPr>
-        <w:t>the Newtonsoft.Json library (using Newtonsoft.Json.Linq)</w:t>
+        <w:t xml:space="preserve">the </w:t>
+      </w:r>
+      <w:proofErr w:type="spellStart"/>
+      <w:r>
+        <w:rPr>
+          <w:lang w:val="en-GB"/>
+        </w:rPr>
+        <w:t>Newtonsoft.Json</w:t>
+      </w:r>
+      <w:proofErr w:type="spellEnd"/>
+      <w:r>
+        <w:rPr>
+          <w:lang w:val="en-GB"/>
+        </w:rPr>
+        <w:t xml:space="preserve"> library (using </w:t>
+      </w:r>
+      <w:proofErr w:type="spellStart"/>
+      <w:r>
+        <w:rPr>
+          <w:lang w:val="en-GB"/>
+        </w:rPr>
+        <w:t>Newtonsoft.Json.Linq</w:t>
+      </w:r>
+      <w:proofErr w:type="spellEnd"/>
+      <w:r>
+        <w:rPr>
+          <w:lang w:val="en-GB"/>
+        </w:rPr>
+        <w:t>)</w:t>
       </w:r>
       <w:r>
         <w:rPr>
@@ -3134,9 +3785,15 @@
         <w:rPr>
           <w:lang w:val="en-GB"/>
         </w:rPr>
+        <w:t xml:space="preserve">in order to process JSON data in Unity </w:t>
+      </w:r>
+      <w:r>
+        <w:rPr>
+          <w:lang w:val="en-GB"/>
+        </w:rPr>
         <w:t>(</w:t>
       </w:r>
-      <w:hyperlink r:id="rId46" w:history="1">
+      <w:hyperlink r:id="rId48" w:history="1">
         <w:r>
           <w:rPr>
             <w:rStyle w:val="Hyperlink"/>
@@ -3201,7 +3858,19 @@
         <w:rPr>
           <w:lang w:val="en-GB"/>
         </w:rPr>
-        <w:t xml:space="preserve">I had an idea in order to make it work for VR, </w:t>
+        <w:t xml:space="preserve">I had an idea </w:t>
+      </w:r>
+      <w:r>
+        <w:rPr>
+          <w:lang w:val="en-GB"/>
+        </w:rPr>
+        <w:t>to</w:t>
+      </w:r>
+      <w:r>
+        <w:rPr>
+          <w:lang w:val="en-GB"/>
+        </w:rPr>
+        <w:t xml:space="preserve"> make it work for VR, </w:t>
       </w:r>
       <w:r>
         <w:rPr>
@@ -3220,9 +3889,23 @@
         <w:rPr>
           <w:lang w:val="en-GB"/>
         </w:rPr>
-        <w:t>For adapting the C# script in Unity I install the NuGetUnityPackage (</w:t>
-      </w:r>
-      <w:hyperlink r:id="rId47" w:history="1">
+        <w:t xml:space="preserve">For adapting the C# script in Unity I install the </w:t>
+      </w:r>
+      <w:proofErr w:type="spellStart"/>
+      <w:r>
+        <w:rPr>
+          <w:lang w:val="en-GB"/>
+        </w:rPr>
+        <w:t>NuGetUnityPackage</w:t>
+      </w:r>
+      <w:proofErr w:type="spellEnd"/>
+      <w:r>
+        <w:rPr>
+          <w:lang w:val="en-GB"/>
+        </w:rPr>
+        <w:t xml:space="preserve"> (</w:t>
+      </w:r>
+      <w:hyperlink r:id="rId49" w:history="1">
         <w:r>
           <w:rPr>
             <w:rStyle w:val="Hyperlink"/>
@@ -3243,7 +3926,7 @@
         </w:rPr>
         <w:t xml:space="preserve"> and (</w:t>
       </w:r>
-      <w:hyperlink r:id="rId48" w:history="1">
+      <w:hyperlink r:id="rId50" w:history="1">
         <w:r>
           <w:rPr>
             <w:rStyle w:val="Hyperlink"/>
@@ -3281,9 +3964,21 @@
         <w:rPr>
           <w:lang w:val="en-GB"/>
         </w:rPr>
-        <w:t>In order to reference the object I want to move (</w:t>
-      </w:r>
-      <w:hyperlink r:id="rId49" w:history="1">
+        <w:t xml:space="preserve">In order to reference the </w:t>
+      </w:r>
+      <w:r>
+        <w:rPr>
+          <w:lang w:val="en-GB"/>
+        </w:rPr>
+        <w:t>object</w:t>
+      </w:r>
+      <w:r>
+        <w:rPr>
+          <w:lang w:val="en-GB"/>
+        </w:rPr>
+        <w:t xml:space="preserve"> I want to move (</w:t>
+      </w:r>
+      <w:hyperlink r:id="rId51" w:history="1">
         <w:r>
           <w:rPr>
             <w:rStyle w:val="Hyperlink"/>
@@ -3309,9 +4004,15 @@
         <w:rPr>
           <w:lang w:val="en-GB"/>
         </w:rPr>
-        <w:t>In order to move the object (</w:t>
-      </w:r>
-      <w:hyperlink r:id="rId50" w:history="1">
+        <w:t>To</w:t>
+      </w:r>
+      <w:r>
+        <w:rPr>
+          <w:lang w:val="en-GB"/>
+        </w:rPr>
+        <w:t xml:space="preserve"> move the object (</w:t>
+      </w:r>
+      <w:hyperlink r:id="rId52" w:history="1">
         <w:r>
           <w:rPr>
             <w:rStyle w:val="Hyperlink"/>
@@ -3339,7 +4040,7 @@
         </w:rPr>
         <w:t>For translating the values obtained from ThingSpeak (0-100) to values needed for modifying the position in Unity (0-2) I create a map function (</w:t>
       </w:r>
-      <w:hyperlink r:id="rId51" w:history="1">
+      <w:hyperlink r:id="rId53" w:history="1">
         <w:r>
           <w:rPr>
             <w:rStyle w:val="Hyperlink"/>
@@ -3367,7 +4068,7 @@
         </w:rPr>
         <w:t>Object from ThingSpeak to int (</w:t>
       </w:r>
-      <w:hyperlink r:id="rId52" w:history="1">
+      <w:hyperlink r:id="rId54" w:history="1">
         <w:r>
           <w:rPr>
             <w:rStyle w:val="Hyperlink"/>
@@ -3396,7 +4097,7 @@
         <w:lastRenderedPageBreak/>
         <w:t>Plant for prototype (</w:t>
       </w:r>
-      <w:hyperlink r:id="rId53" w:history="1">
+      <w:hyperlink r:id="rId55" w:history="1">
         <w:r>
           <w:rPr>
             <w:rStyle w:val="Hyperlink"/>
@@ -3424,12 +4125,15 @@
         </w:rPr>
         <w:t>Git large files management (</w:t>
       </w:r>
-      <w:r>
-        <w:rPr>
-          <w:lang w:val="en-GB"/>
-        </w:rPr>
-        <w:t>https://git-lfs.github.com/</w:t>
-      </w:r>
+      <w:hyperlink r:id="rId56" w:history="1">
+        <w:r>
+          <w:rPr>
+            <w:rStyle w:val="Hyperlink"/>
+            <w:lang w:val="en-GB"/>
+          </w:rPr>
+          <w:t>https://git-lfs.github.com/</w:t>
+        </w:r>
+      </w:hyperlink>
       <w:r>
         <w:rPr>
           <w:lang w:val="en-GB"/>
@@ -3445,6 +4149,37 @@
     </w:p>
     <w:p>
       <w:pPr>
+        <w:rPr>
+          <w:lang w:val="en-GB"/>
+        </w:rPr>
+      </w:pPr>
+      <w:r>
+        <w:rPr>
+          <w:lang w:val="en-GB"/>
+        </w:rPr>
+        <w:t xml:space="preserve">For adding the rest of the sensors, I create </w:t>
+      </w:r>
+      <w:r>
+        <w:rPr>
+          <w:lang w:val="en-GB"/>
+        </w:rPr>
+        <w:t>3 more</w:t>
+      </w:r>
+      <w:r>
+        <w:rPr>
+          <w:lang w:val="en-GB"/>
+        </w:rPr>
+        <w:t xml:space="preserve"> cylinders</w:t>
+      </w:r>
+      <w:r>
+        <w:rPr>
+          <w:lang w:val="en-GB"/>
+        </w:rPr>
+        <w:t>, for displaying the rest of the measurements.</w:t>
+      </w:r>
+    </w:p>
+    <w:p>
+      <w:pPr>
         <w:pStyle w:val="Heading2"/>
         <w:rPr>
           <w:lang w:val="en-GB"/>
@@ -3482,9 +4217,23 @@
         <w:rPr>
           <w:lang w:val="en-GB"/>
         </w:rPr>
-        <w:t>In order to do it I create a bot using BotFather (</w:t>
-      </w:r>
-      <w:hyperlink r:id="rId54" w:history="1">
+        <w:t xml:space="preserve">In order to do it I create a bot using </w:t>
+      </w:r>
+      <w:proofErr w:type="spellStart"/>
+      <w:r>
+        <w:rPr>
+          <w:lang w:val="en-GB"/>
+        </w:rPr>
+        <w:t>BotFather</w:t>
+      </w:r>
+      <w:proofErr w:type="spellEnd"/>
+      <w:r>
+        <w:rPr>
+          <w:lang w:val="en-GB"/>
+        </w:rPr>
+        <w:t xml:space="preserve"> (</w:t>
+      </w:r>
+      <w:hyperlink r:id="rId57" w:history="1">
         <w:r>
           <w:rPr>
             <w:rStyle w:val="Hyperlink"/>
@@ -3522,9 +4271,23 @@
         <w:rPr>
           <w:lang w:val="en-GB"/>
         </w:rPr>
-        <w:t>Then using telepot python library (</w:t>
-      </w:r>
-      <w:hyperlink r:id="rId55" w:history="1">
+        <w:t xml:space="preserve">Then using </w:t>
+      </w:r>
+      <w:proofErr w:type="spellStart"/>
+      <w:r>
+        <w:rPr>
+          <w:lang w:val="en-GB"/>
+        </w:rPr>
+        <w:t>telepot</w:t>
+      </w:r>
+      <w:proofErr w:type="spellEnd"/>
+      <w:r>
+        <w:rPr>
+          <w:lang w:val="en-GB"/>
+        </w:rPr>
+        <w:t xml:space="preserve"> python library (</w:t>
+      </w:r>
+      <w:hyperlink r:id="rId58" w:history="1">
         <w:r>
           <w:rPr>
             <w:rStyle w:val="Hyperlink"/>
@@ -3562,7 +4325,21 @@
         <w:rPr>
           <w:lang w:val="en-GB"/>
         </w:rPr>
-        <w:t>Lastly using the thingspeak python library</w:t>
+        <w:t xml:space="preserve">Lastly using the </w:t>
+      </w:r>
+      <w:proofErr w:type="spellStart"/>
+      <w:r>
+        <w:rPr>
+          <w:lang w:val="en-GB"/>
+        </w:rPr>
+        <w:t>thingspeak</w:t>
+      </w:r>
+      <w:proofErr w:type="spellEnd"/>
+      <w:r>
+        <w:rPr>
+          <w:lang w:val="en-GB"/>
+        </w:rPr>
+        <w:t xml:space="preserve"> python library</w:t>
       </w:r>
       <w:r>
         <w:rPr>
@@ -3570,7 +4347,7 @@
         </w:rPr>
         <w:t xml:space="preserve"> (</w:t>
       </w:r>
-      <w:hyperlink r:id="rId56" w:history="1">
+      <w:hyperlink r:id="rId59" w:history="1">
         <w:r>
           <w:rPr>
             <w:rStyle w:val="Hyperlink"/>
@@ -3608,7 +4385,21 @@
         <w:rPr>
           <w:lang w:val="en-GB"/>
         </w:rPr>
-        <w:t xml:space="preserve">When it’s running, talk to VAR_AUB_bot </w:t>
+        <w:t xml:space="preserve">When it’s running, talk to </w:t>
+      </w:r>
+      <w:proofErr w:type="spellStart"/>
+      <w:r>
+        <w:rPr>
+          <w:lang w:val="en-GB"/>
+        </w:rPr>
+        <w:t>VAR_AUB_bot</w:t>
+      </w:r>
+      <w:proofErr w:type="spellEnd"/>
+      <w:r>
+        <w:rPr>
+          <w:lang w:val="en-GB"/>
+        </w:rPr>
+        <w:t xml:space="preserve"> </w:t>
       </w:r>
       <w:r>
         <w:rPr>
@@ -3616,7 +4407,7 @@
         </w:rPr>
         <w:t>(</w:t>
       </w:r>
-      <w:hyperlink r:id="rId57" w:tgtFrame="_blank" w:history="1">
+      <w:hyperlink r:id="rId60" w:tgtFrame="_blank" w:history="1">
         <w:r>
           <w:rPr>
             <w:rStyle w:val="Hyperlink"/>
@@ -3627,8 +4418,22 @@
             <w:shd w:val="clear" w:color="auto" w:fill="FFFFFF"/>
             <w:lang w:val="en-GB"/>
           </w:rPr>
-          <w:t>t.me/var_aub_bot</w:t>
+          <w:t>t.me/</w:t>
         </w:r>
+        <w:proofErr w:type="spellStart"/>
+        <w:r>
+          <w:rPr>
+            <w:rStyle w:val="Hyperlink"/>
+            <w:rFonts w:ascii="Tahoma" w:hAnsi="Tahoma" w:cs="Tahoma"/>
+            <w:color w:val="3A6D99"/>
+            <w:sz w:val="20"/>
+            <w:szCs w:val="20"/>
+            <w:shd w:val="clear" w:color="auto" w:fill="FFFFFF"/>
+            <w:lang w:val="en-GB"/>
+          </w:rPr>
+          <w:t>var_aub_bot</w:t>
+        </w:r>
+        <w:proofErr w:type="spellEnd"/>
       </w:hyperlink>
       <w:r>
         <w:rPr>
@@ -3693,7 +4498,7 @@
           <w:lang w:val="en-GB"/>
         </w:rPr>
       </w:pPr>
-      <w:hyperlink r:id="rId58" w:history="1">
+      <w:hyperlink r:id="rId61" w:history="1">
         <w:r>
           <w:rPr>
             <w:rStyle w:val="Hyperlink"/>

</xml_diff>

<commit_message>
All indicators working on Unity
</commit_message>
<xml_diff>
--- a/Documentation/General/Notes.docx
+++ b/Documentation/General/Notes.docx
@@ -4180,6 +4180,269 @@
     </w:p>
     <w:p>
       <w:pPr>
+        <w:rPr>
+          <w:lang w:val="en-GB"/>
+        </w:rPr>
+      </w:pPr>
+      <w:r>
+        <w:rPr>
+          <w:lang w:val="en-GB"/>
+        </w:rPr>
+        <w:t xml:space="preserve">Also adapt the C# code for reading </w:t>
+      </w:r>
+      <w:proofErr w:type="spellStart"/>
+      <w:r>
+        <w:rPr>
+          <w:lang w:val="en-GB"/>
+        </w:rPr>
+        <w:t>Thingspeak</w:t>
+      </w:r>
+      <w:proofErr w:type="spellEnd"/>
+      <w:r>
+        <w:rPr>
+          <w:lang w:val="en-GB"/>
+        </w:rPr>
+        <w:t xml:space="preserve"> values</w:t>
+      </w:r>
+      <w:r>
+        <w:rPr>
+          <w:lang w:val="en-GB"/>
+        </w:rPr>
+        <w:t xml:space="preserve"> following the same procedure</w:t>
+      </w:r>
+      <w:r>
+        <w:rPr>
+          <w:lang w:val="en-GB"/>
+        </w:rPr>
+        <w:t>.</w:t>
+      </w:r>
+    </w:p>
+    <w:p>
+      <w:pPr>
+        <w:rPr>
+          <w:lang w:val="en-GB"/>
+        </w:rPr>
+      </w:pPr>
+      <w:r>
+        <w:rPr>
+          <w:lang w:val="en-GB"/>
+        </w:rPr>
+        <w:t>In order to show if it’s highly raining, a raining cloud is programmed to appear above the plant.</w:t>
+      </w:r>
+    </w:p>
+    <w:p>
+      <w:pPr>
+        <w:rPr>
+          <w:lang w:val="en-GB"/>
+        </w:rPr>
+      </w:pPr>
+      <w:r>
+        <w:rPr>
+          <w:lang w:val="en-GB"/>
+        </w:rPr>
+        <w:t>I encountered some problems, when the script manages all 4 indicators, none of them work.</w:t>
+      </w:r>
+    </w:p>
+    <w:p>
+      <w:pPr>
+        <w:rPr>
+          <w:lang w:val="en-GB"/>
+        </w:rPr>
+      </w:pPr>
+      <w:r>
+        <w:rPr>
+          <w:lang w:val="en-GB"/>
+        </w:rPr>
+        <w:t>Converting the values obtained to float for them to work in the vector that modifies the height of the cylinder indicating the values readded from the sensors.</w:t>
+      </w:r>
+    </w:p>
+    <w:p>
+      <w:pPr>
+        <w:rPr>
+          <w:lang w:val="en-GB"/>
+        </w:rPr>
+      </w:pPr>
+      <w:r>
+        <w:rPr>
+          <w:lang w:val="en-GB"/>
+        </w:rPr>
+        <w:t>The script in charge of reading the values and modifying the indicators is used in the object containing these indicators.</w:t>
+      </w:r>
+    </w:p>
+    <w:p>
+      <w:pPr>
+        <w:rPr>
+          <w:lang w:val="en-GB"/>
+        </w:rPr>
+      </w:pPr>
+      <w:r>
+        <w:rPr>
+          <w:lang w:val="en-GB"/>
+        </w:rPr>
+        <w:t xml:space="preserve">When trying to get the temperature from </w:t>
+      </w:r>
+      <w:proofErr w:type="spellStart"/>
+      <w:r>
+        <w:rPr>
+          <w:lang w:val="en-GB"/>
+        </w:rPr>
+        <w:t>Thingspeak</w:t>
+      </w:r>
+      <w:proofErr w:type="spellEnd"/>
+      <w:r>
+        <w:rPr>
+          <w:lang w:val="en-GB"/>
+        </w:rPr>
+        <w:t xml:space="preserve"> the float parsing destroys the decimal point, so the number is gotten incorrectly</w:t>
+      </w:r>
+      <w:r>
+        <w:rPr>
+          <w:lang w:val="en-GB"/>
+        </w:rPr>
+        <w:t xml:space="preserve">. When the number is converted to float using </w:t>
+      </w:r>
+      <w:proofErr w:type="spellStart"/>
+      <w:r>
+        <w:rPr>
+          <w:lang w:val="en-GB"/>
+        </w:rPr>
+        <w:t>System.Globalization.CultureInfo.InvariantCulture</w:t>
+      </w:r>
+      <w:proofErr w:type="spellEnd"/>
+      <w:r>
+        <w:rPr>
+          <w:lang w:val="en-GB"/>
+        </w:rPr>
+        <w:t xml:space="preserve"> comma separator is </w:t>
+      </w:r>
+      <w:r>
+        <w:rPr>
+          <w:lang w:val="en-GB"/>
+        </w:rPr>
+        <w:t>used instead of point (</w:t>
+      </w:r>
+      <w:hyperlink r:id="rId57" w:history="1">
+        <w:r>
+          <w:rPr>
+            <w:rStyle w:val="Hyperlink"/>
+            <w:lang w:val="en-GB"/>
+          </w:rPr>
+          <w:t>https://www.codeproject.com/Questions/188004/Decimal-Seperator-change-in-c</w:t>
+        </w:r>
+      </w:hyperlink>
+      <w:r>
+        <w:rPr>
+          <w:lang w:val="en-GB"/>
+        </w:rPr>
+        <w:t xml:space="preserve">) </w:t>
+      </w:r>
+    </w:p>
+    <w:p>
+      <w:pPr>
+        <w:rPr>
+          <w:lang w:val="en-GB"/>
+        </w:rPr>
+      </w:pPr>
+      <w:r>
+        <w:rPr>
+          <w:lang w:val="en-GB"/>
+        </w:rPr>
+        <w:t>Setting the system to accept dot as the number decimal separator as default (</w:t>
+      </w:r>
+      <w:hyperlink r:id="rId58" w:history="1">
+        <w:r>
+          <w:rPr>
+            <w:rStyle w:val="Hyperlink"/>
+            <w:lang w:val="en-GB"/>
+          </w:rPr>
+          <w:t>https://stackoverflow.com/questions/9160059/set-up-dot-instead-of-comma-in-numeric-values</w:t>
+        </w:r>
+      </w:hyperlink>
+      <w:r>
+        <w:rPr>
+          <w:lang w:val="en-GB"/>
+        </w:rPr>
+        <w:t xml:space="preserve">) </w:t>
+      </w:r>
+    </w:p>
+    <w:p>
+      <w:pPr>
+        <w:rPr>
+          <w:lang w:val="en-GB"/>
+        </w:rPr>
+      </w:pPr>
+      <w:r>
+        <w:rPr>
+          <w:lang w:val="en-GB"/>
+        </w:rPr>
+        <w:t xml:space="preserve">In order to simulate if it’s raining or not, a game object that simulates rain in the scene is activated or deactivated using the </w:t>
+      </w:r>
+      <w:proofErr w:type="spellStart"/>
+      <w:r>
+        <w:rPr>
+          <w:lang w:val="en-GB"/>
+        </w:rPr>
+        <w:t>setActive</w:t>
+      </w:r>
+      <w:proofErr w:type="spellEnd"/>
+      <w:r>
+        <w:rPr>
+          <w:lang w:val="en-GB"/>
+        </w:rPr>
+        <w:t>() function according to the value obtained from the sensor</w:t>
+      </w:r>
+      <w:r>
+        <w:rPr>
+          <w:lang w:val="en-GB"/>
+        </w:rPr>
+        <w:t xml:space="preserve"> (</w:t>
+      </w:r>
+      <w:hyperlink r:id="rId59" w:history="1">
+        <w:r>
+          <w:rPr>
+            <w:rStyle w:val="Hyperlink"/>
+            <w:lang w:val="en-GB"/>
+          </w:rPr>
+          <w:t>https://answers.unity.com/questions/372531/how-to-disable-gameobjects-in-code.html</w:t>
+        </w:r>
+      </w:hyperlink>
+      <w:r>
+        <w:rPr>
+          <w:lang w:val="en-GB"/>
+        </w:rPr>
+        <w:t xml:space="preserve">) </w:t>
+      </w:r>
+      <w:r>
+        <w:rPr>
+          <w:lang w:val="en-GB"/>
+        </w:rPr>
+        <w:t>(</w:t>
+      </w:r>
+      <w:hyperlink r:id="rId60" w:history="1">
+        <w:r>
+          <w:rPr>
+            <w:rStyle w:val="Hyperlink"/>
+            <w:lang w:val="en-GB"/>
+          </w:rPr>
+          <w:t>https://docs.unity3d.com/ScriptReference/GameObject.SetActive.html</w:t>
+        </w:r>
+      </w:hyperlink>
+      <w:r>
+        <w:rPr>
+          <w:lang w:val="en-GB"/>
+        </w:rPr>
+        <w:t xml:space="preserve">) </w:t>
+      </w:r>
+    </w:p>
+    <w:p>
+      <w:pPr>
+        <w:rPr>
+          <w:lang w:val="en-GB"/>
+        </w:rPr>
+      </w:pPr>
+    </w:p>
+    <w:p>
+      <w:pPr>
         <w:pStyle w:val="Heading2"/>
         <w:rPr>
           <w:lang w:val="en-GB"/>
@@ -4233,7 +4496,7 @@
         </w:rPr>
         <w:t xml:space="preserve"> (</w:t>
       </w:r>
-      <w:hyperlink r:id="rId57" w:history="1">
+      <w:hyperlink r:id="rId61" w:history="1">
         <w:r>
           <w:rPr>
             <w:rStyle w:val="Hyperlink"/>
@@ -4287,7 +4550,7 @@
         </w:rPr>
         <w:t xml:space="preserve"> python library (</w:t>
       </w:r>
-      <w:hyperlink r:id="rId58" w:history="1">
+      <w:hyperlink r:id="rId62" w:history="1">
         <w:r>
           <w:rPr>
             <w:rStyle w:val="Hyperlink"/>
@@ -4347,7 +4610,7 @@
         </w:rPr>
         <w:t xml:space="preserve"> (</w:t>
       </w:r>
-      <w:hyperlink r:id="rId59" w:history="1">
+      <w:hyperlink r:id="rId63" w:history="1">
         <w:r>
           <w:rPr>
             <w:rStyle w:val="Hyperlink"/>
@@ -4407,7 +4670,7 @@
         </w:rPr>
         <w:t>(</w:t>
       </w:r>
-      <w:hyperlink r:id="rId60" w:tgtFrame="_blank" w:history="1">
+      <w:hyperlink r:id="rId64" w:tgtFrame="_blank" w:history="1">
         <w:r>
           <w:rPr>
             <w:rStyle w:val="Hyperlink"/>
@@ -4483,6 +4746,7 @@
         <w:rPr>
           <w:lang w:val="en-GB"/>
         </w:rPr>
+        <w:lastRenderedPageBreak/>
         <w:t>Interest links</w:t>
       </w:r>
       <w:bookmarkEnd w:id="14"/>
@@ -4498,7 +4762,7 @@
           <w:lang w:val="en-GB"/>
         </w:rPr>
       </w:pPr>
-      <w:hyperlink r:id="rId61" w:history="1">
+      <w:hyperlink r:id="rId65" w:history="1">
         <w:r>
           <w:rPr>
             <w:rStyle w:val="Hyperlink"/>

</xml_diff>